<commit_message>
Intento de hacer estate of art
</commit_message>
<xml_diff>
--- a/MemoriaTFG/NahiaIglesiasEsquemaTFG.docx
+++ b/MemoriaTFG/NahiaIglesiasEsquemaTFG.docx
@@ -769,15 +769,7 @@
         <w:t xml:space="preserve">A mi hermana por </w:t>
       </w:r>
       <w:r>
-        <w:t xml:space="preserve">hacerme </w:t>
-      </w:r>
-      <w:proofErr w:type="spellStart"/>
-      <w:r>
-        <w:t>sandwitches</w:t>
-      </w:r>
-      <w:proofErr w:type="spellEnd"/>
-      <w:r>
-        <w:t xml:space="preserve"> todas las veces que </w:t>
+        <w:t xml:space="preserve">hacerme sandwitches todas las veces que </w:t>
       </w:r>
       <w:r>
         <w:t>me veía</w:t>
@@ -792,13 +784,8 @@
         <w:t>.</w:t>
       </w:r>
       <w:r>
-        <w:t xml:space="preserve"> </w:t>
-      </w:r>
-      <w:proofErr w:type="spellStart"/>
-      <w:r>
-        <w:t>Lna</w:t>
-      </w:r>
-      <w:proofErr w:type="spellEnd"/>
+        <w:t xml:space="preserve"> Lna</w:t>
+      </w:r>
     </w:p>
     <w:p>
       <w:pPr>
@@ -870,7 +857,7 @@
           <w:color w:val="000000"/>
           <w:szCs w:val="22"/>
         </w:rPr>
-        <w:instrText xml:space="preserve"> ADDIN ZOTERO_ITEM CSL_CITATION {"citationID":"JQl0XBgp","properties":{"unsorted":false,"formattedCitation":"[1]","plainCitation":"[1]","noteIndex":0},"citationItems":[{"id":22,"uris":["http://zotero.org/users/local/axS3HTYd/items/QZNGZM7F"],"itemData":{"id":22,"type":"article-journal","abstract":"Background: Emerging epidemiological data suggest that hundreds of primary studies have examined the prevalence of ADHD in children and adolescents and dozens of systematic view and meta-analyses studies have been conducted on the subject. The purpose of this umbrella review is to provide a robust synthesis of evidence from these systematic reviews and meta-analyses.\nMethods: We systematically searched PubMed, Web of Science, PsychINFO, and Scopus to find pertinent studies. The study was preregistered with PROSPERO (CRD42023389704). The quality of the studies was assessed using a Measurement Tool to Assess Systematic Reviews (AMSTAR). Prevalence estimates from the included studies were pooled using invariance variance weighted random-effect meta-analysis.\nResults: Thirteen meta-analytic systematic reviews (588 primary studies) with 3,277,590 participants were included in the final analysis. A random effect meta-analysis of these studies showed that the global prevalence of ADHD in children and adolescents was 8.0 % (95%CI 6.0–10 %). The prevalence estimate was twice higher in boys (10 %) compared to girls (5 %). Of the three subtypes of ADHD, the inattentive type of ADHD (ADHD-I) was found to be the most common type of ADHD followed by the hyperactive (ADHD-HI) and the combined types (ADHD-C).\nConclusion: Findings from our compressive umbrella review suggest that ADHD is highly prevalent in children and adolescents with boys twice more likely to experience the disorder than girls. Our results underpin that priority should be given to preventing, early identifying, and treating ADHD in children and adolescents.","container-title":"Journal of Affective Disorders","language":"en","source":"Zotero","title":"The global prevalence of attention deficit hyperactivity disorder in children and adolescents: An umbrella review of meta-analyses","author":[{"family":"Ayano","given":"Getinet"}],"issued":{"date-parts":[["2023"]]}}}],"schema":"https://github.com/citation-style-language/schema/raw/master/csl-citation.json"} </w:instrText>
+        <w:instrText xml:space="preserve"> ADDIN ZOTERO_ITEM CSL_CITATION {"citationID":"gMLZhxUn","properties":{"unsorted":false,"formattedCitation":"[1]","plainCitation":"[1]","noteIndex":0},"citationItems":[{"id":22,"uris":["http://zotero.org/users/local/axS3HTYd/items/QZNGZM7F"],"itemData":{"id":22,"type":"article-journal","abstract":"Background: Emerging epidemiological data suggest that hundreds of primary studies have examined the prevalence of ADHD in children and adolescents and dozens of systematic view and meta-analyses studies have been conducted on the subject. The purpose of this umbrella review is to provide a robust synthesis of evidence from these systematic reviews and meta-analyses.\nMethods: We systematically searched PubMed, Web of Science, PsychINFO, and Scopus to find pertinent studies. The study was preregistered with PROSPERO (CRD42023389704). The quality of the studies was assessed using a Measurement Tool to Assess Systematic Reviews (AMSTAR). Prevalence estimates from the included studies were pooled using invariance variance weighted random-effect meta-analysis.\nResults: Thirteen meta-analytic systematic reviews (588 primary studies) with 3,277,590 participants were included in the final analysis. A random effect meta-analysis of these studies showed that the global prevalence of ADHD in children and adolescents was 8.0 % (95%CI 6.0–10 %). The prevalence estimate was twice higher in boys (10 %) compared to girls (5 %). Of the three subtypes of ADHD, the inattentive type of ADHD (ADHD-I) was found to be the most common type of ADHD followed by the hyperactive (ADHD-HI) and the combined types (ADHD-C).\nConclusion: Findings from our compressive umbrella review suggest that ADHD is highly prevalent in children and adolescents with boys twice more likely to experience the disorder than girls. Our results underpin that priority should be given to preventing, early identifying, and treating ADHD in children and adolescents.","container-title":"Journal of Affective Disorders","language":"en","source":"Zotero","title":"The global prevalence of attention deficit hyperactivity disorder in children and adolescents: An umbrella review of meta-analyses","author":[{"family":"Ayano","given":"Getinet"}],"issued":{"date-parts":[["2023"]]}}}],"schema":"https://github.com/citation-style-language/schema/raw/master/csl-citation.json"} </w:instrText>
       </w:r>
       <w:r>
         <w:rPr>
@@ -908,7 +895,7 @@
           <w:color w:val="000000"/>
           <w:szCs w:val="22"/>
         </w:rPr>
-        <w:instrText xml:space="preserve"> ADDIN ZOTERO_ITEM CSL_CITATION {"citationID":"zISg4mIQ","properties":{"unsorted":false,"formattedCitation":"[2]","plainCitation":"[2]","noteIndex":0},"citationItems":[{"id":27,"uris":["http://zotero.org/users/local/axS3HTYd/items/RALXAIUF"],"itemData":{"id":27,"type":"chapter","container-title":"A.D/H.D.: qué es, qué hacer : recomendaciones para padres y docentes","language":"es","page":"267-267","source":"pesquisa.bvsalud.org","title":"A.D/H.D.: qué es, qué hacer : recomendaciones para padres y docentes","title-short":"A.D/H.D.","URL":"https://pesquisa.bvsalud.org/portal/resource/pt/biblio-1201519","author":[{"family":"Joselevich","given":"Estrella"},{"family":"Bernaldo de Quirós","given":"Guillermo"},{"family":"Moyano","given":"María Beatriz"},{"family":"Scandar","given":"Rubén Osvaldo"},{"family":"Vainer","given":"Violeta"}],"accessed":{"date-parts":[["2026",5,1]]}}}],"schema":"https://github.com/citation-style-language/schema/raw/master/csl-citation.json"} </w:instrText>
+        <w:instrText xml:space="preserve"> ADDIN ZOTERO_ITEM CSL_CITATION {"citationID":"YpCVyq8T","properties":{"unsorted":false,"formattedCitation":"[2]","plainCitation":"[2]","noteIndex":0},"citationItems":[{"id":27,"uris":["http://zotero.org/users/local/axS3HTYd/items/RALXAIUF"],"itemData":{"id":27,"type":"chapter","container-title":"A.D/H.D.: qué es, qué hacer : recomendaciones para padres y docentes","language":"es","page":"267-267","source":"pesquisa.bvsalud.org","title":"A.D/H.D.: qué es, qué hacer : recomendaciones para padres y docentes","title-short":"A.D/H.D.","URL":"https://pesquisa.bvsalud.org/portal/resource/pt/biblio-1201519","author":[{"family":"Joselevich","given":"Estrella"},{"family":"Bernaldo de Quirós","given":"Guillermo"},{"family":"Moyano","given":"María Beatriz"},{"family":"Scandar","given":"Rubén Osvaldo"},{"family":"Vainer","given":"Violeta"}],"accessed":{"date-parts":[["2026",5,1]]}}}],"schema":"https://github.com/citation-style-language/schema/raw/master/csl-citation.json"} </w:instrText>
       </w:r>
       <w:r>
         <w:rPr>
@@ -956,7 +943,7 @@
           <w:color w:val="000000"/>
           <w:szCs w:val="22"/>
         </w:rPr>
-        <w:instrText xml:space="preserve"> ADDIN ZOTERO_ITEM CSL_CITATION {"citationID":"ERZVntGA","properties":{"unsorted":false,"formattedCitation":"[3], [4]","plainCitation":"[3], [4]","noteIndex":0},"citationItems":[{"id":31,"uris":["http://zotero.org/users/local/axS3HTYd/items/ELDCSQFL"],"itemData":{"id":31,"type":"article-journal","abstract":"Reports an error in \"Correspondence and disparity in the self- and other ratings of current and childhood ADHD symptoms and impairment in adults with ADHD\" by Russell A. Barkley, Laura E. Knouse and Kevin R. Murphy (Psychological Assessment, , , np). There was an omission in the author note. The author note should have included a disclosure as follows, “Russell A. Barkley receives royalties for books, videos, and rating scales from Guilford Publications, and is the author of Barkley Adult ADHD Rating Scale-IV (BAARS-IV), Barkley Deficits in Executive Functioning Scale (BDEFS), and Barkley Functional Impairment Scale (BFIS), all published by Guilford Press.” (The following abstract of the original article appeared in record 2011-04636-001.) Experts recommend that clinicians evaluating adults for attention-deficit/hyperactivity disorder (ADHD) obtain information from others who know the patient well. The authors examined correspondence between the self- and other-ratings of ADHD symptoms and impairment using 3 groups of adults recruited on the basis of their severity of ADHD: ADHD diagnosis (n = 146), clinical controls self-referring for ADHD but not diagnosed (n = 97), and community controls (n = 109). The influences of diagnostic group, informant relationship, sex of participant, IQ, and comorbid anxiety and depression on self-informant disparities were also examined. Results indicated moderate to high agreement (.59–.80) between self and others on current functioning and slightly lower levels (.53–.75) between self- and parent ratings of childhood functioning. Examination of difference scores between self- and other ratings revealed small mean disparities (−0.1 to +5.0 points) but substantial variation (SDs = –2.4 to 8.9 points) for both current and childhood ratings. Clinic referrals not diagnosed with ADHD, particularly women, had higher disparities than was evident in the ADHD and community groups. Age, IQ, and education were not associated with disparities in most ratings. Higher anxiety, in contrast, was associated with greater disparities on all current and childhood measures of both ADHD and impairment. (PsycInfo Database Record (c) 2025 APA, all rights reserved)","container-title":"Psychological Assessment","DOI":"10.1037/a0024001","ISSN":"1939-134X","issue":"2","page":"446-446","publisher":"American Psychological Association","publisher-place":"US","source":"APA PsycNet","title":"\"Correspondence and disparity in the self- and other ratings of current and childhood ADHD symptoms and impairment in adults with ADHD\": Correction to Barkley et al. (2011)","title-short":"Correspondence and disparity in the self- and other ratings of current and childhood ADHD symptoms and impairment in adults with ADHD","volume":"23","author":[{"family":"Barkley","given":"Russell A."},{"family":"Knouse","given":"Laura E."},{"family":"Murphy","given":"Kevin R."}],"issued":{"date-parts":[["2011"]]}}},{"id":30,"uris":["http://zotero.org/users/local/axS3HTYd/items/7RTPQ3IB"],"itemData":{"id":30,"type":"article-journal","abstract":"Actualmente, las Tecnologías de la Información y la Comunicación como herramientas educativas forman parte de las estrategias pedagógicas necesarias para facilitar el aprendizaje en niños con edad escolar. El objetivo de este trabajo es mostrar al lector cómo las herramientas tecnológicas, en particular los juegos serios, han demostrado ser eficientes para que los niños con Trastorno por Déficit de Atención e Hiperactividad (TDAH) logren un mejor aprendizaje para desarrollar su potencial académico. A través de las estrategias didácticas, los docentes deben facilitar la formación y el aprendizaje con el uso de la tecnología y los métodos didácticos que permitan construir el conocimiento de forma creativa y dinámica. La integración de la tecnología en el proceso de enseñanza-aprendizaje depende de la capacidad de los docentes para estructurar el ambiente con estrategias eficaces y, así, propiciar que el alumno organice y dirija sus propias actividades y procesos de estudio de manera creativa, efectiva y crítica.","container-title":"RD-ICUAP","DOI":"10.32399/icuap.rdic.2448-5829.2019.13.329","ISSN":"2448-5829","journalAbbreviation":"RDI","language":"es","source":"DOI.org (Crossref)","title":"Uso de juegos serios como herramienta educativa para la enseñanza a niños con TDAH","URL":"https://rdicuap.buap.mx/index.php/rdicuap/article/view/329","author":[{"family":"González Calleros","given":"Claudia B."},{"family":"Guerrero García","given":"Josefina"},{"family":"Navarro Rangel","given":"Yadira"}],"accessed":{"date-parts":[["2026",5,1]]},"issued":{"date-parts":[["2019",4,30]]}}}],"schema":"https://github.com/citation-style-language/schema/raw/master/csl-citation.json"} </w:instrText>
+        <w:instrText xml:space="preserve"> ADDIN ZOTERO_ITEM CSL_CITATION {"citationID":"3XJ9MKcL","properties":{"unsorted":false,"formattedCitation":"[3], [4]","plainCitation":"[3], [4]","noteIndex":0},"citationItems":[{"id":31,"uris":["http://zotero.org/users/local/axS3HTYd/items/ELDCSQFL"],"itemData":{"id":31,"type":"article-journal","abstract":"Reports an error in \"Correspondence and disparity in the self- and other ratings of current and childhood ADHD symptoms and impairment in adults with ADHD\" by Russell A. Barkley, Laura E. Knouse and Kevin R. Murphy (Psychological Assessment, , , np). There was an omission in the author note. The author note should have included a disclosure as follows, “Russell A. Barkley receives royalties for books, videos, and rating scales from Guilford Publications, and is the author of Barkley Adult ADHD Rating Scale-IV (BAARS-IV), Barkley Deficits in Executive Functioning Scale (BDEFS), and Barkley Functional Impairment Scale (BFIS), all published by Guilford Press.” (The following abstract of the original article appeared in record 2011-04636-001.) Experts recommend that clinicians evaluating adults for attention-deficit/hyperactivity disorder (ADHD) obtain information from others who know the patient well. The authors examined correspondence between the self- and other-ratings of ADHD symptoms and impairment using 3 groups of adults recruited on the basis of their severity of ADHD: ADHD diagnosis (n = 146), clinical controls self-referring for ADHD but not diagnosed (n = 97), and community controls (n = 109). The influences of diagnostic group, informant relationship, sex of participant, IQ, and comorbid anxiety and depression on self-informant disparities were also examined. Results indicated moderate to high agreement (.59–.80) between self and others on current functioning and slightly lower levels (.53–.75) between self- and parent ratings of childhood functioning. Examination of difference scores between self- and other ratings revealed small mean disparities (−0.1 to +5.0 points) but substantial variation (SDs = –2.4 to 8.9 points) for both current and childhood ratings. Clinic referrals not diagnosed with ADHD, particularly women, had higher disparities than was evident in the ADHD and community groups. Age, IQ, and education were not associated with disparities in most ratings. Higher anxiety, in contrast, was associated with greater disparities on all current and childhood measures of both ADHD and impairment. (PsycInfo Database Record (c) 2025 APA, all rights reserved)","container-title":"Psychological Assessment","DOI":"10.1037/a0024001","ISSN":"1939-134X","issue":"2","page":"446-446","publisher":"American Psychological Association","publisher-place":"US","source":"APA PsycNet","title":"\"Correspondence and disparity in the self- and other ratings of current and childhood ADHD symptoms and impairment in adults with ADHD\": Correction to Barkley et al. (2011)","title-short":"Correspondence and disparity in the self- and other ratings of current and childhood ADHD symptoms and impairment in adults with ADHD","volume":"23","author":[{"family":"Barkley","given":"Russell A."},{"family":"Knouse","given":"Laura E."},{"family":"Murphy","given":"Kevin R."}],"issued":{"date-parts":[["2011"]]}}},{"id":30,"uris":["http://zotero.org/users/local/axS3HTYd/items/7RTPQ3IB"],"itemData":{"id":30,"type":"article-journal","abstract":"Actualmente, las Tecnologías de la Información y la Comunicación como herramientas educativas forman parte de las estrategias pedagógicas necesarias para facilitar el aprendizaje en niños con edad escolar. El objetivo de este trabajo es mostrar al lector cómo las herramientas tecnológicas, en particular los juegos serios, han demostrado ser eficientes para que los niños con Trastorno por Déficit de Atención e Hiperactividad (TDAH) logren un mejor aprendizaje para desarrollar su potencial académico. A través de las estrategias didácticas, los docentes deben facilitar la formación y el aprendizaje con el uso de la tecnología y los métodos didácticos que permitan construir el conocimiento de forma creativa y dinámica. La integración de la tecnología en el proceso de enseñanza-aprendizaje depende de la capacidad de los docentes para estructurar el ambiente con estrategias eficaces y, así, propiciar que el alumno organice y dirija sus propias actividades y procesos de estudio de manera creativa, efectiva y crítica.","container-title":"RD-ICUAP","DOI":"10.32399/icuap.rdic.2448-5829.2019.13.329","ISSN":"2448-5829","journalAbbreviation":"RDI","language":"es","source":"DOI.org (Crossref)","title":"Uso de juegos serios como herramienta educativa para la enseñanza a niños con TDAH","URL":"https://rdicuap.buap.mx/index.php/rdicuap/article/view/329","author":[{"family":"González Calleros","given":"Claudia B."},{"family":"Guerrero García","given":"Josefina"},{"family":"Navarro Rangel","given":"Yadira"}],"accessed":{"date-parts":[["2026",5,1]]},"issued":{"date-parts":[["2019",4,30]]}}}],"schema":"https://github.com/citation-style-language/schema/raw/master/csl-citation.json"} </w:instrText>
       </w:r>
       <w:r>
         <w:rPr>
@@ -1235,49 +1222,7 @@
         <w:rPr>
           <w:lang w:val="en-US" w:eastAsia="es-ES"/>
         </w:rPr>
-        <w:t xml:space="preserve">ADHD (Attention-Deficit/Hyperactivity Disorder) is one of the most common childhood </w:t>
-      </w:r>
-      <w:proofErr w:type="gramStart"/>
-      <w:r>
-        <w:rPr>
-          <w:lang w:val="en-US" w:eastAsia="es-ES"/>
-        </w:rPr>
-        <w:t>disorders[</w:t>
-      </w:r>
-      <w:proofErr w:type="gramEnd"/>
-      <w:r>
-        <w:rPr>
-          <w:lang w:val="en-US" w:eastAsia="es-ES"/>
-        </w:rPr>
-        <w:t xml:space="preserve">1]. Its main symptoms are patterns of inattention, hyperactivity, and impulsivity that persist in the individual and affect executive functioning, in addition to the impact they have on various aspects of daily </w:t>
-      </w:r>
-      <w:proofErr w:type="gramStart"/>
-      <w:r>
-        <w:rPr>
-          <w:lang w:val="en-US" w:eastAsia="es-ES"/>
-        </w:rPr>
-        <w:t>life[</w:t>
-      </w:r>
-      <w:proofErr w:type="gramEnd"/>
-      <w:r>
-        <w:rPr>
-          <w:lang w:val="en-US" w:eastAsia="es-ES"/>
-        </w:rPr>
-        <w:t xml:space="preserve">2]. Planning ability is an important part of executive functioning that is affected by this </w:t>
-      </w:r>
-      <w:proofErr w:type="gramStart"/>
-      <w:r>
-        <w:rPr>
-          <w:lang w:val="en-US" w:eastAsia="es-ES"/>
-        </w:rPr>
-        <w:t>disorder[</w:t>
-      </w:r>
-      <w:proofErr w:type="gramEnd"/>
-      <w:r>
-        <w:rPr>
-          <w:lang w:val="en-US" w:eastAsia="es-ES"/>
-        </w:rPr>
-        <w:t>3], [4].</w:t>
+        <w:t>ADHD (Attention-Deficit/Hyperactivity Disorder) is one of the most common childhood disorders[1]. Its main symptoms are patterns of inattention, hyperactivity, and impulsivity that persist in the individual and affect executive functioning, in addition to the impact they have on various aspects of daily life[2]. Planning ability is an important part of executive functioning that is affected by this disorder[3], [4].</w:t>
       </w:r>
     </w:p>
     <w:p>
@@ -1490,21 +1435,14 @@
         <w:pStyle w:val="PageHeading"/>
       </w:pPr>
       <w:bookmarkStart w:id="1" w:name="Indice"/>
-      <w:proofErr w:type="spellStart"/>
       <w:r>
         <w:lastRenderedPageBreak/>
         <w:t>Índice</w:t>
       </w:r>
-      <w:proofErr w:type="spellEnd"/>
-      <w:r>
-        <w:t xml:space="preserve"> de </w:t>
-      </w:r>
-      <w:proofErr w:type="spellStart"/>
-      <w:r>
-        <w:t>contenidos</w:t>
+      <w:r>
+        <w:t xml:space="preserve"> de contenidos</w:t>
       </w:r>
       <w:bookmarkEnd w:id="1"/>
-      <w:proofErr w:type="spellEnd"/>
     </w:p>
     <w:sdt>
       <w:sdtPr>
@@ -1772,7 +1710,21 @@
                 <w:rStyle w:val="Hipervnculo"/>
                 <w:noProof/>
               </w:rPr>
-              <w:t>1.3 Plan de trabajo</w:t>
+              <w:t>1.3 Plan de</w:t>
+            </w:r>
+            <w:r>
+              <w:rPr>
+                <w:rStyle w:val="Hipervnculo"/>
+                <w:noProof/>
+              </w:rPr>
+              <w:t xml:space="preserve"> </w:t>
+            </w:r>
+            <w:r>
+              <w:rPr>
+                <w:rStyle w:val="Hipervnculo"/>
+                <w:noProof/>
+              </w:rPr>
+              <w:t>trabajo</w:t>
             </w:r>
             <w:r>
               <w:rPr>
@@ -1989,7 +1941,23 @@
                 <w:noProof/>
                 <w:lang w:val="es-ES"/>
               </w:rPr>
-              <w:t>Capítulo 2 - Estado de la cuestión</w:t>
+              <w:t>Capítulo 2 - Estado d</w:t>
+            </w:r>
+            <w:r>
+              <w:rPr>
+                <w:rStyle w:val="Hipervnculo"/>
+                <w:noProof/>
+                <w:lang w:val="es-ES"/>
+              </w:rPr>
+              <w:t>e</w:t>
+            </w:r>
+            <w:r>
+              <w:rPr>
+                <w:rStyle w:val="Hipervnculo"/>
+                <w:noProof/>
+                <w:lang w:val="es-ES"/>
+              </w:rPr>
+              <w:t xml:space="preserve"> la cuestión</w:t>
             </w:r>
             <w:r>
               <w:rPr>
@@ -2063,7 +2031,23 @@
                 <w:noProof/>
                 <w:lang w:val="es-ES"/>
               </w:rPr>
-              <w:t>2.1 TDAH</w:t>
+              <w:t>2.1 T</w:t>
+            </w:r>
+            <w:r>
+              <w:rPr>
+                <w:rStyle w:val="Hipervnculo"/>
+                <w:noProof/>
+                <w:lang w:val="es-ES"/>
+              </w:rPr>
+              <w:t>D</w:t>
+            </w:r>
+            <w:r>
+              <w:rPr>
+                <w:rStyle w:val="Hipervnculo"/>
+                <w:noProof/>
+                <w:lang w:val="es-ES"/>
+              </w:rPr>
+              <w:t>AH</w:t>
             </w:r>
             <w:r>
               <w:rPr>
@@ -5139,19 +5123,11 @@
       <w:bookmarkEnd w:id="7"/>
     </w:p>
     <w:p>
-      <w:proofErr w:type="spellStart"/>
       <w:r>
         <w:rPr>
           <w:shd w:val="clear" w:color="auto" w:fill="FFFFFF"/>
         </w:rPr>
-        <w:t>Hbalar</w:t>
-      </w:r>
-      <w:proofErr w:type="spellEnd"/>
-      <w:r>
-        <w:rPr>
-          <w:shd w:val="clear" w:color="auto" w:fill="FFFFFF"/>
-        </w:rPr>
-        <w:t xml:space="preserve"> un poco del TDAH y los juegos serios</w:t>
+        <w:t>Hbalar un poco del TDAH y los juegos serios</w:t>
       </w:r>
     </w:p>
     <w:p>
@@ -5291,15 +5267,7 @@
       </w:pPr>
       <w:r>
         <w:lastRenderedPageBreak/>
-        <w:t xml:space="preserve">(Como una </w:t>
-      </w:r>
-      <w:proofErr w:type="spellStart"/>
-      <w:r>
-        <w:t>checklist</w:t>
-      </w:r>
-      <w:proofErr w:type="spellEnd"/>
-      <w:r>
-        <w:t>)</w:t>
+        <w:t>(Como una checklist)</w:t>
       </w:r>
     </w:p>
     <w:p>
@@ -5343,74 +5311,10 @@
         <w:t xml:space="preserve"> </w:t>
       </w:r>
       <w:r>
-        <w:t xml:space="preserve">(creo, </w:t>
-      </w:r>
-      <w:proofErr w:type="spellStart"/>
-      <w:r>
-        <w:t>c#</w:t>
-      </w:r>
-      <w:proofErr w:type="spellEnd"/>
-      <w:r>
-        <w:t xml:space="preserve">), Visual </w:t>
-      </w:r>
-      <w:proofErr w:type="spellStart"/>
-      <w:r>
-        <w:t>studio</w:t>
-      </w:r>
-      <w:proofErr w:type="spellEnd"/>
-      <w:r>
-        <w:t xml:space="preserve"> </w:t>
-      </w:r>
-      <w:proofErr w:type="spellStart"/>
-      <w:r>
-        <w:t>core</w:t>
-      </w:r>
-      <w:proofErr w:type="spellEnd"/>
-      <w:r>
-        <w:t xml:space="preserve"> (</w:t>
-      </w:r>
-      <w:proofErr w:type="spellStart"/>
-      <w:r>
-        <w:t>python</w:t>
-      </w:r>
-      <w:proofErr w:type="spellEnd"/>
-      <w:r>
-        <w:t xml:space="preserve">), Photoshop, Blender, Scrum, </w:t>
-      </w:r>
-      <w:proofErr w:type="spellStart"/>
-      <w:r>
-        <w:t>Github</w:t>
-      </w:r>
-      <w:proofErr w:type="spellEnd"/>
-      <w:r>
-        <w:t>, Drive (documentos compartidos y datos de pruebas)</w:t>
-      </w:r>
-      <w:r>
-        <w:t xml:space="preserve">, </w:t>
-      </w:r>
-      <w:proofErr w:type="spellStart"/>
-      <w:r>
-        <w:t>Itchio</w:t>
-      </w:r>
-      <w:proofErr w:type="spellEnd"/>
-      <w:r>
-        <w:t xml:space="preserve">, </w:t>
-      </w:r>
-      <w:proofErr w:type="spellStart"/>
-      <w:r>
-        <w:t>Polypizza</w:t>
-      </w:r>
-      <w:proofErr w:type="spellEnd"/>
-      <w:r>
-        <w:t xml:space="preserve">, </w:t>
-      </w:r>
-      <w:proofErr w:type="spellStart"/>
-      <w:r>
-        <w:t>Freepik</w:t>
-      </w:r>
-      <w:proofErr w:type="spellEnd"/>
-      <w:r>
-        <w:t>, free3D, Davinci Resolve</w:t>
+        <w:t>(creo, c#), Visual studio core (python), Photoshop, Blender, Scrum, Github, Drive (documentos compartidos y datos de pruebas)</w:t>
+      </w:r>
+      <w:r>
+        <w:t>, Itchio, Polypizza, Freepik, free3D, Davinci Resolve</w:t>
       </w:r>
     </w:p>
     <w:p>
@@ -5442,28 +5346,20 @@
         <w:pStyle w:val="Textoindependiente"/>
       </w:pPr>
       <w:r>
-        <w:t xml:space="preserve">Planificar en tiempo lo que hice: </w:t>
-      </w:r>
-      <w:proofErr w:type="spellStart"/>
-      <w:r>
-        <w:t>Ej</w:t>
-      </w:r>
-      <w:proofErr w:type="spellEnd"/>
-      <w:r>
-        <w:t xml:space="preserve"> </w:t>
-      </w:r>
-      <w:proofErr w:type="gramStart"/>
-      <w:r>
-        <w:t>septiembre  hice</w:t>
-      </w:r>
-      <w:proofErr w:type="gramEnd"/>
-      <w:r>
-        <w:t xml:space="preserve"> tal, en octubre tal cual…</w:t>
+        <w:t>Planificar en tiempo lo que hice: Ej septiembre  hice tal, en octubre tal cual…</w:t>
       </w:r>
     </w:p>
     <w:p>
       <w:pPr>
         <w:pStyle w:val="Textoindependiente"/>
+      </w:pPr>
+      <w:r>
+        <w:t>Con una tabla que indique los tiempos.</w:t>
+      </w:r>
+    </w:p>
+    <w:p>
+      <w:pPr>
+        <w:pStyle w:val="Ttulo2"/>
         <w:sectPr>
           <w:footerReference w:type="default" r:id="rId12"/>
           <w:type w:val="oddPage"/>
@@ -5475,7 +5371,7 @@
         </w:sectPr>
       </w:pPr>
       <w:r>
-        <w:t>Con una tabla que indique los tiempos.</w:t>
+        <w:t>Estructura de la memoria</w:t>
       </w:r>
     </w:p>
     <w:p>
@@ -5499,6 +5395,32 @@
     </w:p>
     <w:p>
       <w:pPr>
+        <w:pStyle w:val="Textoindependiente"/>
+        <w:rPr>
+          <w:lang w:val="es-ES"/>
+        </w:rPr>
+      </w:pPr>
+      <w:r>
+        <w:rPr>
+          <w:lang w:val="es-ES"/>
+        </w:rPr>
+        <w:t>En este primer capítulo se habla</w:t>
+      </w:r>
+      <w:r>
+        <w:rPr>
+          <w:lang w:val="es-ES"/>
+        </w:rPr>
+        <w:t xml:space="preserve"> </w:t>
+      </w:r>
+      <w:r>
+        <w:rPr>
+          <w:lang w:val="es-ES"/>
+        </w:rPr>
+        <w:t>de qué es el Trastorno por déficit de atención e hiperactividad que es un juego serio, y de otras herramientas existentes que sean juegos para TDAH.</w:t>
+      </w:r>
+    </w:p>
+    <w:p>
+      <w:pPr>
         <w:pStyle w:val="Ttulo2"/>
         <w:rPr>
           <w:lang w:val="es-ES"/>
@@ -5531,6 +5453,123 @@
     </w:p>
     <w:p>
       <w:pPr>
+        <w:pStyle w:val="Textoindependiente"/>
+        <w:rPr>
+          <w:lang w:val="es-ES"/>
+        </w:rPr>
+      </w:pPr>
+      <w:r>
+        <w:rPr>
+          <w:lang w:val="es-ES"/>
+        </w:rPr>
+        <w:t xml:space="preserve">Las siglas de TDAH vienen del Trastorno por déficit de atención e hiperactividad y </w:t>
+      </w:r>
+      <w:r>
+        <w:rPr>
+          <w:color w:val="000000"/>
+          <w:szCs w:val="22"/>
+        </w:rPr>
+        <w:t>es uno de los trastornos más comunes de la infancia</w:t>
+      </w:r>
+      <w:r>
+        <w:rPr>
+          <w:color w:val="000000"/>
+          <w:szCs w:val="22"/>
+        </w:rPr>
+        <w:fldChar w:fldCharType="begin"/>
+      </w:r>
+      <w:r>
+        <w:rPr>
+          <w:color w:val="000000"/>
+          <w:szCs w:val="22"/>
+        </w:rPr>
+        <w:instrText xml:space="preserve"> ADDIN ZOTERO_ITEM CSL_CITATION {"citationID":"jGBxxx4L","properties":{"unsorted":false,"formattedCitation":"[1]","plainCitation":"[1]","noteIndex":0},"citationItems":[{"id":22,"uris":["http://zotero.org/users/local/axS3HTYd/items/QZNGZM7F"],"itemData":{"id":22,"type":"article-journal","abstract":"Background: Emerging epidemiological data suggest that hundreds of primary studies have examined the prevalence of ADHD in children and adolescents and dozens of systematic view and meta-analyses studies have been conducted on the subject. The purpose of this umbrella review is to provide a robust synthesis of evidence from these systematic reviews and meta-analyses.\nMethods: We systematically searched PubMed, Web of Science, PsychINFO, and Scopus to find pertinent studies. The study was preregistered with PROSPERO (CRD42023389704). The quality of the studies was assessed using a Measurement Tool to Assess Systematic Reviews (AMSTAR). Prevalence estimates from the included studies were pooled using invariance variance weighted random-effect meta-analysis.\nResults: Thirteen meta-analytic systematic reviews (588 primary studies) with 3,277,590 participants were included in the final analysis. A random effect meta-analysis of these studies showed that the global prevalence of ADHD in children and adolescents was 8.0 % (95%CI 6.0–10 %). The prevalence estimate was twice higher in boys (10 %) compared to girls (5 %). Of the three subtypes of ADHD, the inattentive type of ADHD (ADHD-I) was found to be the most common type of ADHD followed by the hyperactive (ADHD-HI) and the combined types (ADHD-C).\nConclusion: Findings from our compressive umbrella review suggest that ADHD is highly prevalent in children and adolescents with boys twice more likely to experience the disorder than girls. Our results underpin that priority should be given to preventing, early identifying, and treating ADHD in children and adolescents.","container-title":"Journal of Affective Disorders","language":"en","source":"Zotero","title":"The global prevalence of attention deficit hyperactivity disorder in children and adolescents: An umbrella review of meta-analyses","author":[{"family":"Ayano","given":"Getinet"}],"issued":{"date-parts":[["2023"]]}}}],"schema":"https://github.com/citation-style-language/schema/raw/master/csl-citation.json"} </w:instrText>
+      </w:r>
+      <w:r>
+        <w:rPr>
+          <w:color w:val="000000"/>
+          <w:szCs w:val="22"/>
+        </w:rPr>
+        <w:fldChar w:fldCharType="separate"/>
+      </w:r>
+      <w:r>
+        <w:t>[1]</w:t>
+      </w:r>
+      <w:r>
+        <w:rPr>
+          <w:color w:val="000000"/>
+          <w:szCs w:val="22"/>
+        </w:rPr>
+        <w:fldChar w:fldCharType="end"/>
+      </w:r>
+      <w:r>
+        <w:rPr>
+          <w:color w:val="000000"/>
+          <w:szCs w:val="22"/>
+        </w:rPr>
+        <w:t>. Sus síntomas principales son patrones de falta de atención, hiperactividad e impulsividad que persisten en el individuo (referencia 2 creo).</w:t>
+      </w:r>
+    </w:p>
+    <w:p>
+      <w:pPr>
+        <w:pStyle w:val="Textoindependiente"/>
+      </w:pPr>
+      <w:r>
+        <w:t>Existe una importante influencia genética, aunque no depende de un único gen sino de numerosos genes que aportan pequeños efectos individuales</w:t>
+      </w:r>
+      <w:r>
+        <w:fldChar w:fldCharType="begin"/>
+      </w:r>
+      <w:r>
+        <w:instrText xml:space="preserve"> ADDIN ZOTERO_ITEM CSL_CITATION {"citationID":"6p1TVb1u","properties":{"unsorted":false,"formattedCitation":"[5]","plainCitation":"[5]","noteIndex":0},"citationItems":[{"id":40,"uris":["http://zotero.org/users/local/axS3HTYd/items/N85Z8S6K"],"itemData":{"id":40,"type":"article-journal","abstract":"Attention-deﬁcit hyperactivity disorder (ADHD) is a prevalent and debilitating disorder diagnosed on the basis of persistent and developmentally-inappropriate levels of overactivity, inattention and impulsivity. The etiology and pathophysiology of ADHD is incompletely understood. There is evidence of a genetic basis for ADHD but it is likely to involve many genes of small individual effect. Differences in the dimensions of the frontal lobes, caudate nucleus, and cerebellar vermis have been demonstrated. Neuropsychological testing has revealed a number of well documented differences between children with and without ADHD. These occur in two main domains: executive function and motivation although neither of these is speciﬁc to ADHD. In view of the recent advances in the neurobiology of reinforcement, we concentrate in this review on altered reinforcement mechanisms. Among the motivational differences, many pieces of evidence indicate that an altered response to reinforcement may play a central role in the symptoms of ADHD. In particular, sensitivity to delay of reinforcement appears to be a reliable ﬁnding. We review neurobiological mechanisms of reinforcement and discuss how these may be altered in ADHD, with particular focus on the neurotransmitter dopamine and its actions at the cellular and systems level. We describe how dopamine cell ﬁring activity is normally associated with reinforcing events, and transfers to earlier time-points in the behavioural sequence as reinforcement becomes more predictable. We discuss how a failure of this transfer may give rise to many symptoms of ADHD, and propose that methylphenidate might act to compensate for the proposed dopamine transfer deﬁcit.","container-title":"Neuropharmacology","DOI":"10.1016/j.neuropharm.2009.07.026","ISSN":"00283908","issue":"7-8","journalAbbreviation":"Neuropharmacology","language":"en","license":"https://www.elsevier.com/tdm/userlicense/1.0/","page":"579-589","source":"DOI.org (Crossref)","title":"Neurobiology of ADHD","volume":"57","author":[{"family":"Tripp","given":"Gail"},{"family":"Wickens","given":"Jeffery R."}],"issued":{"date-parts":[["2009",12]]}}}],"schema":"https://github.com/citation-style-language/schema/raw/master/csl-citation.json"} </w:instrText>
+      </w:r>
+      <w:r>
+        <w:fldChar w:fldCharType="separate"/>
+      </w:r>
+      <w:r>
+        <w:t>[5]</w:t>
+      </w:r>
+      <w:r>
+        <w:fldChar w:fldCharType="end"/>
+      </w:r>
+      <w:r>
+        <w:t>. Es un trastorno muy heterogéneo</w:t>
+      </w:r>
+      <w:r>
+        <w:t>.</w:t>
+      </w:r>
+    </w:p>
+    <w:p>
+      <w:pPr>
+        <w:pStyle w:val="Textoindependiente"/>
+        <w:rPr>
+          <w:lang w:val="es-ES"/>
+        </w:rPr>
+      </w:pPr>
+      <w:r>
+        <w:t>Ayuda darles recompensa cuando hagan algo bien</w:t>
+      </w:r>
+      <w:r>
+        <w:fldChar w:fldCharType="begin"/>
+      </w:r>
+      <w:r>
+        <w:instrText xml:space="preserve"> ADDIN ZOTERO_ITEM CSL_CITATION {"citationID":"arLFNZ70","properties":{"unsorted":false,"formattedCitation":"[6]","plainCitation":"[6]","noteIndex":0},"citationItems":[{"id":41,"uris":["http://zotero.org/users/local/axS3HTYd/items/ZIV2JXVY"],"itemData":{"id":41,"type":"book","abstract":"La utilización de una clasificación diagnóstica, ampliamente aceptada, es vital para el tratamiento afectivo de los pacientes psiquiátricos y esencial para la investigación. Esta versión del capítulo 5 de la décima revisión de la Clasificación Internacional de las Enfermedades y Problemas Relacionados con la Salud (CIE- 10), facilitará tanto la práctica como la investigación. Constituye una fuente de información, sobre la nueva clasificación, fácil de usar y a la que se puede acceder con rapidez. El libro ha sido diseñado pensando en una amplia variedad de lectores entre los que se incluyen psiquiatras con diversos grados de formación y experiencia, investigadores y analistas de datos. Los gerentes y otros profesionales de salud mental no médicos también lo encontrarán útil. Esta obra ha sido revisada por un psiquiatra, es práctica y tiene un enfoque clínico. Reúne en un solo volumen todos los aspectos principales relacionados con la descripción y el diagnóstico de los trastornos mentales. INDICE - Listado de categorías - Notas para los usuarios de la CDI-10 - Caplo V. Trastornos mentales y del comportamiento, con glosario de definiciones, CDI-10 y notas diagnósticas F00-F09 Trastornos mentales orgánicos, incluidos los sintomáticos F10-F19 Trastornos mentales y del comportamiento debidos al consumo de sustancias psicoactivas F20-F29 Esquizofrenia, trastorno esquizotípico y trastornos de ideas delirantes F30-F39 Trastornos del humor (afectivos) F40-F48 Trastornos neuróticos, secundarios a situaciones estresantes y somatomorfos F50-F59 Trastornos del comportamiento asociados a disfunciones fisiológicas y a factores somáticos F60-F69 Trastornos de la personalidad y del comportamiento del adulto F70-F79 Retraso mental F80-F89 Trastorno del desarrollo psicológico F90-F98 Trastornos del comportamiento y de las emociones de comienzo habitual en la infancia y adolescencia - Apéndice 1 de los CDI-10: Criterios provisionales para trastornos determinados - Apéndice 2 de los CDI-10: Trastornos específicos de determinadas culturas - Notas sobre problemas no resueltos - Otros procesos de la CIE-10 frecuentemente asociados con trastornos mentales y del comportamiento - Tabla de equivalencias entre el Capítulo V de la CIE-9 y el Capítulo V de la CIE-10 - Instrumentos diagnósticos y publicaciones asociadas al Capítulo V de la CIE-10.","ISBN":"978-84-7903-492-4","language":"es","note":"Google-Books-ID: Y_oACCnRG34C","number-of-pages":"336","publisher":"Ed. Médica Panamericana","source":"Google Books","title":"Guía de Bolsillo de la Clasificación CIE-10: Clasificación de los Trastornos Mentales y del Comportamiento","title-short":"Guía de Bolsillo de la Clasificación CIE-10","issued":{"date-parts":[["2000"]]}}}],"schema":"https://github.com/citation-style-language/schema/raw/master/csl-citation.json"} </w:instrText>
+      </w:r>
+      <w:r>
+        <w:fldChar w:fldCharType="separate"/>
+      </w:r>
+      <w:r>
+        <w:t>[6]</w:t>
+      </w:r>
+      <w:r>
+        <w:fldChar w:fldCharType="end"/>
+      </w:r>
+      <w:r>
+        <w:t xml:space="preserve"> (Esta es la guía para diagnostico de trastornos mentales).</w:t>
+      </w:r>
+    </w:p>
+    <w:p>
+      <w:pPr>
         <w:pStyle w:val="Ttulo3"/>
         <w:rPr>
           <w:lang w:val="es-ES"/>
@@ -5594,7 +5633,6 @@
           <w:lang w:val="es-ES"/>
         </w:rPr>
       </w:pPr>
-      <w:proofErr w:type="spellStart"/>
       <w:r>
         <w:rPr>
           <w:lang w:val="es-ES"/>
@@ -5613,7 +5651,6 @@
         </w:rPr>
         <w:t>anificacion</w:t>
       </w:r>
-      <w:proofErr w:type="spellEnd"/>
     </w:p>
     <w:p>
       <w:pPr>
@@ -5641,6 +5678,7 @@
         <w:rPr>
           <w:lang w:val="es-ES"/>
         </w:rPr>
+        <w:lastRenderedPageBreak/>
         <w:t>Problemas del TDAH</w:t>
       </w:r>
       <w:bookmarkEnd w:id="22"/>
@@ -5761,144 +5799,130 @@
         <w:rPr>
           <w:lang w:val="es-ES"/>
         </w:rPr>
+        <w:t>Videojuegos y juegos serios</w:t>
+      </w:r>
+      <w:bookmarkEnd w:id="26"/>
+    </w:p>
+    <w:p>
+      <w:pPr>
+        <w:pStyle w:val="Ttulo3"/>
+        <w:rPr>
+          <w:lang w:val="es-ES"/>
+        </w:rPr>
+      </w:pPr>
+      <w:bookmarkStart w:id="27" w:name="_Toc236766580"/>
+      <w:r>
+        <w:rPr>
+          <w:lang w:val="es-ES"/>
+        </w:rPr>
+        <w:t>Que es un videojuego</w:t>
+      </w:r>
+      <w:bookmarkEnd w:id="27"/>
+    </w:p>
+    <w:p>
+      <w:pPr>
+        <w:pStyle w:val="Ttulo3"/>
+        <w:rPr>
+          <w:lang w:val="es-ES"/>
+        </w:rPr>
+      </w:pPr>
+      <w:bookmarkStart w:id="28" w:name="_Toc236766581"/>
+      <w:r>
+        <w:rPr>
+          <w:lang w:val="es-ES"/>
+        </w:rPr>
+        <w:t>Que es un juego serio</w:t>
+      </w:r>
+      <w:bookmarkEnd w:id="28"/>
+    </w:p>
+    <w:p>
+      <w:pPr>
+        <w:pStyle w:val="Ttulo3"/>
+        <w:rPr>
+          <w:lang w:val="es-ES"/>
+        </w:rPr>
+      </w:pPr>
+      <w:bookmarkStart w:id="29" w:name="_Toc236766582"/>
+      <w:r>
+        <w:rPr>
+          <w:lang w:val="es-ES"/>
+        </w:rPr>
+        <w:t>Tipos de juegos serios</w:t>
+      </w:r>
+      <w:bookmarkEnd w:id="29"/>
+    </w:p>
+    <w:p>
+      <w:pPr>
+        <w:pStyle w:val="Ttulo3"/>
+        <w:rPr>
+          <w:lang w:val="es-ES"/>
+        </w:rPr>
+      </w:pPr>
+      <w:bookmarkStart w:id="30" w:name="_Toc236766583"/>
+      <w:r>
+        <w:rPr>
+          <w:lang w:val="es-ES"/>
+        </w:rPr>
+        <w:t>Puntos necesarios para juego para TDAH</w:t>
+      </w:r>
+      <w:bookmarkEnd w:id="30"/>
+    </w:p>
+    <w:p>
+      <w:pPr>
+        <w:pStyle w:val="Ttulo4"/>
+        <w:rPr>
+          <w:lang w:val="es-ES"/>
+        </w:rPr>
+      </w:pPr>
+      <w:r>
+        <w:rPr>
+          <w:lang w:val="es-ES"/>
+        </w:rPr>
+        <w:t>Dificultad</w:t>
+      </w:r>
+    </w:p>
+    <w:p>
+      <w:pPr>
+        <w:pStyle w:val="Ttulo4"/>
+        <w:rPr>
+          <w:lang w:val="es-ES"/>
+        </w:rPr>
+      </w:pPr>
+      <w:r>
+        <w:rPr>
+          <w:lang w:val="es-ES"/>
+        </w:rPr>
+        <w:t>Arte</w:t>
+      </w:r>
+    </w:p>
+    <w:p>
+      <w:pPr>
+        <w:pStyle w:val="Ttulo4"/>
+        <w:rPr>
+          <w:lang w:val="es-ES"/>
+        </w:rPr>
+      </w:pPr>
+      <w:r>
+        <w:rPr>
+          <w:lang w:val="es-ES"/>
+        </w:rPr>
+        <w:t>….</w:t>
+      </w:r>
+    </w:p>
+    <w:p>
+      <w:pPr>
+        <w:pStyle w:val="Ttulo3"/>
+        <w:rPr>
+          <w:lang w:val="es-ES"/>
+        </w:rPr>
+      </w:pPr>
+      <w:bookmarkStart w:id="31" w:name="_Toc236766584"/>
+      <w:r>
+        <w:rPr>
+          <w:lang w:val="es-ES"/>
+        </w:rPr>
         <w:lastRenderedPageBreak/>
-        <w:t>Videojuegos y juegos serios</w:t>
-      </w:r>
-      <w:bookmarkEnd w:id="26"/>
-    </w:p>
-    <w:p>
-      <w:pPr>
-        <w:pStyle w:val="Ttulo3"/>
-        <w:rPr>
-          <w:lang w:val="es-ES"/>
-        </w:rPr>
-      </w:pPr>
-      <w:bookmarkStart w:id="27" w:name="_Toc236766580"/>
-      <w:r>
-        <w:rPr>
-          <w:lang w:val="es-ES"/>
-        </w:rPr>
-        <w:t>Que es un videojuego</w:t>
-      </w:r>
-      <w:bookmarkEnd w:id="27"/>
-    </w:p>
-    <w:p>
-      <w:pPr>
-        <w:pStyle w:val="Ttulo3"/>
-        <w:rPr>
-          <w:lang w:val="es-ES"/>
-        </w:rPr>
-      </w:pPr>
-      <w:bookmarkStart w:id="28" w:name="_Toc236766581"/>
-      <w:r>
-        <w:rPr>
-          <w:lang w:val="es-ES"/>
-        </w:rPr>
-        <w:t>Que es un juego serio</w:t>
-      </w:r>
-      <w:bookmarkEnd w:id="28"/>
-    </w:p>
-    <w:p>
-      <w:pPr>
-        <w:pStyle w:val="Ttulo3"/>
-        <w:rPr>
-          <w:lang w:val="es-ES"/>
-        </w:rPr>
-      </w:pPr>
-      <w:bookmarkStart w:id="29" w:name="_Toc236766582"/>
-      <w:r>
-        <w:rPr>
-          <w:lang w:val="es-ES"/>
-        </w:rPr>
-        <w:t>Tipos de juegos serios</w:t>
-      </w:r>
-      <w:bookmarkEnd w:id="29"/>
-    </w:p>
-    <w:p>
-      <w:pPr>
-        <w:pStyle w:val="Ttulo3"/>
-        <w:rPr>
-          <w:lang w:val="es-ES"/>
-        </w:rPr>
-      </w:pPr>
-      <w:bookmarkStart w:id="30" w:name="_Toc236766583"/>
-      <w:r>
-        <w:rPr>
-          <w:lang w:val="es-ES"/>
-        </w:rPr>
-        <w:t>Puntos necesarios para juego para TDAH</w:t>
-      </w:r>
-      <w:bookmarkEnd w:id="30"/>
-    </w:p>
-    <w:p>
-      <w:pPr>
-        <w:pStyle w:val="Ttulo4"/>
-        <w:rPr>
-          <w:lang w:val="es-ES"/>
-        </w:rPr>
-      </w:pPr>
-      <w:r>
-        <w:rPr>
-          <w:lang w:val="es-ES"/>
-        </w:rPr>
-        <w:t>Dificultad</w:t>
-      </w:r>
-    </w:p>
-    <w:p>
-      <w:pPr>
-        <w:pStyle w:val="Ttulo4"/>
-        <w:rPr>
-          <w:lang w:val="es-ES"/>
-        </w:rPr>
-      </w:pPr>
-      <w:r>
-        <w:rPr>
-          <w:lang w:val="es-ES"/>
-        </w:rPr>
-        <w:t>Arte</w:t>
-      </w:r>
-    </w:p>
-    <w:p>
-      <w:pPr>
-        <w:pStyle w:val="Ttulo4"/>
-        <w:rPr>
-          <w:lang w:val="es-ES"/>
-        </w:rPr>
-      </w:pPr>
-      <w:r>
-        <w:rPr>
-          <w:lang w:val="es-ES"/>
-        </w:rPr>
-        <w:t>….</w:t>
-      </w:r>
-    </w:p>
-    <w:p>
-      <w:pPr>
-        <w:pStyle w:val="Ttulo3"/>
-        <w:rPr>
-          <w:lang w:val="es-ES"/>
-        </w:rPr>
-      </w:pPr>
-      <w:bookmarkStart w:id="31" w:name="_Toc236766584"/>
-      <w:r>
-        <w:rPr>
-          <w:lang w:val="es-ES"/>
-        </w:rPr>
-        <w:t>Juegos serios para educación (</w:t>
-      </w:r>
-      <w:proofErr w:type="gramStart"/>
-      <w:r>
-        <w:rPr>
-          <w:lang w:val="es-ES"/>
-        </w:rPr>
-        <w:t>para TDAH?</w:t>
-      </w:r>
-      <w:proofErr w:type="gramEnd"/>
-      <w:r>
-        <w:rPr>
-          <w:lang w:val="es-ES"/>
-        </w:rPr>
-        <w:t>)</w:t>
+        <w:t>Juegos serios para educación (para TDAH?)</w:t>
       </w:r>
       <w:bookmarkEnd w:id="31"/>
     </w:p>
@@ -6090,21 +6114,7 @@
         <w:rPr>
           <w:lang w:val="es-ES"/>
         </w:rPr>
-        <w:t xml:space="preserve">Pruebas </w:t>
-      </w:r>
-      <w:proofErr w:type="gramStart"/>
-      <w:r>
-        <w:rPr>
-          <w:lang w:val="es-ES"/>
-        </w:rPr>
-        <w:t>explicar</w:t>
-      </w:r>
-      <w:proofErr w:type="gramEnd"/>
-      <w:r>
-        <w:rPr>
-          <w:lang w:val="es-ES"/>
-        </w:rPr>
-        <w:t xml:space="preserve"> bien que fue en </w:t>
+        <w:t xml:space="preserve">Pruebas explicar bien que fue en </w:t>
       </w:r>
       <w:r>
         <w:rPr>
@@ -6429,7 +6439,6 @@
         </w:rPr>
         <w:t>“</w:t>
       </w:r>
-      <w:proofErr w:type="spellStart"/>
       <w:r>
         <w:rPr>
           <w:lang w:val="en-US"/>
@@ -6459,7 +6468,6 @@
         </w:rPr>
         <w:t>Introducción</w:t>
       </w:r>
-      <w:proofErr w:type="spellEnd"/>
       <w:r>
         <w:rPr>
           <w:lang w:val="en-US"/>
@@ -6472,19 +6480,11 @@
         </w:rPr>
         <w:t xml:space="preserve">” </w:t>
       </w:r>
-      <w:proofErr w:type="spellStart"/>
       <w:r>
         <w:rPr>
           <w:lang w:val="en-US"/>
         </w:rPr>
-        <w:t>traducción</w:t>
-      </w:r>
-      <w:proofErr w:type="spellEnd"/>
-      <w:r>
-        <w:rPr>
-          <w:lang w:val="en-US"/>
-        </w:rPr>
-        <w:t>.</w:t>
+        <w:t>traducción.</w:t>
       </w:r>
     </w:p>
     <w:p>
@@ -6494,26 +6494,16 @@
           <w:lang w:val="es-ES"/>
         </w:rPr>
       </w:pPr>
-      <w:proofErr w:type="spellStart"/>
       <w:r>
         <w:rPr>
           <w:lang w:val="es-ES"/>
         </w:rPr>
         <w:t>Motivation</w:t>
       </w:r>
-      <w:proofErr w:type="spellEnd"/>
-    </w:p>
-    <w:p>
-      <w:r>
-        <w:t>Los títulos de las subsecciones de esta sección (</w:t>
-      </w:r>
-      <w:proofErr w:type="spellStart"/>
-      <w:r>
-        <w:t>Introduction</w:t>
-      </w:r>
-      <w:proofErr w:type="spellEnd"/>
-      <w:r>
-        <w:t xml:space="preserve">) usan el estilo </w:t>
+    </w:p>
+    <w:p>
+      <w:r>
+        <w:t xml:space="preserve">Los títulos de las subsecciones de esta sección (Introduction) usan el estilo </w:t>
       </w:r>
       <w:r>
         <w:t>Título 7</w:t>
@@ -6578,31 +6568,15 @@
       </w:pPr>
       <w:bookmarkStart w:id="54" w:name="_Toc116636448"/>
       <w:bookmarkStart w:id="55" w:name="_Toc236766604"/>
-      <w:proofErr w:type="spellStart"/>
       <w:r>
         <w:rPr>
           <w:lang w:val="es-ES"/>
         </w:rPr>
         <w:lastRenderedPageBreak/>
-        <w:t>Conclusions</w:t>
-      </w:r>
-      <w:proofErr w:type="spellEnd"/>
-      <w:r>
-        <w:rPr>
-          <w:lang w:val="es-ES"/>
-        </w:rPr>
-        <w:t xml:space="preserve"> and future </w:t>
-      </w:r>
-      <w:proofErr w:type="spellStart"/>
-      <w:r>
-        <w:rPr>
-          <w:lang w:val="es-ES"/>
-        </w:rPr>
-        <w:t>work</w:t>
+        <w:t>Conclusions and future work</w:t>
       </w:r>
       <w:bookmarkEnd w:id="54"/>
       <w:bookmarkEnd w:id="55"/>
-      <w:proofErr w:type="spellEnd"/>
     </w:p>
     <w:p>
       <w:pPr>
@@ -6693,19 +6667,9 @@
       <w:r>
         <w:t>Los títulos de las subsecciones de esta sección (</w:t>
       </w:r>
-      <w:proofErr w:type="spellStart"/>
-      <w:r>
-        <w:t>Conclusions</w:t>
-      </w:r>
-      <w:proofErr w:type="spellEnd"/>
-      <w:r>
-        <w:t xml:space="preserve"> and future </w:t>
-      </w:r>
-      <w:proofErr w:type="spellStart"/>
-      <w:r>
-        <w:t>work</w:t>
-      </w:r>
-      <w:proofErr w:type="spellEnd"/>
+      <w:r>
+        <w:t>Conclusions and future work</w:t>
+      </w:r>
       <w:r>
         <w:t xml:space="preserve">) usan el estilo </w:t>
       </w:r>
@@ -6765,7 +6729,6 @@
       </w:pPr>
       <w:bookmarkStart w:id="58" w:name="_Toc116636450"/>
       <w:bookmarkStart w:id="59" w:name="_Toc236766605"/>
-      <w:proofErr w:type="spellStart"/>
       <w:r>
         <w:lastRenderedPageBreak/>
         <w:t>Bibliografía</w:t>
@@ -6773,7 +6736,6 @@
       <w:bookmarkEnd w:id="56"/>
       <w:bookmarkEnd w:id="58"/>
       <w:bookmarkEnd w:id="59"/>
-      <w:proofErr w:type="spellEnd"/>
       <w:r>
         <w:rPr>
           <w:sz w:val="22"/>
@@ -6794,128 +6756,209 @@
         <w:fldChar w:fldCharType="separate"/>
       </w:r>
     </w:p>
-    <w:tbl>
-      <w:tblPr>
-        <w:tblW w:w="5000" w:type="pct"/>
-        <w:tblCellSpacing w:w="15" w:type="dxa"/>
-        <w:tblCellMar>
-          <w:top w:w="15" w:type="dxa"/>
-          <w:left w:w="15" w:type="dxa"/>
-          <w:bottom w:w="15" w:type="dxa"/>
-          <w:right w:w="15" w:type="dxa"/>
-        </w:tblCellMar>
-        <w:tblLook w:val="04A0" w:firstRow="1" w:lastRow="0" w:firstColumn="1" w:lastColumn="0" w:noHBand="0" w:noVBand="1"/>
-      </w:tblPr>
-      <w:tblGrid>
-        <w:gridCol w:w="352"/>
-        <w:gridCol w:w="9008"/>
-      </w:tblGrid>
-      <w:tr>
-        <w:trPr>
-          <w:tblCellSpacing w:w="15" w:type="dxa"/>
-        </w:trPr>
-        <w:tc>
-          <w:tcPr>
-            <w:tcW w:w="50" w:type="pct"/>
-            <w:hideMark/>
-          </w:tcPr>
-          <w:p>
-            <w:pPr>
-              <w:pStyle w:val="Bibliografa"/>
-              <w:rPr>
-                <w:noProof/>
-                <w:sz w:val="24"/>
-                <w:lang w:val="es-ES"/>
-              </w:rPr>
-            </w:pPr>
-            <w:r>
-              <w:rPr>
-                <w:noProof/>
-                <w:lang w:val="es-ES"/>
-              </w:rPr>
-              <w:t xml:space="preserve">[1] </w:t>
-            </w:r>
-          </w:p>
-        </w:tc>
-        <w:tc>
-          <w:tcPr>
-            <w:tcW w:w="0" w:type="auto"/>
-            <w:hideMark/>
-          </w:tcPr>
-          <w:p>
-            <w:pPr>
-              <w:pStyle w:val="Bibliografa"/>
-              <w:rPr>
-                <w:noProof/>
-                <w:lang w:val="en-US"/>
-              </w:rPr>
-            </w:pPr>
-            <w:r>
-              <w:rPr>
-                <w:noProof/>
-                <w:lang w:val="en-US"/>
-              </w:rPr>
-              <w:t xml:space="preserve">L. A. Bucki, Word 2013 Bible, John Wiley &amp; Sons, 2013. </w:t>
-            </w:r>
-          </w:p>
-        </w:tc>
-      </w:tr>
-      <w:tr>
-        <w:trPr>
-          <w:tblCellSpacing w:w="15" w:type="dxa"/>
-        </w:trPr>
-        <w:tc>
-          <w:tcPr>
-            <w:tcW w:w="50" w:type="pct"/>
-            <w:hideMark/>
-          </w:tcPr>
-          <w:p>
-            <w:pPr>
-              <w:pStyle w:val="Bibliografa"/>
-              <w:rPr>
-                <w:noProof/>
-                <w:lang w:val="es-ES"/>
-              </w:rPr>
-            </w:pPr>
-            <w:r>
-              <w:rPr>
-                <w:noProof/>
-                <w:lang w:val="es-ES"/>
-              </w:rPr>
-              <w:t xml:space="preserve">[2] </w:t>
-            </w:r>
-          </w:p>
-        </w:tc>
-        <w:tc>
-          <w:tcPr>
-            <w:tcW w:w="0" w:type="auto"/>
-            <w:hideMark/>
-          </w:tcPr>
-          <w:p>
-            <w:pPr>
-              <w:pStyle w:val="Bibliografa"/>
-              <w:rPr>
-                <w:noProof/>
-                <w:lang w:val="es-ES"/>
-              </w:rPr>
-            </w:pPr>
-            <w:r>
-              <w:rPr>
-                <w:noProof/>
-                <w:lang w:val="es-ES"/>
-              </w:rPr>
-              <w:t>CFI, «Cursos de Formación en Informática,» [En línea]. Available: http://cursosinformatica.ucm.es. [Último acceso: 01 06 2019].</w:t>
-            </w:r>
-          </w:p>
-        </w:tc>
-      </w:tr>
-    </w:tbl>
-    <w:p>
-      <w:pPr>
+    <w:p>
+      <w:pPr>
+        <w:pStyle w:val="Bibliografa"/>
+      </w:pPr>
+      <w:r>
         <w:rPr>
           <w:noProof/>
         </w:rPr>
-      </w:pPr>
+        <w:fldChar w:fldCharType="begin"/>
+      </w:r>
+      <w:r>
+        <w:rPr>
+          <w:noProof/>
+        </w:rPr>
+        <w:instrText xml:space="preserve"> ADDIN ZOTERO_BIBL {"uncited":[],"omitted":[],"custom":[]} CSL_BIBLIOGRAPHY </w:instrText>
+      </w:r>
+      <w:r>
+        <w:rPr>
+          <w:noProof/>
+        </w:rPr>
+        <w:fldChar w:fldCharType="separate"/>
+      </w:r>
+      <w:r>
+        <w:t>[1]</w:t>
+      </w:r>
+      <w:r>
+        <w:tab/>
+        <w:t xml:space="preserve">G. Ayano, «The global prevalence of attention deficit hyperactivity disorder in children and adolescents: An umbrella review of meta-analyses», </w:t>
+      </w:r>
+      <w:r>
+        <w:rPr>
+          <w:i/>
+          <w:iCs/>
+        </w:rPr>
+        <w:t>J. Affect. Disord.</w:t>
+      </w:r>
+      <w:r>
+        <w:t>, 2023.</w:t>
+      </w:r>
+    </w:p>
+    <w:p>
+      <w:pPr>
+        <w:pStyle w:val="Bibliografa"/>
+      </w:pPr>
+      <w:r>
+        <w:t>[2]</w:t>
+      </w:r>
+      <w:r>
+        <w:tab/>
+        <w:t>E. Joselevich, G. Bernaldo de Quirós, M. B. Moyano, R. O. Scandar, y V. Vainer, «A.D/H.D.: qué es, qué hacer</w:t>
+      </w:r>
+      <w:r>
+        <w:rPr>
+          <w:rFonts w:ascii="Arial" w:hAnsi="Arial" w:cs="Arial"/>
+        </w:rPr>
+        <w:t> </w:t>
+      </w:r>
+      <w:r>
+        <w:t xml:space="preserve">: recomendaciones para padres y docentes», en </w:t>
+      </w:r>
+      <w:r>
+        <w:rPr>
+          <w:i/>
+          <w:iCs/>
+        </w:rPr>
+        <w:t>A.D/H.D.: qué es, qué hacer</w:t>
+      </w:r>
+      <w:r>
+        <w:rPr>
+          <w:rFonts w:ascii="Arial" w:hAnsi="Arial" w:cs="Arial"/>
+          <w:i/>
+          <w:iCs/>
+        </w:rPr>
+        <w:t> </w:t>
+      </w:r>
+      <w:r>
+        <w:rPr>
+          <w:i/>
+          <w:iCs/>
+        </w:rPr>
+        <w:t>: recomendaciones para padres y docentes</w:t>
+      </w:r>
+      <w:r>
+        <w:t>, pp. 267-267. Accedido: 1 de mayo de 2026. [En línea]. Disponible en: https://pesquisa.bvsalud.org/portal/resource/pt/biblio-1201519</w:t>
+      </w:r>
+    </w:p>
+    <w:p>
+      <w:pPr>
+        <w:pStyle w:val="Bibliografa"/>
+      </w:pPr>
+      <w:r>
+        <w:t>[3]</w:t>
+      </w:r>
+      <w:r>
+        <w:tab/>
+        <w:t xml:space="preserve">R. A. Barkley, L. E. Knouse, y K. R. Murphy, «“Correspondence and disparity in the self- and other ratings of current and childhood ADHD symptoms and impairment in adults with ADHD”: Correction to Barkley et al. (2011)», </w:t>
+      </w:r>
+      <w:r>
+        <w:rPr>
+          <w:i/>
+          <w:iCs/>
+        </w:rPr>
+        <w:t>Psychol. Assess.</w:t>
+      </w:r>
+      <w:r>
+        <w:t>, vol. 23, n.</w:t>
+      </w:r>
+      <w:r>
+        <w:rPr>
+          <w:vertAlign w:val="superscript"/>
+        </w:rPr>
+        <w:t>o</w:t>
+      </w:r>
+      <w:r>
+        <w:t xml:space="preserve"> 2, pp. 446-446, 2011, doi: 10.1037/a0024001.</w:t>
+      </w:r>
+    </w:p>
+    <w:p>
+      <w:pPr>
+        <w:pStyle w:val="Bibliografa"/>
+      </w:pPr>
+      <w:r>
+        <w:t>[4]</w:t>
+      </w:r>
+      <w:r>
+        <w:tab/>
+        <w:t xml:space="preserve">C. B. González Calleros, J. Guerrero García, y Y. Navarro Rangel, «Uso de juegos serios como herramienta educativa para la enseñanza a niños con TDAH», </w:t>
+      </w:r>
+      <w:r>
+        <w:rPr>
+          <w:i/>
+          <w:iCs/>
+        </w:rPr>
+        <w:t>RD-ICUAP</w:t>
+      </w:r>
+      <w:r>
+        <w:t>, abr. 2019, doi: 10.32399/icuap.rdic.2448-5829.2019.13.329.</w:t>
+      </w:r>
+    </w:p>
+    <w:p>
+      <w:pPr>
+        <w:pStyle w:val="Bibliografa"/>
+      </w:pPr>
+      <w:r>
+        <w:t>[5]</w:t>
+      </w:r>
+      <w:r>
+        <w:tab/>
+        <w:t xml:space="preserve">G. Tripp y J. R. Wickens, «Neurobiology of ADHD», </w:t>
+      </w:r>
+      <w:r>
+        <w:rPr>
+          <w:i/>
+          <w:iCs/>
+        </w:rPr>
+        <w:t>Neuropharmacology</w:t>
+      </w:r>
+      <w:r>
+        <w:t>, vol. 57, n.</w:t>
+      </w:r>
+      <w:r>
+        <w:rPr>
+          <w:vertAlign w:val="superscript"/>
+        </w:rPr>
+        <w:t>o</w:t>
+      </w:r>
+      <w:r>
+        <w:t xml:space="preserve"> 7-8, pp. 579-589, dic. 2009, doi: 10.1016/j.neuropharm.2009.07.026.</w:t>
+      </w:r>
+    </w:p>
+    <w:p>
+      <w:pPr>
+        <w:pStyle w:val="Bibliografa"/>
+      </w:pPr>
+      <w:r>
+        <w:t>[6]</w:t>
+      </w:r>
+      <w:r>
+        <w:tab/>
+      </w:r>
+      <w:r>
+        <w:rPr>
+          <w:i/>
+          <w:iCs/>
+        </w:rPr>
+        <w:t>Guía de Bolsillo de la Clasificación CIE-10: Clasificación de los Trastornos Mentales y del Comportamiento</w:t>
+      </w:r>
+      <w:r>
+        <w:t>. Ed. Médica Panamericana, 2000.</w:t>
+      </w:r>
+    </w:p>
+    <w:p>
+      <w:pPr>
+        <w:rPr>
+          <w:noProof/>
+        </w:rPr>
+      </w:pPr>
+      <w:r>
+        <w:rPr>
+          <w:noProof/>
+        </w:rPr>
+        <w:fldChar w:fldCharType="end"/>
+      </w:r>
     </w:p>
     <w:p>
       <w:pPr>
@@ -7011,41 +7054,20 @@
     </w:p>
     <w:p>
       <w:r>
-        <w:t xml:space="preserve">Para los títulos de las subsecciones de los apéndices se utiliza el estilo Título 8. Para las </w:t>
-      </w:r>
-      <w:proofErr w:type="spellStart"/>
-      <w:r>
-        <w:t>sub-subsecciones</w:t>
-      </w:r>
-      <w:proofErr w:type="spellEnd"/>
-      <w:r>
-        <w:t xml:space="preserve"> se usa el estilo Título 9, como aparece a continuación.</w:t>
+        <w:t>Para los títulos de las subsecciones de los apéndices se utiliza el estilo Título 8. Para las sub-subsecciones se usa el estilo Título 9, como aparece a continuación.</w:t>
       </w:r>
     </w:p>
     <w:p>
       <w:pPr>
         <w:pStyle w:val="Ttulo9"/>
       </w:pPr>
-      <w:proofErr w:type="spellStart"/>
-      <w:r>
-        <w:t>Sub-subsecciones</w:t>
-      </w:r>
-      <w:proofErr w:type="spellEnd"/>
-      <w:r>
-        <w:t xml:space="preserve"> del apéndice (Título 9)</w:t>
-      </w:r>
-    </w:p>
-    <w:p>
-      <w:r>
-        <w:t xml:space="preserve">Para las </w:t>
-      </w:r>
-      <w:proofErr w:type="spellStart"/>
-      <w:r>
-        <w:t>sub-subsecciones</w:t>
-      </w:r>
-      <w:proofErr w:type="spellEnd"/>
-      <w:r>
-        <w:t xml:space="preserve"> de un apéndice se utiliza el estilo Título 9. No se recomienda añadir más niveles de subsección</w:t>
+      <w:r>
+        <w:t>Sub-subsecciones del apéndice (Título 9)</w:t>
+      </w:r>
+    </w:p>
+    <w:p>
+      <w:r>
+        <w:t>Para las sub-subsecciones de un apéndice se utiliza el estilo Título 9. No se recomienda añadir más niveles de subsección</w:t>
       </w:r>
       <w:r>
         <w:t>.</w:t>
@@ -11503,7 +11525,6 @@
   <w:style w:type="character" w:default="1" w:styleId="Fuentedeprrafopredeter">
     <w:name w:val="Default Paragraph Font"/>
     <w:uiPriority w:val="1"/>
-    <w:semiHidden/>
     <w:unhideWhenUsed/>
   </w:style>
   <w:style w:type="table" w:default="1" w:styleId="Tablanormal">
@@ -12937,7 +12958,11 @@
     <w:uiPriority w:val="70"/>
     <w:rsid w:val="005556F4"/>
     <w:pPr>
-      <w:ind w:firstLine="0"/>
+      <w:tabs>
+        <w:tab w:val="left" w:pos="384"/>
+      </w:tabs>
+      <w:spacing w:after="0" w:line="240" w:lineRule="auto"/>
+      <w:ind w:left="384" w:hanging="384"/>
     </w:pPr>
   </w:style>
   <w:style w:type="paragraph" w:styleId="Descripcin">

</xml_diff>

<commit_message>
Avance escritura sobre juegois serios
</commit_message>
<xml_diff>
--- a/MemoriaTFG/NahiaIglesiasEsquemaTFG.docx
+++ b/MemoriaTFG/NahiaIglesiasEsquemaTFG.docx
@@ -769,7 +769,15 @@
         <w:t xml:space="preserve">A mi hermana por </w:t>
       </w:r>
       <w:r>
-        <w:t xml:space="preserve">hacerme sandwitches todas las veces que </w:t>
+        <w:t xml:space="preserve">hacerme </w:t>
+      </w:r>
+      <w:proofErr w:type="spellStart"/>
+      <w:r>
+        <w:t>sandwitches</w:t>
+      </w:r>
+      <w:proofErr w:type="spellEnd"/>
+      <w:r>
+        <w:t xml:space="preserve"> todas las veces que </w:t>
       </w:r>
       <w:r>
         <w:t>me veía</w:t>
@@ -784,8 +792,13 @@
         <w:t>.</w:t>
       </w:r>
       <w:r>
-        <w:t xml:space="preserve"> Lna</w:t>
-      </w:r>
+        <w:t xml:space="preserve"> </w:t>
+      </w:r>
+      <w:proofErr w:type="spellStart"/>
+      <w:r>
+        <w:t>Lna</w:t>
+      </w:r>
+      <w:proofErr w:type="spellEnd"/>
     </w:p>
     <w:p>
       <w:pPr>
@@ -843,131 +856,38 @@
           <w:color w:val="000000"/>
           <w:szCs w:val="22"/>
         </w:rPr>
-        <w:t>El TDAH (Trastorno del Déficit de Atención e Hiperactividad) es uno de los trastornos más comunes de la infancia</w:t>
+        <w:t>El Trastorno del Déficit de Atención e Hiperactividad</w:t>
       </w:r>
       <w:r>
         <w:rPr>
           <w:color w:val="000000"/>
           <w:szCs w:val="22"/>
         </w:rPr>
-        <w:fldChar w:fldCharType="begin"/>
+        <w:t xml:space="preserve"> </w:t>
       </w:r>
       <w:r>
         <w:rPr>
           <w:color w:val="000000"/>
           <w:szCs w:val="22"/>
         </w:rPr>
-        <w:instrText xml:space="preserve"> ADDIN ZOTERO_ITEM CSL_CITATION {"citationID":"gMLZhxUn","properties":{"unsorted":false,"formattedCitation":"[1]","plainCitation":"[1]","noteIndex":0},"citationItems":[{"id":22,"uris":["http://zotero.org/users/local/axS3HTYd/items/QZNGZM7F"],"itemData":{"id":22,"type":"article-journal","abstract":"Background: Emerging epidemiological data suggest that hundreds of primary studies have examined the prevalence of ADHD in children and adolescents and dozens of systematic view and meta-analyses studies have been conducted on the subject. The purpose of this umbrella review is to provide a robust synthesis of evidence from these systematic reviews and meta-analyses.\nMethods: We systematically searched PubMed, Web of Science, PsychINFO, and Scopus to find pertinent studies. The study was preregistered with PROSPERO (CRD42023389704). The quality of the studies was assessed using a Measurement Tool to Assess Systematic Reviews (AMSTAR). Prevalence estimates from the included studies were pooled using invariance variance weighted random-effect meta-analysis.\nResults: Thirteen meta-analytic systematic reviews (588 primary studies) with 3,277,590 participants were included in the final analysis. A random effect meta-analysis of these studies showed that the global prevalence of ADHD in children and adolescents was 8.0 % (95%CI 6.0–10 %). The prevalence estimate was twice higher in boys (10 %) compared to girls (5 %). Of the three subtypes of ADHD, the inattentive type of ADHD (ADHD-I) was found to be the most common type of ADHD followed by the hyperactive (ADHD-HI) and the combined types (ADHD-C).\nConclusion: Findings from our compressive umbrella review suggest that ADHD is highly prevalent in children and adolescents with boys twice more likely to experience the disorder than girls. Our results underpin that priority should be given to preventing, early identifying, and treating ADHD in children and adolescents.","container-title":"Journal of Affective Disorders","language":"en","source":"Zotero","title":"The global prevalence of attention deficit hyperactivity disorder in children and adolescents: An umbrella review of meta-analyses","author":[{"family":"Ayano","given":"Getinet"}],"issued":{"date-parts":[["2023"]]}}}],"schema":"https://github.com/citation-style-language/schema/raw/master/csl-citation.json"} </w:instrText>
+        <w:t>(TDAH)</w:t>
       </w:r>
       <w:r>
         <w:rPr>
           <w:color w:val="000000"/>
           <w:szCs w:val="22"/>
         </w:rPr>
-        <w:fldChar w:fldCharType="separate"/>
-      </w:r>
-      <w:r>
-        <w:t>[1]</w:t>
+        <w:t xml:space="preserve"> es uno de los trastornos más comunes de la infancia. Sus síntomas principales son patrones de falta de atención, hiperactividad e impulsividad que persisten en el individuo y afectan en el funcionamiento ejecutivo, además del impacto que tiene en distintos aspectos de la vida diaria.</w:t>
+      </w:r>
+      <w:r>
+        <w:t xml:space="preserve"> </w:t>
       </w:r>
       <w:r>
         <w:rPr>
           <w:color w:val="000000"/>
           <w:szCs w:val="22"/>
         </w:rPr>
-        <w:fldChar w:fldCharType="end"/>
-      </w:r>
-      <w:r>
-        <w:rPr>
-          <w:color w:val="000000"/>
-          <w:szCs w:val="22"/>
-        </w:rPr>
-        <w:t>. Sus síntomas principales son patrones de falta de atención, hiperactividad e impulsividad que persisten en el individuo y afectan en el funcionamiento ejecutivo, además del impacto que tiene en distintos aspectos de la vida diaria</w:t>
-      </w:r>
-      <w:r>
-        <w:rPr>
-          <w:color w:val="000000"/>
-          <w:szCs w:val="22"/>
-        </w:rPr>
-        <w:fldChar w:fldCharType="begin"/>
-      </w:r>
-      <w:r>
-        <w:rPr>
-          <w:color w:val="000000"/>
-          <w:szCs w:val="22"/>
-        </w:rPr>
-        <w:instrText xml:space="preserve"> ADDIN ZOTERO_ITEM CSL_CITATION {"citationID":"YpCVyq8T","properties":{"unsorted":false,"formattedCitation":"[2]","plainCitation":"[2]","noteIndex":0},"citationItems":[{"id":27,"uris":["http://zotero.org/users/local/axS3HTYd/items/RALXAIUF"],"itemData":{"id":27,"type":"chapter","container-title":"A.D/H.D.: qué es, qué hacer : recomendaciones para padres y docentes","language":"es","page":"267-267","source":"pesquisa.bvsalud.org","title":"A.D/H.D.: qué es, qué hacer : recomendaciones para padres y docentes","title-short":"A.D/H.D.","URL":"https://pesquisa.bvsalud.org/portal/resource/pt/biblio-1201519","author":[{"family":"Joselevich","given":"Estrella"},{"family":"Bernaldo de Quirós","given":"Guillermo"},{"family":"Moyano","given":"María Beatriz"},{"family":"Scandar","given":"Rubén Osvaldo"},{"family":"Vainer","given":"Violeta"}],"accessed":{"date-parts":[["2026",5,1]]}}}],"schema":"https://github.com/citation-style-language/schema/raw/master/csl-citation.json"} </w:instrText>
-      </w:r>
-      <w:r>
-        <w:rPr>
-          <w:color w:val="000000"/>
-          <w:szCs w:val="22"/>
-        </w:rPr>
-        <w:fldChar w:fldCharType="separate"/>
-      </w:r>
-      <w:r>
-        <w:t>[2]</w:t>
-      </w:r>
-      <w:r>
-        <w:rPr>
-          <w:color w:val="000000"/>
-          <w:szCs w:val="22"/>
-        </w:rPr>
-        <w:fldChar w:fldCharType="end"/>
-      </w:r>
-      <w:r>
-        <w:rPr>
-          <w:color w:val="000000"/>
-          <w:szCs w:val="22"/>
-        </w:rPr>
-        <w:t>.</w:t>
-      </w:r>
-      <w:r>
-        <w:t xml:space="preserve"> </w:t>
-      </w:r>
-      <w:r>
-        <w:rPr>
-          <w:color w:val="000000"/>
-          <w:szCs w:val="22"/>
-        </w:rPr>
-        <w:t>La capacidad de planificación es una parte importante del funcionamiento ejecutivo que se ve afectada por este trastorno</w:t>
-      </w:r>
-      <w:r>
-        <w:rPr>
-          <w:color w:val="000000"/>
-          <w:szCs w:val="22"/>
-        </w:rPr>
-        <w:fldChar w:fldCharType="begin"/>
-      </w:r>
-      <w:r>
-        <w:rPr>
-          <w:color w:val="000000"/>
-          <w:szCs w:val="22"/>
-        </w:rPr>
-        <w:instrText xml:space="preserve"> ADDIN ZOTERO_ITEM CSL_CITATION {"citationID":"3XJ9MKcL","properties":{"unsorted":false,"formattedCitation":"[3], [4]","plainCitation":"[3], [4]","noteIndex":0},"citationItems":[{"id":31,"uris":["http://zotero.org/users/local/axS3HTYd/items/ELDCSQFL"],"itemData":{"id":31,"type":"article-journal","abstract":"Reports an error in \"Correspondence and disparity in the self- and other ratings of current and childhood ADHD symptoms and impairment in adults with ADHD\" by Russell A. Barkley, Laura E. Knouse and Kevin R. Murphy (Psychological Assessment, , , np). There was an omission in the author note. The author note should have included a disclosure as follows, “Russell A. Barkley receives royalties for books, videos, and rating scales from Guilford Publications, and is the author of Barkley Adult ADHD Rating Scale-IV (BAARS-IV), Barkley Deficits in Executive Functioning Scale (BDEFS), and Barkley Functional Impairment Scale (BFIS), all published by Guilford Press.” (The following abstract of the original article appeared in record 2011-04636-001.) Experts recommend that clinicians evaluating adults for attention-deficit/hyperactivity disorder (ADHD) obtain information from others who know the patient well. The authors examined correspondence between the self- and other-ratings of ADHD symptoms and impairment using 3 groups of adults recruited on the basis of their severity of ADHD: ADHD diagnosis (n = 146), clinical controls self-referring for ADHD but not diagnosed (n = 97), and community controls (n = 109). The influences of diagnostic group, informant relationship, sex of participant, IQ, and comorbid anxiety and depression on self-informant disparities were also examined. Results indicated moderate to high agreement (.59–.80) between self and others on current functioning and slightly lower levels (.53–.75) between self- and parent ratings of childhood functioning. Examination of difference scores between self- and other ratings revealed small mean disparities (−0.1 to +5.0 points) but substantial variation (SDs = –2.4 to 8.9 points) for both current and childhood ratings. Clinic referrals not diagnosed with ADHD, particularly women, had higher disparities than was evident in the ADHD and community groups. Age, IQ, and education were not associated with disparities in most ratings. Higher anxiety, in contrast, was associated with greater disparities on all current and childhood measures of both ADHD and impairment. (PsycInfo Database Record (c) 2025 APA, all rights reserved)","container-title":"Psychological Assessment","DOI":"10.1037/a0024001","ISSN":"1939-134X","issue":"2","page":"446-446","publisher":"American Psychological Association","publisher-place":"US","source":"APA PsycNet","title":"\"Correspondence and disparity in the self- and other ratings of current and childhood ADHD symptoms and impairment in adults with ADHD\": Correction to Barkley et al. (2011)","title-short":"Correspondence and disparity in the self- and other ratings of current and childhood ADHD symptoms and impairment in adults with ADHD","volume":"23","author":[{"family":"Barkley","given":"Russell A."},{"family":"Knouse","given":"Laura E."},{"family":"Murphy","given":"Kevin R."}],"issued":{"date-parts":[["2011"]]}}},{"id":30,"uris":["http://zotero.org/users/local/axS3HTYd/items/7RTPQ3IB"],"itemData":{"id":30,"type":"article-journal","abstract":"Actualmente, las Tecnologías de la Información y la Comunicación como herramientas educativas forman parte de las estrategias pedagógicas necesarias para facilitar el aprendizaje en niños con edad escolar. El objetivo de este trabajo es mostrar al lector cómo las herramientas tecnológicas, en particular los juegos serios, han demostrado ser eficientes para que los niños con Trastorno por Déficit de Atención e Hiperactividad (TDAH) logren un mejor aprendizaje para desarrollar su potencial académico. A través de las estrategias didácticas, los docentes deben facilitar la formación y el aprendizaje con el uso de la tecnología y los métodos didácticos que permitan construir el conocimiento de forma creativa y dinámica. La integración de la tecnología en el proceso de enseñanza-aprendizaje depende de la capacidad de los docentes para estructurar el ambiente con estrategias eficaces y, así, propiciar que el alumno organice y dirija sus propias actividades y procesos de estudio de manera creativa, efectiva y crítica.","container-title":"RD-ICUAP","DOI":"10.32399/icuap.rdic.2448-5829.2019.13.329","ISSN":"2448-5829","journalAbbreviation":"RDI","language":"es","source":"DOI.org (Crossref)","title":"Uso de juegos serios como herramienta educativa para la enseñanza a niños con TDAH","URL":"https://rdicuap.buap.mx/index.php/rdicuap/article/view/329","author":[{"family":"González Calleros","given":"Claudia B."},{"family":"Guerrero García","given":"Josefina"},{"family":"Navarro Rangel","given":"Yadira"}],"accessed":{"date-parts":[["2026",5,1]]},"issued":{"date-parts":[["2019",4,30]]}}}],"schema":"https://github.com/citation-style-language/schema/raw/master/csl-citation.json"} </w:instrText>
-      </w:r>
-      <w:r>
-        <w:rPr>
-          <w:color w:val="000000"/>
-          <w:szCs w:val="22"/>
-        </w:rPr>
-        <w:fldChar w:fldCharType="separate"/>
-      </w:r>
-      <w:r>
-        <w:t>[3], [4]</w:t>
-      </w:r>
-      <w:r>
-        <w:rPr>
-          <w:color w:val="000000"/>
-          <w:szCs w:val="22"/>
-        </w:rPr>
-        <w:fldChar w:fldCharType="end"/>
-      </w:r>
-      <w:r>
-        <w:rPr>
-          <w:color w:val="000000"/>
-          <w:szCs w:val="22"/>
-        </w:rPr>
-        <w:t>.</w:t>
+        <w:t>La capacidad de planificación es una parte importante del funcionamiento ejecutivo que se ve afectada por este trastorno.</w:t>
       </w:r>
     </w:p>
     <w:p>
@@ -1222,7 +1142,7 @@
         <w:rPr>
           <w:lang w:val="en-US" w:eastAsia="es-ES"/>
         </w:rPr>
-        <w:t>ADHD (Attention-Deficit/Hyperactivity Disorder) is one of the most common childhood disorders[1]. Its main symptoms are patterns of inattention, hyperactivity, and impulsivity that persist in the individual and affect executive functioning, in addition to the impact they have on various aspects of daily life[2]. Planning ability is an important part of executive functioning that is affected by this disorder[3], [4].</w:t>
+        <w:t>ADHD (Attention-Deficit/Hyperactivity Disorder) is one of the most common childhood disorders. Its main symptoms are patterns of inattention, hyperactivity, and impulsivity that persist in the individual and affect executive functioning, in addition to the impact they have on various aspects of daily life. Planning ability is an important part of executive functioning that is affected by this disorder.</w:t>
       </w:r>
     </w:p>
     <w:p>
@@ -1435,14 +1355,21 @@
         <w:pStyle w:val="PageHeading"/>
       </w:pPr>
       <w:bookmarkStart w:id="1" w:name="Indice"/>
+      <w:proofErr w:type="spellStart"/>
       <w:r>
         <w:lastRenderedPageBreak/>
         <w:t>Índice</w:t>
       </w:r>
-      <w:r>
-        <w:t xml:space="preserve"> de contenidos</w:t>
+      <w:proofErr w:type="spellEnd"/>
+      <w:r>
+        <w:t xml:space="preserve"> de </w:t>
+      </w:r>
+      <w:proofErr w:type="spellStart"/>
+      <w:r>
+        <w:t>contenidos</w:t>
       </w:r>
       <w:bookmarkEnd w:id="1"/>
+      <w:proofErr w:type="spellEnd"/>
     </w:p>
     <w:sdt>
       <w:sdtPr>
@@ -1710,21 +1637,7 @@
                 <w:rStyle w:val="Hipervnculo"/>
                 <w:noProof/>
               </w:rPr>
-              <w:t>1.3 Plan de</w:t>
-            </w:r>
-            <w:r>
-              <w:rPr>
-                <w:rStyle w:val="Hipervnculo"/>
-                <w:noProof/>
-              </w:rPr>
-              <w:t xml:space="preserve"> </w:t>
-            </w:r>
-            <w:r>
-              <w:rPr>
-                <w:rStyle w:val="Hipervnculo"/>
-                <w:noProof/>
-              </w:rPr>
-              <w:t>trabajo</w:t>
+              <w:t>1.3 Plan de trabajo</w:t>
             </w:r>
             <w:r>
               <w:rPr>
@@ -1941,23 +1854,7 @@
                 <w:noProof/>
                 <w:lang w:val="es-ES"/>
               </w:rPr>
-              <w:t>Capítulo 2 - Estado d</w:t>
-            </w:r>
-            <w:r>
-              <w:rPr>
-                <w:rStyle w:val="Hipervnculo"/>
-                <w:noProof/>
-                <w:lang w:val="es-ES"/>
-              </w:rPr>
-              <w:t>e</w:t>
-            </w:r>
-            <w:r>
-              <w:rPr>
-                <w:rStyle w:val="Hipervnculo"/>
-                <w:noProof/>
-                <w:lang w:val="es-ES"/>
-              </w:rPr>
-              <w:t xml:space="preserve"> la cuestión</w:t>
+              <w:t>Capítulo 2 - Estado de la cuestión</w:t>
             </w:r>
             <w:r>
               <w:rPr>
@@ -2031,23 +1928,7 @@
                 <w:noProof/>
                 <w:lang w:val="es-ES"/>
               </w:rPr>
-              <w:t>2.1 T</w:t>
-            </w:r>
-            <w:r>
-              <w:rPr>
-                <w:rStyle w:val="Hipervnculo"/>
-                <w:noProof/>
-                <w:lang w:val="es-ES"/>
-              </w:rPr>
-              <w:t>D</w:t>
-            </w:r>
-            <w:r>
-              <w:rPr>
-                <w:rStyle w:val="Hipervnculo"/>
-                <w:noProof/>
-                <w:lang w:val="es-ES"/>
-              </w:rPr>
-              <w:t>AH</w:t>
+              <w:t>2.1 TDAH</w:t>
             </w:r>
             <w:r>
               <w:rPr>
@@ -5123,11 +5004,19 @@
       <w:bookmarkEnd w:id="7"/>
     </w:p>
     <w:p>
+      <w:proofErr w:type="spellStart"/>
       <w:r>
         <w:rPr>
           <w:shd w:val="clear" w:color="auto" w:fill="FFFFFF"/>
         </w:rPr>
-        <w:t>Hbalar un poco del TDAH y los juegos serios</w:t>
+        <w:t>Hbalar</w:t>
+      </w:r>
+      <w:proofErr w:type="spellEnd"/>
+      <w:r>
+        <w:rPr>
+          <w:shd w:val="clear" w:color="auto" w:fill="FFFFFF"/>
+        </w:rPr>
+        <w:t xml:space="preserve"> un poco del TDAH y los juegos serios</w:t>
       </w:r>
     </w:p>
     <w:p>
@@ -5267,7 +5156,15 @@
       </w:pPr>
       <w:r>
         <w:lastRenderedPageBreak/>
-        <w:t>(Como una checklist)</w:t>
+        <w:t xml:space="preserve">(Como una </w:t>
+      </w:r>
+      <w:proofErr w:type="spellStart"/>
+      <w:r>
+        <w:t>checklist</w:t>
+      </w:r>
+      <w:proofErr w:type="spellEnd"/>
+      <w:r>
+        <w:t>)</w:t>
       </w:r>
     </w:p>
     <w:p>
@@ -5311,10 +5208,74 @@
         <w:t xml:space="preserve"> </w:t>
       </w:r>
       <w:r>
-        <w:t>(creo, c#), Visual studio core (python), Photoshop, Blender, Scrum, Github, Drive (documentos compartidos y datos de pruebas)</w:t>
-      </w:r>
-      <w:r>
-        <w:t>, Itchio, Polypizza, Freepik, free3D, Davinci Resolve</w:t>
+        <w:t xml:space="preserve">(creo, </w:t>
+      </w:r>
+      <w:proofErr w:type="spellStart"/>
+      <w:r>
+        <w:t>c#</w:t>
+      </w:r>
+      <w:proofErr w:type="spellEnd"/>
+      <w:r>
+        <w:t xml:space="preserve">), Visual </w:t>
+      </w:r>
+      <w:proofErr w:type="spellStart"/>
+      <w:r>
+        <w:t>studio</w:t>
+      </w:r>
+      <w:proofErr w:type="spellEnd"/>
+      <w:r>
+        <w:t xml:space="preserve"> </w:t>
+      </w:r>
+      <w:proofErr w:type="spellStart"/>
+      <w:r>
+        <w:t>core</w:t>
+      </w:r>
+      <w:proofErr w:type="spellEnd"/>
+      <w:r>
+        <w:t xml:space="preserve"> (</w:t>
+      </w:r>
+      <w:proofErr w:type="spellStart"/>
+      <w:r>
+        <w:t>python</w:t>
+      </w:r>
+      <w:proofErr w:type="spellEnd"/>
+      <w:r>
+        <w:t xml:space="preserve">), Photoshop, Blender, Scrum, </w:t>
+      </w:r>
+      <w:proofErr w:type="spellStart"/>
+      <w:r>
+        <w:t>Github</w:t>
+      </w:r>
+      <w:proofErr w:type="spellEnd"/>
+      <w:r>
+        <w:t>, Drive (documentos compartidos y datos de pruebas)</w:t>
+      </w:r>
+      <w:r>
+        <w:t xml:space="preserve">, </w:t>
+      </w:r>
+      <w:proofErr w:type="spellStart"/>
+      <w:r>
+        <w:t>Itchio</w:t>
+      </w:r>
+      <w:proofErr w:type="spellEnd"/>
+      <w:r>
+        <w:t xml:space="preserve">, </w:t>
+      </w:r>
+      <w:proofErr w:type="spellStart"/>
+      <w:r>
+        <w:t>Polypizza</w:t>
+      </w:r>
+      <w:proofErr w:type="spellEnd"/>
+      <w:r>
+        <w:t xml:space="preserve">, </w:t>
+      </w:r>
+      <w:proofErr w:type="spellStart"/>
+      <w:r>
+        <w:t>Freepik</w:t>
+      </w:r>
+      <w:proofErr w:type="spellEnd"/>
+      <w:r>
+        <w:t>, free3D, Davinci Resolve</w:t>
       </w:r>
     </w:p>
     <w:p>
@@ -5346,7 +5307,23 @@
         <w:pStyle w:val="Textoindependiente"/>
       </w:pPr>
       <w:r>
-        <w:t>Planificar en tiempo lo que hice: Ej septiembre  hice tal, en octubre tal cual…</w:t>
+        <w:t xml:space="preserve">Planificar en tiempo lo que hice: </w:t>
+      </w:r>
+      <w:proofErr w:type="spellStart"/>
+      <w:r>
+        <w:t>Ej</w:t>
+      </w:r>
+      <w:proofErr w:type="spellEnd"/>
+      <w:r>
+        <w:t xml:space="preserve"> </w:t>
+      </w:r>
+      <w:proofErr w:type="gramStart"/>
+      <w:r>
+        <w:t>septiembre  hice</w:t>
+      </w:r>
+      <w:proofErr w:type="gramEnd"/>
+      <w:r>
+        <w:t xml:space="preserve"> tal, en octubre tal cual…</w:t>
       </w:r>
     </w:p>
     <w:p>
@@ -5431,7 +5408,13 @@
         <w:rPr>
           <w:lang w:val="es-ES"/>
         </w:rPr>
-        <w:t>TDAH</w:t>
+        <w:t>T</w:t>
+      </w:r>
+      <w:r>
+        <w:rPr>
+          <w:lang w:val="es-ES"/>
+        </w:rPr>
+        <w:t>rastorno por Déficit de Atención e Hiperactividad</w:t>
       </w:r>
       <w:bookmarkEnd w:id="18"/>
     </w:p>
@@ -5521,13 +5504,13 @@
         <w:fldChar w:fldCharType="begin"/>
       </w:r>
       <w:r>
-        <w:instrText xml:space="preserve"> ADDIN ZOTERO_ITEM CSL_CITATION {"citationID":"6p1TVb1u","properties":{"unsorted":false,"formattedCitation":"[5]","plainCitation":"[5]","noteIndex":0},"citationItems":[{"id":40,"uris":["http://zotero.org/users/local/axS3HTYd/items/N85Z8S6K"],"itemData":{"id":40,"type":"article-journal","abstract":"Attention-deﬁcit hyperactivity disorder (ADHD) is a prevalent and debilitating disorder diagnosed on the basis of persistent and developmentally-inappropriate levels of overactivity, inattention and impulsivity. The etiology and pathophysiology of ADHD is incompletely understood. There is evidence of a genetic basis for ADHD but it is likely to involve many genes of small individual effect. Differences in the dimensions of the frontal lobes, caudate nucleus, and cerebellar vermis have been demonstrated. Neuropsychological testing has revealed a number of well documented differences between children with and without ADHD. These occur in two main domains: executive function and motivation although neither of these is speciﬁc to ADHD. In view of the recent advances in the neurobiology of reinforcement, we concentrate in this review on altered reinforcement mechanisms. Among the motivational differences, many pieces of evidence indicate that an altered response to reinforcement may play a central role in the symptoms of ADHD. In particular, sensitivity to delay of reinforcement appears to be a reliable ﬁnding. We review neurobiological mechanisms of reinforcement and discuss how these may be altered in ADHD, with particular focus on the neurotransmitter dopamine and its actions at the cellular and systems level. We describe how dopamine cell ﬁring activity is normally associated with reinforcing events, and transfers to earlier time-points in the behavioural sequence as reinforcement becomes more predictable. We discuss how a failure of this transfer may give rise to many symptoms of ADHD, and propose that methylphenidate might act to compensate for the proposed dopamine transfer deﬁcit.","container-title":"Neuropharmacology","DOI":"10.1016/j.neuropharm.2009.07.026","ISSN":"00283908","issue":"7-8","journalAbbreviation":"Neuropharmacology","language":"en","license":"https://www.elsevier.com/tdm/userlicense/1.0/","page":"579-589","source":"DOI.org (Crossref)","title":"Neurobiology of ADHD","volume":"57","author":[{"family":"Tripp","given":"Gail"},{"family":"Wickens","given":"Jeffery R."}],"issued":{"date-parts":[["2009",12]]}}}],"schema":"https://github.com/citation-style-language/schema/raw/master/csl-citation.json"} </w:instrText>
+        <w:instrText xml:space="preserve"> ADDIN ZOTERO_ITEM CSL_CITATION {"citationID":"6p1TVb1u","properties":{"unsorted":false,"formattedCitation":"[2]","plainCitation":"[2]","noteIndex":0},"citationItems":[{"id":40,"uris":["http://zotero.org/users/local/axS3HTYd/items/N85Z8S6K"],"itemData":{"id":40,"type":"article-journal","abstract":"Attention-deﬁcit hyperactivity disorder (ADHD) is a prevalent and debilitating disorder diagnosed on the basis of persistent and developmentally-inappropriate levels of overactivity, inattention and impulsivity. The etiology and pathophysiology of ADHD is incompletely understood. There is evidence of a genetic basis for ADHD but it is likely to involve many genes of small individual effect. Differences in the dimensions of the frontal lobes, caudate nucleus, and cerebellar vermis have been demonstrated. Neuropsychological testing has revealed a number of well documented differences between children with and without ADHD. These occur in two main domains: executive function and motivation although neither of these is speciﬁc to ADHD. In view of the recent advances in the neurobiology of reinforcement, we concentrate in this review on altered reinforcement mechanisms. Among the motivational differences, many pieces of evidence indicate that an altered response to reinforcement may play a central role in the symptoms of ADHD. In particular, sensitivity to delay of reinforcement appears to be a reliable ﬁnding. We review neurobiological mechanisms of reinforcement and discuss how these may be altered in ADHD, with particular focus on the neurotransmitter dopamine and its actions at the cellular and systems level. We describe how dopamine cell ﬁring activity is normally associated with reinforcing events, and transfers to earlier time-points in the behavioural sequence as reinforcement becomes more predictable. We discuss how a failure of this transfer may give rise to many symptoms of ADHD, and propose that methylphenidate might act to compensate for the proposed dopamine transfer deﬁcit.","container-title":"Neuropharmacology","DOI":"10.1016/j.neuropharm.2009.07.026","ISSN":"00283908","issue":"7-8","journalAbbreviation":"Neuropharmacology","language":"en","license":"https://www.elsevier.com/tdm/userlicense/1.0/","page":"579-589","source":"DOI.org (Crossref)","title":"Neurobiology of ADHD","volume":"57","author":[{"family":"Tripp","given":"Gail"},{"family":"Wickens","given":"Jeffery R."}],"issued":{"date-parts":[["2009",12]]}}}],"schema":"https://github.com/citation-style-language/schema/raw/master/csl-citation.json"} </w:instrText>
       </w:r>
       <w:r>
         <w:fldChar w:fldCharType="separate"/>
       </w:r>
       <w:r>
-        <w:t>[5]</w:t>
+        <w:t>[2]</w:t>
       </w:r>
       <w:r>
         <w:fldChar w:fldCharType="end"/>
@@ -5553,19 +5536,27 @@
         <w:fldChar w:fldCharType="begin"/>
       </w:r>
       <w:r>
-        <w:instrText xml:space="preserve"> ADDIN ZOTERO_ITEM CSL_CITATION {"citationID":"arLFNZ70","properties":{"unsorted":false,"formattedCitation":"[6]","plainCitation":"[6]","noteIndex":0},"citationItems":[{"id":41,"uris":["http://zotero.org/users/local/axS3HTYd/items/ZIV2JXVY"],"itemData":{"id":41,"type":"book","abstract":"La utilización de una clasificación diagnóstica, ampliamente aceptada, es vital para el tratamiento afectivo de los pacientes psiquiátricos y esencial para la investigación. Esta versión del capítulo 5 de la décima revisión de la Clasificación Internacional de las Enfermedades y Problemas Relacionados con la Salud (CIE- 10), facilitará tanto la práctica como la investigación. Constituye una fuente de información, sobre la nueva clasificación, fácil de usar y a la que se puede acceder con rapidez. El libro ha sido diseñado pensando en una amplia variedad de lectores entre los que se incluyen psiquiatras con diversos grados de formación y experiencia, investigadores y analistas de datos. Los gerentes y otros profesionales de salud mental no médicos también lo encontrarán útil. Esta obra ha sido revisada por un psiquiatra, es práctica y tiene un enfoque clínico. Reúne en un solo volumen todos los aspectos principales relacionados con la descripción y el diagnóstico de los trastornos mentales. INDICE - Listado de categorías - Notas para los usuarios de la CDI-10 - Caplo V. Trastornos mentales y del comportamiento, con glosario de definiciones, CDI-10 y notas diagnósticas F00-F09 Trastornos mentales orgánicos, incluidos los sintomáticos F10-F19 Trastornos mentales y del comportamiento debidos al consumo de sustancias psicoactivas F20-F29 Esquizofrenia, trastorno esquizotípico y trastornos de ideas delirantes F30-F39 Trastornos del humor (afectivos) F40-F48 Trastornos neuróticos, secundarios a situaciones estresantes y somatomorfos F50-F59 Trastornos del comportamiento asociados a disfunciones fisiológicas y a factores somáticos F60-F69 Trastornos de la personalidad y del comportamiento del adulto F70-F79 Retraso mental F80-F89 Trastorno del desarrollo psicológico F90-F98 Trastornos del comportamiento y de las emociones de comienzo habitual en la infancia y adolescencia - Apéndice 1 de los CDI-10: Criterios provisionales para trastornos determinados - Apéndice 2 de los CDI-10: Trastornos específicos de determinadas culturas - Notas sobre problemas no resueltos - Otros procesos de la CIE-10 frecuentemente asociados con trastornos mentales y del comportamiento - Tabla de equivalencias entre el Capítulo V de la CIE-9 y el Capítulo V de la CIE-10 - Instrumentos diagnósticos y publicaciones asociadas al Capítulo V de la CIE-10.","ISBN":"978-84-7903-492-4","language":"es","note":"Google-Books-ID: Y_oACCnRG34C","number-of-pages":"336","publisher":"Ed. Médica Panamericana","source":"Google Books","title":"Guía de Bolsillo de la Clasificación CIE-10: Clasificación de los Trastornos Mentales y del Comportamiento","title-short":"Guía de Bolsillo de la Clasificación CIE-10","issued":{"date-parts":[["2000"]]}}}],"schema":"https://github.com/citation-style-language/schema/raw/master/csl-citation.json"} </w:instrText>
+        <w:instrText xml:space="preserve"> ADDIN ZOTERO_ITEM CSL_CITATION {"citationID":"arLFNZ70","properties":{"unsorted":false,"formattedCitation":"[3]","plainCitation":"[3]","noteIndex":0},"citationItems":[{"id":41,"uris":["http://zotero.org/users/local/axS3HTYd/items/ZIV2JXVY"],"itemData":{"id":41,"type":"book","abstract":"La utilización de una clasificación diagnóstica, ampliamente aceptada, es vital para el tratamiento afectivo de los pacientes psiquiátricos y esencial para la investigación. Esta versión del capítulo 5 de la décima revisión de la Clasificación Internacional de las Enfermedades y Problemas Relacionados con la Salud (CIE- 10), facilitará tanto la práctica como la investigación. Constituye una fuente de información, sobre la nueva clasificación, fácil de usar y a la que se puede acceder con rapidez. El libro ha sido diseñado pensando en una amplia variedad de lectores entre los que se incluyen psiquiatras con diversos grados de formación y experiencia, investigadores y analistas de datos. Los gerentes y otros profesionales de salud mental no médicos también lo encontrarán útil. Esta obra ha sido revisada por un psiquiatra, es práctica y tiene un enfoque clínico. Reúne en un solo volumen todos los aspectos principales relacionados con la descripción y el diagnóstico de los trastornos mentales. INDICE - Listado de categorías - Notas para los usuarios de la CDI-10 - Caplo V. Trastornos mentales y del comportamiento, con glosario de definiciones, CDI-10 y notas diagnósticas F00-F09 Trastornos mentales orgánicos, incluidos los sintomáticos F10-F19 Trastornos mentales y del comportamiento debidos al consumo de sustancias psicoactivas F20-F29 Esquizofrenia, trastorno esquizotípico y trastornos de ideas delirantes F30-F39 Trastornos del humor (afectivos) F40-F48 Trastornos neuróticos, secundarios a situaciones estresantes y somatomorfos F50-F59 Trastornos del comportamiento asociados a disfunciones fisiológicas y a factores somáticos F60-F69 Trastornos de la personalidad y del comportamiento del adulto F70-F79 Retraso mental F80-F89 Trastorno del desarrollo psicológico F90-F98 Trastornos del comportamiento y de las emociones de comienzo habitual en la infancia y adolescencia - Apéndice 1 de los CDI-10: Criterios provisionales para trastornos determinados - Apéndice 2 de los CDI-10: Trastornos específicos de determinadas culturas - Notas sobre problemas no resueltos - Otros procesos de la CIE-10 frecuentemente asociados con trastornos mentales y del comportamiento - Tabla de equivalencias entre el Capítulo V de la CIE-9 y el Capítulo V de la CIE-10 - Instrumentos diagnósticos y publicaciones asociadas al Capítulo V de la CIE-10.","ISBN":"978-84-7903-492-4","language":"es","note":"Google-Books-ID: Y_oACCnRG34C","number-of-pages":"336","publisher":"Ed. Médica Panamericana","source":"Google Books","title":"Guía de Bolsillo de la Clasificación CIE-10: Clasificación de los Trastornos Mentales y del Comportamiento","title-short":"Guía de Bolsillo de la Clasificación CIE-10","issued":{"date-parts":[["2000"]]}}}],"schema":"https://github.com/citation-style-language/schema/raw/master/csl-citation.json"} </w:instrText>
       </w:r>
       <w:r>
         <w:fldChar w:fldCharType="separate"/>
       </w:r>
       <w:r>
-        <w:t>[6]</w:t>
+        <w:t>[3]</w:t>
       </w:r>
       <w:r>
         <w:fldChar w:fldCharType="end"/>
       </w:r>
       <w:r>
-        <w:t xml:space="preserve"> (Esta es la guía para diagnostico de trastornos mentales).</w:t>
+        <w:t xml:space="preserve"> (Esta es la guía para </w:t>
+      </w:r>
+      <w:proofErr w:type="spellStart"/>
+      <w:r>
+        <w:t>diagnostico</w:t>
+      </w:r>
+      <w:proofErr w:type="spellEnd"/>
+      <w:r>
+        <w:t xml:space="preserve"> de trastornos mentales).</w:t>
       </w:r>
     </w:p>
     <w:p>
@@ -5586,13 +5577,7 @@
         <w:rPr>
           <w:lang w:val="es-ES"/>
         </w:rPr>
-        <w:t>Tipos TDAH</w:t>
-      </w:r>
-      <w:r>
-        <w:rPr>
-          <w:lang w:val="es-ES"/>
-        </w:rPr>
-        <w:t xml:space="preserve"> (3)</w:t>
+        <w:t>Tipos</w:t>
       </w:r>
       <w:bookmarkEnd w:id="20"/>
     </w:p>
@@ -5633,6 +5618,7 @@
           <w:lang w:val="es-ES"/>
         </w:rPr>
       </w:pPr>
+      <w:proofErr w:type="spellStart"/>
       <w:r>
         <w:rPr>
           <w:lang w:val="es-ES"/>
@@ -5651,6 +5637,7 @@
         </w:rPr>
         <w:t>anificacion</w:t>
       </w:r>
+      <w:proofErr w:type="spellEnd"/>
     </w:p>
     <w:p>
       <w:pPr>
@@ -5821,6 +5808,144 @@
     </w:p>
     <w:p>
       <w:pPr>
+        <w:pStyle w:val="Textoindependiente"/>
+        <w:rPr>
+          <w:lang w:val="es-ES"/>
+        </w:rPr>
+      </w:pPr>
+      <w:r>
+        <w:rPr>
+          <w:lang w:val="es-ES"/>
+        </w:rPr>
+        <w:t>Un videojuego se puede entender como un programa interactivo que permite al jugador participar en un mundo ficticio, con unas reglas, y unas consecuencias a sus acciones</w:t>
+      </w:r>
+      <w:r>
+        <w:rPr>
+          <w:lang w:val="es-ES"/>
+        </w:rPr>
+        <w:fldChar w:fldCharType="begin"/>
+      </w:r>
+      <w:r>
+        <w:rPr>
+          <w:lang w:val="es-ES"/>
+        </w:rPr>
+        <w:instrText xml:space="preserve"> ADDIN ZOTERO_ITEM CSL_CITATION {"citationID":"6y1ePGUj","properties":{"unsorted":false,"formattedCitation":"[4], [5]","plainCitation":"[4], [5]","noteIndex":0},"citationItems":[{"id":55,"uris":["http://zotero.org/users/local/axS3HTYd/items/TS552UNA"],"itemData":{"id":55,"type":"article-journal","abstract":"During the last ﬁve decades, videogames evolved into a major component of popular culture as well as a multi-billion-dollar industry. The medium diversiﬁed tremendously, currently encompassing simple implementations of numeric games on the screen of a cell phone as well as vast, persistent online worlds on last generation consoles and PCs. In spite of its cultural and economic relevance, few attempts have been made to deﬁne what a videogame exactly is. In this article, I endeavour to propose an essentialist deﬁnition of videogame, that is, one structured in terms of necessary and sufﬁcient conditions. I begin with a critical consideration of the main theoretical approaches to the medium and the few published deﬁnitions. From this analysis, four essential properties are deﬁned and separately characterized. Finally, a deﬁnition is proposed, capable of encompassing the medium in both its speciﬁcity and variability.","container-title":"The Computer Games Journal","DOI":"10.1007/s40869-017-0045-4","ISSN":"2052-773X","issue":"4","journalAbbreviation":"Comput Game J","language":"en","page":"239-255","source":"DOI.org (Crossref)","title":"Fifty Years on, What Exactly is a Videogame? An Essentialistic Definitional Approach","title-short":"Fifty Years on, What Exactly is a Videogame?","volume":"6","author":[{"family":"Bergonse","given":"Rafaello"}],"issued":{"date-parts":[["2017",12]]}}},{"id":59,"uris":["http://zotero.org/users/local/axS3HTYd/items/GWFVCQ5U"],"itemData":{"id":59,"type":"paper-conference","abstract":"Videogames have been studied seriously only for a few years. So, we can wonder how we could  use the recent academic works to approach new design methods. This article proposes a first  step: a short and simple definition of what a videogame is, this definition being connected with  existing academic works about  game,  play,  interactivity, and  narrative. The definition is: A  videogame is a game which we play thanks to an audiovisual apparatus and which can be based  on a  story. The article also shows what the videogame heritage teaches us about what a  videogame is.","container-title":"Proceedings of DiGRA 2005 Conference: Changing Views: Worlds in Play","DOI":"10.26503/dl.v2005i1.177","event-title":"Proceedings of DiGRA 2005 Conference: Changing Views: Worlds in Play","ISSN":"2342-9666","language":"en","license":"Copyright (c) 2005 Nicolas   Esposito","source":"dl.digra.org","title":"A Short and Simple Definition of What a Videogame Is","URL":"https://dl.digra.org/index.php/dl/article/view/177","author":[{"family":"Esposito","given":"Nicolas"}],"accessed":{"date-parts":[["2026",8,7]]},"issued":{"date-parts":[["2005",1,1]]}}}],"schema":"https://github.com/citation-style-language/schema/raw/master/csl-citation.json"} </w:instrText>
+      </w:r>
+      <w:r>
+        <w:rPr>
+          <w:lang w:val="es-ES"/>
+        </w:rPr>
+        <w:fldChar w:fldCharType="separate"/>
+      </w:r>
+      <w:r>
+        <w:rPr>
+          <w:lang w:val="es-ES"/>
+        </w:rPr>
+        <w:t>[4], [5]</w:t>
+      </w:r>
+      <w:r>
+        <w:rPr>
+          <w:lang w:val="es-ES"/>
+        </w:rPr>
+        <w:fldChar w:fldCharType="end"/>
+      </w:r>
+      <w:r>
+        <w:rPr>
+          <w:lang w:val="es-ES"/>
+        </w:rPr>
+        <w:t xml:space="preserve">. </w:t>
+      </w:r>
+    </w:p>
+    <w:p>
+      <w:pPr>
+        <w:pStyle w:val="Textoindependiente"/>
+        <w:rPr>
+          <w:lang w:val="es-ES"/>
+        </w:rPr>
+      </w:pPr>
+      <w:r>
+        <w:rPr>
+          <w:lang w:val="es-ES"/>
+        </w:rPr>
+        <w:t xml:space="preserve">No hay una definición única y universal </w:t>
+      </w:r>
+      <w:r>
+        <w:rPr>
+          <w:lang w:val="es-ES"/>
+        </w:rPr>
+        <w:t>debido a la diversidad de formas que adoptan los videojuegos y a las diferentes perspectivas desde las que pueden estudiarse</w:t>
+      </w:r>
+      <w:r>
+        <w:rPr>
+          <w:lang w:val="es-ES"/>
+        </w:rPr>
+        <w:fldChar w:fldCharType="begin"/>
+      </w:r>
+      <w:r>
+        <w:rPr>
+          <w:lang w:val="es-ES"/>
+        </w:rPr>
+        <w:instrText xml:space="preserve"> ADDIN ZOTERO_ITEM CSL_CITATION {"citationID":"hGeCMKMe","properties":{"unsorted":false,"formattedCitation":"[6]","plainCitation":"[6]","noteIndex":0},"citationItems":[{"id":57,"uris":["http://zotero.org/users/local/axS3HTYd/items/IV9CTCMN"],"itemData":{"id":57,"type":"article-journal","abstract":"This article provides guidelines on how to make useful game definitions and discusses when that is a worthwhile undertaking. It examines a recent article attempting to define videogames (Bergonse in Comput Games J 6(4):239–255, 2017. https ://doi.org/10.1007/s40869-017-0045-4), and uses it as an example to discuss game definitions in general. It concludes with reasons why making a final definition of games is not possible and why we need to continue to define games.","container-title":"The Computer Games Journal","DOI":"10.1007/s40869-019-00080-6","ISSN":"2052-773X","issue":"3-4","journalAbbreviation":"Comput Game J","language":"en","page":"109-120","source":"DOI.org (Crossref)","title":"How to Define Games and Why We Need to","volume":"8","author":[{"family":"Arjoranta","given":"Jonne"}],"issued":{"date-parts":[["2019",12]]}}}],"schema":"https://github.com/citation-style-language/schema/raw/master/csl-citation.json"} </w:instrText>
+      </w:r>
+      <w:r>
+        <w:rPr>
+          <w:lang w:val="es-ES"/>
+        </w:rPr>
+        <w:fldChar w:fldCharType="separate"/>
+      </w:r>
+      <w:r>
+        <w:rPr>
+          <w:lang w:val="es-ES"/>
+        </w:rPr>
+        <w:t>[6]</w:t>
+      </w:r>
+      <w:r>
+        <w:rPr>
+          <w:lang w:val="es-ES"/>
+        </w:rPr>
+        <w:fldChar w:fldCharType="end"/>
+      </w:r>
+      <w:r>
+        <w:rPr>
+          <w:lang w:val="es-ES"/>
+        </w:rPr>
+        <w:t>.</w:t>
+      </w:r>
+      <w:r>
+        <w:rPr>
+          <w:lang w:val="es-ES"/>
+        </w:rPr>
+        <w:t xml:space="preserve"> </w:t>
+      </w:r>
+      <w:r>
+        <w:rPr>
+          <w:lang w:val="es-ES"/>
+        </w:rPr>
+        <w:t>Es cierto que suelen tener el objetivo de entretener, pero no tiene porqué suceder en todos, como en el caso de los juegos serios.</w:t>
+      </w:r>
+    </w:p>
+    <w:p>
+      <w:pPr>
+        <w:pStyle w:val="Textoindependiente"/>
+        <w:rPr>
+          <w:lang w:val="es-ES"/>
+        </w:rPr>
+      </w:pPr>
+      <w:r>
+        <w:rPr>
+          <w:lang w:val="es-ES"/>
+        </w:rPr>
+        <w:t>Tipos de videojuegos que hay</w:t>
+      </w:r>
+      <w:r>
+        <w:rPr>
+          <w:lang w:val="es-ES"/>
+        </w:rPr>
+        <w:t>…</w:t>
+      </w:r>
+    </w:p>
+    <w:p>
+      <w:pPr>
         <w:pStyle w:val="Ttulo3"/>
         <w:rPr>
           <w:lang w:val="es-ES"/>
@@ -5837,6 +5962,165 @@
     </w:p>
     <w:p>
       <w:pPr>
+        <w:pStyle w:val="NormalWeb"/>
+        <w:spacing w:before="0" w:after="160"/>
+        <w:rPr>
+          <w:color w:val="000000"/>
+          <w:szCs w:val="22"/>
+        </w:rPr>
+      </w:pPr>
+      <w:r>
+        <w:rPr>
+          <w:color w:val="000000"/>
+          <w:szCs w:val="22"/>
+        </w:rPr>
+        <w:t xml:space="preserve">Los juegos serios son videojuegos diseñados con el objetivo de educar o enseñar y no tienen </w:t>
+      </w:r>
+      <w:r>
+        <w:rPr>
+          <w:color w:val="000000"/>
+          <w:szCs w:val="22"/>
+        </w:rPr>
+        <w:t>por qué</w:t>
+      </w:r>
+      <w:r>
+        <w:rPr>
+          <w:color w:val="000000"/>
+          <w:szCs w:val="22"/>
+        </w:rPr>
+        <w:t xml:space="preserve"> tener el objetivo de entretener.</w:t>
+      </w:r>
+      <w:r>
+        <w:rPr>
+          <w:color w:val="000000"/>
+          <w:szCs w:val="22"/>
+        </w:rPr>
+        <w:t xml:space="preserve"> S</w:t>
+      </w:r>
+      <w:r>
+        <w:rPr>
+          <w:color w:val="000000"/>
+          <w:szCs w:val="22"/>
+        </w:rPr>
+        <w:t>e diseñan para alcanzar objetivos relacionados con la educación, la formación o la transmisión de información</w:t>
+      </w:r>
+      <w:r>
+        <w:rPr>
+          <w:color w:val="000000"/>
+          <w:szCs w:val="22"/>
+        </w:rPr>
+        <w:fldChar w:fldCharType="begin"/>
+      </w:r>
+      <w:r>
+        <w:rPr>
+          <w:color w:val="000000"/>
+          <w:szCs w:val="22"/>
+        </w:rPr>
+        <w:instrText xml:space="preserve"> ADDIN ZOTERO_ITEM CSL_CITATION {"citationID":"cAtawusF","properties":{"unsorted":false,"formattedCitation":"[7]","plainCitation":"[7]","noteIndex":0},"citationItems":[{"id":61,"uris":["http://zotero.org/users/local/axS3HTYd/items/RUN9MV5P"],"itemData":{"id":61,"type":"article-journal","abstract":"During the past decades, the virtual reality community has based its development on a synthesis of earlier work in interactive 3D graphics, user interfaces, and visual simulation. Currently, the VR field is transitioning into work influenced by video games. Because much of the research and development being conducted in the games community parallels the VR community's efforts, it has the potential to affect a greater audience. Given these trends, VR researchers who want their work to remain relevant must realign to focus on game research and development. Leveraging technology from the visual simulation and virtual reality communities, serious games provide a delivery system for organizational video game instruction and training.","container-title":"Computer","DOI":"10.1109/MC.2005.297","ISSN":"1558-0814","issue":"9","page":"25-32","source":"IEEE Xplore","title":"From visual simulation to virtual reality to games","volume":"38","author":[{"family":"Zyda","given":"M."}],"issued":{"date-parts":[["2005",9]]}}}],"schema":"https://github.com/citation-style-language/schema/raw/master/csl-citation.json"} </w:instrText>
+      </w:r>
+      <w:r>
+        <w:rPr>
+          <w:color w:val="000000"/>
+          <w:szCs w:val="22"/>
+        </w:rPr>
+        <w:fldChar w:fldCharType="separate"/>
+      </w:r>
+      <w:r>
+        <w:t>[7]</w:t>
+      </w:r>
+      <w:r>
+        <w:rPr>
+          <w:color w:val="000000"/>
+          <w:szCs w:val="22"/>
+        </w:rPr>
+        <w:fldChar w:fldCharType="end"/>
+      </w:r>
+      <w:r>
+        <w:rPr>
+          <w:color w:val="000000"/>
+          <w:szCs w:val="22"/>
+        </w:rPr>
+        <w:t xml:space="preserve">. </w:t>
+      </w:r>
+      <w:r>
+        <w:rPr>
+          <w:color w:val="000000"/>
+          <w:szCs w:val="22"/>
+          <w:highlight w:val="yellow"/>
+        </w:rPr>
+        <w:sym w:font="Wingdings" w:char="F0E0"/>
+      </w:r>
+      <w:r>
+        <w:rPr>
+          <w:color w:val="000000"/>
+          <w:szCs w:val="22"/>
+          <w:highlight w:val="yellow"/>
+        </w:rPr>
+        <w:t xml:space="preserve"> </w:t>
+      </w:r>
+      <w:r>
+        <w:rPr>
+          <w:color w:val="000000"/>
+          <w:szCs w:val="22"/>
+          <w:highlight w:val="yellow"/>
+        </w:rPr>
+        <w:t xml:space="preserve">y </w:t>
+      </w:r>
+      <w:r>
+        <w:rPr>
+          <w:color w:val="000000"/>
+          <w:szCs w:val="22"/>
+          <w:highlight w:val="yellow"/>
+        </w:rPr>
+        <w:t>(</w:t>
+      </w:r>
+      <w:r>
+        <w:rPr>
+          <w:color w:val="000000"/>
+          <w:szCs w:val="22"/>
+          <w:highlight w:val="yellow"/>
+        </w:rPr>
+        <w:t>Michael &amp; Chen, 2006</w:t>
+      </w:r>
+      <w:r>
+        <w:rPr>
+          <w:color w:val="000000"/>
+          <w:szCs w:val="22"/>
+          <w:highlight w:val="yellow"/>
+        </w:rPr>
+        <w:t>) no encuentro el libro.</w:t>
+      </w:r>
+    </w:p>
+    <w:p>
+      <w:pPr>
+        <w:pStyle w:val="NormalWeb"/>
+        <w:spacing w:before="0" w:after="160"/>
+        <w:rPr>
+          <w:color w:val="000000"/>
+          <w:szCs w:val="22"/>
+        </w:rPr>
+      </w:pPr>
+    </w:p>
+    <w:p>
+      <w:pPr>
+        <w:pStyle w:val="NormalWeb"/>
+        <w:spacing w:before="0" w:after="160"/>
+      </w:pPr>
+      <w:r>
+        <w:rPr>
+          <w:color w:val="000000"/>
+          <w:szCs w:val="22"/>
+        </w:rPr>
+        <w:t>El uso de este tipo de juegos como herramienta para la educación y el entrenamiento cognitivo ha ido aumentando a medida que pasan los años. </w:t>
+      </w:r>
+    </w:p>
+    <w:p>
+      <w:pPr>
+        <w:pStyle w:val="Textoindependiente"/>
+      </w:pPr>
+    </w:p>
+    <w:p>
+      <w:pPr>
         <w:pStyle w:val="Ttulo3"/>
         <w:rPr>
           <w:lang w:val="es-ES"/>
@@ -5921,8 +6205,21 @@
         <w:rPr>
           <w:lang w:val="es-ES"/>
         </w:rPr>
-        <w:lastRenderedPageBreak/>
-        <w:t>Juegos serios para educación (para TDAH?)</w:t>
+        <w:t>Juegos serios para educación (</w:t>
+      </w:r>
+      <w:proofErr w:type="gramStart"/>
+      <w:r>
+        <w:rPr>
+          <w:lang w:val="es-ES"/>
+        </w:rPr>
+        <w:t>para TDAH?</w:t>
+      </w:r>
+      <w:proofErr w:type="gramEnd"/>
+      <w:r>
+        <w:rPr>
+          <w:lang w:val="es-ES"/>
+        </w:rPr>
+        <w:t>)</w:t>
       </w:r>
       <w:bookmarkEnd w:id="31"/>
     </w:p>
@@ -6114,7 +6411,21 @@
         <w:rPr>
           <w:lang w:val="es-ES"/>
         </w:rPr>
-        <w:t xml:space="preserve">Pruebas explicar bien que fue en </w:t>
+        <w:t xml:space="preserve">Pruebas </w:t>
+      </w:r>
+      <w:proofErr w:type="gramStart"/>
+      <w:r>
+        <w:rPr>
+          <w:lang w:val="es-ES"/>
+        </w:rPr>
+        <w:t>explicar</w:t>
+      </w:r>
+      <w:proofErr w:type="gramEnd"/>
+      <w:r>
+        <w:rPr>
+          <w:lang w:val="es-ES"/>
+        </w:rPr>
+        <w:t xml:space="preserve"> bien que fue en </w:t>
       </w:r>
       <w:r>
         <w:rPr>
@@ -6397,6 +6708,30 @@
         <w:rPr>
           <w:lang w:val="es-ES"/>
         </w:rPr>
+      </w:pPr>
+      <w:bookmarkStart w:id="51" w:name="_Toc236766602"/>
+      <w:r>
+        <w:rPr>
+          <w:lang w:val="es-ES"/>
+        </w:rPr>
+        <w:t>Trabajo Futuro</w:t>
+      </w:r>
+      <w:bookmarkEnd w:id="51"/>
+    </w:p>
+    <w:p>
+      <w:pPr>
+        <w:pStyle w:val="Textoindependiente"/>
+        <w:rPr>
+          <w:lang w:val="es-ES"/>
+        </w:rPr>
+      </w:pPr>
+    </w:p>
+    <w:p>
+      <w:pPr>
+        <w:pStyle w:val="Textoindependiente"/>
+        <w:rPr>
+          <w:lang w:val="es-ES"/>
+        </w:rPr>
         <w:sectPr>
           <w:type w:val="oddPage"/>
           <w:pgSz w:w="12240" w:h="15840"/>
@@ -6405,84 +6740,118 @@
           <w:docGrid w:linePitch="360"/>
         </w:sectPr>
       </w:pPr>
-      <w:bookmarkStart w:id="51" w:name="_Toc236766602"/>
-      <w:r>
-        <w:rPr>
-          <w:lang w:val="es-ES"/>
-        </w:rPr>
-        <w:t>Trabajo Futuro</w:t>
-      </w:r>
-      <w:bookmarkEnd w:id="51"/>
+      <w:r>
+        <w:rPr>
+          <w:lang w:val="es-ES"/>
+        </w:rPr>
+        <w:t xml:space="preserve">Realizar pruebas estando presente y que sean para mejorar el </w:t>
+      </w:r>
+      <w:proofErr w:type="gramStart"/>
+      <w:r>
+        <w:rPr>
+          <w:lang w:val="es-ES"/>
+        </w:rPr>
+        <w:t>juego  con</w:t>
+      </w:r>
+      <w:proofErr w:type="gramEnd"/>
+      <w:r>
+        <w:rPr>
+          <w:lang w:val="es-ES"/>
+        </w:rPr>
+        <w:t xml:space="preserve"> el </w:t>
+      </w:r>
+      <w:proofErr w:type="spellStart"/>
+      <w:r>
+        <w:rPr>
+          <w:lang w:val="es-ES"/>
+        </w:rPr>
+        <w:t>feedback</w:t>
+      </w:r>
+      <w:proofErr w:type="spellEnd"/>
+      <w:r>
+        <w:rPr>
+          <w:lang w:val="es-ES"/>
+        </w:rPr>
+        <w:t xml:space="preserve"> de los jugadores</w:t>
+      </w:r>
     </w:p>
     <w:p>
       <w:pPr>
         <w:pStyle w:val="EnglishSectionTitle"/>
+        <w:rPr>
+          <w:lang w:val="es-ES"/>
+        </w:rPr>
       </w:pPr>
       <w:bookmarkStart w:id="52" w:name="_Toc116636447"/>
       <w:bookmarkStart w:id="53" w:name="_Toc236766603"/>
-      <w:r>
+      <w:proofErr w:type="spellStart"/>
+      <w:r>
+        <w:rPr>
+          <w:lang w:val="es-ES"/>
+        </w:rPr>
         <w:lastRenderedPageBreak/>
         <w:t>Introduction</w:t>
       </w:r>
       <w:bookmarkEnd w:id="52"/>
       <w:bookmarkEnd w:id="53"/>
-    </w:p>
-    <w:p>
-      <w:pPr>
+      <w:proofErr w:type="spellEnd"/>
+    </w:p>
+    <w:p>
+      <w:pPr>
+        <w:rPr>
+          <w:lang w:val="es-ES"/>
+        </w:rPr>
+      </w:pPr>
+      <w:r>
+        <w:rPr>
+          <w:lang w:val="es-ES"/>
+        </w:rPr>
+        <w:t>“</w:t>
+      </w:r>
+      <w:r>
         <w:rPr>
           <w:lang w:val="en-US"/>
         </w:rPr>
-      </w:pPr>
+        <w:fldChar w:fldCharType="begin"/>
+      </w:r>
+      <w:r>
+        <w:rPr>
+          <w:lang w:val="es-ES"/>
+        </w:rPr>
+        <w:instrText xml:space="preserve"> REF _Ref11684759 \h </w:instrText>
+      </w:r>
       <w:r>
         <w:rPr>
           <w:lang w:val="en-US"/>
         </w:rPr>
-        <w:t>“</w:t>
       </w:r>
       <w:r>
         <w:rPr>
           <w:lang w:val="en-US"/>
         </w:rPr>
-        <w:fldChar w:fldCharType="begin"/>
+        <w:fldChar w:fldCharType="separate"/>
+      </w:r>
+      <w:r>
+        <w:rPr>
+          <w:lang w:val="es-ES"/>
+        </w:rPr>
+        <w:t>Introducción</w:t>
       </w:r>
       <w:r>
         <w:rPr>
           <w:lang w:val="en-US"/>
         </w:rPr>
-        <w:instrText xml:space="preserve"> REF _Ref11684759 \h </w:instrText>
-      </w:r>
-      <w:r>
-        <w:rPr>
-          <w:lang w:val="en-US"/>
-        </w:rPr>
-      </w:r>
-      <w:r>
-        <w:rPr>
-          <w:lang w:val="en-US"/>
-        </w:rPr>
-        <w:fldChar w:fldCharType="separate"/>
-      </w:r>
-      <w:r>
-        <w:rPr>
-          <w:lang w:val="en-US"/>
-        </w:rPr>
-        <w:t>Introducción</w:t>
-      </w:r>
-      <w:r>
-        <w:rPr>
-          <w:lang w:val="en-US"/>
-        </w:rPr>
         <w:fldChar w:fldCharType="end"/>
       </w:r>
       <w:r>
         <w:rPr>
-          <w:lang w:val="en-US"/>
+          <w:lang w:val="es-ES"/>
         </w:rPr>
         <w:t xml:space="preserve">” </w:t>
       </w:r>
       <w:r>
         <w:rPr>
-          <w:lang w:val="en-US"/>
+          <w:lang w:val="es-ES"/>
         </w:rPr>
         <w:t>traducción.</w:t>
       </w:r>
@@ -6494,16 +6863,26 @@
           <w:lang w:val="es-ES"/>
         </w:rPr>
       </w:pPr>
+      <w:proofErr w:type="spellStart"/>
       <w:r>
         <w:rPr>
           <w:lang w:val="es-ES"/>
         </w:rPr>
         <w:t>Motivation</w:t>
       </w:r>
-    </w:p>
-    <w:p>
-      <w:r>
-        <w:t xml:space="preserve">Los títulos de las subsecciones de esta sección (Introduction) usan el estilo </w:t>
+      <w:proofErr w:type="spellEnd"/>
+    </w:p>
+    <w:p>
+      <w:r>
+        <w:t>Los títulos de las subsecciones de esta sección (</w:t>
+      </w:r>
+      <w:proofErr w:type="spellStart"/>
+      <w:r>
+        <w:t>Introduction</w:t>
+      </w:r>
+      <w:proofErr w:type="spellEnd"/>
+      <w:r>
+        <w:t xml:space="preserve">) usan el estilo </w:t>
       </w:r>
       <w:r>
         <w:t>Título 7</w:t>
@@ -6568,15 +6947,31 @@
       </w:pPr>
       <w:bookmarkStart w:id="54" w:name="_Toc116636448"/>
       <w:bookmarkStart w:id="55" w:name="_Toc236766604"/>
+      <w:proofErr w:type="spellStart"/>
       <w:r>
         <w:rPr>
           <w:lang w:val="es-ES"/>
         </w:rPr>
         <w:lastRenderedPageBreak/>
-        <w:t>Conclusions and future work</w:t>
+        <w:t>Conclusions</w:t>
+      </w:r>
+      <w:proofErr w:type="spellEnd"/>
+      <w:r>
+        <w:rPr>
+          <w:lang w:val="es-ES"/>
+        </w:rPr>
+        <w:t xml:space="preserve"> and future </w:t>
+      </w:r>
+      <w:proofErr w:type="spellStart"/>
+      <w:r>
+        <w:rPr>
+          <w:lang w:val="es-ES"/>
+        </w:rPr>
+        <w:t>work</w:t>
       </w:r>
       <w:bookmarkEnd w:id="54"/>
       <w:bookmarkEnd w:id="55"/>
+      <w:proofErr w:type="spellEnd"/>
     </w:p>
     <w:p>
       <w:pPr>
@@ -6667,9 +7062,19 @@
       <w:r>
         <w:t>Los títulos de las subsecciones de esta sección (</w:t>
       </w:r>
-      <w:r>
-        <w:t>Conclusions and future work</w:t>
-      </w:r>
+      <w:proofErr w:type="spellStart"/>
+      <w:r>
+        <w:t>Conclusions</w:t>
+      </w:r>
+      <w:proofErr w:type="spellEnd"/>
+      <w:r>
+        <w:t xml:space="preserve"> and future </w:t>
+      </w:r>
+      <w:proofErr w:type="spellStart"/>
+      <w:r>
+        <w:t>work</w:t>
+      </w:r>
+      <w:proofErr w:type="spellEnd"/>
       <w:r>
         <w:t xml:space="preserve">) usan el estilo </w:t>
       </w:r>
@@ -6729,6 +7134,7 @@
       </w:pPr>
       <w:bookmarkStart w:id="58" w:name="_Toc116636450"/>
       <w:bookmarkStart w:id="59" w:name="_Toc236766605"/>
+      <w:proofErr w:type="spellStart"/>
       <w:r>
         <w:lastRenderedPageBreak/>
         <w:t>Bibliografía</w:t>
@@ -6736,6 +7142,7 @@
       <w:bookmarkEnd w:id="56"/>
       <w:bookmarkEnd w:id="58"/>
       <w:bookmarkEnd w:id="59"/>
+      <w:proofErr w:type="spellEnd"/>
       <w:r>
         <w:rPr>
           <w:sz w:val="22"/>
@@ -6805,41 +7212,78 @@
       </w:r>
       <w:r>
         <w:tab/>
-        <w:t>E. Joselevich, G. Bernaldo de Quirós, M. B. Moyano, R. O. Scandar, y V. Vainer, «A.D/H.D.: qué es, qué hacer</w:t>
-      </w:r>
-      <w:r>
-        <w:rPr>
-          <w:rFonts w:ascii="Arial" w:hAnsi="Arial" w:cs="Arial"/>
-        </w:rPr>
-        <w:t> </w:t>
-      </w:r>
-      <w:r>
-        <w:t xml:space="preserve">: recomendaciones para padres y docentes», en </w:t>
+        <w:t xml:space="preserve">G. Tripp y J. R. Wickens, «Neurobiology of ADHD», </w:t>
       </w:r>
       <w:r>
         <w:rPr>
           <w:i/>
           <w:iCs/>
         </w:rPr>
-        <w:t>A.D/H.D.: qué es, qué hacer</w:t>
-      </w:r>
-      <w:r>
-        <w:rPr>
-          <w:rFonts w:ascii="Arial" w:hAnsi="Arial" w:cs="Arial"/>
+        <w:t>Neuropharmacology</w:t>
+      </w:r>
+      <w:r>
+        <w:t>, vol. 57, n.</w:t>
+      </w:r>
+      <w:r>
+        <w:rPr>
+          <w:vertAlign w:val="superscript"/>
+        </w:rPr>
+        <w:t>o</w:t>
+      </w:r>
+      <w:r>
+        <w:t xml:space="preserve"> 7-8, pp. 579-589, dic. 2009, doi: 10.1016/j.neuropharm.2009.07.026.</w:t>
+      </w:r>
+    </w:p>
+    <w:p>
+      <w:pPr>
+        <w:pStyle w:val="Bibliografa"/>
+      </w:pPr>
+      <w:r>
+        <w:t>[3]</w:t>
+      </w:r>
+      <w:r>
+        <w:tab/>
+      </w:r>
+      <w:r>
+        <w:rPr>
           <w:i/>
           <w:iCs/>
         </w:rPr>
-        <w:t> </w:t>
+        <w:t>Guía de Bolsillo de la Clasificación CIE-10: Clasificación de los Trastornos Mentales y del Comportamiento</w:t>
+      </w:r>
+      <w:r>
+        <w:t>. Ed. Médica Panamericana, 2000.</w:t>
+      </w:r>
+    </w:p>
+    <w:p>
+      <w:pPr>
+        <w:pStyle w:val="Bibliografa"/>
+      </w:pPr>
+      <w:r>
+        <w:t>[4]</w:t>
+      </w:r>
+      <w:r>
+        <w:tab/>
+        <w:t xml:space="preserve">R. Bergonse, «Fifty Years on, What Exactly is a Videogame? An Essentialistic Definitional Approach», </w:t>
       </w:r>
       <w:r>
         <w:rPr>
           <w:i/>
           <w:iCs/>
         </w:rPr>
-        <w:t>: recomendaciones para padres y docentes</w:t>
-      </w:r>
-      <w:r>
-        <w:t>, pp. 267-267. Accedido: 1 de mayo de 2026. [En línea]. Disponible en: https://pesquisa.bvsalud.org/portal/resource/pt/biblio-1201519</w:t>
+        <w:t>Comput. Games J.</w:t>
+      </w:r>
+      <w:r>
+        <w:t>, vol. 6, n.</w:t>
+      </w:r>
+      <w:r>
+        <w:rPr>
+          <w:vertAlign w:val="superscript"/>
+        </w:rPr>
+        <w:t>o</w:t>
+      </w:r>
+      <w:r>
+        <w:t xml:space="preserve"> 4, pp. 239-255, dic. 2017, doi: 10.1007/s40869-017-0045-4.</w:t>
       </w:r>
     </w:p>
     <w:p>
@@ -6847,30 +7291,21 @@
         <w:pStyle w:val="Bibliografa"/>
       </w:pPr>
       <w:r>
-        <w:t>[3]</w:t>
+        <w:t>[5]</w:t>
       </w:r>
       <w:r>
         <w:tab/>
-        <w:t xml:space="preserve">R. A. Barkley, L. E. Knouse, y K. R. Murphy, «“Correspondence and disparity in the self- and other ratings of current and childhood ADHD symptoms and impairment in adults with ADHD”: Correction to Barkley et al. (2011)», </w:t>
+        <w:t xml:space="preserve">N. Esposito, «A Short and Simple Definition of What a Videogame Is», en </w:t>
       </w:r>
       <w:r>
         <w:rPr>
           <w:i/>
           <w:iCs/>
         </w:rPr>
-        <w:t>Psychol. Assess.</w:t>
-      </w:r>
-      <w:r>
-        <w:t>, vol. 23, n.</w:t>
-      </w:r>
-      <w:r>
-        <w:rPr>
-          <w:vertAlign w:val="superscript"/>
-        </w:rPr>
-        <w:t>o</w:t>
-      </w:r>
-      <w:r>
-        <w:t xml:space="preserve"> 2, pp. 446-446, 2011, doi: 10.1037/a0024001.</w:t>
+        <w:t>Proceedings of DiGRA 2005 Conference: Changing Views: Worlds in Play</w:t>
+      </w:r>
+      <w:r>
+        <w:t>, ene. 2005. doi: 10.26503/dl.v2005i1.177.</w:t>
       </w:r>
     </w:p>
     <w:p>
@@ -6878,21 +7313,30 @@
         <w:pStyle w:val="Bibliografa"/>
       </w:pPr>
       <w:r>
-        <w:t>[4]</w:t>
+        <w:t>[6]</w:t>
       </w:r>
       <w:r>
         <w:tab/>
-        <w:t xml:space="preserve">C. B. González Calleros, J. Guerrero García, y Y. Navarro Rangel, «Uso de juegos serios como herramienta educativa para la enseñanza a niños con TDAH», </w:t>
+        <w:t xml:space="preserve">J. Arjoranta, «How to Define Games and Why We Need to», </w:t>
       </w:r>
       <w:r>
         <w:rPr>
           <w:i/>
           <w:iCs/>
         </w:rPr>
-        <w:t>RD-ICUAP</w:t>
-      </w:r>
-      <w:r>
-        <w:t>, abr. 2019, doi: 10.32399/icuap.rdic.2448-5829.2019.13.329.</w:t>
+        <w:t>Comput. Games J.</w:t>
+      </w:r>
+      <w:r>
+        <w:t>, vol. 8, n.</w:t>
+      </w:r>
+      <w:r>
+        <w:rPr>
+          <w:vertAlign w:val="superscript"/>
+        </w:rPr>
+        <w:t>o</w:t>
+      </w:r>
+      <w:r>
+        <w:t xml:space="preserve"> 3-4, pp. 109-120, dic. 2019, doi: 10.1007/s40869-019-00080-6.</w:t>
       </w:r>
     </w:p>
     <w:p>
@@ -6900,21 +7344,21 @@
         <w:pStyle w:val="Bibliografa"/>
       </w:pPr>
       <w:r>
-        <w:t>[5]</w:t>
+        <w:t>[7]</w:t>
       </w:r>
       <w:r>
         <w:tab/>
-        <w:t xml:space="preserve">G. Tripp y J. R. Wickens, «Neurobiology of ADHD», </w:t>
+        <w:t xml:space="preserve">M. Zyda, «From visual simulation to virtual reality to games», </w:t>
       </w:r>
       <w:r>
         <w:rPr>
           <w:i/>
           <w:iCs/>
         </w:rPr>
-        <w:t>Neuropharmacology</w:t>
-      </w:r>
-      <w:r>
-        <w:t>, vol. 57, n.</w:t>
+        <w:t>Computer</w:t>
+      </w:r>
+      <w:r>
+        <w:t>, vol. 38, n.</w:t>
       </w:r>
       <w:r>
         <w:rPr>
@@ -6923,28 +7367,7 @@
         <w:t>o</w:t>
       </w:r>
       <w:r>
-        <w:t xml:space="preserve"> 7-8, pp. 579-589, dic. 2009, doi: 10.1016/j.neuropharm.2009.07.026.</w:t>
-      </w:r>
-    </w:p>
-    <w:p>
-      <w:pPr>
-        <w:pStyle w:val="Bibliografa"/>
-      </w:pPr>
-      <w:r>
-        <w:t>[6]</w:t>
-      </w:r>
-      <w:r>
-        <w:tab/>
-      </w:r>
-      <w:r>
-        <w:rPr>
-          <w:i/>
-          <w:iCs/>
-        </w:rPr>
-        <w:t>Guía de Bolsillo de la Clasificación CIE-10: Clasificación de los Trastornos Mentales y del Comportamiento</w:t>
-      </w:r>
-      <w:r>
-        <w:t>. Ed. Médica Panamericana, 2000.</w:t>
+        <w:t xml:space="preserve"> 9, pp. 25-32, sep. 2005, doi: 10.1109/MC.2005.297.</w:t>
       </w:r>
     </w:p>
     <w:p>
@@ -7054,20 +7477,41 @@
     </w:p>
     <w:p>
       <w:r>
-        <w:t>Para los títulos de las subsecciones de los apéndices se utiliza el estilo Título 8. Para las sub-subsecciones se usa el estilo Título 9, como aparece a continuación.</w:t>
+        <w:t xml:space="preserve">Para los títulos de las subsecciones de los apéndices se utiliza el estilo Título 8. Para las </w:t>
+      </w:r>
+      <w:proofErr w:type="spellStart"/>
+      <w:r>
+        <w:t>sub-subsecciones</w:t>
+      </w:r>
+      <w:proofErr w:type="spellEnd"/>
+      <w:r>
+        <w:t xml:space="preserve"> se usa el estilo Título 9, como aparece a continuación.</w:t>
       </w:r>
     </w:p>
     <w:p>
       <w:pPr>
         <w:pStyle w:val="Ttulo9"/>
       </w:pPr>
-      <w:r>
-        <w:t>Sub-subsecciones del apéndice (Título 9)</w:t>
-      </w:r>
-    </w:p>
-    <w:p>
-      <w:r>
-        <w:t>Para las sub-subsecciones de un apéndice se utiliza el estilo Título 9. No se recomienda añadir más niveles de subsección</w:t>
+      <w:proofErr w:type="spellStart"/>
+      <w:r>
+        <w:t>Sub-subsecciones</w:t>
+      </w:r>
+      <w:proofErr w:type="spellEnd"/>
+      <w:r>
+        <w:t xml:space="preserve"> del apéndice (Título 9)</w:t>
+      </w:r>
+    </w:p>
+    <w:p>
+      <w:r>
+        <w:t xml:space="preserve">Para las </w:t>
+      </w:r>
+      <w:proofErr w:type="spellStart"/>
+      <w:r>
+        <w:t>sub-subsecciones</w:t>
+      </w:r>
+      <w:proofErr w:type="spellEnd"/>
+      <w:r>
+        <w:t xml:space="preserve"> de un apéndice se utiliza el estilo Título 9. No se recomienda añadir más niveles de subsección</w:t>
       </w:r>
       <w:r>
         <w:t>.</w:t>

</xml_diff>

<commit_message>
Avances estado del arte videojuegos
</commit_message>
<xml_diff>
--- a/MemoriaTFG/NahiaIglesiasEsquemaTFG.docx
+++ b/MemoriaTFG/NahiaIglesiasEsquemaTFG.docx
@@ -1412,7 +1412,7 @@
           <w:r>
             <w:fldChar w:fldCharType="separate"/>
           </w:r>
-          <w:hyperlink w:anchor="_Toc236766564" w:history="1">
+          <w:hyperlink w:anchor="_Toc237110981" w:history="1">
             <w:r>
               <w:rPr>
                 <w:rStyle w:val="Hipervnculo"/>
@@ -1439,7 +1439,7 @@
                 <w:noProof/>
                 <w:webHidden/>
               </w:rPr>
-              <w:instrText xml:space="preserve"> PAGEREF _Toc236766564 \h </w:instrText>
+              <w:instrText xml:space="preserve"> PAGEREF _Toc237110981 \h </w:instrText>
             </w:r>
             <w:r>
               <w:rPr>
@@ -1485,7 +1485,7 @@
               <w14:ligatures w14:val="standardContextual"/>
             </w:rPr>
           </w:pPr>
-          <w:hyperlink w:anchor="_Toc236766565" w:history="1">
+          <w:hyperlink w:anchor="_Toc237110982" w:history="1">
             <w:r>
               <w:rPr>
                 <w:rStyle w:val="Hipervnculo"/>
@@ -1512,7 +1512,7 @@
                 <w:noProof/>
                 <w:webHidden/>
               </w:rPr>
-              <w:instrText xml:space="preserve"> PAGEREF _Toc236766565 \h </w:instrText>
+              <w:instrText xml:space="preserve"> PAGEREF _Toc237110982 \h </w:instrText>
             </w:r>
             <w:r>
               <w:rPr>
@@ -1558,7 +1558,7 @@
               <w14:ligatures w14:val="standardContextual"/>
             </w:rPr>
           </w:pPr>
-          <w:hyperlink w:anchor="_Toc236766566" w:history="1">
+          <w:hyperlink w:anchor="_Toc237110983" w:history="1">
             <w:r>
               <w:rPr>
                 <w:rStyle w:val="Hipervnculo"/>
@@ -1585,7 +1585,7 @@
                 <w:noProof/>
                 <w:webHidden/>
               </w:rPr>
-              <w:instrText xml:space="preserve"> PAGEREF _Toc236766566 \h </w:instrText>
+              <w:instrText xml:space="preserve"> PAGEREF _Toc237110983 \h </w:instrText>
             </w:r>
             <w:r>
               <w:rPr>
@@ -1631,7 +1631,7 @@
               <w14:ligatures w14:val="standardContextual"/>
             </w:rPr>
           </w:pPr>
-          <w:hyperlink w:anchor="_Toc236766567" w:history="1">
+          <w:hyperlink w:anchor="_Toc237110984" w:history="1">
             <w:r>
               <w:rPr>
                 <w:rStyle w:val="Hipervnculo"/>
@@ -1658,7 +1658,7 @@
                 <w:noProof/>
                 <w:webHidden/>
               </w:rPr>
-              <w:instrText xml:space="preserve"> PAGEREF _Toc236766567 \h </w:instrText>
+              <w:instrText xml:space="preserve"> PAGEREF _Toc237110984 \h </w:instrText>
             </w:r>
             <w:r>
               <w:rPr>
@@ -1704,7 +1704,7 @@
               <w14:ligatures w14:val="standardContextual"/>
             </w:rPr>
           </w:pPr>
-          <w:hyperlink w:anchor="_Toc236766568" w:history="1">
+          <w:hyperlink w:anchor="_Toc237110985" w:history="1">
             <w:r>
               <w:rPr>
                 <w:rStyle w:val="Hipervnculo"/>
@@ -1731,7 +1731,7 @@
                 <w:noProof/>
                 <w:webHidden/>
               </w:rPr>
-              <w:instrText xml:space="preserve"> PAGEREF _Toc236766568 \h </w:instrText>
+              <w:instrText xml:space="preserve"> PAGEREF _Toc237110985 \h </w:instrText>
             </w:r>
             <w:r>
               <w:rPr>
@@ -1777,7 +1777,7 @@
               <w14:ligatures w14:val="standardContextual"/>
             </w:rPr>
           </w:pPr>
-          <w:hyperlink w:anchor="_Toc236766569" w:history="1">
+          <w:hyperlink w:anchor="_Toc237110986" w:history="1">
             <w:r>
               <w:rPr>
                 <w:rStyle w:val="Hipervnculo"/>
@@ -1804,7 +1804,7 @@
                 <w:noProof/>
                 <w:webHidden/>
               </w:rPr>
-              <w:instrText xml:space="preserve"> PAGEREF _Toc236766569 \h </w:instrText>
+              <w:instrText xml:space="preserve"> PAGEREF _Toc237110986 \h </w:instrText>
             </w:r>
             <w:r>
               <w:rPr>
@@ -1825,77 +1825,6 @@
                 <w:webHidden/>
               </w:rPr>
               <w:t>2</w:t>
-            </w:r>
-            <w:r>
-              <w:rPr>
-                <w:noProof/>
-                <w:webHidden/>
-              </w:rPr>
-              <w:fldChar w:fldCharType="end"/>
-            </w:r>
-          </w:hyperlink>
-        </w:p>
-        <w:p>
-          <w:pPr>
-            <w:pStyle w:val="TDC1"/>
-            <w:rPr>
-              <w:rFonts w:asciiTheme="minorHAnsi" w:eastAsiaTheme="minorEastAsia" w:hAnsiTheme="minorHAnsi" w:cstheme="minorBidi"/>
-              <w:noProof/>
-              <w:kern w:val="2"/>
-              <w:sz w:val="24"/>
-              <w:lang w:val="es-ES" w:eastAsia="es-ES"/>
-              <w14:ligatures w14:val="standardContextual"/>
-            </w:rPr>
-          </w:pPr>
-          <w:hyperlink w:anchor="_Toc236766570" w:history="1">
-            <w:r>
-              <w:rPr>
-                <w:rStyle w:val="Hipervnculo"/>
-                <w:noProof/>
-                <w:lang w:val="es-ES"/>
-              </w:rPr>
-              <w:t>Capítulo 2 - Estado de la cuestión</w:t>
-            </w:r>
-            <w:r>
-              <w:rPr>
-                <w:noProof/>
-                <w:webHidden/>
-              </w:rPr>
-              <w:tab/>
-            </w:r>
-            <w:r>
-              <w:rPr>
-                <w:noProof/>
-                <w:webHidden/>
-              </w:rPr>
-              <w:fldChar w:fldCharType="begin"/>
-            </w:r>
-            <w:r>
-              <w:rPr>
-                <w:noProof/>
-                <w:webHidden/>
-              </w:rPr>
-              <w:instrText xml:space="preserve"> PAGEREF _Toc236766570 \h </w:instrText>
-            </w:r>
-            <w:r>
-              <w:rPr>
-                <w:noProof/>
-                <w:webHidden/>
-              </w:rPr>
-            </w:r>
-            <w:r>
-              <w:rPr>
-                <w:noProof/>
-                <w:webHidden/>
-              </w:rPr>
-              <w:fldChar w:fldCharType="separate"/>
-            </w:r>
-            <w:r>
-              <w:rPr>
-                <w:noProof/>
-                <w:webHidden/>
-              </w:rPr>
-              <w:t>3</w:t>
             </w:r>
             <w:r>
               <w:rPr>
@@ -1921,14 +1850,84 @@
               <w14:ligatures w14:val="standardContextual"/>
             </w:rPr>
           </w:pPr>
-          <w:hyperlink w:anchor="_Toc236766571" w:history="1">
+          <w:hyperlink w:anchor="_Toc237110987" w:history="1">
             <w:r>
               <w:rPr>
                 <w:rStyle w:val="Hipervnculo"/>
                 <w:noProof/>
+              </w:rPr>
+              <w:t>1.4 Estructura de la memoria</w:t>
+            </w:r>
+            <w:r>
+              <w:rPr>
+                <w:noProof/>
+                <w:webHidden/>
+              </w:rPr>
+              <w:tab/>
+            </w:r>
+            <w:r>
+              <w:rPr>
+                <w:noProof/>
+                <w:webHidden/>
+              </w:rPr>
+              <w:fldChar w:fldCharType="begin"/>
+            </w:r>
+            <w:r>
+              <w:rPr>
+                <w:noProof/>
+                <w:webHidden/>
+              </w:rPr>
+              <w:instrText xml:space="preserve"> PAGEREF _Toc237110987 \h </w:instrText>
+            </w:r>
+            <w:r>
+              <w:rPr>
+                <w:noProof/>
+                <w:webHidden/>
+              </w:rPr>
+            </w:r>
+            <w:r>
+              <w:rPr>
+                <w:noProof/>
+                <w:webHidden/>
+              </w:rPr>
+              <w:fldChar w:fldCharType="separate"/>
+            </w:r>
+            <w:r>
+              <w:rPr>
+                <w:noProof/>
+                <w:webHidden/>
+              </w:rPr>
+              <w:t>2</w:t>
+            </w:r>
+            <w:r>
+              <w:rPr>
+                <w:noProof/>
+                <w:webHidden/>
+              </w:rPr>
+              <w:fldChar w:fldCharType="end"/>
+            </w:r>
+          </w:hyperlink>
+        </w:p>
+        <w:p>
+          <w:pPr>
+            <w:pStyle w:val="TDC1"/>
+            <w:rPr>
+              <w:rFonts w:asciiTheme="minorHAnsi" w:eastAsiaTheme="minorEastAsia" w:hAnsiTheme="minorHAnsi" w:cstheme="minorBidi"/>
+              <w:noProof/>
+              <w:kern w:val="2"/>
+              <w:sz w:val="24"/>
+              <w:lang w:val="es-ES" w:eastAsia="es-ES"/>
+              <w14:ligatures w14:val="standardContextual"/>
+            </w:rPr>
+          </w:pPr>
+          <w:hyperlink w:anchor="_Toc237110988" w:history="1">
+            <w:r>
+              <w:rPr>
+                <w:rStyle w:val="Hipervnculo"/>
+                <w:noProof/>
                 <w:lang w:val="es-ES"/>
               </w:rPr>
-              <w:t>2.1 TDAH</w:t>
+              <w:t>Capítulo 2 - Estado de la cuestión</w:t>
             </w:r>
             <w:r>
               <w:rPr>
@@ -1949,7 +1948,81 @@
                 <w:noProof/>
                 <w:webHidden/>
               </w:rPr>
-              <w:instrText xml:space="preserve"> PAGEREF _Toc236766571 \h </w:instrText>
+              <w:instrText xml:space="preserve"> PAGEREF _Toc237110988 \h </w:instrText>
+            </w:r>
+            <w:r>
+              <w:rPr>
+                <w:noProof/>
+                <w:webHidden/>
+              </w:rPr>
+            </w:r>
+            <w:r>
+              <w:rPr>
+                <w:noProof/>
+                <w:webHidden/>
+              </w:rPr>
+              <w:fldChar w:fldCharType="separate"/>
+            </w:r>
+            <w:r>
+              <w:rPr>
+                <w:noProof/>
+                <w:webHidden/>
+              </w:rPr>
+              <w:t>3</w:t>
+            </w:r>
+            <w:r>
+              <w:rPr>
+                <w:noProof/>
+                <w:webHidden/>
+              </w:rPr>
+              <w:fldChar w:fldCharType="end"/>
+            </w:r>
+          </w:hyperlink>
+        </w:p>
+        <w:p>
+          <w:pPr>
+            <w:pStyle w:val="TDC2"/>
+            <w:tabs>
+              <w:tab w:val="right" w:leader="dot" w:pos="9350"/>
+            </w:tabs>
+            <w:rPr>
+              <w:rFonts w:asciiTheme="minorHAnsi" w:eastAsiaTheme="minorEastAsia" w:hAnsiTheme="minorHAnsi" w:cstheme="minorBidi"/>
+              <w:noProof/>
+              <w:kern w:val="2"/>
+              <w:sz w:val="24"/>
+              <w:lang w:val="es-ES" w:eastAsia="es-ES"/>
+              <w14:ligatures w14:val="standardContextual"/>
+            </w:rPr>
+          </w:pPr>
+          <w:hyperlink w:anchor="_Toc237110989" w:history="1">
+            <w:r>
+              <w:rPr>
+                <w:rStyle w:val="Hipervnculo"/>
+                <w:noProof/>
+                <w:lang w:val="es-ES"/>
+              </w:rPr>
+              <w:t>2.1 Trastorno por Déficit de Atención e Hiperactividad</w:t>
+            </w:r>
+            <w:r>
+              <w:rPr>
+                <w:noProof/>
+                <w:webHidden/>
+              </w:rPr>
+              <w:tab/>
+            </w:r>
+            <w:r>
+              <w:rPr>
+                <w:noProof/>
+                <w:webHidden/>
+              </w:rPr>
+              <w:fldChar w:fldCharType="begin"/>
+            </w:r>
+            <w:r>
+              <w:rPr>
+                <w:noProof/>
+                <w:webHidden/>
+              </w:rPr>
+              <w:instrText xml:space="preserve"> PAGEREF _Toc237110989 \h </w:instrText>
             </w:r>
             <w:r>
               <w:rPr>
@@ -1995,7 +2068,7 @@
               <w14:ligatures w14:val="standardContextual"/>
             </w:rPr>
           </w:pPr>
-          <w:hyperlink w:anchor="_Toc236766572" w:history="1">
+          <w:hyperlink w:anchor="_Toc237110990" w:history="1">
             <w:r>
               <w:rPr>
                 <w:rStyle w:val="Hipervnculo"/>
@@ -2023,7 +2096,7 @@
                 <w:noProof/>
                 <w:webHidden/>
               </w:rPr>
-              <w:instrText xml:space="preserve"> PAGEREF _Toc236766572 \h </w:instrText>
+              <w:instrText xml:space="preserve"> PAGEREF _Toc237110990 \h </w:instrText>
             </w:r>
             <w:r>
               <w:rPr>
@@ -2069,14 +2142,14 @@
               <w14:ligatures w14:val="standardContextual"/>
             </w:rPr>
           </w:pPr>
-          <w:hyperlink w:anchor="_Toc236766573" w:history="1">
+          <w:hyperlink w:anchor="_Toc237110991" w:history="1">
             <w:r>
               <w:rPr>
                 <w:rStyle w:val="Hipervnculo"/>
                 <w:noProof/>
                 <w:lang w:val="es-ES"/>
               </w:rPr>
-              <w:t>2.1.2 Tipos TDAH (3)</w:t>
+              <w:t>2.1.2 Tipos</w:t>
             </w:r>
             <w:r>
               <w:rPr>
@@ -2097,7 +2170,7 @@
                 <w:noProof/>
                 <w:webHidden/>
               </w:rPr>
-              <w:instrText xml:space="preserve"> PAGEREF _Toc236766573 \h </w:instrText>
+              <w:instrText xml:space="preserve"> PAGEREF _Toc237110991 \h </w:instrText>
             </w:r>
             <w:r>
               <w:rPr>
@@ -2143,7 +2216,7 @@
               <w14:ligatures w14:val="standardContextual"/>
             </w:rPr>
           </w:pPr>
-          <w:hyperlink w:anchor="_Toc236766574" w:history="1">
+          <w:hyperlink w:anchor="_Toc237110992" w:history="1">
             <w:r>
               <w:rPr>
                 <w:rStyle w:val="Hipervnculo"/>
@@ -2171,7 +2244,7 @@
                 <w:noProof/>
                 <w:webHidden/>
               </w:rPr>
-              <w:instrText xml:space="preserve"> PAGEREF _Toc236766574 \h </w:instrText>
+              <w:instrText xml:space="preserve"> PAGEREF _Toc237110992 \h </w:instrText>
             </w:r>
             <w:r>
               <w:rPr>
@@ -2217,7 +2290,7 @@
               <w14:ligatures w14:val="standardContextual"/>
             </w:rPr>
           </w:pPr>
-          <w:hyperlink w:anchor="_Toc236766575" w:history="1">
+          <w:hyperlink w:anchor="_Toc237110993" w:history="1">
             <w:r>
               <w:rPr>
                 <w:rStyle w:val="Hipervnculo"/>
@@ -2245,7 +2318,7 @@
                 <w:noProof/>
                 <w:webHidden/>
               </w:rPr>
-              <w:instrText xml:space="preserve"> PAGEREF _Toc236766575 \h </w:instrText>
+              <w:instrText xml:space="preserve"> PAGEREF _Toc237110993 \h </w:instrText>
             </w:r>
             <w:r>
               <w:rPr>
@@ -2265,7 +2338,7 @@
                 <w:noProof/>
                 <w:webHidden/>
               </w:rPr>
-              <w:t>3</w:t>
+              <w:t>4</w:t>
             </w:r>
             <w:r>
               <w:rPr>
@@ -2291,7 +2364,7 @@
               <w14:ligatures w14:val="standardContextual"/>
             </w:rPr>
           </w:pPr>
-          <w:hyperlink w:anchor="_Toc236766576" w:history="1">
+          <w:hyperlink w:anchor="_Toc237110994" w:history="1">
             <w:r>
               <w:rPr>
                 <w:rStyle w:val="Hipervnculo"/>
@@ -2319,7 +2392,7 @@
                 <w:noProof/>
                 <w:webHidden/>
               </w:rPr>
-              <w:instrText xml:space="preserve"> PAGEREF _Toc236766576 \h </w:instrText>
+              <w:instrText xml:space="preserve"> PAGEREF _Toc237110994 \h </w:instrText>
             </w:r>
             <w:r>
               <w:rPr>
@@ -2339,7 +2412,7 @@
                 <w:noProof/>
                 <w:webHidden/>
               </w:rPr>
-              <w:t>3</w:t>
+              <w:t>4</w:t>
             </w:r>
             <w:r>
               <w:rPr>
@@ -2365,7 +2438,7 @@
               <w14:ligatures w14:val="standardContextual"/>
             </w:rPr>
           </w:pPr>
-          <w:hyperlink w:anchor="_Toc236766577" w:history="1">
+          <w:hyperlink w:anchor="_Toc237110995" w:history="1">
             <w:r>
               <w:rPr>
                 <w:rStyle w:val="Hipervnculo"/>
@@ -2393,7 +2466,7 @@
                 <w:noProof/>
                 <w:webHidden/>
               </w:rPr>
-              <w:instrText xml:space="preserve"> PAGEREF _Toc236766577 \h </w:instrText>
+              <w:instrText xml:space="preserve"> PAGEREF _Toc237110995 \h </w:instrText>
             </w:r>
             <w:r>
               <w:rPr>
@@ -2413,7 +2486,7 @@
                 <w:noProof/>
                 <w:webHidden/>
               </w:rPr>
-              <w:t>3</w:t>
+              <w:t>4</w:t>
             </w:r>
             <w:r>
               <w:rPr>
@@ -2439,7 +2512,7 @@
               <w14:ligatures w14:val="standardContextual"/>
             </w:rPr>
           </w:pPr>
-          <w:hyperlink w:anchor="_Toc236766578" w:history="1">
+          <w:hyperlink w:anchor="_Toc237110996" w:history="1">
             <w:r>
               <w:rPr>
                 <w:rStyle w:val="Hipervnculo"/>
@@ -2467,7 +2540,7 @@
                 <w:noProof/>
                 <w:webHidden/>
               </w:rPr>
-              <w:instrText xml:space="preserve"> PAGEREF _Toc236766578 \h </w:instrText>
+              <w:instrText xml:space="preserve"> PAGEREF _Toc237110996 \h </w:instrText>
             </w:r>
             <w:r>
               <w:rPr>
@@ -2487,7 +2560,7 @@
                 <w:noProof/>
                 <w:webHidden/>
               </w:rPr>
-              <w:t>3</w:t>
+              <w:t>4</w:t>
             </w:r>
             <w:r>
               <w:rPr>
@@ -2513,7 +2586,7 @@
               <w14:ligatures w14:val="standardContextual"/>
             </w:rPr>
           </w:pPr>
-          <w:hyperlink w:anchor="_Toc236766579" w:history="1">
+          <w:hyperlink w:anchor="_Toc237110997" w:history="1">
             <w:r>
               <w:rPr>
                 <w:rStyle w:val="Hipervnculo"/>
@@ -2541,7 +2614,7 @@
                 <w:noProof/>
                 <w:webHidden/>
               </w:rPr>
-              <w:instrText xml:space="preserve"> PAGEREF _Toc236766579 \h </w:instrText>
+              <w:instrText xml:space="preserve"> PAGEREF _Toc237110997 \h </w:instrText>
             </w:r>
             <w:r>
               <w:rPr>
@@ -2587,7 +2660,7 @@
               <w14:ligatures w14:val="standardContextual"/>
             </w:rPr>
           </w:pPr>
-          <w:hyperlink w:anchor="_Toc236766580" w:history="1">
+          <w:hyperlink w:anchor="_Toc237110998" w:history="1">
             <w:r>
               <w:rPr>
                 <w:rStyle w:val="Hipervnculo"/>
@@ -2615,7 +2688,7 @@
                 <w:noProof/>
                 <w:webHidden/>
               </w:rPr>
-              <w:instrText xml:space="preserve"> PAGEREF _Toc236766580 \h </w:instrText>
+              <w:instrText xml:space="preserve"> PAGEREF _Toc237110998 \h </w:instrText>
             </w:r>
             <w:r>
               <w:rPr>
@@ -2635,7 +2708,7 @@
                 <w:noProof/>
                 <w:webHidden/>
               </w:rPr>
-              <w:t>4</w:t>
+              <w:t>5</w:t>
             </w:r>
             <w:r>
               <w:rPr>
@@ -2661,7 +2734,7 @@
               <w14:ligatures w14:val="standardContextual"/>
             </w:rPr>
           </w:pPr>
-          <w:hyperlink w:anchor="_Toc236766581" w:history="1">
+          <w:hyperlink w:anchor="_Toc237110999" w:history="1">
             <w:r>
               <w:rPr>
                 <w:rStyle w:val="Hipervnculo"/>
@@ -2689,7 +2762,7 @@
                 <w:noProof/>
                 <w:webHidden/>
               </w:rPr>
-              <w:instrText xml:space="preserve"> PAGEREF _Toc236766581 \h </w:instrText>
+              <w:instrText xml:space="preserve"> PAGEREF _Toc237110999 \h </w:instrText>
             </w:r>
             <w:r>
               <w:rPr>
@@ -2709,7 +2782,7 @@
                 <w:noProof/>
                 <w:webHidden/>
               </w:rPr>
-              <w:t>4</w:t>
+              <w:t>5</w:t>
             </w:r>
             <w:r>
               <w:rPr>
@@ -2735,7 +2808,7 @@
               <w14:ligatures w14:val="standardContextual"/>
             </w:rPr>
           </w:pPr>
-          <w:hyperlink w:anchor="_Toc236766582" w:history="1">
+          <w:hyperlink w:anchor="_Toc237111000" w:history="1">
             <w:r>
               <w:rPr>
                 <w:rStyle w:val="Hipervnculo"/>
@@ -2763,7 +2836,7 @@
                 <w:noProof/>
                 <w:webHidden/>
               </w:rPr>
-              <w:instrText xml:space="preserve"> PAGEREF _Toc236766582 \h </w:instrText>
+              <w:instrText xml:space="preserve"> PAGEREF _Toc237111000 \h </w:instrText>
             </w:r>
             <w:r>
               <w:rPr>
@@ -2783,7 +2856,7 @@
                 <w:noProof/>
                 <w:webHidden/>
               </w:rPr>
-              <w:t>4</w:t>
+              <w:t>6</w:t>
             </w:r>
             <w:r>
               <w:rPr>
@@ -2809,7 +2882,7 @@
               <w14:ligatures w14:val="standardContextual"/>
             </w:rPr>
           </w:pPr>
-          <w:hyperlink w:anchor="_Toc236766583" w:history="1">
+          <w:hyperlink w:anchor="_Toc237111001" w:history="1">
             <w:r>
               <w:rPr>
                 <w:rStyle w:val="Hipervnculo"/>
@@ -2837,7 +2910,7 @@
                 <w:noProof/>
                 <w:webHidden/>
               </w:rPr>
-              <w:instrText xml:space="preserve"> PAGEREF _Toc236766583 \h </w:instrText>
+              <w:instrText xml:space="preserve"> PAGEREF _Toc237111001 \h </w:instrText>
             </w:r>
             <w:r>
               <w:rPr>
@@ -2857,7 +2930,7 @@
                 <w:noProof/>
                 <w:webHidden/>
               </w:rPr>
-              <w:t>4</w:t>
+              <w:t>7</w:t>
             </w:r>
             <w:r>
               <w:rPr>
@@ -2883,14 +2956,14 @@
               <w14:ligatures w14:val="standardContextual"/>
             </w:rPr>
           </w:pPr>
-          <w:hyperlink w:anchor="_Toc236766584" w:history="1">
+          <w:hyperlink w:anchor="_Toc237111002" w:history="1">
             <w:r>
               <w:rPr>
                 <w:rStyle w:val="Hipervnculo"/>
                 <w:noProof/>
                 <w:lang w:val="es-ES"/>
               </w:rPr>
-              <w:t>2.2.5 Juegos serios para educación (para TDAH?)</w:t>
+              <w:t>2.2.5 Juegos serios para educación</w:t>
             </w:r>
             <w:r>
               <w:rPr>
@@ -2911,7 +2984,7 @@
                 <w:noProof/>
                 <w:webHidden/>
               </w:rPr>
-              <w:instrText xml:space="preserve"> PAGEREF _Toc236766584 \h </w:instrText>
+              <w:instrText xml:space="preserve"> PAGEREF _Toc237111002 \h </w:instrText>
             </w:r>
             <w:r>
               <w:rPr>
@@ -2931,7 +3004,7 @@
                 <w:noProof/>
                 <w:webHidden/>
               </w:rPr>
-              <w:t>4</w:t>
+              <w:t>7</w:t>
             </w:r>
             <w:r>
               <w:rPr>
@@ -2957,14 +3030,14 @@
               <w14:ligatures w14:val="standardContextual"/>
             </w:rPr>
           </w:pPr>
-          <w:hyperlink w:anchor="_Toc236766585" w:history="1">
+          <w:hyperlink w:anchor="_Toc237111003" w:history="1">
             <w:r>
               <w:rPr>
                 <w:rStyle w:val="Hipervnculo"/>
                 <w:noProof/>
                 <w:lang w:val="es-ES"/>
               </w:rPr>
-              <w:t>2.2.6 Juegos serios como herramienta psicológica (para TDAH)</w:t>
+              <w:t>2.2.6 Juegos serios como herramienta psicológica</w:t>
             </w:r>
             <w:r>
               <w:rPr>
@@ -2985,7 +3058,7 @@
                 <w:noProof/>
                 <w:webHidden/>
               </w:rPr>
-              <w:instrText xml:space="preserve"> PAGEREF _Toc236766585 \h </w:instrText>
+              <w:instrText xml:space="preserve"> PAGEREF _Toc237111003 \h </w:instrText>
             </w:r>
             <w:r>
               <w:rPr>
@@ -3005,7 +3078,7 @@
                 <w:noProof/>
                 <w:webHidden/>
               </w:rPr>
-              <w:t>4</w:t>
+              <w:t>7</w:t>
             </w:r>
             <w:r>
               <w:rPr>
@@ -3031,7 +3104,7 @@
               <w14:ligatures w14:val="standardContextual"/>
             </w:rPr>
           </w:pPr>
-          <w:hyperlink w:anchor="_Toc236766586" w:history="1">
+          <w:hyperlink w:anchor="_Toc237111004" w:history="1">
             <w:r>
               <w:rPr>
                 <w:rStyle w:val="Hipervnculo"/>
@@ -3059,7 +3132,7 @@
                 <w:noProof/>
                 <w:webHidden/>
               </w:rPr>
-              <w:instrText xml:space="preserve"> PAGEREF _Toc236766586 \h </w:instrText>
+              <w:instrText xml:space="preserve"> PAGEREF _Toc237111004 \h </w:instrText>
             </w:r>
             <w:r>
               <w:rPr>
@@ -3079,7 +3152,7 @@
                 <w:noProof/>
                 <w:webHidden/>
               </w:rPr>
-              <w:t>4</w:t>
+              <w:t>7</w:t>
             </w:r>
             <w:r>
               <w:rPr>
@@ -3105,7 +3178,7 @@
               <w14:ligatures w14:val="standardContextual"/>
             </w:rPr>
           </w:pPr>
-          <w:hyperlink w:anchor="_Toc236766587" w:history="1">
+          <w:hyperlink w:anchor="_Toc237111005" w:history="1">
             <w:r>
               <w:rPr>
                 <w:rStyle w:val="Hipervnculo"/>
@@ -3133,7 +3206,7 @@
                 <w:noProof/>
                 <w:webHidden/>
               </w:rPr>
-              <w:instrText xml:space="preserve"> PAGEREF _Toc236766587 \h </w:instrText>
+              <w:instrText xml:space="preserve"> PAGEREF _Toc237111005 \h </w:instrText>
             </w:r>
             <w:r>
               <w:rPr>
@@ -3153,7 +3226,7 @@
                 <w:noProof/>
                 <w:webHidden/>
               </w:rPr>
-              <w:t>4</w:t>
+              <w:t>7</w:t>
             </w:r>
             <w:r>
               <w:rPr>
@@ -3179,7 +3252,7 @@
               <w14:ligatures w14:val="standardContextual"/>
             </w:rPr>
           </w:pPr>
-          <w:hyperlink w:anchor="_Toc236766588" w:history="1">
+          <w:hyperlink w:anchor="_Toc237111006" w:history="1">
             <w:r>
               <w:rPr>
                 <w:rStyle w:val="Hipervnculo"/>
@@ -3207,7 +3280,7 @@
                 <w:noProof/>
                 <w:webHidden/>
               </w:rPr>
-              <w:instrText xml:space="preserve"> PAGEREF _Toc236766588 \h </w:instrText>
+              <w:instrText xml:space="preserve"> PAGEREF _Toc237111006 \h </w:instrText>
             </w:r>
             <w:r>
               <w:rPr>
@@ -3227,7 +3300,7 @@
                 <w:noProof/>
                 <w:webHidden/>
               </w:rPr>
-              <w:t>4</w:t>
+              <w:t>7</w:t>
             </w:r>
             <w:r>
               <w:rPr>
@@ -3250,7 +3323,7 @@
               <w14:ligatures w14:val="standardContextual"/>
             </w:rPr>
           </w:pPr>
-          <w:hyperlink w:anchor="_Toc236766589" w:history="1">
+          <w:hyperlink w:anchor="_Toc237111007" w:history="1">
             <w:r>
               <w:rPr>
                 <w:rStyle w:val="Hipervnculo"/>
@@ -3278,7 +3351,7 @@
                 <w:noProof/>
                 <w:webHidden/>
               </w:rPr>
-              <w:instrText xml:space="preserve"> PAGEREF _Toc236766589 \h </w:instrText>
+              <w:instrText xml:space="preserve"> PAGEREF _Toc237111007 \h </w:instrText>
             </w:r>
             <w:r>
               <w:rPr>
@@ -3298,7 +3371,7 @@
                 <w:noProof/>
                 <w:webHidden/>
               </w:rPr>
-              <w:t>5</w:t>
+              <w:t>8</w:t>
             </w:r>
             <w:r>
               <w:rPr>
@@ -3324,7 +3397,7 @@
               <w14:ligatures w14:val="standardContextual"/>
             </w:rPr>
           </w:pPr>
-          <w:hyperlink w:anchor="_Toc236766590" w:history="1">
+          <w:hyperlink w:anchor="_Toc237111008" w:history="1">
             <w:r>
               <w:rPr>
                 <w:rStyle w:val="Hipervnculo"/>
@@ -3352,7 +3425,7 @@
                 <w:noProof/>
                 <w:webHidden/>
               </w:rPr>
-              <w:instrText xml:space="preserve"> PAGEREF _Toc236766590 \h </w:instrText>
+              <w:instrText xml:space="preserve"> PAGEREF _Toc237111008 \h </w:instrText>
             </w:r>
             <w:r>
               <w:rPr>
@@ -3372,7 +3445,7 @@
                 <w:noProof/>
                 <w:webHidden/>
               </w:rPr>
-              <w:t>5</w:t>
+              <w:t>8</w:t>
             </w:r>
             <w:r>
               <w:rPr>
@@ -3398,7 +3471,7 @@
               <w14:ligatures w14:val="standardContextual"/>
             </w:rPr>
           </w:pPr>
-          <w:hyperlink w:anchor="_Toc236766591" w:history="1">
+          <w:hyperlink w:anchor="_Toc237111009" w:history="1">
             <w:r>
               <w:rPr>
                 <w:rStyle w:val="Hipervnculo"/>
@@ -3426,7 +3499,7 @@
                 <w:noProof/>
                 <w:webHidden/>
               </w:rPr>
-              <w:instrText xml:space="preserve"> PAGEREF _Toc236766591 \h </w:instrText>
+              <w:instrText xml:space="preserve"> PAGEREF _Toc237111009 \h </w:instrText>
             </w:r>
             <w:r>
               <w:rPr>
@@ -3446,7 +3519,7 @@
                 <w:noProof/>
                 <w:webHidden/>
               </w:rPr>
-              <w:t>5</w:t>
+              <w:t>8</w:t>
             </w:r>
             <w:r>
               <w:rPr>
@@ -3472,7 +3545,7 @@
               <w14:ligatures w14:val="standardContextual"/>
             </w:rPr>
           </w:pPr>
-          <w:hyperlink w:anchor="_Toc236766592" w:history="1">
+          <w:hyperlink w:anchor="_Toc237111010" w:history="1">
             <w:r>
               <w:rPr>
                 <w:rStyle w:val="Hipervnculo"/>
@@ -3500,7 +3573,7 @@
                 <w:noProof/>
                 <w:webHidden/>
               </w:rPr>
-              <w:instrText xml:space="preserve"> PAGEREF _Toc236766592 \h </w:instrText>
+              <w:instrText xml:space="preserve"> PAGEREF _Toc237111010 \h </w:instrText>
             </w:r>
             <w:r>
               <w:rPr>
@@ -3520,7 +3593,7 @@
                 <w:noProof/>
                 <w:webHidden/>
               </w:rPr>
-              <w:t>5</w:t>
+              <w:t>8</w:t>
             </w:r>
             <w:r>
               <w:rPr>
@@ -3546,7 +3619,7 @@
               <w14:ligatures w14:val="standardContextual"/>
             </w:rPr>
           </w:pPr>
-          <w:hyperlink w:anchor="_Toc236766593" w:history="1">
+          <w:hyperlink w:anchor="_Toc237111011" w:history="1">
             <w:r>
               <w:rPr>
                 <w:rStyle w:val="Hipervnculo"/>
@@ -3574,7 +3647,7 @@
                 <w:noProof/>
                 <w:webHidden/>
               </w:rPr>
-              <w:instrText xml:space="preserve"> PAGEREF _Toc236766593 \h </w:instrText>
+              <w:instrText xml:space="preserve"> PAGEREF _Toc237111011 \h </w:instrText>
             </w:r>
             <w:r>
               <w:rPr>
@@ -3594,7 +3667,7 @@
                 <w:noProof/>
                 <w:webHidden/>
               </w:rPr>
-              <w:t>5</w:t>
+              <w:t>8</w:t>
             </w:r>
             <w:r>
               <w:rPr>
@@ -3617,7 +3690,7 @@
               <w14:ligatures w14:val="standardContextual"/>
             </w:rPr>
           </w:pPr>
-          <w:hyperlink w:anchor="_Toc236766594" w:history="1">
+          <w:hyperlink w:anchor="_Toc237111012" w:history="1">
             <w:r>
               <w:rPr>
                 <w:rStyle w:val="Hipervnculo"/>
@@ -3645,7 +3718,7 @@
                 <w:noProof/>
                 <w:webHidden/>
               </w:rPr>
-              <w:instrText xml:space="preserve"> PAGEREF _Toc236766594 \h </w:instrText>
+              <w:instrText xml:space="preserve"> PAGEREF _Toc237111012 \h </w:instrText>
             </w:r>
             <w:r>
               <w:rPr>
@@ -3665,7 +3738,7 @@
                 <w:noProof/>
                 <w:webHidden/>
               </w:rPr>
-              <w:t>7</w:t>
+              <w:t>9</w:t>
             </w:r>
             <w:r>
               <w:rPr>
@@ -3691,7 +3764,7 @@
               <w14:ligatures w14:val="standardContextual"/>
             </w:rPr>
           </w:pPr>
-          <w:hyperlink w:anchor="_Toc236766595" w:history="1">
+          <w:hyperlink w:anchor="_Toc237111013" w:history="1">
             <w:r>
               <w:rPr>
                 <w:rStyle w:val="Hipervnculo"/>
@@ -3719,7 +3792,7 @@
                 <w:noProof/>
                 <w:webHidden/>
               </w:rPr>
-              <w:instrText xml:space="preserve"> PAGEREF _Toc236766595 \h </w:instrText>
+              <w:instrText xml:space="preserve"> PAGEREF _Toc237111013 \h </w:instrText>
             </w:r>
             <w:r>
               <w:rPr>
@@ -3739,7 +3812,7 @@
                 <w:noProof/>
                 <w:webHidden/>
               </w:rPr>
-              <w:t>7</w:t>
+              <w:t>9</w:t>
             </w:r>
             <w:r>
               <w:rPr>
@@ -3765,7 +3838,7 @@
               <w14:ligatures w14:val="standardContextual"/>
             </w:rPr>
           </w:pPr>
-          <w:hyperlink w:anchor="_Toc236766596" w:history="1">
+          <w:hyperlink w:anchor="_Toc237111014" w:history="1">
             <w:r>
               <w:rPr>
                 <w:rStyle w:val="Hipervnculo"/>
@@ -3793,7 +3866,7 @@
                 <w:noProof/>
                 <w:webHidden/>
               </w:rPr>
-              <w:instrText xml:space="preserve"> PAGEREF _Toc236766596 \h </w:instrText>
+              <w:instrText xml:space="preserve"> PAGEREF _Toc237111014 \h </w:instrText>
             </w:r>
             <w:r>
               <w:rPr>
@@ -3813,7 +3886,7 @@
                 <w:noProof/>
                 <w:webHidden/>
               </w:rPr>
-              <w:t>7</w:t>
+              <w:t>9</w:t>
             </w:r>
             <w:r>
               <w:rPr>
@@ -3839,7 +3912,7 @@
               <w14:ligatures w14:val="standardContextual"/>
             </w:rPr>
           </w:pPr>
-          <w:hyperlink w:anchor="_Toc236766597" w:history="1">
+          <w:hyperlink w:anchor="_Toc237111015" w:history="1">
             <w:r>
               <w:rPr>
                 <w:rStyle w:val="Hipervnculo"/>
@@ -3867,7 +3940,7 @@
                 <w:noProof/>
                 <w:webHidden/>
               </w:rPr>
-              <w:instrText xml:space="preserve"> PAGEREF _Toc236766597 \h </w:instrText>
+              <w:instrText xml:space="preserve"> PAGEREF _Toc237111015 \h </w:instrText>
             </w:r>
             <w:r>
               <w:rPr>
@@ -3887,7 +3960,7 @@
                 <w:noProof/>
                 <w:webHidden/>
               </w:rPr>
-              <w:t>7</w:t>
+              <w:t>9</w:t>
             </w:r>
             <w:r>
               <w:rPr>
@@ -3913,7 +3986,7 @@
               <w14:ligatures w14:val="standardContextual"/>
             </w:rPr>
           </w:pPr>
-          <w:hyperlink w:anchor="_Toc236766598" w:history="1">
+          <w:hyperlink w:anchor="_Toc237111016" w:history="1">
             <w:r>
               <w:rPr>
                 <w:rStyle w:val="Hipervnculo"/>
@@ -3941,7 +4014,7 @@
                 <w:noProof/>
                 <w:webHidden/>
               </w:rPr>
-              <w:instrText xml:space="preserve"> PAGEREF _Toc236766598 \h </w:instrText>
+              <w:instrText xml:space="preserve"> PAGEREF _Toc237111016 \h </w:instrText>
             </w:r>
             <w:r>
               <w:rPr>
@@ -3961,7 +4034,7 @@
                 <w:noProof/>
                 <w:webHidden/>
               </w:rPr>
-              <w:t>7</w:t>
+              <w:t>9</w:t>
             </w:r>
             <w:r>
               <w:rPr>
@@ -3984,7 +4057,7 @@
               <w14:ligatures w14:val="standardContextual"/>
             </w:rPr>
           </w:pPr>
-          <w:hyperlink w:anchor="_Toc236766599" w:history="1">
+          <w:hyperlink w:anchor="_Toc237111017" w:history="1">
             <w:r>
               <w:rPr>
                 <w:rStyle w:val="Hipervnculo"/>
@@ -4012,7 +4085,7 @@
                 <w:noProof/>
                 <w:webHidden/>
               </w:rPr>
-              <w:instrText xml:space="preserve"> PAGEREF _Toc236766599 \h </w:instrText>
+              <w:instrText xml:space="preserve"> PAGEREF _Toc237111017 \h </w:instrText>
             </w:r>
             <w:r>
               <w:rPr>
@@ -4032,7 +4105,7 @@
                 <w:noProof/>
                 <w:webHidden/>
               </w:rPr>
-              <w:t>8</w:t>
+              <w:t>10</w:t>
             </w:r>
             <w:r>
               <w:rPr>
@@ -4055,7 +4128,7 @@
               <w14:ligatures w14:val="standardContextual"/>
             </w:rPr>
           </w:pPr>
-          <w:hyperlink w:anchor="_Toc236766600" w:history="1">
+          <w:hyperlink w:anchor="_Toc237111018" w:history="1">
             <w:r>
               <w:rPr>
                 <w:rStyle w:val="Hipervnculo"/>
@@ -4083,7 +4156,7 @@
                 <w:noProof/>
                 <w:webHidden/>
               </w:rPr>
-              <w:instrText xml:space="preserve"> PAGEREF _Toc236766600 \h </w:instrText>
+              <w:instrText xml:space="preserve"> PAGEREF _Toc237111018 \h </w:instrText>
             </w:r>
             <w:r>
               <w:rPr>
@@ -4103,7 +4176,7 @@
                 <w:noProof/>
                 <w:webHidden/>
               </w:rPr>
-              <w:t>9</w:t>
+              <w:t>11</w:t>
             </w:r>
             <w:r>
               <w:rPr>
@@ -4129,7 +4202,7 @@
               <w14:ligatures w14:val="standardContextual"/>
             </w:rPr>
           </w:pPr>
-          <w:hyperlink w:anchor="_Toc236766601" w:history="1">
+          <w:hyperlink w:anchor="_Toc237111019" w:history="1">
             <w:r>
               <w:rPr>
                 <w:rStyle w:val="Hipervnculo"/>
@@ -4157,7 +4230,7 @@
                 <w:noProof/>
                 <w:webHidden/>
               </w:rPr>
-              <w:instrText xml:space="preserve"> PAGEREF _Toc236766601 \h </w:instrText>
+              <w:instrText xml:space="preserve"> PAGEREF _Toc237111019 \h </w:instrText>
             </w:r>
             <w:r>
               <w:rPr>
@@ -4177,7 +4250,7 @@
                 <w:noProof/>
                 <w:webHidden/>
               </w:rPr>
-              <w:t>9</w:t>
+              <w:t>11</w:t>
             </w:r>
             <w:r>
               <w:rPr>
@@ -4203,7 +4276,7 @@
               <w14:ligatures w14:val="standardContextual"/>
             </w:rPr>
           </w:pPr>
-          <w:hyperlink w:anchor="_Toc236766602" w:history="1">
+          <w:hyperlink w:anchor="_Toc237111020" w:history="1">
             <w:r>
               <w:rPr>
                 <w:rStyle w:val="Hipervnculo"/>
@@ -4231,7 +4304,7 @@
                 <w:noProof/>
                 <w:webHidden/>
               </w:rPr>
-              <w:instrText xml:space="preserve"> PAGEREF _Toc236766602 \h </w:instrText>
+              <w:instrText xml:space="preserve"> PAGEREF _Toc237111020 \h </w:instrText>
             </w:r>
             <w:r>
               <w:rPr>
@@ -4251,7 +4324,7 @@
                 <w:noProof/>
                 <w:webHidden/>
               </w:rPr>
-              <w:t>9</w:t>
+              <w:t>11</w:t>
             </w:r>
             <w:r>
               <w:rPr>
@@ -4274,11 +4347,12 @@
               <w14:ligatures w14:val="standardContextual"/>
             </w:rPr>
           </w:pPr>
-          <w:hyperlink w:anchor="_Toc236766603" w:history="1">
+          <w:hyperlink w:anchor="_Toc237111021" w:history="1">
             <w:r>
               <w:rPr>
                 <w:rStyle w:val="Hipervnculo"/>
                 <w:noProof/>
+                <w:lang w:val="es-ES"/>
               </w:rPr>
               <w:t>Introduction</w:t>
             </w:r>
@@ -4301,7 +4375,7 @@
                 <w:noProof/>
                 <w:webHidden/>
               </w:rPr>
-              <w:instrText xml:space="preserve"> PAGEREF _Toc236766603 \h </w:instrText>
+              <w:instrText xml:space="preserve"> PAGEREF _Toc237111021 \h </w:instrText>
             </w:r>
             <w:r>
               <w:rPr>
@@ -4321,7 +4395,7 @@
                 <w:noProof/>
                 <w:webHidden/>
               </w:rPr>
-              <w:t>11</w:t>
+              <w:t>13</w:t>
             </w:r>
             <w:r>
               <w:rPr>
@@ -4344,7 +4418,7 @@
               <w14:ligatures w14:val="standardContextual"/>
             </w:rPr>
           </w:pPr>
-          <w:hyperlink w:anchor="_Toc236766604" w:history="1">
+          <w:hyperlink w:anchor="_Toc237111022" w:history="1">
             <w:r>
               <w:rPr>
                 <w:rStyle w:val="Hipervnculo"/>
@@ -4372,7 +4446,7 @@
                 <w:noProof/>
                 <w:webHidden/>
               </w:rPr>
-              <w:instrText xml:space="preserve"> PAGEREF _Toc236766604 \h </w:instrText>
+              <w:instrText xml:space="preserve"> PAGEREF _Toc237111022 \h </w:instrText>
             </w:r>
             <w:r>
               <w:rPr>
@@ -4392,7 +4466,7 @@
                 <w:noProof/>
                 <w:webHidden/>
               </w:rPr>
-              <w:t>13</w:t>
+              <w:t>15</w:t>
             </w:r>
             <w:r>
               <w:rPr>
@@ -4415,7 +4489,7 @@
               <w14:ligatures w14:val="standardContextual"/>
             </w:rPr>
           </w:pPr>
-          <w:hyperlink w:anchor="_Toc236766605" w:history="1">
+          <w:hyperlink w:anchor="_Toc237111023" w:history="1">
             <w:r>
               <w:rPr>
                 <w:rStyle w:val="Hipervnculo"/>
@@ -4442,7 +4516,7 @@
                 <w:noProof/>
                 <w:webHidden/>
               </w:rPr>
-              <w:instrText xml:space="preserve"> PAGEREF _Toc236766605 \h </w:instrText>
+              <w:instrText xml:space="preserve"> PAGEREF _Toc237111023 \h </w:instrText>
             </w:r>
             <w:r>
               <w:rPr>
@@ -4462,7 +4536,7 @@
                 <w:noProof/>
                 <w:webHidden/>
               </w:rPr>
-              <w:t>17</w:t>
+              <w:t>19</w:t>
             </w:r>
             <w:r>
               <w:rPr>
@@ -4485,7 +4559,7 @@
               <w14:ligatures w14:val="standardContextual"/>
             </w:rPr>
           </w:pPr>
-          <w:hyperlink w:anchor="_Toc236766606" w:history="1">
+          <w:hyperlink w:anchor="_Toc237111024" w:history="1">
             <w:r>
               <w:rPr>
                 <w:rStyle w:val="Hipervnculo"/>
@@ -4512,7 +4586,7 @@
                 <w:noProof/>
                 <w:webHidden/>
               </w:rPr>
-              <w:instrText xml:space="preserve"> PAGEREF _Toc236766606 \h </w:instrText>
+              <w:instrText xml:space="preserve"> PAGEREF _Toc237111024 \h </w:instrText>
             </w:r>
             <w:r>
               <w:rPr>
@@ -4532,7 +4606,7 @@
                 <w:noProof/>
                 <w:webHidden/>
               </w:rPr>
-              <w:t>19</w:t>
+              <w:t>21</w:t>
             </w:r>
             <w:r>
               <w:rPr>
@@ -4555,7 +4629,7 @@
               <w14:ligatures w14:val="standardContextual"/>
             </w:rPr>
           </w:pPr>
-          <w:hyperlink w:anchor="_Toc236766607" w:history="1">
+          <w:hyperlink w:anchor="_Toc237111025" w:history="1">
             <w:r>
               <w:rPr>
                 <w:rStyle w:val="Hipervnculo"/>
@@ -4582,7 +4656,7 @@
                 <w:noProof/>
                 <w:webHidden/>
               </w:rPr>
-              <w:instrText xml:space="preserve"> PAGEREF _Toc236766607 \h </w:instrText>
+              <w:instrText xml:space="preserve"> PAGEREF _Toc237111025 \h </w:instrText>
             </w:r>
             <w:r>
               <w:rPr>
@@ -4602,7 +4676,7 @@
                 <w:noProof/>
                 <w:webHidden/>
               </w:rPr>
-              <w:t>21</w:t>
+              <w:t>23</w:t>
             </w:r>
             <w:r>
               <w:rPr>
@@ -4993,7 +5067,7 @@
       <w:bookmarkStart w:id="4" w:name="_Ref11682300"/>
       <w:bookmarkStart w:id="5" w:name="_Ref11684759"/>
       <w:bookmarkStart w:id="6" w:name="_Toc116636436"/>
-      <w:bookmarkStart w:id="7" w:name="_Toc236766564"/>
+      <w:bookmarkStart w:id="7" w:name="_Toc237110981"/>
       <w:r>
         <w:lastRenderedPageBreak/>
         <w:t>Introducción</w:t>
@@ -5024,7 +5098,7 @@
         <w:pStyle w:val="Ttulo2"/>
       </w:pPr>
       <w:bookmarkStart w:id="8" w:name="_Toc116636437"/>
-      <w:bookmarkStart w:id="9" w:name="_Toc236766565"/>
+      <w:bookmarkStart w:id="9" w:name="_Toc237110982"/>
       <w:r>
         <w:t>M</w:t>
       </w:r>
@@ -5082,7 +5156,7 @@
         <w:pStyle w:val="Ttulo2"/>
       </w:pPr>
       <w:bookmarkStart w:id="10" w:name="_Toc116636438"/>
-      <w:bookmarkStart w:id="11" w:name="_Toc236766566"/>
+      <w:bookmarkStart w:id="11" w:name="_Toc237110983"/>
       <w:r>
         <w:t>Objetivos</w:t>
       </w:r>
@@ -5172,7 +5246,7 @@
         <w:pStyle w:val="Ttulo2"/>
       </w:pPr>
       <w:bookmarkStart w:id="12" w:name="_Toc116636439"/>
-      <w:bookmarkStart w:id="13" w:name="_Toc236766567"/>
+      <w:bookmarkStart w:id="13" w:name="_Toc237110984"/>
       <w:r>
         <w:t>Plan de trabajo</w:t>
       </w:r>
@@ -5191,7 +5265,7 @@
       <w:pPr>
         <w:pStyle w:val="Ttulo3"/>
       </w:pPr>
-      <w:bookmarkStart w:id="14" w:name="_Toc236766568"/>
+      <w:bookmarkStart w:id="14" w:name="_Toc237110985"/>
       <w:r>
         <w:t>Tecnologías y herramientas usadas</w:t>
       </w:r>
@@ -5282,7 +5356,7 @@
       <w:pPr>
         <w:pStyle w:val="Ttulo3"/>
       </w:pPr>
-      <w:bookmarkStart w:id="15" w:name="_Toc236766569"/>
+      <w:bookmarkStart w:id="15" w:name="_Toc237110986"/>
       <w:r>
         <w:t>Metodología</w:t>
       </w:r>
@@ -5347,9 +5421,11 @@
           <w:docGrid w:linePitch="360"/>
         </w:sectPr>
       </w:pPr>
+      <w:bookmarkStart w:id="16" w:name="_Toc237110987"/>
       <w:r>
         <w:t>Estructura de la memoria</w:t>
       </w:r>
+      <w:bookmarkEnd w:id="16"/>
     </w:p>
     <w:p>
       <w:pPr>
@@ -5358,8 +5434,8 @@
           <w:lang w:val="es-ES"/>
         </w:rPr>
       </w:pPr>
-      <w:bookmarkStart w:id="16" w:name="_Toc116636440"/>
-      <w:bookmarkStart w:id="17" w:name="_Toc236766570"/>
+      <w:bookmarkStart w:id="17" w:name="_Toc116636440"/>
+      <w:bookmarkStart w:id="18" w:name="_Toc237110988"/>
       <w:r>
         <w:rPr>
           <w:lang w:val="es-ES"/>
@@ -5367,8 +5443,8 @@
         <w:lastRenderedPageBreak/>
         <w:t>Estado de la cuestión</w:t>
       </w:r>
-      <w:bookmarkEnd w:id="16"/>
       <w:bookmarkEnd w:id="17"/>
+      <w:bookmarkEnd w:id="18"/>
     </w:p>
     <w:p>
       <w:pPr>
@@ -5415,7 +5491,7 @@
           <w:lang w:val="es-ES"/>
         </w:rPr>
       </w:pPr>
-      <w:bookmarkStart w:id="18" w:name="_Toc236766571"/>
+      <w:bookmarkStart w:id="19" w:name="_Toc237110989"/>
       <w:r>
         <w:rPr>
           <w:lang w:val="es-ES"/>
@@ -5428,7 +5504,7 @@
         </w:rPr>
         <w:t>rastorno por Déficit de Atención e Hiperactividad</w:t>
       </w:r>
-      <w:bookmarkEnd w:id="18"/>
+      <w:bookmarkEnd w:id="19"/>
     </w:p>
     <w:p>
       <w:pPr>
@@ -5437,14 +5513,14 @@
           <w:lang w:val="es-ES"/>
         </w:rPr>
       </w:pPr>
-      <w:bookmarkStart w:id="19" w:name="_Toc236766572"/>
+      <w:bookmarkStart w:id="20" w:name="_Toc237110990"/>
       <w:r>
         <w:rPr>
           <w:lang w:val="es-ES"/>
         </w:rPr>
         <w:t>Qué es el TDAH</w:t>
       </w:r>
-      <w:bookmarkEnd w:id="19"/>
+      <w:bookmarkEnd w:id="20"/>
     </w:p>
     <w:p>
       <w:pPr>
@@ -5584,14 +5660,14 @@
         </w:rPr>
         <w:t xml:space="preserve"> </w:t>
       </w:r>
-      <w:bookmarkStart w:id="20" w:name="_Toc236766573"/>
+      <w:bookmarkStart w:id="21" w:name="_Toc237110991"/>
       <w:r>
         <w:rPr>
           <w:lang w:val="es-ES"/>
         </w:rPr>
         <w:t>Tipos</w:t>
       </w:r>
-      <w:bookmarkEnd w:id="20"/>
+      <w:bookmarkEnd w:id="21"/>
     </w:p>
     <w:p>
       <w:pPr>
@@ -5600,14 +5676,14 @@
           <w:lang w:val="es-ES"/>
         </w:rPr>
       </w:pPr>
-      <w:bookmarkStart w:id="21" w:name="_Toc236766574"/>
+      <w:bookmarkStart w:id="22" w:name="_Toc237110992"/>
       <w:r>
         <w:rPr>
           <w:lang w:val="es-ES"/>
         </w:rPr>
         <w:t>Apartados a los que afecta TDAH</w:t>
       </w:r>
-      <w:bookmarkEnd w:id="21"/>
+      <w:bookmarkEnd w:id="22"/>
     </w:p>
     <w:p>
       <w:pPr>
@@ -5672,7 +5748,7 @@
           <w:lang w:val="es-ES"/>
         </w:rPr>
       </w:pPr>
-      <w:bookmarkStart w:id="22" w:name="_Toc236766575"/>
+      <w:bookmarkStart w:id="23" w:name="_Toc237110993"/>
       <w:r>
         <w:rPr>
           <w:lang w:val="es-ES"/>
@@ -5680,7 +5756,7 @@
         <w:lastRenderedPageBreak/>
         <w:t>Problemas del TDAH</w:t>
       </w:r>
-      <w:bookmarkEnd w:id="22"/>
+      <w:bookmarkEnd w:id="23"/>
     </w:p>
     <w:p>
       <w:pPr>
@@ -5689,14 +5765,14 @@
           <w:lang w:val="es-ES"/>
         </w:rPr>
       </w:pPr>
-      <w:bookmarkStart w:id="23" w:name="_Toc236766576"/>
+      <w:bookmarkStart w:id="24" w:name="_Toc237110994"/>
       <w:r>
         <w:rPr>
           <w:lang w:val="es-ES"/>
         </w:rPr>
         <w:t>Ventajas del TDAH</w:t>
       </w:r>
-      <w:bookmarkEnd w:id="23"/>
+      <w:bookmarkEnd w:id="24"/>
     </w:p>
     <w:p>
       <w:pPr>
@@ -5705,14 +5781,14 @@
           <w:lang w:val="es-ES"/>
         </w:rPr>
       </w:pPr>
-      <w:bookmarkStart w:id="24" w:name="_Toc236766577"/>
+      <w:bookmarkStart w:id="25" w:name="_Toc237110995"/>
       <w:r>
         <w:rPr>
           <w:lang w:val="es-ES"/>
         </w:rPr>
         <w:t>TDAH en niños y adolescentes</w:t>
       </w:r>
-      <w:bookmarkEnd w:id="24"/>
+      <w:bookmarkEnd w:id="25"/>
     </w:p>
     <w:p>
       <w:pPr>
@@ -5749,14 +5825,14 @@
           <w:lang w:val="es-ES"/>
         </w:rPr>
       </w:pPr>
-      <w:bookmarkStart w:id="25" w:name="_Toc236766578"/>
+      <w:bookmarkStart w:id="26" w:name="_Toc237110996"/>
       <w:r>
         <w:rPr>
           <w:lang w:val="es-ES"/>
         </w:rPr>
         <w:t>Sociedad hoy en día</w:t>
       </w:r>
-      <w:bookmarkEnd w:id="25"/>
+      <w:bookmarkEnd w:id="26"/>
     </w:p>
     <w:p>
       <w:pPr>
@@ -5793,14 +5869,14 @@
           <w:lang w:val="es-ES"/>
         </w:rPr>
       </w:pPr>
-      <w:bookmarkStart w:id="26" w:name="_Toc236766579"/>
+      <w:bookmarkStart w:id="27" w:name="_Toc237110997"/>
       <w:r>
         <w:rPr>
           <w:lang w:val="es-ES"/>
         </w:rPr>
         <w:t>Videojuegos y juegos serios</w:t>
       </w:r>
-      <w:bookmarkEnd w:id="26"/>
+      <w:bookmarkEnd w:id="27"/>
     </w:p>
     <w:p>
       <w:pPr>
@@ -5960,7 +6036,43 @@
           <w:lang w:val="es-ES"/>
         </w:rPr>
         <w:lastRenderedPageBreak/>
-        <w:t xml:space="preserve">¿Pero qué tienen de diferente los juegos serios de los demás videojuegos? El objetivo principal. Los videojuegos toman el entretenimiento como objetivo principal mientras que el de los juegos serios es educar, informar o formar, independientemente de que sea entretenido o no </w:t>
+        <w:t>¿Pero qué tienen de diferente los juegos serios de los demás videojuegos? El objetivo principal. Los videojuegos toman el entretenimiento como objetivo principal mientras que el de los juegos serios es educar, informar o formar, independientemente de que sea entretenido o no</w:t>
+      </w:r>
+      <w:r>
+        <w:rPr>
+          <w:lang w:val="es-ES"/>
+        </w:rPr>
+        <w:fldChar w:fldCharType="begin"/>
+      </w:r>
+      <w:r>
+        <w:rPr>
+          <w:lang w:val="es-ES"/>
+        </w:rPr>
+        <w:instrText xml:space="preserve"> ADDIN ZOTERO_ITEM CSL_CITATION {"citationID":"MsDvkX8J","properties":{"unsorted":false,"formattedCitation":"[4]","plainCitation":"[4]","noteIndex":0},"citationItems":[{"id":70,"uris":["http://zotero.org/users/local/axS3HTYd/items/IE2PUA2E"],"itemData":{"id":70,"type":"article-journal","abstract":"This article proposes a definition of the object “Serious Game” and an approach dedicated to classify its various occurrences.","language":"en","source":"Zotero","title":"An introduction to Serious game Definitions and concepts","author":[{"family":"Alvarez","given":"Julian"},{"family":"Djaouti","given":"Damien"}]}}],"schema":"https://github.com/citation-style-language/schema/raw/master/csl-citation.json"} </w:instrText>
+      </w:r>
+      <w:r>
+        <w:rPr>
+          <w:lang w:val="es-ES"/>
+        </w:rPr>
+        <w:fldChar w:fldCharType="separate"/>
+      </w:r>
+      <w:r>
+        <w:rPr>
+          <w:lang w:val="es-ES"/>
+        </w:rPr>
+        <w:t>[4]</w:t>
+      </w:r>
+      <w:r>
+        <w:rPr>
+          <w:lang w:val="es-ES"/>
+        </w:rPr>
+        <w:fldChar w:fldCharType="end"/>
+      </w:r>
+      <w:r>
+        <w:rPr>
+          <w:lang w:val="es-ES"/>
+        </w:rPr>
+        <w:t xml:space="preserve"> </w:t>
       </w:r>
       <w:r>
         <w:rPr>
@@ -6008,14 +6120,14 @@
           <w:lang w:val="es-ES"/>
         </w:rPr>
       </w:pPr>
-      <w:bookmarkStart w:id="27" w:name="_Toc236766580"/>
+      <w:bookmarkStart w:id="28" w:name="_Toc237110998"/>
       <w:r>
         <w:rPr>
           <w:lang w:val="es-ES"/>
         </w:rPr>
         <w:t>Que es un videojuego</w:t>
       </w:r>
-      <w:bookmarkEnd w:id="27"/>
+      <w:bookmarkEnd w:id="28"/>
     </w:p>
     <w:p>
       <w:pPr>
@@ -6040,7 +6152,7 @@
         <w:rPr>
           <w:lang w:val="es-ES"/>
         </w:rPr>
-        <w:instrText xml:space="preserve"> ADDIN ZOTERO_ITEM CSL_CITATION {"citationID":"6y1ePGUj","properties":{"unsorted":false,"formattedCitation":"[4], [5]","plainCitation":"[4], [5]","noteIndex":0},"citationItems":[{"id":55,"uris":["http://zotero.org/users/local/axS3HTYd/items/TS552UNA"],"itemData":{"id":55,"type":"article-journal","abstract":"During the last ﬁve decades, videogames evolved into a major component of popular culture as well as a multi-billion-dollar industry. The medium diversiﬁed tremendously, currently encompassing simple implementations of numeric games on the screen of a cell phone as well as vast, persistent online worlds on last generation consoles and PCs. In spite of its cultural and economic relevance, few attempts have been made to deﬁne what a videogame exactly is. In this article, I endeavour to propose an essentialist deﬁnition of videogame, that is, one structured in terms of necessary and sufﬁcient conditions. I begin with a critical consideration of the main theoretical approaches to the medium and the few published deﬁnitions. From this analysis, four essential properties are deﬁned and separately characterized. Finally, a deﬁnition is proposed, capable of encompassing the medium in both its speciﬁcity and variability.","container-title":"The Computer Games Journal","DOI":"10.1007/s40869-017-0045-4","ISSN":"2052-773X","issue":"4","journalAbbreviation":"Comput Game J","language":"en","page":"239-255","source":"DOI.org (Crossref)","title":"Fifty Years on, What Exactly is a Videogame? An Essentialistic Definitional Approach","title-short":"Fifty Years on, What Exactly is a Videogame?","volume":"6","author":[{"family":"Bergonse","given":"Rafaello"}],"issued":{"date-parts":[["2017",12]]}}},{"id":59,"uris":["http://zotero.org/users/local/axS3HTYd/items/GWFVCQ5U"],"itemData":{"id":59,"type":"paper-conference","abstract":"Videogames have been studied seriously only for a few years. So, we can wonder how we could  use the recent academic works to approach new design methods. This article proposes a first  step: a short and simple definition of what a videogame is, this definition being connected with  existing academic works about  game,  play,  interactivity, and  narrative. The definition is: A  videogame is a game which we play thanks to an audiovisual apparatus and which can be based  on a  story. The article also shows what the videogame heritage teaches us about what a  videogame is.","container-title":"Proceedings of DiGRA 2005 Conference: Changing Views: Worlds in Play","DOI":"10.26503/dl.v2005i1.177","event-title":"Proceedings of DiGRA 2005 Conference: Changing Views: Worlds in Play","ISSN":"2342-9666","language":"en","license":"Copyright (c) 2005 Nicolas   Esposito","source":"dl.digra.org","title":"A Short and Simple Definition of What a Videogame Is","URL":"https://dl.digra.org/index.php/dl/article/view/177","author":[{"family":"Esposito","given":"Nicolas"}],"accessed":{"date-parts":[["2026",8,7]]},"issued":{"date-parts":[["2005",1,1]]}}}],"schema":"https://github.com/citation-style-language/schema/raw/master/csl-citation.json"} </w:instrText>
+        <w:instrText xml:space="preserve"> ADDIN ZOTERO_ITEM CSL_CITATION {"citationID":"6y1ePGUj","properties":{"unsorted":false,"formattedCitation":"[5], [6]","plainCitation":"[5], [6]","noteIndex":0},"citationItems":[{"id":55,"uris":["http://zotero.org/users/local/axS3HTYd/items/TS552UNA"],"itemData":{"id":55,"type":"article-journal","abstract":"During the last ﬁve decades, videogames evolved into a major component of popular culture as well as a multi-billion-dollar industry. The medium diversiﬁed tremendously, currently encompassing simple implementations of numeric games on the screen of a cell phone as well as vast, persistent online worlds on last generation consoles and PCs. In spite of its cultural and economic relevance, few attempts have been made to deﬁne what a videogame exactly is. In this article, I endeavour to propose an essentialist deﬁnition of videogame, that is, one structured in terms of necessary and sufﬁcient conditions. I begin with a critical consideration of the main theoretical approaches to the medium and the few published deﬁnitions. From this analysis, four essential properties are deﬁned and separately characterized. Finally, a deﬁnition is proposed, capable of encompassing the medium in both its speciﬁcity and variability.","container-title":"The Computer Games Journal","DOI":"10.1007/s40869-017-0045-4","ISSN":"2052-773X","issue":"4","journalAbbreviation":"Comput Game J","language":"en","page":"239-255","source":"DOI.org (Crossref)","title":"Fifty Years on, What Exactly is a Videogame? An Essentialistic Definitional Approach","title-short":"Fifty Years on, What Exactly is a Videogame?","volume":"6","author":[{"family":"Bergonse","given":"Rafaello"}],"issued":{"date-parts":[["2017",12]]}}},{"id":59,"uris":["http://zotero.org/users/local/axS3HTYd/items/GWFVCQ5U"],"itemData":{"id":59,"type":"paper-conference","abstract":"Videogames have been studied seriously only for a few years. So, we can wonder how we could  use the recent academic works to approach new design methods. This article proposes a first  step: a short and simple definition of what a videogame is, this definition being connected with  existing academic works about  game,  play,  interactivity, and  narrative. The definition is: A  videogame is a game which we play thanks to an audiovisual apparatus and which can be based  on a  story. The article also shows what the videogame heritage teaches us about what a  videogame is.","container-title":"Proceedings of DiGRA 2005 Conference: Changing Views: Worlds in Play","DOI":"10.26503/dl.v2005i1.177","event-title":"Proceedings of DiGRA 2005 Conference: Changing Views: Worlds in Play","ISSN":"2342-9666","language":"en","license":"Copyright (c) 2005 Nicolas   Esposito","source":"dl.digra.org","title":"A Short and Simple Definition of What a Videogame Is","URL":"https://dl.digra.org/index.php/dl/article/view/177","author":[{"family":"Esposito","given":"Nicolas"}],"accessed":{"date-parts":[["2026",8,7]]},"issued":{"date-parts":[["2005",1,1]]}}}],"schema":"https://github.com/citation-style-language/schema/raw/master/csl-citation.json"} </w:instrText>
       </w:r>
       <w:r>
         <w:rPr>
@@ -6052,7 +6164,7 @@
         <w:rPr>
           <w:lang w:val="es-ES"/>
         </w:rPr>
-        <w:t>[4], [5]</w:t>
+        <w:t>[5], [6]</w:t>
       </w:r>
       <w:r>
         <w:rPr>
@@ -6096,7 +6208,7 @@
         <w:rPr>
           <w:lang w:val="es-ES"/>
         </w:rPr>
-        <w:instrText xml:space="preserve"> ADDIN ZOTERO_ITEM CSL_CITATION {"citationID":"hGeCMKMe","properties":{"unsorted":false,"formattedCitation":"[6]","plainCitation":"[6]","noteIndex":0},"citationItems":[{"id":57,"uris":["http://zotero.org/users/local/axS3HTYd/items/IV9CTCMN"],"itemData":{"id":57,"type":"article-journal","abstract":"This article provides guidelines on how to make useful game definitions and discusses when that is a worthwhile undertaking. It examines a recent article attempting to define videogames (Bergonse in Comput Games J 6(4):239–255, 2017. https ://doi.org/10.1007/s40869-017-0045-4), and uses it as an example to discuss game definitions in general. It concludes with reasons why making a final definition of games is not possible and why we need to continue to define games.","container-title":"The Computer Games Journal","DOI":"10.1007/s40869-019-00080-6","ISSN":"2052-773X","issue":"3-4","journalAbbreviation":"Comput Game J","language":"en","page":"109-120","source":"DOI.org (Crossref)","title":"How to Define Games and Why We Need to","volume":"8","author":[{"family":"Arjoranta","given":"Jonne"}],"issued":{"date-parts":[["2019",12]]}}}],"schema":"https://github.com/citation-style-language/schema/raw/master/csl-citation.json"} </w:instrText>
+        <w:instrText xml:space="preserve"> ADDIN ZOTERO_ITEM CSL_CITATION {"citationID":"hGeCMKMe","properties":{"unsorted":false,"formattedCitation":"[7]","plainCitation":"[7]","noteIndex":0},"citationItems":[{"id":57,"uris":["http://zotero.org/users/local/axS3HTYd/items/IV9CTCMN"],"itemData":{"id":57,"type":"article-journal","abstract":"This article provides guidelines on how to make useful game definitions and discusses when that is a worthwhile undertaking. It examines a recent article attempting to define videogames (Bergonse in Comput Games J 6(4):239–255, 2017. https ://doi.org/10.1007/s40869-017-0045-4), and uses it as an example to discuss game definitions in general. It concludes with reasons why making a final definition of games is not possible and why we need to continue to define games.","container-title":"The Computer Games Journal","DOI":"10.1007/s40869-019-00080-6","ISSN":"2052-773X","issue":"3-4","journalAbbreviation":"Comput Game J","language":"en","page":"109-120","source":"DOI.org (Crossref)","title":"How to Define Games and Why We Need to","volume":"8","author":[{"family":"Arjoranta","given":"Jonne"}],"issued":{"date-parts":[["2019",12]]}}}],"schema":"https://github.com/citation-style-language/schema/raw/master/csl-citation.json"} </w:instrText>
       </w:r>
       <w:r>
         <w:rPr>
@@ -6108,7 +6220,7 @@
         <w:rPr>
           <w:lang w:val="es-ES"/>
         </w:rPr>
-        <w:t>[6]</w:t>
+        <w:t>[7]</w:t>
       </w:r>
       <w:r>
         <w:rPr>
@@ -6132,7 +6244,7 @@
         <w:rPr>
           <w:lang w:val="es-ES"/>
         </w:rPr>
-        <w:instrText xml:space="preserve"> ADDIN ZOTERO_ITEM CSL_CITATION {"citationID":"NetHTdtm","properties":{"unsorted":false,"formattedCitation":"[4], [7]","plainCitation":"[4], [7]","noteIndex":0},"citationItems":[{"id":55,"uris":["http://zotero.org/users/local/axS3HTYd/items/TS552UNA"],"itemData":{"id":55,"type":"article-journal","abstract":"During the last ﬁve decades, videogames evolved into a major component of popular culture as well as a multi-billion-dollar industry. The medium diversiﬁed tremendously, currently encompassing simple implementations of numeric games on the screen of a cell phone as well as vast, persistent online worlds on last generation consoles and PCs. In spite of its cultural and economic relevance, few attempts have been made to deﬁne what a videogame exactly is. In this article, I endeavour to propose an essentialist deﬁnition of videogame, that is, one structured in terms of necessary and sufﬁcient conditions. I begin with a critical consideration of the main theoretical approaches to the medium and the few published deﬁnitions. From this analysis, four essential properties are deﬁned and separately characterized. Finally, a deﬁnition is proposed, capable of encompassing the medium in both its speciﬁcity and variability.","container-title":"The Computer Games Journal","DOI":"10.1007/s40869-017-0045-4","ISSN":"2052-773X","issue":"4","journalAbbreviation":"Comput Game J","language":"en","page":"239-255","source":"DOI.org (Crossref)","title":"Fifty Years on, What Exactly is a Videogame? An Essentialistic Definitional Approach","title-short":"Fifty Years on, What Exactly is a Videogame?","volume":"6","author":[{"family":"Bergonse","given":"Rafaello"}],"issued":{"date-parts":[["2017",12]]}}},{"id":63,"uris":["http://zotero.org/users/local/axS3HTYd/items/KSEIVBAL"],"itemData":{"id":63,"type":"paper-conference","abstract":"An idle game, also known as an incremental game, is a genre of games defined by the primary feature of its strategy: leaving the game running by itself with minimum or zero player interaction. Interaction with the game, while often useful for progression, is optional for extended periods of gameplay. Through a comparison between academic views on the definition of a video game and the results of a survey, this paper uncovers the importance of interactivity in an academic definition and a player's perceptions on how a game can be defined.","container-title":"2015 IEEE Games Entertainment Media Conference (GEM)","DOI":"10.1109/GEM.2015.7377233","event-title":"2015 IEEE Games Entertainment Media Conference (GEM)","page":"1-6","source":"IEEE Xplore","title":"A study of interaction in idle games &amp; perceptions on the definition of a game","URL":"https://ieeexplore.ieee.org/document/7377233","author":[{"family":"Khaliq","given":"Imran"},{"family":"Purkiss","given":"Blair"}],"accessed":{"date-parts":[["2026",8,7]]},"issued":{"date-parts":[["2015",10]]}}}],"schema":"https://github.com/citation-style-language/schema/raw/master/csl-citation.json"} </w:instrText>
+        <w:instrText xml:space="preserve"> ADDIN ZOTERO_ITEM CSL_CITATION {"citationID":"NetHTdtm","properties":{"unsorted":false,"formattedCitation":"[5], [8]","plainCitation":"[5], [8]","noteIndex":0},"citationItems":[{"id":55,"uris":["http://zotero.org/users/local/axS3HTYd/items/TS552UNA"],"itemData":{"id":55,"type":"article-journal","abstract":"During the last ﬁve decades, videogames evolved into a major component of popular culture as well as a multi-billion-dollar industry. The medium diversiﬁed tremendously, currently encompassing simple implementations of numeric games on the screen of a cell phone as well as vast, persistent online worlds on last generation consoles and PCs. In spite of its cultural and economic relevance, few attempts have been made to deﬁne what a videogame exactly is. In this article, I endeavour to propose an essentialist deﬁnition of videogame, that is, one structured in terms of necessary and sufﬁcient conditions. I begin with a critical consideration of the main theoretical approaches to the medium and the few published deﬁnitions. From this analysis, four essential properties are deﬁned and separately characterized. Finally, a deﬁnition is proposed, capable of encompassing the medium in both its speciﬁcity and variability.","container-title":"The Computer Games Journal","DOI":"10.1007/s40869-017-0045-4","ISSN":"2052-773X","issue":"4","journalAbbreviation":"Comput Game J","language":"en","page":"239-255","source":"DOI.org (Crossref)","title":"Fifty Years on, What Exactly is a Videogame? An Essentialistic Definitional Approach","title-short":"Fifty Years on, What Exactly is a Videogame?","volume":"6","author":[{"family":"Bergonse","given":"Rafaello"}],"issued":{"date-parts":[["2017",12]]}}},{"id":63,"uris":["http://zotero.org/users/local/axS3HTYd/items/KSEIVBAL"],"itemData":{"id":63,"type":"paper-conference","abstract":"An idle game, also known as an incremental game, is a genre of games defined by the primary feature of its strategy: leaving the game running by itself with minimum or zero player interaction. Interaction with the game, while often useful for progression, is optional for extended periods of gameplay. Through a comparison between academic views on the definition of a video game and the results of a survey, this paper uncovers the importance of interactivity in an academic definition and a player's perceptions on how a game can be defined.","container-title":"2015 IEEE Games Entertainment Media Conference (GEM)","DOI":"10.1109/GEM.2015.7377233","event-title":"2015 IEEE Games Entertainment Media Conference (GEM)","page":"1-6","source":"IEEE Xplore","title":"A study of interaction in idle games &amp; perceptions on the definition of a game","URL":"https://ieeexplore.ieee.org/document/7377233","author":[{"family":"Khaliq","given":"Imran"},{"family":"Purkiss","given":"Blair"}],"accessed":{"date-parts":[["2026",8,7]]},"issued":{"date-parts":[["2015",10]]}}}],"schema":"https://github.com/citation-style-language/schema/raw/master/csl-citation.json"} </w:instrText>
       </w:r>
       <w:r>
         <w:rPr>
@@ -6144,7 +6256,7 @@
         <w:rPr>
           <w:lang w:val="es-ES"/>
         </w:rPr>
-        <w:t>[4], [7]</w:t>
+        <w:t>[5], [8]</w:t>
       </w:r>
       <w:r>
         <w:rPr>
@@ -6198,14 +6310,14 @@
           <w:lang w:val="es-ES"/>
         </w:rPr>
       </w:pPr>
-      <w:bookmarkStart w:id="28" w:name="_Toc236766581"/>
+      <w:bookmarkStart w:id="29" w:name="_Toc237110999"/>
       <w:r>
         <w:rPr>
           <w:lang w:val="es-ES"/>
         </w:rPr>
         <w:t>Que es un juego serio</w:t>
       </w:r>
-      <w:bookmarkEnd w:id="28"/>
+      <w:bookmarkEnd w:id="29"/>
     </w:p>
     <w:p>
       <w:pPr>
@@ -6263,7 +6375,7 @@
           <w:color w:val="000000"/>
           <w:szCs w:val="22"/>
         </w:rPr>
-        <w:instrText xml:space="preserve"> ADDIN ZOTERO_ITEM CSL_CITATION {"citationID":"cAtawusF","properties":{"unsorted":false,"formattedCitation":"[8]","plainCitation":"[8]","noteIndex":0},"citationItems":[{"id":61,"uris":["http://zotero.org/users/local/axS3HTYd/items/RUN9MV5P"],"itemData":{"id":61,"type":"article-journal","abstract":"During the past decades, the virtual reality community has based its development on a synthesis of earlier work in interactive 3D graphics, user interfaces, and visual simulation. Currently, the VR field is transitioning into work influenced by video games. Because much of the research and development being conducted in the games community parallels the VR community's efforts, it has the potential to affect a greater audience. Given these trends, VR researchers who want their work to remain relevant must realign to focus on game research and development. Leveraging technology from the visual simulation and virtual reality communities, serious games provide a delivery system for organizational video game instruction and training.","container-title":"Computer","DOI":"10.1109/MC.2005.297","ISSN":"1558-0814","issue":"9","page":"25-32","source":"IEEE Xplore","title":"From visual simulation to virtual reality to games","volume":"38","author":[{"family":"Zyda","given":"M."}],"issued":{"date-parts":[["2005",9]]}}}],"schema":"https://github.com/citation-style-language/schema/raw/master/csl-citation.json"} </w:instrText>
+        <w:instrText xml:space="preserve"> ADDIN ZOTERO_ITEM CSL_CITATION {"citationID":"lei9s9As","properties":{"unsorted":false,"formattedCitation":"[4], [9]","plainCitation":"[4], [9]","noteIndex":0},"citationItems":[{"id":70,"uris":["http://zotero.org/users/local/axS3HTYd/items/IE2PUA2E"],"itemData":{"id":70,"type":"article-journal","abstract":"This article proposes a definition of the object “Serious Game” and an approach dedicated to classify its various occurrences.","language":"en","source":"Zotero","title":"An introduction to Serious game Definitions and concepts","author":[{"family":"Alvarez","given":"Julian"},{"family":"Djaouti","given":"Damien"}]}},{"id":61,"uris":["http://zotero.org/users/local/axS3HTYd/items/RUN9MV5P"],"itemData":{"id":61,"type":"article-journal","abstract":"During the past decades, the virtual reality community has based its development on a synthesis of earlier work in interactive 3D graphics, user interfaces, and visual simulation. Currently, the VR field is transitioning into work influenced by video games. Because much of the research and development being conducted in the games community parallels the VR community's efforts, it has the potential to affect a greater audience. Given these trends, VR researchers who want their work to remain relevant must realign to focus on game research and development. Leveraging technology from the visual simulation and virtual reality communities, serious games provide a delivery system for organizational video game instruction and training.","container-title":"Computer","DOI":"10.1109/MC.2005.297","ISSN":"1558-0814","issue":"9","page":"25-32","source":"IEEE Xplore","title":"From visual simulation to virtual reality to games","volume":"38","author":[{"family":"Zyda","given":"M."}],"issued":{"date-parts":[["2005",9]]}}}],"schema":"https://github.com/citation-style-language/schema/raw/master/csl-citation.json"} </w:instrText>
       </w:r>
       <w:r>
         <w:rPr>
@@ -6273,7 +6385,7 @@
         <w:fldChar w:fldCharType="separate"/>
       </w:r>
       <w:r>
-        <w:t>[8]</w:t>
+        <w:t>[4], [9]</w:t>
       </w:r>
       <w:r>
         <w:rPr>
@@ -6352,14 +6464,48 @@
       <w:pPr>
         <w:pStyle w:val="NormalWeb"/>
         <w:spacing w:before="0" w:after="160"/>
-      </w:pPr>
-      <w:r>
         <w:rPr>
           <w:color w:val="000000"/>
           <w:szCs w:val="22"/>
         </w:rPr>
+      </w:pPr>
+      <w:r>
+        <w:rPr>
+          <w:color w:val="000000"/>
+          <w:szCs w:val="22"/>
+        </w:rPr>
         <w:t>El uso de este tipo de juegos como herramienta para la educación y el entrenamiento cognitivo ha ido aumentando a medida que pasan los años. </w:t>
       </w:r>
+      <w:r>
+        <w:rPr>
+          <w:color w:val="000000"/>
+          <w:szCs w:val="22"/>
+          <w:highlight w:val="yellow"/>
+        </w:rPr>
+        <w:t>BUSCAR REF</w:t>
+      </w:r>
+      <w:r>
+        <w:rPr>
+          <w:color w:val="000000"/>
+          <w:szCs w:val="22"/>
+        </w:rPr>
+        <w:t>. Este tipo de juegos son muy útiles ya que pueden crear entornos simulados en los que el jugador puede experimentar situaciones relacionadas con problemas reales y permite probar, practicar, equivocarse y aprender en un entorno controlado sin que haya consecuencias reales</w:t>
+      </w:r>
+      <w:r>
+        <w:rPr>
+          <w:color w:val="000000"/>
+          <w:szCs w:val="22"/>
+        </w:rPr>
+        <w:t xml:space="preserve">, algo que es importante en muchos ámbitos. </w:t>
+      </w:r>
+      <w:r>
+        <w:rPr>
+          <w:color w:val="000000"/>
+          <w:szCs w:val="22"/>
+          <w:highlight w:val="yellow"/>
+        </w:rPr>
+        <w:t>(Michael &amp; Chen, 2006)</w:t>
+      </w:r>
     </w:p>
     <w:p>
       <w:pPr>
@@ -6373,14 +6519,275 @@
           <w:lang w:val="es-ES"/>
         </w:rPr>
       </w:pPr>
-      <w:bookmarkStart w:id="29" w:name="_Toc236766582"/>
-      <w:r>
-        <w:rPr>
-          <w:lang w:val="es-ES"/>
-        </w:rPr>
+      <w:bookmarkStart w:id="30" w:name="_Toc237111000"/>
+      <w:r>
+        <w:rPr>
+          <w:lang w:val="es-ES"/>
+        </w:rPr>
+        <w:lastRenderedPageBreak/>
         <w:t>Tipos de juegos serios</w:t>
       </w:r>
-      <w:bookmarkEnd w:id="29"/>
+      <w:bookmarkEnd w:id="30"/>
+    </w:p>
+    <w:p>
+      <w:pPr>
+        <w:pStyle w:val="NormalWeb"/>
+        <w:spacing w:before="0" w:after="160"/>
+        <w:rPr>
+          <w:color w:val="000000"/>
+          <w:szCs w:val="22"/>
+        </w:rPr>
+      </w:pPr>
+      <w:r>
+        <w:rPr>
+          <w:color w:val="000000"/>
+          <w:szCs w:val="22"/>
+          <w:highlight w:val="yellow"/>
+        </w:rPr>
+        <w:t>(Michael &amp; Chen, 2006)</w:t>
+      </w:r>
+      <w:r>
+        <w:rPr>
+          <w:color w:val="000000"/>
+          <w:szCs w:val="22"/>
+        </w:rPr>
+        <w:t xml:space="preserve"> hacen una clasificación de juegos serios según el mercado y estos son los principales:</w:t>
+      </w:r>
+    </w:p>
+    <w:p>
+      <w:pPr>
+        <w:pStyle w:val="NormalWeb"/>
+        <w:numPr>
+          <w:ilvl w:val="0"/>
+          <w:numId w:val="50"/>
+        </w:numPr>
+        <w:spacing w:before="0" w:after="160"/>
+      </w:pPr>
+      <w:r>
+        <w:t>Juegos militares</w:t>
+      </w:r>
+    </w:p>
+    <w:p>
+      <w:pPr>
+        <w:pStyle w:val="NormalWeb"/>
+        <w:numPr>
+          <w:ilvl w:val="0"/>
+          <w:numId w:val="50"/>
+        </w:numPr>
+        <w:spacing w:before="0" w:after="160"/>
+      </w:pPr>
+      <w:r>
+        <w:t>Juegos gubernamentales</w:t>
+      </w:r>
+    </w:p>
+    <w:p>
+      <w:pPr>
+        <w:pStyle w:val="NormalWeb"/>
+        <w:numPr>
+          <w:ilvl w:val="0"/>
+          <w:numId w:val="50"/>
+        </w:numPr>
+        <w:spacing w:before="0" w:after="160"/>
+      </w:pPr>
+      <w:r>
+        <w:t>Juegos educativos</w:t>
+      </w:r>
+    </w:p>
+    <w:p>
+      <w:pPr>
+        <w:pStyle w:val="NormalWeb"/>
+        <w:numPr>
+          <w:ilvl w:val="0"/>
+          <w:numId w:val="50"/>
+        </w:numPr>
+        <w:spacing w:before="0" w:after="160"/>
+      </w:pPr>
+      <w:r>
+        <w:t>Juegos corporativos</w:t>
+      </w:r>
+    </w:p>
+    <w:p>
+      <w:pPr>
+        <w:pStyle w:val="NormalWeb"/>
+        <w:numPr>
+          <w:ilvl w:val="0"/>
+          <w:numId w:val="50"/>
+        </w:numPr>
+        <w:spacing w:before="0" w:after="160"/>
+      </w:pPr>
+      <w:r>
+        <w:t>Juegos relacionados con la salud</w:t>
+      </w:r>
+    </w:p>
+    <w:p>
+      <w:pPr>
+        <w:pStyle w:val="NormalWeb"/>
+        <w:numPr>
+          <w:ilvl w:val="0"/>
+          <w:numId w:val="50"/>
+        </w:numPr>
+        <w:spacing w:before="0" w:after="160"/>
+      </w:pPr>
+      <w:r>
+        <w:t>Juegos políticos, religiosos y artísticos</w:t>
+      </w:r>
+    </w:p>
+    <w:p>
+      <w:pPr>
+        <w:pStyle w:val="Textoindependiente"/>
+        <w:rPr>
+          <w:lang w:val="es-ES"/>
+        </w:rPr>
+      </w:pPr>
+      <w:r>
+        <w:rPr>
+          <w:lang w:val="es-ES"/>
+        </w:rPr>
+        <w:t>Teniendo en cuenta el apartado anterior, en alguno de estos ámbitos un fallo puede causar un gran problema, como por ejemplo si un militar está aprendiendo a echar granadas o un médico a operar una zona del cuerpo compleja. Los juegos serios son muy buena alternativa o ayuda.</w:t>
+      </w:r>
+    </w:p>
+    <w:p>
+      <w:pPr>
+        <w:pStyle w:val="Textoindependiente"/>
+        <w:rPr>
+          <w:lang w:val="es-ES"/>
+        </w:rPr>
+      </w:pPr>
+      <w:r>
+        <w:rPr>
+          <w:lang w:val="es-ES"/>
+        </w:rPr>
+        <w:t>Otra manera de clasificar los juegos serios podría ser por juegos para educar, juegos para</w:t>
+      </w:r>
+      <w:r>
+        <w:rPr>
+          <w:lang w:val="es-ES"/>
+        </w:rPr>
+        <w:t xml:space="preserve"> entrenar y juegos para informar, basándome también en el mismo libro</w:t>
+      </w:r>
+      <w:r>
+        <w:rPr>
+          <w:lang w:val="es-ES"/>
+        </w:rPr>
+        <w:t xml:space="preserve"> y por otro lado también podría tener una clasifica</w:t>
+      </w:r>
+      <w:r>
+        <w:rPr>
+          <w:lang w:val="es-ES"/>
+        </w:rPr>
+        <w:t>ción similar a la de los demás videojuegos</w:t>
+      </w:r>
+      <w:r>
+        <w:rPr>
+          <w:lang w:val="es-ES"/>
+        </w:rPr>
+        <w:t>.</w:t>
+      </w:r>
+      <w:r>
+        <w:rPr>
+          <w:lang w:val="es-ES"/>
+        </w:rPr>
+        <w:t xml:space="preserve"> Por </w:t>
+      </w:r>
+      <w:proofErr w:type="gramStart"/>
+      <w:r>
+        <w:rPr>
+          <w:lang w:val="es-ES"/>
+        </w:rPr>
+        <w:t>ejemplo</w:t>
+      </w:r>
+      <w:proofErr w:type="gramEnd"/>
+      <w:r>
+        <w:rPr>
+          <w:lang w:val="es-ES"/>
+        </w:rPr>
+        <w:t xml:space="preserve"> puede ser un simulador o podría ser una novela visual, </w:t>
+      </w:r>
+      <w:proofErr w:type="gramStart"/>
+      <w:r>
+        <w:rPr>
+          <w:lang w:val="es-ES"/>
+        </w:rPr>
+        <w:t>etc..</w:t>
+      </w:r>
+      <w:proofErr w:type="gramEnd"/>
+    </w:p>
+    <w:p>
+      <w:pPr>
+        <w:pStyle w:val="Textoindependiente"/>
+      </w:pPr>
+      <w:r>
+        <w:rPr>
+          <w:highlight w:val="yellow"/>
+          <w:lang w:val="es-ES"/>
+        </w:rPr>
+        <w:t>Sawyer y Smith(2008)</w:t>
+      </w:r>
+      <w:r>
+        <w:rPr>
+          <w:lang w:val="es-ES"/>
+        </w:rPr>
+        <w:t xml:space="preserve"> proponen separarlo por mercado y por propósito mientras que </w:t>
+      </w:r>
+      <w:r>
+        <w:rPr>
+          <w:highlight w:val="yellow"/>
+        </w:rPr>
+        <w:t>Prieto de Lope y Medina-Medina (2017)</w:t>
+      </w:r>
+      <w:r>
+        <w:t xml:space="preserve"> </w:t>
+      </w:r>
+      <w:r>
+        <w:fldChar w:fldCharType="begin"/>
+      </w:r>
+      <w:r>
+        <w:instrText xml:space="preserve"> ADDIN ZOTERO_ITEM CSL_CITATION {"citationID":"bQjYso0U","properties":{"unsorted":false,"formattedCitation":"[10]","plainCitation":"[10]","noteIndex":0},"citationItems":[{"id":65,"uris":["http://zotero.org/users/local/axS3HTYd/items/FP59JJME"],"itemData":{"id":65,"type":"article-journal","abstract":"This article highlights the importance of establishing comprehensive taxonomies in the booming sector of serious games. Although various authors have proposed partial classification systems in this field, very little has so far been published on serious game taxonomies which serve to classify any type of serious game. This article proposes a comprehensive serious game taxonomy. The aim of this taxonomy is to gather the particular features of video game design and development, the platforms used to run the games, and operational aspects such as use, users, and distribution by highlighting the idiosyncrasies of the serious component. To this end, 16 criteria are discussed in this work. The taxonomy collects a large number of features that will be useful for those looking for a serious game (e.g., to teach a subject or train a skill). If they wish to use an existing game, the taxonomy helps to choose between the different options. If they need to develop a custom game, the taxonomy details the design alternatives to consider. The proposal has been applied on 22 serious games, and some interesting conclusions are drawn from this study. In addition, a web application has been built to support the proposal.","container-title":"Journal of Educational Computing Research","DOI":"10.1177/0735633116681301","ISSN":"0735-6331","issue":"5","language":"EN","page":"629-672","publisher":"SAGE Publications Inc","source":"SAGE Journals","title":"A Comprehensive Taxonomy for Serious Games","volume":"55","author":[{"family":"De Lope","given":"Rafael Prieto"},{"family":"Medina-Medina","given":"Nuria"}],"issued":{"date-parts":[["2017",9,1]]}}}],"schema":"https://github.com/citation-style-language/schema/raw/master/csl-citation.json"} </w:instrText>
+      </w:r>
+      <w:r>
+        <w:fldChar w:fldCharType="separate"/>
+      </w:r>
+      <w:r>
+        <w:t>[10]</w:t>
+      </w:r>
+      <w:r>
+        <w:fldChar w:fldCharType="end"/>
+      </w:r>
+      <w:r>
+        <w:t>proponen basarse en 16 criterios para clasificar los juegos serios.</w:t>
+      </w:r>
+    </w:p>
+    <w:p>
+      <w:pPr>
+        <w:pStyle w:val="Textoindependiente"/>
+      </w:pPr>
+      <w:r>
+        <w:t xml:space="preserve">A diferencia de las clasificaciones centradas exclusivamente en el ámbito de aplicación, </w:t>
+      </w:r>
+      <w:r>
+        <w:rPr>
+          <w:highlight w:val="yellow"/>
+        </w:rPr>
+        <w:t>Prieto de Lope y Medina-Medina (2017)</w:t>
+      </w:r>
+      <w:r>
+        <w:fldChar w:fldCharType="begin"/>
+      </w:r>
+      <w:r>
+        <w:instrText xml:space="preserve"> ADDIN ZOTERO_ITEM CSL_CITATION {"citationID":"4dNHFKYN","properties":{"unsorted":false,"formattedCitation":"[10]","plainCitation":"[10]","noteIndex":0},"citationItems":[{"id":65,"uris":["http://zotero.org/users/local/axS3HTYd/items/FP59JJME"],"itemData":{"id":65,"type":"article-journal","abstract":"This article highlights the importance of establishing comprehensive taxonomies in the booming sector of serious games. Although various authors have proposed partial classification systems in this field, very little has so far been published on serious game taxonomies which serve to classify any type of serious game. This article proposes a comprehensive serious game taxonomy. The aim of this taxonomy is to gather the particular features of video game design and development, the platforms used to run the games, and operational aspects such as use, users, and distribution by highlighting the idiosyncrasies of the serious component. To this end, 16 criteria are discussed in this work. The taxonomy collects a large number of features that will be useful for those looking for a serious game (e.g., to teach a subject or train a skill). If they wish to use an existing game, the taxonomy helps to choose between the different options. If they need to develop a custom game, the taxonomy details the design alternatives to consider. The proposal has been applied on 22 serious games, and some interesting conclusions are drawn from this study. In addition, a web application has been built to support the proposal.","container-title":"Journal of Educational Computing Research","DOI":"10.1177/0735633116681301","ISSN":"0735-6331","issue":"5","language":"EN","page":"629-672","publisher":"SAGE Publications Inc","source":"SAGE Journals","title":"A Comprehensive Taxonomy for Serious Games","volume":"55","author":[{"family":"De Lope","given":"Rafael Prieto"},{"family":"Medina-Medina","given":"Nuria"}],"issued":{"date-parts":[["2017",9,1]]}}}],"schema":"https://github.com/citation-style-language/schema/raw/master/csl-citation.json"} </w:instrText>
+      </w:r>
+      <w:r>
+        <w:fldChar w:fldCharType="separate"/>
+      </w:r>
+      <w:r>
+        <w:t>[10]</w:t>
+      </w:r>
+      <w:r>
+        <w:fldChar w:fldCharType="end"/>
+      </w:r>
+      <w:r>
+        <w:t xml:space="preserve"> proponen una taxonomía integral de los juegos serios que contempla 16 criterios relacionados con el diseño y desarrollo del videojuego, las plataformas, los usuarios, el uso y la distribución. De este modo, un juego serio puede caracterizarse mediante la combinación de diferentes dimensiones, en lugar de quedar adscrito a una única categoría.</w:t>
+      </w:r>
     </w:p>
     <w:p>
       <w:pPr>
@@ -6389,14 +6796,85 @@
           <w:lang w:val="es-ES"/>
         </w:rPr>
       </w:pPr>
-      <w:bookmarkStart w:id="30" w:name="_Toc236766583"/>
-      <w:r>
-        <w:rPr>
-          <w:lang w:val="es-ES"/>
-        </w:rPr>
+      <w:bookmarkStart w:id="31" w:name="_Toc237111001"/>
+      <w:r>
+        <w:rPr>
+          <w:lang w:val="es-ES"/>
+        </w:rPr>
+        <w:lastRenderedPageBreak/>
         <w:t>Puntos necesarios para juego para TDAH</w:t>
       </w:r>
-      <w:bookmarkEnd w:id="30"/>
+      <w:bookmarkEnd w:id="31"/>
+    </w:p>
+    <w:p>
+      <w:pPr>
+        <w:pStyle w:val="Textoindependiente"/>
+        <w:rPr>
+          <w:lang w:val="es-ES"/>
+        </w:rPr>
+      </w:pPr>
+      <w:r>
+        <w:rPr>
+          <w:lang w:val="es-ES"/>
+        </w:rPr>
+        <w:t xml:space="preserve">Los juegos serios pueden tener muchos temas diferentes y puede servir, dentro de el objetivo principal de enseñar, para muchas cosas. Por lo </w:t>
+      </w:r>
+      <w:proofErr w:type="gramStart"/>
+      <w:r>
+        <w:rPr>
+          <w:lang w:val="es-ES"/>
+        </w:rPr>
+        <w:t>tanto</w:t>
+      </w:r>
+      <w:proofErr w:type="gramEnd"/>
+      <w:r>
+        <w:rPr>
+          <w:lang w:val="es-ES"/>
+        </w:rPr>
+        <w:t xml:space="preserve"> cada juego se debe centrar en los aspectos específicos que se necesiten para cada tema. En el caso de el TDAH no se queda atrás.</w:t>
+      </w:r>
+    </w:p>
+    <w:p>
+      <w:pPr>
+        <w:pStyle w:val="Textoindependiente"/>
+        <w:rPr>
+          <w:lang w:val="es-ES"/>
+        </w:rPr>
+      </w:pPr>
+      <w:r>
+        <w:rPr>
+          <w:lang w:val="es-ES"/>
+        </w:rPr>
+        <w:t>(</w:t>
+      </w:r>
+      <w:proofErr w:type="spellStart"/>
+      <w:r>
+        <w:rPr>
+          <w:lang w:val="es-ES"/>
+        </w:rPr>
+        <w:t>Explicacion</w:t>
+      </w:r>
+      <w:proofErr w:type="spellEnd"/>
+      <w:r>
+        <w:rPr>
+          <w:lang w:val="es-ES"/>
+        </w:rPr>
+        <w:t xml:space="preserve"> de características importantes de un juego para una persona con TDAH, </w:t>
+      </w:r>
+      <w:proofErr w:type="gramStart"/>
+      <w:r>
+        <w:rPr>
+          <w:lang w:val="es-ES"/>
+        </w:rPr>
+        <w:t>qué necesita?</w:t>
+      </w:r>
+      <w:proofErr w:type="gramEnd"/>
+      <w:r>
+        <w:rPr>
+          <w:lang w:val="es-ES"/>
+        </w:rPr>
+        <w:t xml:space="preserve">) </w:t>
+      </w:r>
     </w:p>
     <w:p>
       <w:pPr>
@@ -6423,7 +6901,6 @@
         <w:rPr>
           <w:lang w:val="es-ES"/>
         </w:rPr>
-        <w:lastRenderedPageBreak/>
         <w:t>Es importante que el juego pueda ser regulable en dificultad. Las personas con TDAH presentan baja autoestima y suelen abandonar las tareas a la más mínima muestra de fracaso</w:t>
       </w:r>
       <w:r>
@@ -6436,7 +6913,7 @@
         <w:rPr>
           <w:lang w:val="es-ES"/>
         </w:rPr>
-        <w:instrText xml:space="preserve"> ADDIN ZOTERO_ITEM CSL_CITATION {"citationID":"E27w79bG","properties":{"unsorted":false,"formattedCitation":"[9], [10]","plainCitation":"[9], [10]","noteIndex":0},"citationItems":[{"id":37,"uris":["http://zotero.org/users/local/axS3HTYd/items/SW432NXV"],"itemData":{"id":37,"type":"article-journal","language":"es","source":"Zotero","title":"LAS NUEVAS TECNOLOGÍAS EN LA RESPUESTA EDUCATIVA A LA DIVERSIDAD","author":[{"family":"Pérez","given":"Francisco Javier Soto"},{"family":"Vázquez","given":"José Rodríguez"}]}},{"id":38,"uris":["http://zotero.org/users/local/axS3HTYd/items/Y7XSXNTV"],"itemData":{"id":38,"type":"article-journal","page":"8","source":"Google Scholar","title":"TIC Y TDAH","author":[{"family":"González","given":"Tatiana Marín"}]}}],"schema":"https://github.com/citation-style-language/schema/raw/master/csl-citation.json"} </w:instrText>
+        <w:instrText xml:space="preserve"> ADDIN ZOTERO_ITEM CSL_CITATION {"citationID":"E27w79bG","properties":{"unsorted":false,"formattedCitation":"[11], [12]","plainCitation":"[11], [12]","noteIndex":0},"citationItems":[{"id":37,"uris":["http://zotero.org/users/local/axS3HTYd/items/SW432NXV"],"itemData":{"id":37,"type":"article-journal","language":"es","source":"Zotero","title":"LAS NUEVAS TECNOLOGÍAS EN LA RESPUESTA EDUCATIVA A LA DIVERSIDAD","author":[{"family":"Pérez","given":"Francisco Javier Soto"},{"family":"Vázquez","given":"José Rodríguez"}]}},{"id":38,"uris":["http://zotero.org/users/local/axS3HTYd/items/Y7XSXNTV"],"itemData":{"id":38,"type":"article-journal","page":"8","source":"Google Scholar","title":"TIC Y TDAH","author":[{"family":"González","given":"Tatiana Marín"}]}}],"schema":"https://github.com/citation-style-language/schema/raw/master/csl-citation.json"} </w:instrText>
       </w:r>
       <w:r>
         <w:rPr>
@@ -6448,7 +6925,7 @@
         <w:rPr>
           <w:lang w:val="es-ES"/>
         </w:rPr>
-        <w:t>[9], [10]</w:t>
+        <w:t>[11], [12]</w:t>
       </w:r>
       <w:r>
         <w:rPr>
@@ -6498,28 +6975,36 @@
           <w:lang w:val="es-ES"/>
         </w:rPr>
       </w:pPr>
-      <w:bookmarkStart w:id="31" w:name="_Toc236766584"/>
-      <w:r>
-        <w:rPr>
-          <w:lang w:val="es-ES"/>
-        </w:rPr>
-        <w:t>Juegos serios para educación (</w:t>
-      </w:r>
-      <w:proofErr w:type="gramStart"/>
-      <w:r>
-        <w:rPr>
-          <w:lang w:val="es-ES"/>
-        </w:rPr>
-        <w:t>para TDAH?</w:t>
-      </w:r>
-      <w:proofErr w:type="gramEnd"/>
-      <w:r>
-        <w:rPr>
-          <w:lang w:val="es-ES"/>
-        </w:rPr>
-        <w:t>)</w:t>
-      </w:r>
-      <w:bookmarkEnd w:id="31"/>
+      <w:bookmarkStart w:id="32" w:name="_Toc237111002"/>
+      <w:r>
+        <w:rPr>
+          <w:lang w:val="es-ES"/>
+        </w:rPr>
+        <w:t>Juegos serios para educación</w:t>
+      </w:r>
+      <w:bookmarkEnd w:id="32"/>
+    </w:p>
+    <w:p>
+      <w:pPr>
+        <w:pStyle w:val="Textoindependiente"/>
+        <w:rPr>
+          <w:lang w:val="es-ES"/>
+        </w:rPr>
+      </w:pPr>
+      <w:r>
+        <w:rPr>
+          <w:lang w:val="es-ES"/>
+        </w:rPr>
+        <w:t xml:space="preserve">En el TDAH puede ser muy efectivo </w:t>
+      </w:r>
+      <w:proofErr w:type="spellStart"/>
+      <w:r>
+        <w:rPr>
+          <w:lang w:val="es-ES"/>
+        </w:rPr>
+        <w:t>blahblahblah</w:t>
+      </w:r>
+      <w:proofErr w:type="spellEnd"/>
     </w:p>
     <w:p>
       <w:pPr>
@@ -6528,14 +7013,14 @@
           <w:lang w:val="es-ES"/>
         </w:rPr>
       </w:pPr>
-      <w:bookmarkStart w:id="32" w:name="_Toc236766585"/>
-      <w:r>
-        <w:rPr>
-          <w:lang w:val="es-ES"/>
-        </w:rPr>
-        <w:t>Juegos serios como herramienta psicológica (para TDAH)</w:t>
-      </w:r>
-      <w:bookmarkEnd w:id="32"/>
+      <w:bookmarkStart w:id="33" w:name="_Toc237111003"/>
+      <w:r>
+        <w:rPr>
+          <w:lang w:val="es-ES"/>
+        </w:rPr>
+        <w:t>Juegos serios como herramienta psicológica</w:t>
+      </w:r>
+      <w:bookmarkEnd w:id="33"/>
     </w:p>
     <w:p>
       <w:pPr>
@@ -6544,14 +7029,14 @@
           <w:lang w:val="es-ES"/>
         </w:rPr>
       </w:pPr>
-      <w:bookmarkStart w:id="33" w:name="_Toc236766586"/>
+      <w:bookmarkStart w:id="34" w:name="_Toc237111004"/>
       <w:r>
         <w:rPr>
           <w:lang w:val="es-ES"/>
         </w:rPr>
         <w:t>Ventajas de juegos en TDAH</w:t>
       </w:r>
-      <w:bookmarkEnd w:id="33"/>
+      <w:bookmarkEnd w:id="34"/>
     </w:p>
     <w:p>
       <w:pPr>
@@ -6560,14 +7045,14 @@
           <w:lang w:val="es-ES"/>
         </w:rPr>
       </w:pPr>
-      <w:bookmarkStart w:id="34" w:name="_Toc236766587"/>
+      <w:bookmarkStart w:id="35" w:name="_Toc237111005"/>
       <w:r>
         <w:rPr>
           <w:lang w:val="es-ES"/>
         </w:rPr>
         <w:t>Desventajas juegos en TDAH</w:t>
       </w:r>
-      <w:bookmarkEnd w:id="34"/>
+      <w:bookmarkEnd w:id="35"/>
     </w:p>
     <w:p>
       <w:pPr>
@@ -6576,14 +7061,14 @@
           <w:lang w:val="es-ES"/>
         </w:rPr>
       </w:pPr>
-      <w:bookmarkStart w:id="35" w:name="_Toc236766588"/>
+      <w:bookmarkStart w:id="36" w:name="_Toc237111006"/>
       <w:r>
         <w:rPr>
           <w:lang w:val="es-ES"/>
         </w:rPr>
         <w:t>Trabajos parecidos (Juegos serios para TDAH)</w:t>
       </w:r>
-      <w:bookmarkEnd w:id="35"/>
+      <w:bookmarkEnd w:id="36"/>
     </w:p>
     <w:p>
       <w:pPr>
@@ -6612,7 +7097,7 @@
         </w:rPr>
         <w:br w:type="column"/>
       </w:r>
-      <w:bookmarkStart w:id="36" w:name="_Toc236766589"/>
+      <w:bookmarkStart w:id="37" w:name="_Toc237111007"/>
       <w:r>
         <w:rPr>
           <w:lang w:val="es-ES"/>
@@ -6620,7 +7105,7 @@
         <w:lastRenderedPageBreak/>
         <w:t>Trabajo realizado</w:t>
       </w:r>
-      <w:bookmarkEnd w:id="36"/>
+      <w:bookmarkEnd w:id="37"/>
     </w:p>
     <w:p>
       <w:pPr>
@@ -6629,14 +7114,14 @@
           <w:lang w:val="es-ES"/>
         </w:rPr>
       </w:pPr>
-      <w:bookmarkStart w:id="37" w:name="_Toc236766590"/>
+      <w:bookmarkStart w:id="38" w:name="_Toc237111008"/>
       <w:r>
         <w:rPr>
           <w:lang w:val="es-ES"/>
         </w:rPr>
         <w:t>Diseño</w:t>
       </w:r>
-      <w:bookmarkEnd w:id="37"/>
+      <w:bookmarkEnd w:id="38"/>
     </w:p>
     <w:p>
       <w:pPr>
@@ -6659,14 +7144,14 @@
           <w:lang w:val="es-ES"/>
         </w:rPr>
       </w:pPr>
-      <w:bookmarkStart w:id="38" w:name="_Toc236766591"/>
+      <w:bookmarkStart w:id="39" w:name="_Toc237111009"/>
       <w:r>
         <w:rPr>
           <w:lang w:val="es-ES"/>
         </w:rPr>
         <w:t>Desarrollo</w:t>
       </w:r>
-      <w:bookmarkEnd w:id="38"/>
+      <w:bookmarkEnd w:id="39"/>
     </w:p>
     <w:p>
       <w:pPr>
@@ -6689,14 +7174,14 @@
           <w:lang w:val="es-ES"/>
         </w:rPr>
       </w:pPr>
-      <w:bookmarkStart w:id="39" w:name="_Toc236766592"/>
+      <w:bookmarkStart w:id="40" w:name="_Toc237111010"/>
       <w:r>
         <w:rPr>
           <w:lang w:val="es-ES"/>
         </w:rPr>
         <w:t>Pruebas</w:t>
       </w:r>
-      <w:bookmarkEnd w:id="39"/>
+      <w:bookmarkEnd w:id="40"/>
     </w:p>
     <w:p>
       <w:pPr>
@@ -6757,14 +7242,14 @@
           <w:lang w:val="es-ES"/>
         </w:rPr>
       </w:pPr>
-      <w:bookmarkStart w:id="40" w:name="_Toc236766593"/>
+      <w:bookmarkStart w:id="41" w:name="_Toc237111011"/>
       <w:r>
         <w:rPr>
           <w:lang w:val="es-ES"/>
         </w:rPr>
         <w:t>Datos</w:t>
       </w:r>
-      <w:bookmarkEnd w:id="40"/>
+      <w:bookmarkEnd w:id="41"/>
     </w:p>
     <w:p>
       <w:pPr>
@@ -6804,14 +7289,14 @@
           <w:lang w:val="es-ES"/>
         </w:rPr>
       </w:pPr>
-      <w:bookmarkStart w:id="41" w:name="_Toc236766594"/>
+      <w:bookmarkStart w:id="42" w:name="_Toc237111012"/>
       <w:r>
         <w:rPr>
           <w:lang w:val="es-ES"/>
         </w:rPr>
         <w:t>Análisis de los datos</w:t>
       </w:r>
-      <w:bookmarkEnd w:id="41"/>
+      <w:bookmarkEnd w:id="42"/>
     </w:p>
     <w:p>
       <w:pPr>
@@ -6834,14 +7319,14 @@
           <w:lang w:val="es-ES"/>
         </w:rPr>
       </w:pPr>
-      <w:bookmarkStart w:id="42" w:name="_Toc236766595"/>
+      <w:bookmarkStart w:id="43" w:name="_Toc237111013"/>
       <w:r>
         <w:rPr>
           <w:lang w:val="es-ES"/>
         </w:rPr>
         <w:t>Análisis por intento</w:t>
       </w:r>
-      <w:bookmarkEnd w:id="42"/>
+      <w:bookmarkEnd w:id="43"/>
     </w:p>
     <w:p>
       <w:pPr>
@@ -6850,14 +7335,14 @@
           <w:lang w:val="es-ES"/>
         </w:rPr>
       </w:pPr>
-      <w:bookmarkStart w:id="43" w:name="_Toc236766596"/>
+      <w:bookmarkStart w:id="44" w:name="_Toc237111014"/>
       <w:r>
         <w:rPr>
           <w:lang w:val="es-ES"/>
         </w:rPr>
         <w:t>Análisis por nivel</w:t>
       </w:r>
-      <w:bookmarkEnd w:id="43"/>
+      <w:bookmarkEnd w:id="44"/>
     </w:p>
     <w:p>
       <w:pPr>
@@ -6866,14 +7351,14 @@
           <w:lang w:val="es-ES"/>
         </w:rPr>
       </w:pPr>
-      <w:bookmarkStart w:id="44" w:name="_Toc236766597"/>
+      <w:bookmarkStart w:id="45" w:name="_Toc237111015"/>
       <w:r>
         <w:rPr>
           <w:lang w:val="es-ES"/>
         </w:rPr>
         <w:t>Análisis por sesión</w:t>
       </w:r>
-      <w:bookmarkEnd w:id="44"/>
+      <w:bookmarkEnd w:id="45"/>
     </w:p>
     <w:p>
       <w:pPr>
@@ -6882,14 +7367,14 @@
           <w:lang w:val="es-ES"/>
         </w:rPr>
       </w:pPr>
-      <w:bookmarkStart w:id="45" w:name="_Toc236766598"/>
+      <w:bookmarkStart w:id="46" w:name="_Toc237111016"/>
       <w:r>
         <w:rPr>
           <w:lang w:val="es-ES"/>
         </w:rPr>
         <w:t>Análisis tiempos de reacción</w:t>
       </w:r>
-      <w:bookmarkEnd w:id="45"/>
+      <w:bookmarkEnd w:id="46"/>
     </w:p>
     <w:p>
       <w:pPr>
@@ -6919,7 +7404,7 @@
         </w:rPr>
         <w:br w:type="column"/>
       </w:r>
-      <w:bookmarkStart w:id="46" w:name="_Toc236766599"/>
+      <w:bookmarkStart w:id="47" w:name="_Toc237111017"/>
       <w:r>
         <w:rPr>
           <w:lang w:val="es-ES"/>
@@ -6927,7 +7412,7 @@
         <w:lastRenderedPageBreak/>
         <w:t>Discusión</w:t>
       </w:r>
-      <w:bookmarkEnd w:id="46"/>
+      <w:bookmarkEnd w:id="47"/>
     </w:p>
     <w:p>
       <w:pPr>
@@ -6936,9 +7421,9 @@
           <w:lang w:val="es-ES"/>
         </w:rPr>
       </w:pPr>
-      <w:bookmarkStart w:id="47" w:name="_Ref11684775"/>
-      <w:bookmarkStart w:id="48" w:name="_Toc116636446"/>
-      <w:bookmarkStart w:id="49" w:name="_Toc236766600"/>
+      <w:bookmarkStart w:id="48" w:name="_Ref11684775"/>
+      <w:bookmarkStart w:id="49" w:name="_Toc116636446"/>
+      <w:bookmarkStart w:id="50" w:name="_Toc237111018"/>
       <w:r>
         <w:rPr>
           <w:lang w:val="es-ES"/>
@@ -6946,9 +7431,9 @@
         <w:lastRenderedPageBreak/>
         <w:t>Conclusiones y trabajo futuro</w:t>
       </w:r>
-      <w:bookmarkEnd w:id="47"/>
       <w:bookmarkEnd w:id="48"/>
       <w:bookmarkEnd w:id="49"/>
+      <w:bookmarkEnd w:id="50"/>
     </w:p>
     <w:p>
       <w:pPr>
@@ -6977,14 +7462,14 @@
           <w:lang w:val="es-ES"/>
         </w:rPr>
       </w:pPr>
-      <w:bookmarkStart w:id="50" w:name="_Toc236766601"/>
+      <w:bookmarkStart w:id="51" w:name="_Toc237111019"/>
       <w:r>
         <w:rPr>
           <w:lang w:val="es-ES"/>
         </w:rPr>
         <w:t>Resultados</w:t>
       </w:r>
-      <w:bookmarkEnd w:id="50"/>
+      <w:bookmarkEnd w:id="51"/>
     </w:p>
     <w:p>
       <w:pPr>
@@ -7007,14 +7492,14 @@
           <w:lang w:val="es-ES"/>
         </w:rPr>
       </w:pPr>
-      <w:bookmarkStart w:id="51" w:name="_Toc236766602"/>
+      <w:bookmarkStart w:id="52" w:name="_Toc237111020"/>
       <w:r>
         <w:rPr>
           <w:lang w:val="es-ES"/>
         </w:rPr>
         <w:t>Trabajo Futuro</w:t>
       </w:r>
-      <w:bookmarkEnd w:id="51"/>
+      <w:bookmarkEnd w:id="52"/>
     </w:p>
     <w:p>
       <w:pPr>
@@ -7080,8 +7565,8 @@
           <w:lang w:val="es-ES"/>
         </w:rPr>
       </w:pPr>
-      <w:bookmarkStart w:id="52" w:name="_Toc116636447"/>
-      <w:bookmarkStart w:id="53" w:name="_Toc236766603"/>
+      <w:bookmarkStart w:id="53" w:name="_Toc116636447"/>
+      <w:bookmarkStart w:id="54" w:name="_Toc237111021"/>
       <w:proofErr w:type="spellStart"/>
       <w:r>
         <w:rPr>
@@ -7090,8 +7575,8 @@
         <w:lastRenderedPageBreak/>
         <w:t>Introduction</w:t>
       </w:r>
-      <w:bookmarkEnd w:id="52"/>
       <w:bookmarkEnd w:id="53"/>
+      <w:bookmarkEnd w:id="54"/>
       <w:proofErr w:type="spellEnd"/>
     </w:p>
     <w:p>
@@ -7243,8 +7728,8 @@
           <w:lang w:val="es-ES"/>
         </w:rPr>
       </w:pPr>
-      <w:bookmarkStart w:id="54" w:name="_Toc116636448"/>
-      <w:bookmarkStart w:id="55" w:name="_Toc236766604"/>
+      <w:bookmarkStart w:id="55" w:name="_Toc116636448"/>
+      <w:bookmarkStart w:id="56" w:name="_Toc237111022"/>
       <w:proofErr w:type="spellStart"/>
       <w:r>
         <w:rPr>
@@ -7267,8 +7752,8 @@
         </w:rPr>
         <w:t>work</w:t>
       </w:r>
-      <w:bookmarkEnd w:id="54"/>
       <w:bookmarkEnd w:id="55"/>
+      <w:bookmarkEnd w:id="56"/>
       <w:proofErr w:type="spellEnd"/>
     </w:p>
     <w:p>
@@ -7404,8 +7889,8 @@
           <w:docGrid w:linePitch="360"/>
         </w:sectPr>
       </w:pPr>
-      <w:bookmarkStart w:id="56" w:name="Bibliografía"/>
-      <w:bookmarkStart w:id="57" w:name="Apendices"/>
+      <w:bookmarkStart w:id="57" w:name="Bibliografía"/>
+      <w:bookmarkStart w:id="58" w:name="Apendices"/>
     </w:p>
     <w:p>
       <w:pPr>
@@ -7430,16 +7915,16 @@
           <w:lang w:val="es-ES_tradnl"/>
         </w:rPr>
       </w:pPr>
-      <w:bookmarkStart w:id="58" w:name="_Toc116636450"/>
-      <w:bookmarkStart w:id="59" w:name="_Toc236766605"/>
+      <w:bookmarkStart w:id="59" w:name="_Toc116636450"/>
+      <w:bookmarkStart w:id="60" w:name="_Toc237111023"/>
       <w:proofErr w:type="spellStart"/>
       <w:r>
         <w:lastRenderedPageBreak/>
         <w:t>Bibliografía</w:t>
       </w:r>
-      <w:bookmarkEnd w:id="56"/>
-      <w:bookmarkEnd w:id="58"/>
+      <w:bookmarkEnd w:id="57"/>
       <w:bookmarkEnd w:id="59"/>
+      <w:bookmarkEnd w:id="60"/>
       <w:proofErr w:type="spellEnd"/>
       <w:r>
         <w:rPr>
@@ -7562,6 +8047,18 @@
       </w:r>
       <w:r>
         <w:tab/>
+        <w:t>J. Alvarez y D. Djaouti, «An introduction to Serious game Definitions and concepts».</w:t>
+      </w:r>
+    </w:p>
+    <w:p>
+      <w:pPr>
+        <w:pStyle w:val="Bibliografa"/>
+      </w:pPr>
+      <w:r>
+        <w:t>[5]</w:t>
+      </w:r>
+      <w:r>
+        <w:tab/>
         <w:t xml:space="preserve">R. Bergonse, «Fifty Years on, What Exactly is a Videogame? An Essentialistic Definitional Approach», </w:t>
       </w:r>
       <w:r>
@@ -7589,7 +8086,7 @@
         <w:pStyle w:val="Bibliografa"/>
       </w:pPr>
       <w:r>
-        <w:t>[5]</w:t>
+        <w:t>[6]</w:t>
       </w:r>
       <w:r>
         <w:tab/>
@@ -7611,7 +8108,7 @@
         <w:pStyle w:val="Bibliografa"/>
       </w:pPr>
       <w:r>
-        <w:t>[6]</w:t>
+        <w:t>[7]</w:t>
       </w:r>
       <w:r>
         <w:tab/>
@@ -7642,7 +8139,7 @@
         <w:pStyle w:val="Bibliografa"/>
       </w:pPr>
       <w:r>
-        <w:t>[7]</w:t>
+        <w:t>[8]</w:t>
       </w:r>
       <w:r>
         <w:tab/>
@@ -7664,7 +8161,7 @@
         <w:pStyle w:val="Bibliografa"/>
       </w:pPr>
       <w:r>
-        <w:t>[8]</w:t>
+        <w:t>[9]</w:t>
       </w:r>
       <w:r>
         <w:tab/>
@@ -7695,7 +8192,38 @@
         <w:pStyle w:val="Bibliografa"/>
       </w:pPr>
       <w:r>
-        <w:t>[9]</w:t>
+        <w:t>[10]</w:t>
+      </w:r>
+      <w:r>
+        <w:tab/>
+        <w:t xml:space="preserve">R. P. De Lope y N. Medina-Medina, «A Comprehensive Taxonomy for Serious Games», </w:t>
+      </w:r>
+      <w:r>
+        <w:rPr>
+          <w:i/>
+          <w:iCs/>
+        </w:rPr>
+        <w:t>J. Educ. Comput. Res.</w:t>
+      </w:r>
+      <w:r>
+        <w:t>, vol. 55, n.</w:t>
+      </w:r>
+      <w:r>
+        <w:rPr>
+          <w:vertAlign w:val="superscript"/>
+        </w:rPr>
+        <w:t>o</w:t>
+      </w:r>
+      <w:r>
+        <w:t xml:space="preserve"> 5, pp. 629-672, sep. 2017, doi: 10.1177/0735633116681301.</w:t>
+      </w:r>
+    </w:p>
+    <w:p>
+      <w:pPr>
+        <w:pStyle w:val="Bibliografa"/>
+      </w:pPr>
+      <w:r>
+        <w:t>[11]</w:t>
       </w:r>
       <w:r>
         <w:tab/>
@@ -7707,7 +8235,7 @@
         <w:pStyle w:val="Bibliografa"/>
       </w:pPr>
       <w:r>
-        <w:t>[10]</w:t>
+        <w:t>[12]</w:t>
       </w:r>
       <w:r>
         <w:tab/>
@@ -7756,15 +8284,15 @@
         <w:lastRenderedPageBreak/>
         <w:t>Apéndices</w:t>
       </w:r>
-      <w:bookmarkStart w:id="60" w:name="_Toc267562109"/>
-      <w:bookmarkEnd w:id="57"/>
+      <w:bookmarkStart w:id="61" w:name="_Toc267562109"/>
+      <w:bookmarkEnd w:id="58"/>
     </w:p>
     <w:p>
       <w:pPr>
         <w:pStyle w:val="Ttulo6"/>
       </w:pPr>
-      <w:bookmarkStart w:id="61" w:name="_Toc236766606"/>
-      <w:bookmarkEnd w:id="60"/>
+      <w:bookmarkStart w:id="62" w:name="_Toc237111024"/>
+      <w:bookmarkEnd w:id="61"/>
       <w:r>
         <w:t>Título del</w:t>
       </w:r>
@@ -7774,7 +8302,7 @@
       <w:r>
         <w:t xml:space="preserve"> apéndice</w:t>
       </w:r>
-      <w:bookmarkEnd w:id="61"/>
+      <w:bookmarkEnd w:id="62"/>
     </w:p>
     <w:p>
       <w:r>
@@ -7877,12 +8405,12 @@
       <w:pPr>
         <w:pStyle w:val="Ttulo6"/>
       </w:pPr>
-      <w:bookmarkStart w:id="62" w:name="_Toc236766607"/>
+      <w:bookmarkStart w:id="63" w:name="_Toc237111025"/>
       <w:r>
         <w:lastRenderedPageBreak/>
         <w:t>Título del segundo apéndice</w:t>
       </w:r>
-      <w:bookmarkEnd w:id="62"/>
+      <w:bookmarkEnd w:id="63"/>
     </w:p>
     <w:p>
       <w:r>
@@ -9584,6 +10112,96 @@
     </w:lvl>
   </w:abstractNum>
   <w:abstractNum w:abstractNumId="20" w15:restartNumberingAfterBreak="0">
+    <w:nsid w:val="24020EEB"/>
+    <w:multiLevelType w:val="hybridMultilevel"/>
+    <w:tmpl w:val="366C581C"/>
+    <w:lvl w:ilvl="0" w:tplc="E2F4695A">
+      <w:start w:val="1"/>
+      <w:numFmt w:val="decimal"/>
+      <w:lvlText w:val="%1."/>
+      <w:lvlJc w:val="left"/>
+      <w:pPr>
+        <w:ind w:left="1080" w:hanging="360"/>
+      </w:pPr>
+      <w:rPr>
+        <w:rFonts w:hint="default"/>
+        <w:color w:val="000000"/>
+      </w:rPr>
+    </w:lvl>
+    <w:lvl w:ilvl="1" w:tplc="0C0A0019" w:tentative="1">
+      <w:start w:val="1"/>
+      <w:numFmt w:val="lowerLetter"/>
+      <w:lvlText w:val="%2."/>
+      <w:lvlJc w:val="left"/>
+      <w:pPr>
+        <w:ind w:left="1800" w:hanging="360"/>
+      </w:pPr>
+    </w:lvl>
+    <w:lvl w:ilvl="2" w:tplc="0C0A001B" w:tentative="1">
+      <w:start w:val="1"/>
+      <w:numFmt w:val="lowerRoman"/>
+      <w:lvlText w:val="%3."/>
+      <w:lvlJc w:val="right"/>
+      <w:pPr>
+        <w:ind w:left="2520" w:hanging="180"/>
+      </w:pPr>
+    </w:lvl>
+    <w:lvl w:ilvl="3" w:tplc="0C0A000F" w:tentative="1">
+      <w:start w:val="1"/>
+      <w:numFmt w:val="decimal"/>
+      <w:lvlText w:val="%4."/>
+      <w:lvlJc w:val="left"/>
+      <w:pPr>
+        <w:ind w:left="3240" w:hanging="360"/>
+      </w:pPr>
+    </w:lvl>
+    <w:lvl w:ilvl="4" w:tplc="0C0A0019" w:tentative="1">
+      <w:start w:val="1"/>
+      <w:numFmt w:val="lowerLetter"/>
+      <w:lvlText w:val="%5."/>
+      <w:lvlJc w:val="left"/>
+      <w:pPr>
+        <w:ind w:left="3960" w:hanging="360"/>
+      </w:pPr>
+    </w:lvl>
+    <w:lvl w:ilvl="5" w:tplc="0C0A001B" w:tentative="1">
+      <w:start w:val="1"/>
+      <w:numFmt w:val="lowerRoman"/>
+      <w:lvlText w:val="%6."/>
+      <w:lvlJc w:val="right"/>
+      <w:pPr>
+        <w:ind w:left="4680" w:hanging="180"/>
+      </w:pPr>
+    </w:lvl>
+    <w:lvl w:ilvl="6" w:tplc="0C0A000F" w:tentative="1">
+      <w:start w:val="1"/>
+      <w:numFmt w:val="decimal"/>
+      <w:lvlText w:val="%7."/>
+      <w:lvlJc w:val="left"/>
+      <w:pPr>
+        <w:ind w:left="5400" w:hanging="360"/>
+      </w:pPr>
+    </w:lvl>
+    <w:lvl w:ilvl="7" w:tplc="0C0A0019" w:tentative="1">
+      <w:start w:val="1"/>
+      <w:numFmt w:val="lowerLetter"/>
+      <w:lvlText w:val="%8."/>
+      <w:lvlJc w:val="left"/>
+      <w:pPr>
+        <w:ind w:left="6120" w:hanging="360"/>
+      </w:pPr>
+    </w:lvl>
+    <w:lvl w:ilvl="8" w:tplc="0C0A001B" w:tentative="1">
+      <w:start w:val="1"/>
+      <w:numFmt w:val="lowerRoman"/>
+      <w:lvlText w:val="%9."/>
+      <w:lvlJc w:val="right"/>
+      <w:pPr>
+        <w:ind w:left="6840" w:hanging="180"/>
+      </w:pPr>
+    </w:lvl>
+  </w:abstractNum>
+  <w:abstractNum w:abstractNumId="21" w15:restartNumberingAfterBreak="0">
     <w:nsid w:val="250F6CC7"/>
     <w:multiLevelType w:val="multilevel"/>
     <w:tmpl w:val="1B084830"/>
@@ -9710,7 +10328,7 @@
       </w:rPr>
     </w:lvl>
   </w:abstractNum>
-  <w:abstractNum w:abstractNumId="21" w15:restartNumberingAfterBreak="0">
+  <w:abstractNum w:abstractNumId="22" w15:restartNumberingAfterBreak="0">
     <w:nsid w:val="2DE97FF1"/>
     <w:multiLevelType w:val="multilevel"/>
     <w:tmpl w:val="24346896"/>
@@ -9859,7 +10477,7 @@
       </w:rPr>
     </w:lvl>
   </w:abstractNum>
-  <w:abstractNum w:abstractNumId="22" w15:restartNumberingAfterBreak="0">
+  <w:abstractNum w:abstractNumId="23" w15:restartNumberingAfterBreak="0">
     <w:nsid w:val="2FFC21B7"/>
     <w:multiLevelType w:val="hybridMultilevel"/>
     <w:tmpl w:val="4336DDD2"/>
@@ -9999,7 +10617,7 @@
       </w:rPr>
     </w:lvl>
   </w:abstractNum>
-  <w:abstractNum w:abstractNumId="23" w15:restartNumberingAfterBreak="0">
+  <w:abstractNum w:abstractNumId="24" w15:restartNumberingAfterBreak="0">
     <w:nsid w:val="321C0D15"/>
     <w:multiLevelType w:val="multilevel"/>
     <w:tmpl w:val="54140BA4"/>
@@ -10134,7 +10752,7 @@
       </w:rPr>
     </w:lvl>
   </w:abstractNum>
-  <w:abstractNum w:abstractNumId="24" w15:restartNumberingAfterBreak="0">
+  <w:abstractNum w:abstractNumId="25" w15:restartNumberingAfterBreak="0">
     <w:nsid w:val="330865B5"/>
     <w:multiLevelType w:val="multilevel"/>
     <w:tmpl w:val="040A001D"/>
@@ -10220,7 +10838,7 @@
       </w:pPr>
     </w:lvl>
   </w:abstractNum>
-  <w:abstractNum w:abstractNumId="25" w15:restartNumberingAfterBreak="0">
+  <w:abstractNum w:abstractNumId="26" w15:restartNumberingAfterBreak="0">
     <w:nsid w:val="51C115A6"/>
     <w:multiLevelType w:val="multilevel"/>
     <w:tmpl w:val="80440ECC"/>
@@ -10369,7 +10987,7 @@
       </w:rPr>
     </w:lvl>
   </w:abstractNum>
-  <w:abstractNum w:abstractNumId="26" w15:restartNumberingAfterBreak="0">
+  <w:abstractNum w:abstractNumId="27" w15:restartNumberingAfterBreak="0">
     <w:nsid w:val="59957CE0"/>
     <w:multiLevelType w:val="multilevel"/>
     <w:tmpl w:val="AA562C7C"/>
@@ -10499,7 +11117,7 @@
       </w:rPr>
     </w:lvl>
   </w:abstractNum>
-  <w:abstractNum w:abstractNumId="27" w15:restartNumberingAfterBreak="0">
+  <w:abstractNum w:abstractNumId="28" w15:restartNumberingAfterBreak="0">
     <w:nsid w:val="64F42C83"/>
     <w:multiLevelType w:val="multilevel"/>
     <w:tmpl w:val="AA562C7C"/>
@@ -10629,7 +11247,7 @@
       </w:rPr>
     </w:lvl>
   </w:abstractNum>
-  <w:abstractNum w:abstractNumId="28" w15:restartNumberingAfterBreak="0">
+  <w:abstractNum w:abstractNumId="29" w15:restartNumberingAfterBreak="0">
     <w:nsid w:val="67B85907"/>
     <w:multiLevelType w:val="hybridMultilevel"/>
     <w:tmpl w:val="6E6E04D6"/>
@@ -10715,7 +11333,7 @@
       </w:pPr>
     </w:lvl>
   </w:abstractNum>
-  <w:abstractNum w:abstractNumId="29" w15:restartNumberingAfterBreak="0">
+  <w:abstractNum w:abstractNumId="30" w15:restartNumberingAfterBreak="0">
     <w:nsid w:val="6FBF4159"/>
     <w:multiLevelType w:val="multilevel"/>
     <w:tmpl w:val="982674FA"/>
@@ -10845,7 +11463,7 @@
       </w:rPr>
     </w:lvl>
   </w:abstractNum>
-  <w:abstractNum w:abstractNumId="30" w15:restartNumberingAfterBreak="0">
+  <w:abstractNum w:abstractNumId="31" w15:restartNumberingAfterBreak="0">
     <w:nsid w:val="70301EDE"/>
     <w:multiLevelType w:val="multilevel"/>
     <w:tmpl w:val="DFFA0438"/>
@@ -10975,7 +11593,7 @@
       </w:rPr>
     </w:lvl>
   </w:abstractNum>
-  <w:abstractNum w:abstractNumId="31" w15:restartNumberingAfterBreak="0">
+  <w:abstractNum w:abstractNumId="32" w15:restartNumberingAfterBreak="0">
     <w:nsid w:val="736F4A0D"/>
     <w:multiLevelType w:val="multilevel"/>
     <w:tmpl w:val="040A001D"/>
@@ -11061,7 +11679,7 @@
       </w:pPr>
     </w:lvl>
   </w:abstractNum>
-  <w:abstractNum w:abstractNumId="32" w15:restartNumberingAfterBreak="0">
+  <w:abstractNum w:abstractNumId="33" w15:restartNumberingAfterBreak="0">
     <w:nsid w:val="76864434"/>
     <w:multiLevelType w:val="multilevel"/>
     <w:tmpl w:val="040A001D"/>
@@ -11147,7 +11765,7 @@
       </w:pPr>
     </w:lvl>
   </w:abstractNum>
-  <w:abstractNum w:abstractNumId="33" w15:restartNumberingAfterBreak="0">
+  <w:abstractNum w:abstractNumId="34" w15:restartNumberingAfterBreak="0">
     <w:nsid w:val="78622BFC"/>
     <w:multiLevelType w:val="multilevel"/>
     <w:tmpl w:val="473C4EE0"/>
@@ -11260,7 +11878,7 @@
       </w:pPr>
     </w:lvl>
   </w:abstractNum>
-  <w:abstractNum w:abstractNumId="34" w15:restartNumberingAfterBreak="0">
+  <w:abstractNum w:abstractNumId="35" w15:restartNumberingAfterBreak="0">
     <w:nsid w:val="79E81350"/>
     <w:multiLevelType w:val="multilevel"/>
     <w:tmpl w:val="D89EC2BE"/>
@@ -11391,7 +12009,7 @@
     </w:lvl>
   </w:abstractNum>
   <w:num w:numId="1" w16cid:durableId="962927342">
-    <w:abstractNumId w:val="22"/>
+    <w:abstractNumId w:val="23"/>
   </w:num>
   <w:num w:numId="2" w16cid:durableId="1200972430">
     <w:abstractNumId w:val="10"/>
@@ -11427,16 +12045,16 @@
     <w:abstractNumId w:val="16"/>
   </w:num>
   <w:num w:numId="13" w16cid:durableId="1519850972">
-    <w:abstractNumId w:val="23"/>
+    <w:abstractNumId w:val="24"/>
   </w:num>
   <w:num w:numId="14" w16cid:durableId="1283880269">
-    <w:abstractNumId w:val="20"/>
+    <w:abstractNumId w:val="21"/>
   </w:num>
   <w:num w:numId="15" w16cid:durableId="1646739723">
-    <w:abstractNumId w:val="34"/>
+    <w:abstractNumId w:val="35"/>
   </w:num>
   <w:num w:numId="16" w16cid:durableId="466629650">
-    <w:abstractNumId w:val="24"/>
+    <w:abstractNumId w:val="25"/>
   </w:num>
   <w:num w:numId="17" w16cid:durableId="1079012301">
     <w:abstractNumId w:val="19"/>
@@ -11445,28 +12063,28 @@
     <w:abstractNumId w:val="13"/>
   </w:num>
   <w:num w:numId="19" w16cid:durableId="1434395498">
-    <w:abstractNumId w:val="29"/>
+    <w:abstractNumId w:val="30"/>
   </w:num>
   <w:num w:numId="20" w16cid:durableId="1893346169">
     <w:abstractNumId w:val="11"/>
   </w:num>
   <w:num w:numId="21" w16cid:durableId="1509711991">
-    <w:abstractNumId w:val="30"/>
+    <w:abstractNumId w:val="31"/>
   </w:num>
   <w:num w:numId="22" w16cid:durableId="1149319704">
     <w:abstractNumId w:val="14"/>
   </w:num>
   <w:num w:numId="23" w16cid:durableId="53814836">
-    <w:abstractNumId w:val="26"/>
+    <w:abstractNumId w:val="27"/>
   </w:num>
   <w:num w:numId="24" w16cid:durableId="858156727">
-    <w:abstractNumId w:val="27"/>
+    <w:abstractNumId w:val="28"/>
   </w:num>
   <w:num w:numId="25" w16cid:durableId="1782651091">
     <w:abstractNumId w:val="0"/>
   </w:num>
   <w:num w:numId="26" w16cid:durableId="1087188752">
-    <w:abstractNumId w:val="33"/>
+    <w:abstractNumId w:val="34"/>
   </w:num>
   <w:num w:numId="27" w16cid:durableId="524753162">
     <w:abstractNumId w:val="15"/>
@@ -11478,13 +12096,13 @@
     <w:abstractNumId w:val="12"/>
   </w:num>
   <w:num w:numId="30" w16cid:durableId="358169484">
+    <w:abstractNumId w:val="33"/>
+  </w:num>
+  <w:num w:numId="31" w16cid:durableId="1628580751">
     <w:abstractNumId w:val="32"/>
   </w:num>
-  <w:num w:numId="31" w16cid:durableId="1628580751">
-    <w:abstractNumId w:val="31"/>
-  </w:num>
   <w:num w:numId="32" w16cid:durableId="792945128">
-    <w:abstractNumId w:val="28"/>
+    <w:abstractNumId w:val="29"/>
   </w:num>
   <w:num w:numId="33" w16cid:durableId="959652879">
     <w:abstractNumId w:val="18"/>
@@ -11520,7 +12138,7 @@
     </w:lvlOverride>
   </w:num>
   <w:num w:numId="35" w16cid:durableId="2083020368">
-    <w:abstractNumId w:val="25"/>
+    <w:abstractNumId w:val="26"/>
     <w:lvlOverride w:ilvl="0">
       <w:lvl w:ilvl="0">
         <w:numFmt w:val="bullet"/>
@@ -11540,7 +12158,7 @@
     </w:lvlOverride>
   </w:num>
   <w:num w:numId="36" w16cid:durableId="1001854229">
-    <w:abstractNumId w:val="25"/>
+    <w:abstractNumId w:val="26"/>
     <w:lvlOverride w:ilvl="0">
       <w:lvl w:ilvl="0">
         <w:numFmt w:val="bullet"/>
@@ -11560,7 +12178,7 @@
     </w:lvlOverride>
   </w:num>
   <w:num w:numId="37" w16cid:durableId="869030630">
-    <w:abstractNumId w:val="25"/>
+    <w:abstractNumId w:val="26"/>
     <w:lvlOverride w:ilvl="0">
       <w:lvl w:ilvl="0">
         <w:numFmt w:val="bullet"/>
@@ -11580,7 +12198,7 @@
     </w:lvlOverride>
   </w:num>
   <w:num w:numId="38" w16cid:durableId="1484851695">
-    <w:abstractNumId w:val="25"/>
+    <w:abstractNumId w:val="26"/>
     <w:lvlOverride w:ilvl="1">
       <w:lvl w:ilvl="1">
         <w:numFmt w:val="bullet"/>
@@ -11600,7 +12218,7 @@
     </w:lvlOverride>
   </w:num>
   <w:num w:numId="39" w16cid:durableId="1159807235">
-    <w:abstractNumId w:val="25"/>
+    <w:abstractNumId w:val="26"/>
     <w:lvlOverride w:ilvl="1">
       <w:lvl w:ilvl="1">
         <w:numFmt w:val="bullet"/>
@@ -11620,7 +12238,7 @@
     </w:lvlOverride>
   </w:num>
   <w:num w:numId="40" w16cid:durableId="1223827547">
-    <w:abstractNumId w:val="25"/>
+    <w:abstractNumId w:val="26"/>
     <w:lvlOverride w:ilvl="1">
       <w:lvl w:ilvl="1">
         <w:numFmt w:val="bullet"/>
@@ -11640,7 +12258,7 @@
     </w:lvlOverride>
   </w:num>
   <w:num w:numId="41" w16cid:durableId="52968556">
-    <w:abstractNumId w:val="25"/>
+    <w:abstractNumId w:val="26"/>
     <w:lvlOverride w:ilvl="0">
       <w:lvl w:ilvl="0">
         <w:numFmt w:val="bullet"/>
@@ -11660,7 +12278,7 @@
     </w:lvlOverride>
   </w:num>
   <w:num w:numId="42" w16cid:durableId="2029596336">
-    <w:abstractNumId w:val="25"/>
+    <w:abstractNumId w:val="26"/>
     <w:lvlOverride w:ilvl="0">
       <w:lvl w:ilvl="0">
         <w:numFmt w:val="bullet"/>
@@ -11680,7 +12298,7 @@
     </w:lvlOverride>
   </w:num>
   <w:num w:numId="43" w16cid:durableId="1394890120">
-    <w:abstractNumId w:val="25"/>
+    <w:abstractNumId w:val="26"/>
     <w:lvlOverride w:ilvl="0">
       <w:lvl w:ilvl="0">
         <w:numFmt w:val="bullet"/>
@@ -11700,7 +12318,7 @@
     </w:lvlOverride>
   </w:num>
   <w:num w:numId="44" w16cid:durableId="2143426673">
-    <w:abstractNumId w:val="25"/>
+    <w:abstractNumId w:val="26"/>
     <w:lvlOverride w:ilvl="1">
       <w:lvl w:ilvl="1">
         <w:numFmt w:val="bullet"/>
@@ -11720,7 +12338,7 @@
     </w:lvlOverride>
   </w:num>
   <w:num w:numId="45" w16cid:durableId="976107736">
-    <w:abstractNumId w:val="25"/>
+    <w:abstractNumId w:val="26"/>
     <w:lvlOverride w:ilvl="1">
       <w:lvl w:ilvl="1">
         <w:numFmt w:val="bullet"/>
@@ -11740,7 +12358,7 @@
     </w:lvlOverride>
   </w:num>
   <w:num w:numId="46" w16cid:durableId="1971353749">
-    <w:abstractNumId w:val="25"/>
+    <w:abstractNumId w:val="26"/>
     <w:lvlOverride w:ilvl="0">
       <w:lvl w:ilvl="0">
         <w:numFmt w:val="bullet"/>
@@ -11760,7 +12378,7 @@
     </w:lvlOverride>
   </w:num>
   <w:num w:numId="47" w16cid:durableId="197087714">
-    <w:abstractNumId w:val="25"/>
+    <w:abstractNumId w:val="26"/>
     <w:lvlOverride w:ilvl="1">
       <w:lvl w:ilvl="1">
         <w:numFmt w:val="bullet"/>
@@ -11780,7 +12398,7 @@
     </w:lvlOverride>
   </w:num>
   <w:num w:numId="48" w16cid:durableId="307788907">
-    <w:abstractNumId w:val="25"/>
+    <w:abstractNumId w:val="26"/>
     <w:lvlOverride w:ilvl="1">
       <w:lvl w:ilvl="1">
         <w:numFmt w:val="bullet"/>
@@ -11800,7 +12418,10 @@
     </w:lvlOverride>
   </w:num>
   <w:num w:numId="49" w16cid:durableId="1427338620">
-    <w:abstractNumId w:val="21"/>
+    <w:abstractNumId w:val="22"/>
+  </w:num>
+  <w:num w:numId="50" w16cid:durableId="1249659110">
+    <w:abstractNumId w:val="20"/>
   </w:num>
   <w:numIdMacAtCleanup w:val="13"/>
 </w:numbering>

</xml_diff>

<commit_message>
Caracteristicas importantes para juego con tdah
</commit_message>
<xml_diff>
--- a/MemoriaTFG/NahiaIglesiasEsquemaTFG.docx
+++ b/MemoriaTFG/NahiaIglesiasEsquemaTFG.docx
@@ -769,15 +769,7 @@
         <w:t xml:space="preserve">A mi hermana por </w:t>
       </w:r>
       <w:r>
-        <w:t xml:space="preserve">hacerme </w:t>
-      </w:r>
-      <w:proofErr w:type="spellStart"/>
-      <w:r>
-        <w:t>sandwitches</w:t>
-      </w:r>
-      <w:proofErr w:type="spellEnd"/>
-      <w:r>
-        <w:t xml:space="preserve"> todas las veces que </w:t>
+        <w:t xml:space="preserve">hacerme sandwitches todas las veces que </w:t>
       </w:r>
       <w:r>
         <w:t>me veía</w:t>
@@ -792,13 +784,8 @@
         <w:t>.</w:t>
       </w:r>
       <w:r>
-        <w:t xml:space="preserve"> </w:t>
-      </w:r>
-      <w:proofErr w:type="spellStart"/>
-      <w:r>
-        <w:t>Lna</w:t>
-      </w:r>
-      <w:proofErr w:type="spellEnd"/>
+        <w:t xml:space="preserve"> Lna</w:t>
+      </w:r>
     </w:p>
     <w:p>
       <w:pPr>
@@ -1355,21 +1342,14 @@
         <w:pStyle w:val="PageHeading"/>
       </w:pPr>
       <w:bookmarkStart w:id="1" w:name="Indice"/>
-      <w:proofErr w:type="spellStart"/>
       <w:r>
         <w:lastRenderedPageBreak/>
         <w:t>Índice</w:t>
       </w:r>
-      <w:proofErr w:type="spellEnd"/>
-      <w:r>
-        <w:t xml:space="preserve"> de </w:t>
-      </w:r>
-      <w:proofErr w:type="spellStart"/>
-      <w:r>
-        <w:t>contenidos</w:t>
+      <w:r>
+        <w:t xml:space="preserve"> de contenidos</w:t>
       </w:r>
       <w:bookmarkEnd w:id="1"/>
-      <w:proofErr w:type="spellEnd"/>
     </w:p>
     <w:sdt>
       <w:sdtPr>
@@ -5078,19 +5058,11 @@
       <w:bookmarkEnd w:id="7"/>
     </w:p>
     <w:p>
-      <w:proofErr w:type="spellStart"/>
       <w:r>
         <w:rPr>
           <w:shd w:val="clear" w:color="auto" w:fill="FFFFFF"/>
         </w:rPr>
-        <w:t>Hbalar</w:t>
-      </w:r>
-      <w:proofErr w:type="spellEnd"/>
-      <w:r>
-        <w:rPr>
-          <w:shd w:val="clear" w:color="auto" w:fill="FFFFFF"/>
-        </w:rPr>
-        <w:t xml:space="preserve"> un poco del TDAH y los juegos serios</w:t>
+        <w:t>Hbalar un poco del TDAH y los juegos serios</w:t>
       </w:r>
     </w:p>
     <w:p>
@@ -5230,15 +5202,7 @@
       </w:pPr>
       <w:r>
         <w:lastRenderedPageBreak/>
-        <w:t xml:space="preserve">(Como una </w:t>
-      </w:r>
-      <w:proofErr w:type="spellStart"/>
-      <w:r>
-        <w:t>checklist</w:t>
-      </w:r>
-      <w:proofErr w:type="spellEnd"/>
-      <w:r>
-        <w:t>)</w:t>
+        <w:t>(Como una checklist)</w:t>
       </w:r>
     </w:p>
     <w:p>
@@ -5282,74 +5246,10 @@
         <w:t xml:space="preserve"> </w:t>
       </w:r>
       <w:r>
-        <w:t xml:space="preserve">(creo, </w:t>
-      </w:r>
-      <w:proofErr w:type="spellStart"/>
-      <w:r>
-        <w:t>c#</w:t>
-      </w:r>
-      <w:proofErr w:type="spellEnd"/>
-      <w:r>
-        <w:t xml:space="preserve">), Visual </w:t>
-      </w:r>
-      <w:proofErr w:type="spellStart"/>
-      <w:r>
-        <w:t>studio</w:t>
-      </w:r>
-      <w:proofErr w:type="spellEnd"/>
-      <w:r>
-        <w:t xml:space="preserve"> </w:t>
-      </w:r>
-      <w:proofErr w:type="spellStart"/>
-      <w:r>
-        <w:t>core</w:t>
-      </w:r>
-      <w:proofErr w:type="spellEnd"/>
-      <w:r>
-        <w:t xml:space="preserve"> (</w:t>
-      </w:r>
-      <w:proofErr w:type="spellStart"/>
-      <w:r>
-        <w:t>python</w:t>
-      </w:r>
-      <w:proofErr w:type="spellEnd"/>
-      <w:r>
-        <w:t xml:space="preserve">), Photoshop, Blender, Scrum, </w:t>
-      </w:r>
-      <w:proofErr w:type="spellStart"/>
-      <w:r>
-        <w:t>Github</w:t>
-      </w:r>
-      <w:proofErr w:type="spellEnd"/>
-      <w:r>
-        <w:t>, Drive (documentos compartidos y datos de pruebas)</w:t>
-      </w:r>
-      <w:r>
-        <w:t xml:space="preserve">, </w:t>
-      </w:r>
-      <w:proofErr w:type="spellStart"/>
-      <w:r>
-        <w:t>Itchio</w:t>
-      </w:r>
-      <w:proofErr w:type="spellEnd"/>
-      <w:r>
-        <w:t xml:space="preserve">, </w:t>
-      </w:r>
-      <w:proofErr w:type="spellStart"/>
-      <w:r>
-        <w:t>Polypizza</w:t>
-      </w:r>
-      <w:proofErr w:type="spellEnd"/>
-      <w:r>
-        <w:t xml:space="preserve">, </w:t>
-      </w:r>
-      <w:proofErr w:type="spellStart"/>
-      <w:r>
-        <w:t>Freepik</w:t>
-      </w:r>
-      <w:proofErr w:type="spellEnd"/>
-      <w:r>
-        <w:t>, free3D, Davinci Resolve</w:t>
+        <w:t>(creo, c#), Visual studio core (python), Photoshop, Blender, Scrum, Github, Drive (documentos compartidos y datos de pruebas)</w:t>
+      </w:r>
+      <w:r>
+        <w:t>, Itchio, Polypizza, Freepik, free3D, Davinci Resolve</w:t>
       </w:r>
     </w:p>
     <w:p>
@@ -5381,23 +5281,7 @@
         <w:pStyle w:val="Textoindependiente"/>
       </w:pPr>
       <w:r>
-        <w:t xml:space="preserve">Planificar en tiempo lo que hice: </w:t>
-      </w:r>
-      <w:proofErr w:type="spellStart"/>
-      <w:r>
-        <w:t>Ej</w:t>
-      </w:r>
-      <w:proofErr w:type="spellEnd"/>
-      <w:r>
-        <w:t xml:space="preserve"> </w:t>
-      </w:r>
-      <w:proofErr w:type="gramStart"/>
-      <w:r>
-        <w:t>septiembre  hice</w:t>
-      </w:r>
-      <w:proofErr w:type="gramEnd"/>
-      <w:r>
-        <w:t xml:space="preserve"> tal, en octubre tal cual…</w:t>
+        <w:t>Planificar en tiempo lo que hice: Ej septiembre  hice tal, en octubre tal cual…</w:t>
       </w:r>
     </w:p>
     <w:p>
@@ -5636,15 +5520,7 @@
         <w:fldChar w:fldCharType="end"/>
       </w:r>
       <w:r>
-        <w:t xml:space="preserve"> (Esta es la guía para </w:t>
-      </w:r>
-      <w:proofErr w:type="spellStart"/>
-      <w:r>
-        <w:t>diagnostico</w:t>
-      </w:r>
-      <w:proofErr w:type="spellEnd"/>
-      <w:r>
-        <w:t xml:space="preserve"> de trastornos mentales).</w:t>
+        <w:t xml:space="preserve"> (Esta es la guía para diagnostico de trastornos mentales).</w:t>
       </w:r>
     </w:p>
     <w:p>
@@ -5706,7 +5582,6 @@
           <w:lang w:val="es-ES"/>
         </w:rPr>
       </w:pPr>
-      <w:proofErr w:type="spellStart"/>
       <w:r>
         <w:rPr>
           <w:lang w:val="es-ES"/>
@@ -5725,7 +5600,6 @@
         </w:rPr>
         <w:t>anificacion</w:t>
       </w:r>
-      <w:proofErr w:type="spellEnd"/>
     </w:p>
     <w:p>
       <w:pPr>
@@ -5971,25 +5845,7 @@
           <w:szCs w:val="22"/>
           <w:highlight w:val="yellow"/>
         </w:rPr>
-        <w:t xml:space="preserve"> (</w:t>
-      </w:r>
-      <w:proofErr w:type="spellStart"/>
-      <w:r>
-        <w:rPr>
-          <w:color w:val="000000"/>
-          <w:szCs w:val="22"/>
-          <w:highlight w:val="yellow"/>
-        </w:rPr>
-        <w:t>pg</w:t>
-      </w:r>
-      <w:proofErr w:type="spellEnd"/>
-      <w:r>
-        <w:rPr>
-          <w:color w:val="000000"/>
-          <w:szCs w:val="22"/>
-          <w:highlight w:val="yellow"/>
-        </w:rPr>
-        <w:t xml:space="preserve"> 19)</w:t>
+        <w:t xml:space="preserve"> (pg 19)</w:t>
       </w:r>
       <w:r>
         <w:rPr>
@@ -6651,30 +6507,8 @@
         <w:rPr>
           <w:lang w:val="es-ES"/>
         </w:rPr>
-        <w:t xml:space="preserve"> Por </w:t>
-      </w:r>
-      <w:proofErr w:type="gramStart"/>
-      <w:r>
-        <w:rPr>
-          <w:lang w:val="es-ES"/>
-        </w:rPr>
-        <w:t>ejemplo</w:t>
-      </w:r>
-      <w:proofErr w:type="gramEnd"/>
-      <w:r>
-        <w:rPr>
-          <w:lang w:val="es-ES"/>
-        </w:rPr>
-        <w:t xml:space="preserve"> puede ser un simulador o podría ser una novela visual, </w:t>
-      </w:r>
-      <w:proofErr w:type="gramStart"/>
-      <w:r>
-        <w:rPr>
-          <w:lang w:val="es-ES"/>
-        </w:rPr>
-        <w:t>etc..</w:t>
-      </w:r>
-      <w:proofErr w:type="gramEnd"/>
+        <w:t xml:space="preserve"> Por ejemplo puede ser un simulador o podría ser una novela visual, etc..</w:t>
+      </w:r>
     </w:p>
     <w:p>
       <w:pPr>
@@ -6766,7 +6600,37 @@
           <w:lang w:val="es-ES"/>
         </w:rPr>
         <w:lastRenderedPageBreak/>
-        <w:t>Puntos necesarios para juego para TDAH</w:t>
+        <w:t>Características recomendables para</w:t>
+      </w:r>
+      <w:r>
+        <w:rPr>
+          <w:lang w:val="es-ES"/>
+        </w:rPr>
+        <w:t xml:space="preserve"> juego</w:t>
+      </w:r>
+      <w:r>
+        <w:rPr>
+          <w:lang w:val="es-ES"/>
+        </w:rPr>
+        <w:t>s</w:t>
+      </w:r>
+      <w:r>
+        <w:rPr>
+          <w:lang w:val="es-ES"/>
+        </w:rPr>
+        <w:t xml:space="preserve"> </w:t>
+      </w:r>
+      <w:r>
+        <w:rPr>
+          <w:lang w:val="es-ES"/>
+        </w:rPr>
+        <w:t>sobre</w:t>
+      </w:r>
+      <w:r>
+        <w:rPr>
+          <w:lang w:val="es-ES"/>
+        </w:rPr>
+        <w:t xml:space="preserve"> TDAH</w:t>
       </w:r>
       <w:bookmarkEnd w:id="31"/>
     </w:p>
@@ -6781,7 +6645,31 @@
         <w:rPr>
           <w:lang w:val="es-ES"/>
         </w:rPr>
-        <w:t xml:space="preserve">Los juegos serios pueden tener muchos temas diferentes y puede servir, dentro de el objetivo principal de enseñar, para muchas cosas. Por lo </w:t>
+        <w:t xml:space="preserve">Los juegos serios pueden tener muchos temas diferentes y puede </w:t>
+      </w:r>
+      <w:r>
+        <w:rPr>
+          <w:lang w:val="es-ES"/>
+        </w:rPr>
+        <w:t>funcionar</w:t>
+      </w:r>
+      <w:r>
+        <w:rPr>
+          <w:lang w:val="es-ES"/>
+        </w:rPr>
+        <w:t xml:space="preserve">, dentro </w:t>
+      </w:r>
+      <w:r>
+        <w:rPr>
+          <w:lang w:val="es-ES"/>
+        </w:rPr>
+        <w:t>del</w:t>
+      </w:r>
+      <w:r>
+        <w:rPr>
+          <w:lang w:val="es-ES"/>
+        </w:rPr>
+        <w:t xml:space="preserve"> objetivo principal de enseñar, para muchas cosas. Por lo </w:t>
       </w:r>
       <w:r>
         <w:rPr>
@@ -6793,7 +6681,31 @@
         <w:rPr>
           <w:lang w:val="es-ES"/>
         </w:rPr>
-        <w:t xml:space="preserve"> cada juego se debe centrar en los aspectos específicos que se necesiten para cada tema. En el caso de el TDAH no se queda atrás.</w:t>
+        <w:t xml:space="preserve"> cada juego se debe centrar en los aspectos específicos que necesite cada tema. En el caso del </w:t>
+      </w:r>
+      <w:r>
+        <w:rPr>
+          <w:lang w:val="es-ES"/>
+        </w:rPr>
+        <w:t>Trastorno por déficit de atención e hiperactividad (</w:t>
+      </w:r>
+      <w:r>
+        <w:rPr>
+          <w:lang w:val="es-ES"/>
+        </w:rPr>
+        <w:t>TDAH</w:t>
+      </w:r>
+      <w:r>
+        <w:rPr>
+          <w:lang w:val="es-ES"/>
+        </w:rPr>
+        <w:t>)</w:t>
+      </w:r>
+      <w:r>
+        <w:rPr>
+          <w:lang w:val="es-ES"/>
+        </w:rPr>
+        <w:t xml:space="preserve"> no se queda atrás.</w:t>
       </w:r>
       <w:r>
         <w:rPr>
@@ -6811,9 +6723,17 @@
       </w:pPr>
       <w:r>
         <w:rPr>
-          <w:lang w:val="es-ES"/>
-        </w:rPr>
-        <w:t xml:space="preserve">Regulable en dificultad: </w:t>
+          <w:b/>
+          <w:bCs/>
+          <w:lang w:val="es-ES"/>
+        </w:rPr>
+        <w:t>Regulable en dificultad:</w:t>
+      </w:r>
+      <w:r>
+        <w:rPr>
+          <w:lang w:val="es-ES"/>
+        </w:rPr>
+        <w:t xml:space="preserve"> </w:t>
       </w:r>
       <w:r>
         <w:rPr>
@@ -6857,6 +6777,48 @@
         </w:rPr>
         <w:t>. Un juego adaptable a la capacidad del usuario permite que los especialistas puedan editar las características y así evitar el abandono en el juego y la frustración en el usuario.</w:t>
       </w:r>
+      <w:r>
+        <w:rPr>
+          <w:lang w:val="es-ES"/>
+        </w:rPr>
+        <w:t xml:space="preserve"> Las aplicaciones utilizadas para fines educativos o de aprendizaje deberían poder ser parametrizables de manera independiente</w:t>
+      </w:r>
+      <w:r>
+        <w:rPr>
+          <w:lang w:val="es-ES"/>
+        </w:rPr>
+        <w:fldChar w:fldCharType="begin"/>
+      </w:r>
+      <w:r>
+        <w:rPr>
+          <w:lang w:val="es-ES"/>
+        </w:rPr>
+        <w:instrText xml:space="preserve"> ADDIN ZOTERO_ITEM CSL_CITATION {"citationID":"uCDPlEcV","properties":{"unsorted":false,"formattedCitation":"[13]","plainCitation":"[13]","noteIndex":0},"citationItems":[{"id":75,"uris":["http://zotero.org/users/local/axS3HTYd/items/YAGCAE7R"],"itemData":{"id":75,"type":"article-journal","abstract":"El Trastorno por Déficit de Atención e Hiperactividad (TDAH) implica un patrón de déficit de atención, hiperactividad e impulsividad. Existen muchos trabajos donde se usan los videojuegos como un instrumento tecnológico de apoyo en el aula. No obstante, si bien se documentan los beneficios no queda claro el cómo fueron creados y sobre todo el impacto de estos para el propósito de aprendizaje para el que fueron creados. En este propósito, este artículo se centra en la propuesta metodológica de desarrollo de videojuegos para niños con TDAH. Se realizó una revisión de fuentes bibliográficas y entrevistas a especialistas para comprender que el apoyo basado en videojuegos tiene puntos positivos para el aprendizaje. Para el desarrollo de los videojuegos se emplea la metodología de SCRUM, se presentan 7 videojuegos para apoyar en el aprendizaje de niños de primaria, estos fueron evaluados por los especialistas en educación, padres de familia, especialistas de TDAH y los niños. Los resultados son alentadores y nos permiten sentar una base más formal respecto a los videojuegos serios para niños con TDAH. La metodología de desarrollo SRUM ha sido utilizada de manera específica para videojuegos, sin embargo, en este trabajo se presentan algunos artefactos modificados que contribuyen al diseño de videojuegos con propósitos de aprendizaje de niños con TDAH.","container-title":"Revista de la Asociación Interacción Persona Ordenador (AIPO)","DOI":"10.65234/interaccion.35","ISSN":"2695-6578","issue":"1","language":"es","license":"https://creativecommons.org/licenses/by-nc/4.0","page":"48-59","source":"revista.aipo.es","title":"Videojuegos en educación especial: niños con TDAH","title-short":"Videojuegos en educación especial","volume":"2","author":[{"family":"García","given":"Josefina Guerrero"},{"family":"Calleros","given":"Juan Manuel González"}],"issued":{"date-parts":[["2021",6,23]]}}}],"schema":"https://github.com/citation-style-language/schema/raw/master/csl-citation.json"} </w:instrText>
+      </w:r>
+      <w:r>
+        <w:rPr>
+          <w:lang w:val="es-ES"/>
+        </w:rPr>
+        <w:fldChar w:fldCharType="separate"/>
+      </w:r>
+      <w:r>
+        <w:rPr>
+          <w:lang w:val="es-ES"/>
+        </w:rPr>
+        <w:t>[13]</w:t>
+      </w:r>
+      <w:r>
+        <w:rPr>
+          <w:lang w:val="es-ES"/>
+        </w:rPr>
+        <w:fldChar w:fldCharType="end"/>
+      </w:r>
+      <w:r>
+        <w:rPr>
+          <w:lang w:val="es-ES"/>
+        </w:rPr>
+        <w:t>.</w:t>
+      </w:r>
     </w:p>
     <w:p>
       <w:pPr>
@@ -6867,29 +6829,29 @@
       </w:pPr>
       <w:r>
         <w:rPr>
-          <w:lang w:val="es-ES"/>
-        </w:rPr>
-        <w:t xml:space="preserve">Flexible: Por lo tanto, si el juego es flexible a los errores también ayudará a evitar esta frustración, los usuarios pueden tener errores, pero esto no debería </w:t>
-      </w:r>
-      <w:proofErr w:type="gramStart"/>
-      <w:r>
-        <w:rPr>
-          <w:lang w:val="es-ES"/>
-        </w:rPr>
-        <w:t xml:space="preserve">limitar poder </w:t>
-      </w:r>
-      <w:r>
-        <w:rPr>
-          <w:lang w:val="es-ES"/>
-        </w:rPr>
-        <w:t>intentarlo</w:t>
-      </w:r>
-      <w:proofErr w:type="gramEnd"/>
-      <w:r>
-        <w:rPr>
-          <w:lang w:val="es-ES"/>
-        </w:rPr>
-        <w:t xml:space="preserve"> de nuevo y conseguir las recompensas.  </w:t>
+          <w:b/>
+          <w:bCs/>
+          <w:lang w:val="es-ES"/>
+        </w:rPr>
+        <w:t>Flexible:</w:t>
+      </w:r>
+      <w:r>
+        <w:rPr>
+          <w:lang w:val="es-ES"/>
+        </w:rPr>
+        <w:t xml:space="preserve"> Por lo tanto, si el juego es flexible a los errores también ayudará a evitar esta frustración, los usuarios pueden tener errores, pero esto no debería </w:t>
+      </w:r>
+      <w:r>
+        <w:rPr>
+          <w:lang w:val="es-ES"/>
+        </w:rPr>
+        <w:t xml:space="preserve">limitar </w:t>
+      </w:r>
+      <w:r>
+        <w:rPr>
+          <w:lang w:val="es-ES"/>
+        </w:rPr>
+        <w:t xml:space="preserve">intentarlo de nuevo y conseguir las recompensas.  </w:t>
       </w:r>
     </w:p>
     <w:p>
@@ -6901,10 +6863,60 @@
       </w:pPr>
       <w:r>
         <w:rPr>
+          <w:b/>
+          <w:bCs/>
           <w:lang w:val="es-ES"/>
         </w:rPr>
         <w:t>Explicaciones claras y estructuradas:</w:t>
       </w:r>
+      <w:r>
+        <w:rPr>
+          <w:lang w:val="es-ES"/>
+        </w:rPr>
+        <w:t xml:space="preserve"> </w:t>
+      </w:r>
+      <w:r>
+        <w:rPr>
+          <w:lang w:val="es-ES"/>
+        </w:rPr>
+        <w:t>Los juegos estructurados destacan por ser efectivos mejorando la atención prolongada o la regulación emocional en personas con TDAH</w:t>
+      </w:r>
+      <w:r>
+        <w:rPr>
+          <w:lang w:val="es-ES"/>
+        </w:rPr>
+        <w:fldChar w:fldCharType="begin"/>
+      </w:r>
+      <w:r>
+        <w:rPr>
+          <w:lang w:val="es-ES"/>
+        </w:rPr>
+        <w:instrText xml:space="preserve"> ADDIN ZOTERO_ITEM CSL_CITATION {"citationID":"oN1XFSiJ","properties":{"unsorted":false,"formattedCitation":"[14]","plainCitation":"[14]","noteIndex":0},"citationItems":[{"id":73,"uris":["http://zotero.org/users/local/axS3HTYd/items/BQFYIPRE"],"itemData":{"id":73,"type":"thesis","abstract":"El objetivo de esta revisión sistemática fue el analizar la efectividad y características de las intervenciones basadas en el juego aplicado a niños que presentan cuadros de TEA o TDAH, un tema que resulta importante, especialmente cuando existe la necesidad de optimizar enfoques terapéuticos y educativos en cada uno de estos grupos. En este sentido, el estudio se acogió a la guía PRISMA 2020, considerando varios criterios de inclusión y exclusión tal como la revisión de la literatura publicada entre el 2016 y 2025 dentro de bases de datos especializadas que incluyen estudios empíricos sobre población menor a 16 años con diagnóstico clínico confirmado. Así también, se evitaron revisiones narrativas, teóricas o sistemáticas, estudios que combinen el juego con otras terapias y documentos con acceso restringido. Para cumplir con este objetivo, se seleccionaron diez estudios tras un riguroso proceso de cribado y análisis de sesgo que inicialmente contaba con 800 investigaciones. Con base en esta selección, los hallazgos muestran que las intervenciones estructuradas, así como las flexibles que utilizan juegos simbólicos, digitales y grupales son eficaces para la mejora de las funciones cognitivas y socioemocionales de los niños. Entre los mayores defectos se detectó que la atención, autocontrol, comunicación y sociabilidad varían según el diagnóstico y contexto del niño. Se concluye que la aplicación de intervenciones lúdicas que se adaptan a las necesidades individuales del niño representa una pieza importante dentro de la atención clínica y escolar, sugiriendo profundizar en diseños robustos, así como el seguimiento longitudinal y estrategias de colaboración interdisciplinaria que permitan avanzar en la inclusión y bienestar de los niños.","genre":"masterThesis","language":"spa","license":"openAccess","note":"Accepted: 2025-09-15T20:44:29Z","publisher":"Quito: Universidad de las Américas, 2025","source":"dspace.udla.edu.ec","title":"Revisión sistemática de intervenciones basadas en el juego como herramienta terapéutica para niños con TEA o TDAH","URL":"http://dspace.udla.edu.ec/handle/33000/18031","author":[{"family":"Alban Tarco","given":"Dayana Carolina"},{"family":"Jara Ramírez","given":"Verónica Elizabeth"}],"accessed":{"date-parts":[["2026",8,9]]},"issued":{"date-parts":[["2025"]]}}}],"schema":"https://github.com/citation-style-language/schema/raw/master/csl-citation.json"} </w:instrText>
+      </w:r>
+      <w:r>
+        <w:rPr>
+          <w:lang w:val="es-ES"/>
+        </w:rPr>
+        <w:fldChar w:fldCharType="separate"/>
+      </w:r>
+      <w:r>
+        <w:rPr>
+          <w:lang w:val="es-ES"/>
+        </w:rPr>
+        <w:t>[14]</w:t>
+      </w:r>
+      <w:r>
+        <w:rPr>
+          <w:lang w:val="es-ES"/>
+        </w:rPr>
+        <w:fldChar w:fldCharType="end"/>
+      </w:r>
+      <w:r>
+        <w:rPr>
+          <w:lang w:val="es-ES"/>
+        </w:rPr>
+        <w:t>. Las explicaciones claras y estructuradas ayudan a entender mejor el juego.</w:t>
+      </w:r>
     </w:p>
     <w:p>
       <w:pPr>
@@ -6917,7 +6929,13 @@
         <w:rPr>
           <w:lang w:val="es-ES"/>
         </w:rPr>
-        <w:t>Las intervenciones efectivas deben ser sistemáticas, flexibles y centradas en el niño para proporcionar una participación significativa. Es importante que el terapeuta gestione el proceso de manera receptiva y ajuste el nivel de desafío para mantener el nivel de interés</w:t>
+        <w:t>En relación con las anteriores características, l</w:t>
+      </w:r>
+      <w:r>
+        <w:rPr>
+          <w:lang w:val="es-ES"/>
+        </w:rPr>
+        <w:t>as intervenciones efectivas deben ser sistemáticas, flexibles y centradas en el niño para proporcionar una participación significativa. Es importante que el terapeuta gestione el proceso de manera receptiva y ajuste el nivel de desafío para mantener el nivel de interés</w:t>
       </w:r>
       <w:r>
         <w:rPr>
@@ -6929,7 +6947,7 @@
         <w:rPr>
           <w:lang w:val="es-ES"/>
         </w:rPr>
-        <w:instrText xml:space="preserve"> ADDIN ZOTERO_ITEM CSL_CITATION {"citationID":"RLyirFn5","properties":{"unsorted":false,"formattedCitation":"[13], [14]","plainCitation":"[13], [14]","noteIndex":0},"citationItems":[{"id":80,"uris":["http://zotero.org/users/local/axS3HTYd/items/W7SSLPFI"],"itemData":{"id":80,"type":"article-journal","abstract":"Resumen\nIntroducción\nExisten diferentes posturas en cuanto a la delimitación entre los trastornos del lenguaje y de la comunicación; sobre todo al acuñar las definiciones, sus limitantes y particularmente poder medir los pronósticos y diferentes procesos a lo largo del neurodesarrollo. El presente consenso busca unir las diferentes visiones de la región latinoamericana sobre los Trastornos del Desarrollo del Lenguaje (TDL) y Trastornos del Espectro Autista (TEA), homologar taxonomías y evolución a lo largo de los primeros años de vida.\nMétodo\nSe realizó un estudio Delphi Modificado para llegar a un consenso sobre la definición más adecuada y diagnóstico temprano de los TDL y TEA.\nResultados\nUn total de 34 profesionales de 11 países de la región aceptaron la invitación para participar en el consenso e incluyó a distintos especialistas a cargo del cuidado de estos pacientes. Se realizaron dos rondas de evaluación llegando a un acuerdo y consenso en todos los ítems.\nConclusiones\nEl término “Riesgo para Trastornos de la Comunicación y del Lenguaje” es creado para referirse a los niños que no caen en ninguna categoría diagnóstica en etapas tempranas del desarrollo. Consideramos que tanto el uso de este término como el del resto de los mismos, alcanzados por consenso, permitirá coincidir en distintos puntos para la caracterización del TDL y TEA, todo ello contribuirá a evaluar de forma más específica cuáles son las intervenciones adecuadas que mejoren el pronóstico y modifiquen las trayectorias del desarrollo de esta población en nuestra región.\nSummary\nIntroduction\nThere are different points of view regarding the delimitation between language and communication disorders; especially when establishing the definitions, their limitations and above all being able to measure prognoses and different processes throughout neurodevelopment. The present consensus seeks to unify the different points of view of the Latin American region on Language Development Disorders (LDD) and Autism Spectrum Disorders (ASD), standardize the taxonomies and evolution throughout the first years of life.\nMethod\nA Modified Delphi study was carried out to reach a consensus on the most adequate definition and early diagnosis of TDL and ASD.\nResults\nA total of 34 professionals from 11 countries in the region accepted the invitation to participate in the consensus and included different specialists in charge of the care of these patients. Two rounds of evaluation were carried out, reaching an agreement and consensus on all items.\nConclusions\nThe term “Risk for Communication and Language Disorders” is created to refer to children who do not fall into any diagnostic category in early stages of development. We consider that using this term as well as the rest of the terms reached by consensus in the present work will allow to match in different points for the characterization of TDL and ASD, this will contribute to a more specific evaluation regarding the appropriate interventions to improve prognosis and modify development trajectories of this population in our region.","collection-title":"TEMA CENTRAL: Pandemia COVID-19","container-title":"Revista Médica Clínica Las Condes","DOI":"10.1016/j.rmclc.2020.12.012","ISSN":"0716-8640","issue":"1","journalAbbreviation":"Revista Médica Clínica Las Condes","page":"112-127","source":"ScienceDirect","title":"MIDIENDO EL ESPECTRO: DE LOS TRASTORNOS DEL LENGUAJE A LOS TRASTORNOS DEL ESPECTRO AUTISTA: CONSENSO LATINOAMERICANO DELPHI MODIFICADO","title-short":"MIDIENDO EL ESPECTRO","volume":"32","author":[{"family":"Barragan-Perez","given":"Eduardo"},{"family":"Alvarez-Amado","given":"Daniel"},{"family":"García-Beristain","given":"Juan Carlos"},{"family":"Garfias-Rau","given":"Carlos"},{"family":"Oliva","given":"Montserrat Peinador"},{"family":"Guevara","given":"Mariana Ladron","dropping-particle":"de"},{"family":"Betancourt","given":"Alejandra Acevedo"},{"family":"Koloffon","given":"Gina Chapa"}],"issued":{"date-parts":[["2021",1,1]]}}},{"id":73,"uris":["http://zotero.org/users/local/axS3HTYd/items/BQFYIPRE"],"itemData":{"id":73,"type":"thesis","abstract":"El objetivo de esta revisión sistemática fue el analizar la efectividad y características de las intervenciones basadas en el juego aplicado a niños que presentan cuadros de TEA o TDAH, un tema que resulta importante, especialmente cuando existe la necesidad de optimizar enfoques terapéuticos y educativos en cada uno de estos grupos. En este sentido, el estudio se acogió a la guía PRISMA 2020, considerando varios criterios de inclusión y exclusión tal como la revisión de la literatura publicada entre el 2016 y 2025 dentro de bases de datos especializadas que incluyen estudios empíricos sobre población menor a 16 años con diagnóstico clínico confirmado. Así también, se evitaron revisiones narrativas, teóricas o sistemáticas, estudios que combinen el juego con otras terapias y documentos con acceso restringido. Para cumplir con este objetivo, se seleccionaron diez estudios tras un riguroso proceso de cribado y análisis de sesgo que inicialmente contaba con 800 investigaciones. Con base en esta selección, los hallazgos muestran que las intervenciones estructuradas, así como las flexibles que utilizan juegos simbólicos, digitales y grupales son eficaces para la mejora de las funciones cognitivas y socioemocionales de los niños. Entre los mayores defectos se detectó que la atención, autocontrol, comunicación y sociabilidad varían según el diagnóstico y contexto del niño. Se concluye que la aplicación de intervenciones lúdicas que se adaptan a las necesidades individuales del niño representa una pieza importante dentro de la atención clínica y escolar, sugiriendo profundizar en diseños robustos, así como el seguimiento longitudinal y estrategias de colaboración interdisciplinaria que permitan avanzar en la inclusión y bienestar de los niños.","genre":"masterThesis","language":"spa","license":"openAccess","note":"Accepted: 2025-09-15T20:44:29Z","publisher":"Quito: Universidad de las Américas, 2025","source":"dspace.udla.edu.ec","title":"Revisión sistemática de intervenciones basadas en el juego como herramienta terapéutica para niños con TEA o TDAH","URL":"http://dspace.udla.edu.ec/handle/33000/18031","author":[{"family":"Alban Tarco","given":"Dayana Carolina"},{"family":"Jara Ramírez","given":"Verónica Elizabeth"}],"accessed":{"date-parts":[["2026",8,9]]},"issued":{"date-parts":[["2025"]]}}}],"schema":"https://github.com/citation-style-language/schema/raw/master/csl-citation.json"} </w:instrText>
+        <w:instrText xml:space="preserve"> ADDIN ZOTERO_ITEM CSL_CITATION {"citationID":"RLyirFn5","properties":{"unsorted":false,"formattedCitation":"[14], [15]","plainCitation":"[14], [15]","noteIndex":0},"citationItems":[{"id":80,"uris":["http://zotero.org/users/local/axS3HTYd/items/W7SSLPFI"],"itemData":{"id":80,"type":"article-journal","abstract":"Resumen\nIntroducción\nExisten diferentes posturas en cuanto a la delimitación entre los trastornos del lenguaje y de la comunicación; sobre todo al acuñar las definiciones, sus limitantes y particularmente poder medir los pronósticos y diferentes procesos a lo largo del neurodesarrollo. El presente consenso busca unir las diferentes visiones de la región latinoamericana sobre los Trastornos del Desarrollo del Lenguaje (TDL) y Trastornos del Espectro Autista (TEA), homologar taxonomías y evolución a lo largo de los primeros años de vida.\nMétodo\nSe realizó un estudio Delphi Modificado para llegar a un consenso sobre la definición más adecuada y diagnóstico temprano de los TDL y TEA.\nResultados\nUn total de 34 profesionales de 11 países de la región aceptaron la invitación para participar en el consenso e incluyó a distintos especialistas a cargo del cuidado de estos pacientes. Se realizaron dos rondas de evaluación llegando a un acuerdo y consenso en todos los ítems.\nConclusiones\nEl término “Riesgo para Trastornos de la Comunicación y del Lenguaje” es creado para referirse a los niños que no caen en ninguna categoría diagnóstica en etapas tempranas del desarrollo. Consideramos que tanto el uso de este término como el del resto de los mismos, alcanzados por consenso, permitirá coincidir en distintos puntos para la caracterización del TDL y TEA, todo ello contribuirá a evaluar de forma más específica cuáles son las intervenciones adecuadas que mejoren el pronóstico y modifiquen las trayectorias del desarrollo de esta población en nuestra región.\nSummary\nIntroduction\nThere are different points of view regarding the delimitation between language and communication disorders; especially when establishing the definitions, their limitations and above all being able to measure prognoses and different processes throughout neurodevelopment. The present consensus seeks to unify the different points of view of the Latin American region on Language Development Disorders (LDD) and Autism Spectrum Disorders (ASD), standardize the taxonomies and evolution throughout the first years of life.\nMethod\nA Modified Delphi study was carried out to reach a consensus on the most adequate definition and early diagnosis of TDL and ASD.\nResults\nA total of 34 professionals from 11 countries in the region accepted the invitation to participate in the consensus and included different specialists in charge of the care of these patients. Two rounds of evaluation were carried out, reaching an agreement and consensus on all items.\nConclusions\nThe term “Risk for Communication and Language Disorders” is created to refer to children who do not fall into any diagnostic category in early stages of development. We consider that using this term as well as the rest of the terms reached by consensus in the present work will allow to match in different points for the characterization of TDL and ASD, this will contribute to a more specific evaluation regarding the appropriate interventions to improve prognosis and modify development trajectories of this population in our region.","collection-title":"TEMA CENTRAL: Pandemia COVID-19","container-title":"Revista Médica Clínica Las Condes","DOI":"10.1016/j.rmclc.2020.12.012","ISSN":"0716-8640","issue":"1","journalAbbreviation":"Revista Médica Clínica Las Condes","page":"112-127","source":"ScienceDirect","title":"MIDIENDO EL ESPECTRO: DE LOS TRASTORNOS DEL LENGUAJE A LOS TRASTORNOS DEL ESPECTRO AUTISTA: CONSENSO LATINOAMERICANO DELPHI MODIFICADO","title-short":"MIDIENDO EL ESPECTRO","volume":"32","author":[{"family":"Barragan-Perez","given":"Eduardo"},{"family":"Alvarez-Amado","given":"Daniel"},{"family":"García-Beristain","given":"Juan Carlos"},{"family":"Garfias-Rau","given":"Carlos"},{"family":"Oliva","given":"Montserrat Peinador"},{"family":"Guevara","given":"Mariana Ladron","dropping-particle":"de"},{"family":"Betancourt","given":"Alejandra Acevedo"},{"family":"Koloffon","given":"Gina Chapa"}],"issued":{"date-parts":[["2021",1,1]]}}},{"id":73,"uris":["http://zotero.org/users/local/axS3HTYd/items/BQFYIPRE"],"itemData":{"id":73,"type":"thesis","abstract":"El objetivo de esta revisión sistemática fue el analizar la efectividad y características de las intervenciones basadas en el juego aplicado a niños que presentan cuadros de TEA o TDAH, un tema que resulta importante, especialmente cuando existe la necesidad de optimizar enfoques terapéuticos y educativos en cada uno de estos grupos. En este sentido, el estudio se acogió a la guía PRISMA 2020, considerando varios criterios de inclusión y exclusión tal como la revisión de la literatura publicada entre el 2016 y 2025 dentro de bases de datos especializadas que incluyen estudios empíricos sobre población menor a 16 años con diagnóstico clínico confirmado. Así también, se evitaron revisiones narrativas, teóricas o sistemáticas, estudios que combinen el juego con otras terapias y documentos con acceso restringido. Para cumplir con este objetivo, se seleccionaron diez estudios tras un riguroso proceso de cribado y análisis de sesgo que inicialmente contaba con 800 investigaciones. Con base en esta selección, los hallazgos muestran que las intervenciones estructuradas, así como las flexibles que utilizan juegos simbólicos, digitales y grupales son eficaces para la mejora de las funciones cognitivas y socioemocionales de los niños. Entre los mayores defectos se detectó que la atención, autocontrol, comunicación y sociabilidad varían según el diagnóstico y contexto del niño. Se concluye que la aplicación de intervenciones lúdicas que se adaptan a las necesidades individuales del niño representa una pieza importante dentro de la atención clínica y escolar, sugiriendo profundizar en diseños robustos, así como el seguimiento longitudinal y estrategias de colaboración interdisciplinaria que permitan avanzar en la inclusión y bienestar de los niños.","genre":"masterThesis","language":"spa","license":"openAccess","note":"Accepted: 2025-09-15T20:44:29Z","publisher":"Quito: Universidad de las Américas, 2025","source":"dspace.udla.edu.ec","title":"Revisión sistemática de intervenciones basadas en el juego como herramienta terapéutica para niños con TEA o TDAH","URL":"http://dspace.udla.edu.ec/handle/33000/18031","author":[{"family":"Alban Tarco","given":"Dayana Carolina"},{"family":"Jara Ramírez","given":"Verónica Elizabeth"}],"accessed":{"date-parts":[["2026",8,9]]},"issued":{"date-parts":[["2025"]]}}}],"schema":"https://github.com/citation-style-language/schema/raw/master/csl-citation.json"} </w:instrText>
       </w:r>
       <w:r>
         <w:rPr>
@@ -6941,7 +6959,7 @@
         <w:rPr>
           <w:lang w:val="es-ES"/>
         </w:rPr>
-        <w:t>[13], [14]</w:t>
+        <w:t>[14], [15]</w:t>
       </w:r>
       <w:r>
         <w:rPr>
@@ -6965,9 +6983,17 @@
       </w:pPr>
       <w:r>
         <w:rPr>
-          <w:lang w:val="es-ES"/>
-        </w:rPr>
-        <w:t>Imágenes explicativas: Las imágenes ayudan a captar la atención del niño y conseguir así estrategias de atención global y selectiva. Las imágenes ayudan a que pueda haber un desplazamiento rápido de la atención, además, como estrategia de atención selectiva se puede hacer seleccionar al niño una imagen sobre la información que se le está pidiendo, confirmando así que haya entendido lo aprendido</w:t>
+          <w:b/>
+          <w:bCs/>
+          <w:lang w:val="es-ES"/>
+        </w:rPr>
+        <w:t>Imágenes explicativas:</w:t>
+      </w:r>
+      <w:r>
+        <w:rPr>
+          <w:lang w:val="es-ES"/>
+        </w:rPr>
+        <w:t xml:space="preserve"> Las imágenes ayudan a captar la atención del niño y conseguir así estrategias de atención global y selectiva. Las imágenes ayudan a que pueda haber un desplazamiento rápido de la atención, además, como estrategia de atención selectiva se puede hacer seleccionar al niño una imagen sobre la información que se le está pidiendo, confirmando así que haya entendido lo aprendido</w:t>
       </w:r>
       <w:r>
         <w:rPr>
@@ -6979,7 +7005,7 @@
         <w:rPr>
           <w:lang w:val="es-ES"/>
         </w:rPr>
-        <w:instrText xml:space="preserve"> ADDIN ZOTERO_ITEM CSL_CITATION {"citationID":"gLOnhMLG","properties":{"unsorted":false,"formattedCitation":"[15]","plainCitation":"[15]","noteIndex":0},"citationItems":[{"id":72,"uris":["http://zotero.org/users/local/axS3HTYd/items/866V932Z"],"itemData":{"id":72,"type":"article-journal","abstract":"The principal characteristics of the Attention Deficit Hyperactivity Disorder (ADHD) are impulsivity, attention deficit, anxiety, conduct disorders and learning disabilities. The objective of this paper is to describe a program for the detection and intervention of ADHD in preschool children. In the evaluation were applied: direct observations, the Conners’ Rating Scale-Revised, the Attention Deficit Disorders Evaluation Scale, and interviews to parents and teachers. Sixty preschoolers were evaluated, and nine of these children were diagnosed with ADHD, we gave them a global treatment which includes two classic models in child psychology: the behavioral approach and the cognitive-behavioral approach, in order to promote the development of abilities and competencies; furthermore, there was given advise and counseling to parents and teachers for the management of the child. In the evaluation, results of the pretest and posttest were compared with the selected scales and the questionnaire for parents and teachers, observing remarkable improvements in the most problematic behaviors and the development of abilities in their social skills.","language":"es","source":"Zotero","title":"DETECCIÓN E INTERVENCIÓN A TRAVÉS DEL JUEGO DEL TRASTORNO POR DÉFICIT DE ATENCIÓN CON HIPERACTIVIDAD (TDAH)","author":[{"family":"Encalada","given":"Leticia Sánchez"}]}}],"schema":"https://github.com/citation-style-language/schema/raw/master/csl-citation.json"} </w:instrText>
+        <w:instrText xml:space="preserve"> ADDIN ZOTERO_ITEM CSL_CITATION {"citationID":"gLOnhMLG","properties":{"unsorted":false,"formattedCitation":"[16]","plainCitation":"[16]","noteIndex":0},"citationItems":[{"id":72,"uris":["http://zotero.org/users/local/axS3HTYd/items/866V932Z"],"itemData":{"id":72,"type":"article-journal","abstract":"The principal characteristics of the Attention Deficit Hyperactivity Disorder (ADHD) are impulsivity, attention deficit, anxiety, conduct disorders and learning disabilities. The objective of this paper is to describe a program for the detection and intervention of ADHD in preschool children. In the evaluation were applied: direct observations, the Conners’ Rating Scale-Revised, the Attention Deficit Disorders Evaluation Scale, and interviews to parents and teachers. Sixty preschoolers were evaluated, and nine of these children were diagnosed with ADHD, we gave them a global treatment which includes two classic models in child psychology: the behavioral approach and the cognitive-behavioral approach, in order to promote the development of abilities and competencies; furthermore, there was given advise and counseling to parents and teachers for the management of the child. In the evaluation, results of the pretest and posttest were compared with the selected scales and the questionnaire for parents and teachers, observing remarkable improvements in the most problematic behaviors and the development of abilities in their social skills.","language":"es","source":"Zotero","title":"DETECCIÓN E INTERVENCIÓN A TRAVÉS DEL JUEGO DEL TRASTORNO POR DÉFICIT DE ATENCIÓN CON HIPERACTIVIDAD (TDAH)","author":[{"family":"Encalada","given":"Leticia Sánchez"}]}}],"schema":"https://github.com/citation-style-language/schema/raw/master/csl-citation.json"} </w:instrText>
       </w:r>
       <w:r>
         <w:rPr>
@@ -6991,7 +7017,7 @@
         <w:rPr>
           <w:lang w:val="es-ES"/>
         </w:rPr>
-        <w:t>[15]</w:t>
+        <w:t>[16]</w:t>
       </w:r>
       <w:r>
         <w:rPr>
@@ -7015,9 +7041,54 @@
       </w:pPr>
       <w:r>
         <w:rPr>
-          <w:lang w:val="es-ES"/>
-        </w:rPr>
-        <w:t>Música o sonidos: La parte visual y auditiva atrae la atención y reduce los niveles de hiperactividad adaptándose a las necesidades que presenta el niño.</w:t>
+          <w:b/>
+          <w:bCs/>
+          <w:lang w:val="es-ES"/>
+        </w:rPr>
+        <w:lastRenderedPageBreak/>
+        <w:t>Música o sonidos:</w:t>
+      </w:r>
+      <w:r>
+        <w:rPr>
+          <w:lang w:val="es-ES"/>
+        </w:rPr>
+        <w:t xml:space="preserve"> La parte visual y auditiva atrae la atención y reduce los niveles de hiperactividad adaptándose a las necesidades que presenta el niño</w:t>
+      </w:r>
+      <w:r>
+        <w:rPr>
+          <w:lang w:val="es-ES"/>
+        </w:rPr>
+        <w:fldChar w:fldCharType="begin"/>
+      </w:r>
+      <w:r>
+        <w:rPr>
+          <w:lang w:val="es-ES"/>
+        </w:rPr>
+        <w:instrText xml:space="preserve"> ADDIN ZOTERO_ITEM CSL_CITATION {"citationID":"RiZp9DnN","properties":{"unsorted":false,"formattedCitation":"[17]","plainCitation":"[17]","noteIndex":0},"citationItems":[{"id":86,"uris":["http://zotero.org/users/local/axS3HTYd/items/M7NMA5MN"],"itemData":{"id":86,"type":"article-journal","abstract":"Girls and boys diagnosed with attention deﬁcit hyperactivity disorder (ADHD) need to reduce their symptoms through interventions. A crossover quasi-experimental design has been carried out aimed at both mothers and fathers and their girls and boys diagnosed with ADHD. Speciﬁcally, a Family Bonding Therapy (FBT) for mothers and fathers and a Clinical Psychomotor Therapy (CPT) for girls and boys with ADHD. The sample has been made up of three girls and thirteen boys between 5 years 11 months and 9 years old, in addition to their mothers and fathers. The girls and boys have been evaluated at the beginning, middle, and the end of the interventions. Their capacity of self-regulation has been measured through two questionnaires addressed to mothers and fathers (Behavioral Assessment of Executive Function/BRIEF-2 and Behavior Assessment System for children/BASC). The indicators of both questionnaires quantiﬁed the change in self-regulation as the response variable. Statistical methods associated with mixed linear models have measure the effect and the order of treatment as explanatory variables. Furthermore, different control variables were incorporated, the initial level of response and covariates such as the anxiety and the adaptability. This study has reported that hyperactivity has proven to be a central symptom to measure self-regulation capacity because it showed a signiﬁcant association with PBT when applied after CPT, as measured by the BASC. In conclusion, the effect of clinical interventions based on their order favors the reduction of hyperactivity and inﬂuences the self-regulation capacity of girls and boys.","container-title":"Revista de Psicodidáctica (English ed.)","DOI":"10.1016/j.psicoe.2022.12.003","ISSN":"25303805","issue":"1","journalAbbreviation":"Revista de Psicodidáctica (English ed.)","language":"en","page":"80-91","source":"DOI.org (Crossref)","title":"Effectiveness of family bonding therapy supported by child clinical psychomotricity to increase self-regulation in children with attention deficit hyperactivity disorder: A pilot study","title-short":"Effectiveness of family bonding therapy supported by child clinical psychomotricity to increase self-regulation in children with attention deficit hyperactivity disorder","volume":"28","author":[{"family":"Larraín-Valenzuela","given":"Josefina"},{"family":"Aspé-Sánchez","given":"Mauricio"},{"family":"Nieto","given":"Patricia"},{"family":"Vergara","given":"Rodrigo C."},{"family":"Palma Contreras","given":"Andrea María"}],"issued":{"date-parts":[["2023",1]]}}}],"schema":"https://github.com/citation-style-language/schema/raw/master/csl-citation.json"} </w:instrText>
+      </w:r>
+      <w:r>
+        <w:rPr>
+          <w:lang w:val="es-ES"/>
+        </w:rPr>
+        <w:fldChar w:fldCharType="separate"/>
+      </w:r>
+      <w:r>
+        <w:rPr>
+          <w:lang w:val="es-ES"/>
+        </w:rPr>
+        <w:t>[17]</w:t>
+      </w:r>
+      <w:r>
+        <w:rPr>
+          <w:lang w:val="es-ES"/>
+        </w:rPr>
+        <w:fldChar w:fldCharType="end"/>
+      </w:r>
+      <w:r>
+        <w:rPr>
+          <w:lang w:val="es-ES"/>
+        </w:rPr>
+        <w:t>.</w:t>
       </w:r>
     </w:p>
     <w:p>
@@ -7029,10 +7100,120 @@
       </w:pPr>
       <w:r>
         <w:rPr>
+          <w:b/>
+          <w:bCs/>
           <w:lang w:val="es-ES"/>
         </w:rPr>
         <w:t>Refuerzo positivo:</w:t>
       </w:r>
+      <w:r>
+        <w:rPr>
+          <w:lang w:val="es-ES"/>
+        </w:rPr>
+        <w:t xml:space="preserve"> Es importante </w:t>
+      </w:r>
+      <w:r>
+        <w:rPr>
+          <w:lang w:val="es-ES"/>
+        </w:rPr>
+        <w:t>qu</w:t>
+      </w:r>
+      <w:r>
+        <w:rPr>
+          <w:lang w:val="es-ES"/>
+        </w:rPr>
+        <w:t xml:space="preserve">e el juego tenga refuerzo positivo como </w:t>
+      </w:r>
+      <w:r>
+        <w:rPr>
+          <w:lang w:val="es-ES"/>
+        </w:rPr>
+        <w:t xml:space="preserve">por ejemplo </w:t>
+      </w:r>
+      <w:r>
+        <w:rPr>
+          <w:lang w:val="es-ES"/>
+        </w:rPr>
+        <w:t>mensajes positivos o recompensas cuando el usuario lo hace bien o mensajes que animen a seguir cuando comete errores,</w:t>
+      </w:r>
+      <w:r>
+        <w:rPr>
+          <w:lang w:val="es-ES"/>
+        </w:rPr>
+        <w:t xml:space="preserve"> para</w:t>
+      </w:r>
+      <w:r>
+        <w:rPr>
+          <w:lang w:val="es-ES"/>
+        </w:rPr>
+        <w:t xml:space="preserve"> </w:t>
+      </w:r>
+      <w:r>
+        <w:rPr>
+          <w:lang w:val="es-ES"/>
+        </w:rPr>
+        <w:t>modificar</w:t>
+      </w:r>
+      <w:r>
+        <w:rPr>
+          <w:lang w:val="es-ES"/>
+        </w:rPr>
+        <w:t xml:space="preserve"> así </w:t>
+      </w:r>
+      <w:r>
+        <w:rPr>
+          <w:lang w:val="es-ES"/>
+        </w:rPr>
+        <w:t>los patrones de pensamiento disfuncional y tratar la ansiedad, depresión y baja autoestima que tien</w:t>
+      </w:r>
+      <w:r>
+        <w:rPr>
+          <w:lang w:val="es-ES"/>
+        </w:rPr>
+        <w:t>d</w:t>
+      </w:r>
+      <w:r>
+        <w:rPr>
+          <w:lang w:val="es-ES"/>
+        </w:rPr>
+        <w:t>en a sufrir las personas con TDAH</w:t>
+      </w:r>
+      <w:r>
+        <w:rPr>
+          <w:lang w:val="es-ES"/>
+        </w:rPr>
+        <w:fldChar w:fldCharType="begin"/>
+      </w:r>
+      <w:r>
+        <w:rPr>
+          <w:lang w:val="es-ES"/>
+        </w:rPr>
+        <w:instrText xml:space="preserve"> ADDIN ZOTERO_ITEM CSL_CITATION {"citationID":"10wodI2R","properties":{"unsorted":false,"formattedCitation":"[18]","plainCitation":"[18]","noteIndex":0},"citationItems":[{"id":87,"uris":["http://zotero.org/users/local/axS3HTYd/items/2WPRBCMR"],"itemData":{"id":87,"type":"article-journal","abstract":"El avance tecnológico ha sido muy favorable en diversos ámbitos, sobre todo en el ocio y diversión, debido a la creación de videojuegos y juegos por internet. Las personas que utilizan estas actividades de forma desmedida pueden adquirir una adicción. La Psicología Clínica ha empleado algunas terapias para tratar esta patología, el estudio tiene como objetivo revisar de forma sistemática la evidencia publicada en diferentes revistas científicas sobre el empleo de terapias del enfoque cognitivo conductual en el tratamiento de la adicción a videojuegos. La revisión utilizó los lineamientos de PRISMA y de COCHRANE.&amp;nbsp; Se encontraron 17 estudios, los cuales se analizaron con la escala POMRF (Psychotherapy Outcome Study Methodology Rating Form) y con la herramienta CONSORT (Consolidated Standards Of Reporting Trials). Los resultados señalan que la utilización de la Terapia Cognitivo Conductual o tratamientos basados en el enfoque cognitivo conductual, son muy eficaces para reducir la adicción a videojuegos y tratar los síntomas que conlleva como depresión, ansiedad, aislamiento social, entre otros.","container-title":"Pro Sciences: Revista de Producción, Ciencias e Investigación","DOI":"10.29018/issn.2588-1000vol6iss42.2022pp301-322","ISSN":"2588-1000","issue":"42","language":"es","page":"301-322","source":"journalprosciences.com","title":"Terapia cognitivo conductual en el tratamiento de las adicciones a los videojuegos: una revisión sistemática","title-short":"Terapia cognitivo conductual en el tratamiento de las adicciones a los videojuegos","volume":"6","author":[{"family":"Landy","given":"Karla Elizabeth Chamba"},{"family":"Neira","given":"Johanna Lucía Pozo"},{"family":"Ortiz","given":"Geovanny Genaro Reivan"}],"issued":{"date-parts":[["2022",3,31]]}}}],"schema":"https://github.com/citation-style-language/schema/raw/master/csl-citation.json"} </w:instrText>
+      </w:r>
+      <w:r>
+        <w:rPr>
+          <w:lang w:val="es-ES"/>
+        </w:rPr>
+        <w:fldChar w:fldCharType="separate"/>
+      </w:r>
+      <w:r>
+        <w:rPr>
+          <w:lang w:val="es-ES"/>
+        </w:rPr>
+        <w:t>[18]</w:t>
+      </w:r>
+      <w:r>
+        <w:rPr>
+          <w:lang w:val="es-ES"/>
+        </w:rPr>
+        <w:fldChar w:fldCharType="end"/>
+      </w:r>
+      <w:r>
+        <w:rPr>
+          <w:lang w:val="es-ES"/>
+        </w:rPr>
+        <w:t>.</w:t>
+      </w:r>
     </w:p>
     <w:p>
       <w:pPr>
@@ -7043,22 +7224,53 @@
       </w:pPr>
       <w:r>
         <w:rPr>
-          <w:lang w:val="es-ES"/>
-        </w:rPr>
-        <w:t xml:space="preserve">Novedad: Los niños con TDAH se aburren rápido y necesitan novedad para mantener su interés. Utilizar nuevas recompensas, mecánicas o dinámicas en el videojuego puede ser de gran ayuda. </w:t>
-      </w:r>
-      <w:r>
-        <w:rPr>
-          <w:highlight w:val="yellow"/>
-          <w:lang w:val="es-ES"/>
-        </w:rPr>
-        <w:t>BUSCAR RE</w:t>
-      </w:r>
-      <w:r>
-        <w:rPr>
-          <w:lang w:val="es-ES"/>
-        </w:rPr>
-        <w:t>F EN MI CUADERNO</w:t>
+          <w:b/>
+          <w:bCs/>
+          <w:lang w:val="es-ES"/>
+        </w:rPr>
+        <w:t>Novedad:</w:t>
+      </w:r>
+      <w:r>
+        <w:rPr>
+          <w:lang w:val="es-ES"/>
+        </w:rPr>
+        <w:t xml:space="preserve"> Los niños con TDAH se aburren rápido y necesitan novedad para mantener su interés. Utilizar nuevas recompensas, mecánicas o dinámicas en el videojuego puede ser de gran ayuda</w:t>
+      </w:r>
+      <w:r>
+        <w:rPr>
+          <w:lang w:val="es-ES"/>
+        </w:rPr>
+        <w:fldChar w:fldCharType="begin"/>
+      </w:r>
+      <w:r>
+        <w:rPr>
+          <w:lang w:val="es-ES"/>
+        </w:rPr>
+        <w:instrText xml:space="preserve"> ADDIN ZOTERO_ITEM CSL_CITATION {"citationID":"GlRPnxx6","properties":{"unsorted":false,"formattedCitation":"[13]","plainCitation":"[13]","noteIndex":0},"citationItems":[{"id":75,"uris":["http://zotero.org/users/local/axS3HTYd/items/YAGCAE7R"],"itemData":{"id":75,"type":"article-journal","abstract":"El Trastorno por Déficit de Atención e Hiperactividad (TDAH) implica un patrón de déficit de atención, hiperactividad e impulsividad. Existen muchos trabajos donde se usan los videojuegos como un instrumento tecnológico de apoyo en el aula. No obstante, si bien se documentan los beneficios no queda claro el cómo fueron creados y sobre todo el impacto de estos para el propósito de aprendizaje para el que fueron creados. En este propósito, este artículo se centra en la propuesta metodológica de desarrollo de videojuegos para niños con TDAH. Se realizó una revisión de fuentes bibliográficas y entrevistas a especialistas para comprender que el apoyo basado en videojuegos tiene puntos positivos para el aprendizaje. Para el desarrollo de los videojuegos se emplea la metodología de SCRUM, se presentan 7 videojuegos para apoyar en el aprendizaje de niños de primaria, estos fueron evaluados por los especialistas en educación, padres de familia, especialistas de TDAH y los niños. Los resultados son alentadores y nos permiten sentar una base más formal respecto a los videojuegos serios para niños con TDAH. La metodología de desarrollo SRUM ha sido utilizada de manera específica para videojuegos, sin embargo, en este trabajo se presentan algunos artefactos modificados que contribuyen al diseño de videojuegos con propósitos de aprendizaje de niños con TDAH.","container-title":"Revista de la Asociación Interacción Persona Ordenador (AIPO)","DOI":"10.65234/interaccion.35","ISSN":"2695-6578","issue":"1","language":"es","license":"https://creativecommons.org/licenses/by-nc/4.0","page":"48-59","source":"revista.aipo.es","title":"Videojuegos en educación especial: niños con TDAH","title-short":"Videojuegos en educación especial","volume":"2","author":[{"family":"García","given":"Josefina Guerrero"},{"family":"Calleros","given":"Juan Manuel González"}],"issued":{"date-parts":[["2021",6,23]]}}}],"schema":"https://github.com/citation-style-language/schema/raw/master/csl-citation.json"} </w:instrText>
+      </w:r>
+      <w:r>
+        <w:rPr>
+          <w:lang w:val="es-ES"/>
+        </w:rPr>
+        <w:fldChar w:fldCharType="separate"/>
+      </w:r>
+      <w:r>
+        <w:rPr>
+          <w:lang w:val="es-ES"/>
+        </w:rPr>
+        <w:t>[13]</w:t>
+      </w:r>
+      <w:r>
+        <w:rPr>
+          <w:lang w:val="es-ES"/>
+        </w:rPr>
+        <w:fldChar w:fldCharType="end"/>
+      </w:r>
+      <w:r>
+        <w:rPr>
+          <w:lang w:val="es-ES"/>
+        </w:rPr>
+        <w:t>.</w:t>
       </w:r>
     </w:p>
     <w:p>
@@ -7070,11 +7282,72 @@
       </w:pPr>
       <w:r>
         <w:rPr>
-          <w:lang w:val="es-ES"/>
-        </w:rPr>
-        <w:lastRenderedPageBreak/>
+          <w:b/>
+          <w:bCs/>
+          <w:lang w:val="es-ES"/>
+        </w:rPr>
         <w:t>Conjunto de datos con persistencia:</w:t>
       </w:r>
+      <w:r>
+        <w:rPr>
+          <w:lang w:val="es-ES"/>
+        </w:rPr>
+        <w:t xml:space="preserve"> </w:t>
+      </w:r>
+      <w:r>
+        <w:rPr>
+          <w:lang w:val="es-ES"/>
+        </w:rPr>
+        <w:t>Es interesante poder llevar un seguimiento del progreso del jugador para poder analizar las conductas y centrarse en el usuario adaptando el videojuego lo mejor posible. Una de las opciones para</w:t>
+      </w:r>
+      <w:r>
+        <w:rPr>
+          <w:lang w:val="es-ES"/>
+        </w:rPr>
+        <w:t xml:space="preserve"> hacer el seguimiento es g</w:t>
+      </w:r>
+      <w:r>
+        <w:rPr>
+          <w:lang w:val="es-ES"/>
+        </w:rPr>
+        <w:t>uardar conjuntos de datos con persistencia</w:t>
+      </w:r>
+      <w:r>
+        <w:rPr>
+          <w:lang w:val="es-ES"/>
+        </w:rPr>
+        <w:fldChar w:fldCharType="begin"/>
+      </w:r>
+      <w:r>
+        <w:rPr>
+          <w:lang w:val="es-ES"/>
+        </w:rPr>
+        <w:instrText xml:space="preserve"> ADDIN ZOTERO_ITEM CSL_CITATION {"citationID":"ECue8tiY","properties":{"unsorted":false,"formattedCitation":"[13]","plainCitation":"[13]","noteIndex":0},"citationItems":[{"id":75,"uris":["http://zotero.org/users/local/axS3HTYd/items/YAGCAE7R"],"itemData":{"id":75,"type":"article-journal","abstract":"El Trastorno por Déficit de Atención e Hiperactividad (TDAH) implica un patrón de déficit de atención, hiperactividad e impulsividad. Existen muchos trabajos donde se usan los videojuegos como un instrumento tecnológico de apoyo en el aula. No obstante, si bien se documentan los beneficios no queda claro el cómo fueron creados y sobre todo el impacto de estos para el propósito de aprendizaje para el que fueron creados. En este propósito, este artículo se centra en la propuesta metodológica de desarrollo de videojuegos para niños con TDAH. Se realizó una revisión de fuentes bibliográficas y entrevistas a especialistas para comprender que el apoyo basado en videojuegos tiene puntos positivos para el aprendizaje. Para el desarrollo de los videojuegos se emplea la metodología de SCRUM, se presentan 7 videojuegos para apoyar en el aprendizaje de niños de primaria, estos fueron evaluados por los especialistas en educación, padres de familia, especialistas de TDAH y los niños. Los resultados son alentadores y nos permiten sentar una base más formal respecto a los videojuegos serios para niños con TDAH. La metodología de desarrollo SRUM ha sido utilizada de manera específica para videojuegos, sin embargo, en este trabajo se presentan algunos artefactos modificados que contribuyen al diseño de videojuegos con propósitos de aprendizaje de niños con TDAH.","container-title":"Revista de la Asociación Interacción Persona Ordenador (AIPO)","DOI":"10.65234/interaccion.35","ISSN":"2695-6578","issue":"1","language":"es","license":"https://creativecommons.org/licenses/by-nc/4.0","page":"48-59","source":"revista.aipo.es","title":"Videojuegos en educación especial: niños con TDAH","title-short":"Videojuegos en educación especial","volume":"2","author":[{"family":"García","given":"Josefina Guerrero"},{"family":"Calleros","given":"Juan Manuel González"}],"issued":{"date-parts":[["2021",6,23]]}}}],"schema":"https://github.com/citation-style-language/schema/raw/master/csl-citation.json"} </w:instrText>
+      </w:r>
+      <w:r>
+        <w:rPr>
+          <w:lang w:val="es-ES"/>
+        </w:rPr>
+        <w:fldChar w:fldCharType="separate"/>
+      </w:r>
+      <w:r>
+        <w:rPr>
+          <w:lang w:val="es-ES"/>
+        </w:rPr>
+        <w:t>[13]</w:t>
+      </w:r>
+      <w:r>
+        <w:rPr>
+          <w:lang w:val="es-ES"/>
+        </w:rPr>
+        <w:fldChar w:fldCharType="end"/>
+      </w:r>
+      <w:r>
+        <w:rPr>
+          <w:lang w:val="es-ES"/>
+        </w:rPr>
+        <w:t>.</w:t>
+      </w:r>
     </w:p>
     <w:p>
       <w:pPr>
@@ -7085,10 +7358,68 @@
       </w:pPr>
       <w:r>
         <w:rPr>
+          <w:b/>
+          <w:bCs/>
           <w:lang w:val="es-ES"/>
         </w:rPr>
         <w:t>Plataforma</w:t>
       </w:r>
+      <w:r>
+        <w:rPr>
+          <w:b/>
+          <w:bCs/>
+          <w:lang w:val="es-ES"/>
+        </w:rPr>
+        <w:t>:</w:t>
+      </w:r>
+      <w:r>
+        <w:rPr>
+          <w:lang w:val="es-ES"/>
+        </w:rPr>
+        <w:t xml:space="preserve"> </w:t>
+      </w:r>
+      <w:r>
+        <w:rPr>
+          <w:lang w:val="es-ES"/>
+        </w:rPr>
+        <w:t>Es recomendable desarrollar el videojuego para plataformas en las que el público objetivo, en este caso usuarios con Trastorno del déficit de atención e hiperactividad, se sienta cómodo y esté habituado a utilizar</w:t>
+      </w:r>
+      <w:r>
+        <w:rPr>
+          <w:lang w:val="es-ES"/>
+        </w:rPr>
+        <w:fldChar w:fldCharType="begin"/>
+      </w:r>
+      <w:r>
+        <w:rPr>
+          <w:lang w:val="es-ES"/>
+        </w:rPr>
+        <w:instrText xml:space="preserve"> ADDIN ZOTERO_ITEM CSL_CITATION {"citationID":"bBJ3K61w","properties":{"unsorted":false,"formattedCitation":"[13]","plainCitation":"[13]","noteIndex":0},"citationItems":[{"id":75,"uris":["http://zotero.org/users/local/axS3HTYd/items/YAGCAE7R"],"itemData":{"id":75,"type":"article-journal","abstract":"El Trastorno por Déficit de Atención e Hiperactividad (TDAH) implica un patrón de déficit de atención, hiperactividad e impulsividad. Existen muchos trabajos donde se usan los videojuegos como un instrumento tecnológico de apoyo en el aula. No obstante, si bien se documentan los beneficios no queda claro el cómo fueron creados y sobre todo el impacto de estos para el propósito de aprendizaje para el que fueron creados. En este propósito, este artículo se centra en la propuesta metodológica de desarrollo de videojuegos para niños con TDAH. Se realizó una revisión de fuentes bibliográficas y entrevistas a especialistas para comprender que el apoyo basado en videojuegos tiene puntos positivos para el aprendizaje. Para el desarrollo de los videojuegos se emplea la metodología de SCRUM, se presentan 7 videojuegos para apoyar en el aprendizaje de niños de primaria, estos fueron evaluados por los especialistas en educación, padres de familia, especialistas de TDAH y los niños. Los resultados son alentadores y nos permiten sentar una base más formal respecto a los videojuegos serios para niños con TDAH. La metodología de desarrollo SRUM ha sido utilizada de manera específica para videojuegos, sin embargo, en este trabajo se presentan algunos artefactos modificados que contribuyen al diseño de videojuegos con propósitos de aprendizaje de niños con TDAH.","container-title":"Revista de la Asociación Interacción Persona Ordenador (AIPO)","DOI":"10.65234/interaccion.35","ISSN":"2695-6578","issue":"1","language":"es","license":"https://creativecommons.org/licenses/by-nc/4.0","page":"48-59","source":"revista.aipo.es","title":"Videojuegos en educación especial: niños con TDAH","title-short":"Videojuegos en educación especial","volume":"2","author":[{"family":"García","given":"Josefina Guerrero"},{"family":"Calleros","given":"Juan Manuel González"}],"issued":{"date-parts":[["2021",6,23]]}}}],"schema":"https://github.com/citation-style-language/schema/raw/master/csl-citation.json"} </w:instrText>
+      </w:r>
+      <w:r>
+        <w:rPr>
+          <w:lang w:val="es-ES"/>
+        </w:rPr>
+        <w:fldChar w:fldCharType="separate"/>
+      </w:r>
+      <w:r>
+        <w:rPr>
+          <w:lang w:val="es-ES"/>
+        </w:rPr>
+        <w:t>[13]</w:t>
+      </w:r>
+      <w:r>
+        <w:rPr>
+          <w:lang w:val="es-ES"/>
+        </w:rPr>
+        <w:fldChar w:fldCharType="end"/>
+      </w:r>
+      <w:r>
+        <w:rPr>
+          <w:lang w:val="es-ES"/>
+        </w:rPr>
+        <w:t>.</w:t>
+      </w:r>
     </w:p>
     <w:p>
       <w:pPr>
@@ -7100,11 +7431,81 @@
     </w:p>
     <w:p>
       <w:pPr>
+        <w:pStyle w:val="Ttulo3"/>
+        <w:rPr>
+          <w:lang w:val="es-ES"/>
+        </w:rPr>
+      </w:pPr>
+      <w:bookmarkStart w:id="32" w:name="_Toc237111002"/>
+      <w:r>
+        <w:rPr>
+          <w:lang w:val="es-ES"/>
+        </w:rPr>
+        <w:t>Juegos serios para educación</w:t>
+      </w:r>
+      <w:bookmarkEnd w:id="32"/>
+    </w:p>
+    <w:p>
+      <w:pPr>
         <w:pStyle w:val="Textoindependiente"/>
         <w:rPr>
           <w:lang w:val="es-ES"/>
         </w:rPr>
       </w:pPr>
+      <w:r>
+        <w:rPr>
+          <w:lang w:val="es-ES"/>
+        </w:rPr>
+        <w:t>En el TDAH puede ser muy efectivo blahblahblah</w:t>
+      </w:r>
+    </w:p>
+    <w:p>
+      <w:pPr>
+        <w:pStyle w:val="Ttulo3"/>
+        <w:rPr>
+          <w:lang w:val="es-ES"/>
+        </w:rPr>
+      </w:pPr>
+      <w:bookmarkStart w:id="33" w:name="_Toc237111003"/>
+      <w:r>
+        <w:rPr>
+          <w:lang w:val="es-ES"/>
+        </w:rPr>
+        <w:t>Juegos serios como herramienta psicológica</w:t>
+      </w:r>
+      <w:bookmarkEnd w:id="33"/>
+    </w:p>
+    <w:p>
+      <w:pPr>
+        <w:pStyle w:val="Ttulo3"/>
+        <w:rPr>
+          <w:lang w:val="es-ES"/>
+        </w:rPr>
+      </w:pPr>
+      <w:bookmarkStart w:id="34" w:name="_Toc237111004"/>
+      <w:r>
+        <w:rPr>
+          <w:lang w:val="es-ES"/>
+        </w:rPr>
+        <w:t>Ventajas de juegos en TDAH</w:t>
+      </w:r>
+      <w:bookmarkEnd w:id="34"/>
+    </w:p>
+    <w:p>
+      <w:pPr>
+        <w:pStyle w:val="Ttulo3"/>
+        <w:rPr>
+          <w:lang w:val="es-ES"/>
+        </w:rPr>
+      </w:pPr>
+      <w:bookmarkStart w:id="35" w:name="_Toc237111005"/>
+      <w:r>
+        <w:rPr>
+          <w:lang w:val="es-ES"/>
+        </w:rPr>
+        <w:t>Desventajas juegos en TDAH</w:t>
+      </w:r>
+      <w:bookmarkEnd w:id="35"/>
     </w:p>
     <w:p>
       <w:pPr>
@@ -7117,108 +7518,8 @@
         <w:rPr>
           <w:lang w:val="es-ES"/>
         </w:rPr>
-        <w:t>Atención global: Es importante mantener la atención global</w:t>
-      </w:r>
-    </w:p>
-    <w:p>
-      <w:pPr>
-        <w:pStyle w:val="Textoindependiente"/>
-        <w:rPr>
-          <w:lang w:val="es-ES"/>
-        </w:rPr>
-      </w:pPr>
-      <w:r>
-        <w:rPr>
-          <w:lang w:val="es-ES"/>
-        </w:rPr>
-        <w:t>Atención selectiva:</w:t>
-      </w:r>
-    </w:p>
-    <w:p>
-      <w:pPr>
-        <w:pStyle w:val="Ttulo3"/>
-        <w:rPr>
-          <w:lang w:val="es-ES"/>
-        </w:rPr>
-      </w:pPr>
-      <w:bookmarkStart w:id="32" w:name="_Toc237111002"/>
-      <w:r>
-        <w:rPr>
-          <w:lang w:val="es-ES"/>
-        </w:rPr>
-        <w:t>Juegos serios para educación</w:t>
-      </w:r>
-      <w:bookmarkEnd w:id="32"/>
-    </w:p>
-    <w:p>
-      <w:pPr>
-        <w:pStyle w:val="Textoindependiente"/>
-        <w:rPr>
-          <w:lang w:val="es-ES"/>
-        </w:rPr>
-      </w:pPr>
-      <w:r>
-        <w:rPr>
-          <w:lang w:val="es-ES"/>
-        </w:rPr>
-        <w:t xml:space="preserve">En el TDAH puede ser muy efectivo </w:t>
-      </w:r>
-      <w:proofErr w:type="spellStart"/>
-      <w:r>
-        <w:rPr>
-          <w:lang w:val="es-ES"/>
-        </w:rPr>
-        <w:t>blahblahblah</w:t>
-      </w:r>
-      <w:proofErr w:type="spellEnd"/>
-    </w:p>
-    <w:p>
-      <w:pPr>
-        <w:pStyle w:val="Ttulo3"/>
-        <w:rPr>
-          <w:lang w:val="es-ES"/>
-        </w:rPr>
-      </w:pPr>
-      <w:bookmarkStart w:id="33" w:name="_Toc237111003"/>
-      <w:r>
-        <w:rPr>
-          <w:lang w:val="es-ES"/>
-        </w:rPr>
-        <w:t>Juegos serios como herramienta psicológica</w:t>
-      </w:r>
-      <w:bookmarkEnd w:id="33"/>
-    </w:p>
-    <w:p>
-      <w:pPr>
-        <w:pStyle w:val="Ttulo3"/>
-        <w:rPr>
-          <w:lang w:val="es-ES"/>
-        </w:rPr>
-      </w:pPr>
-      <w:bookmarkStart w:id="34" w:name="_Toc237111004"/>
-      <w:r>
-        <w:rPr>
-          <w:lang w:val="es-ES"/>
-        </w:rPr>
-        <w:t>Ventajas de juegos en TDAH</w:t>
-      </w:r>
-      <w:bookmarkEnd w:id="34"/>
-    </w:p>
-    <w:p>
-      <w:pPr>
-        <w:pStyle w:val="Ttulo3"/>
-        <w:rPr>
-          <w:lang w:val="es-ES"/>
-        </w:rPr>
-      </w:pPr>
-      <w:bookmarkStart w:id="35" w:name="_Toc237111005"/>
-      <w:r>
-        <w:rPr>
-          <w:lang w:val="es-ES"/>
-        </w:rPr>
-        <w:t>Desventajas juegos en TDAH</w:t>
-      </w:r>
-      <w:bookmarkEnd w:id="35"/>
+        <w:t>Los juegos muy repetitivos pueden causar desinterés.</w:t>
+      </w:r>
     </w:p>
     <w:p>
       <w:pPr>
@@ -7360,21 +7661,7 @@
         <w:rPr>
           <w:lang w:val="es-ES"/>
         </w:rPr>
-        <w:t xml:space="preserve">Pruebas </w:t>
-      </w:r>
-      <w:proofErr w:type="gramStart"/>
-      <w:r>
-        <w:rPr>
-          <w:lang w:val="es-ES"/>
-        </w:rPr>
-        <w:t>explicar</w:t>
-      </w:r>
-      <w:proofErr w:type="gramEnd"/>
-      <w:r>
-        <w:rPr>
-          <w:lang w:val="es-ES"/>
-        </w:rPr>
-        <w:t xml:space="preserve"> bien que fue en </w:t>
+        <w:t xml:space="preserve">Pruebas explicar bien que fue en </w:t>
       </w:r>
       <w:r>
         <w:rPr>
@@ -7686,35 +7973,7 @@
         <w:rPr>
           <w:lang w:val="es-ES"/>
         </w:rPr>
-        <w:t xml:space="preserve">Realizar pruebas estando presente y que sean para mejorar el </w:t>
-      </w:r>
-      <w:proofErr w:type="gramStart"/>
-      <w:r>
-        <w:rPr>
-          <w:lang w:val="es-ES"/>
-        </w:rPr>
-        <w:t>juego  con</w:t>
-      </w:r>
-      <w:proofErr w:type="gramEnd"/>
-      <w:r>
-        <w:rPr>
-          <w:lang w:val="es-ES"/>
-        </w:rPr>
-        <w:t xml:space="preserve"> el </w:t>
-      </w:r>
-      <w:proofErr w:type="spellStart"/>
-      <w:r>
-        <w:rPr>
-          <w:lang w:val="es-ES"/>
-        </w:rPr>
-        <w:t>feedback</w:t>
-      </w:r>
-      <w:proofErr w:type="spellEnd"/>
-      <w:r>
-        <w:rPr>
-          <w:lang w:val="es-ES"/>
-        </w:rPr>
-        <w:t xml:space="preserve"> de los jugadores</w:t>
+        <w:t>Realizar pruebas estando presente y que sean para mejorar el juego  con el feedback de los jugadores</w:t>
       </w:r>
     </w:p>
     <w:p>
@@ -7747,7 +8006,6 @@
       </w:pPr>
       <w:bookmarkStart w:id="53" w:name="_Toc116636447"/>
       <w:bookmarkStart w:id="54" w:name="_Toc237111021"/>
-      <w:proofErr w:type="spellStart"/>
       <w:r>
         <w:rPr>
           <w:lang w:val="es-ES"/>
@@ -7757,7 +8015,6 @@
       </w:r>
       <w:bookmarkEnd w:id="53"/>
       <w:bookmarkEnd w:id="54"/>
-      <w:proofErr w:type="spellEnd"/>
     </w:p>
     <w:p>
       <w:pPr>
@@ -7826,26 +8083,16 @@
           <w:lang w:val="es-ES"/>
         </w:rPr>
       </w:pPr>
-      <w:proofErr w:type="spellStart"/>
       <w:r>
         <w:rPr>
           <w:lang w:val="es-ES"/>
         </w:rPr>
         <w:t>Motivation</w:t>
       </w:r>
-      <w:proofErr w:type="spellEnd"/>
-    </w:p>
-    <w:p>
-      <w:r>
-        <w:t>Los títulos de las subsecciones de esta sección (</w:t>
-      </w:r>
-      <w:proofErr w:type="spellStart"/>
-      <w:r>
-        <w:t>Introduction</w:t>
-      </w:r>
-      <w:proofErr w:type="spellEnd"/>
-      <w:r>
-        <w:t xml:space="preserve">) usan el estilo </w:t>
+    </w:p>
+    <w:p>
+      <w:r>
+        <w:t xml:space="preserve">Los títulos de las subsecciones de esta sección (Introduction) usan el estilo </w:t>
       </w:r>
       <w:r>
         <w:t>Título 7</w:t>
@@ -7910,31 +8157,15 @@
       </w:pPr>
       <w:bookmarkStart w:id="55" w:name="_Toc116636448"/>
       <w:bookmarkStart w:id="56" w:name="_Toc237111022"/>
-      <w:proofErr w:type="spellStart"/>
       <w:r>
         <w:rPr>
           <w:lang w:val="es-ES"/>
         </w:rPr>
         <w:lastRenderedPageBreak/>
-        <w:t>Conclusions</w:t>
-      </w:r>
-      <w:proofErr w:type="spellEnd"/>
-      <w:r>
-        <w:rPr>
-          <w:lang w:val="es-ES"/>
-        </w:rPr>
-        <w:t xml:space="preserve"> and future </w:t>
-      </w:r>
-      <w:proofErr w:type="spellStart"/>
-      <w:r>
-        <w:rPr>
-          <w:lang w:val="es-ES"/>
-        </w:rPr>
-        <w:t>work</w:t>
+        <w:t>Conclusions and future work</w:t>
       </w:r>
       <w:bookmarkEnd w:id="55"/>
       <w:bookmarkEnd w:id="56"/>
-      <w:proofErr w:type="spellEnd"/>
     </w:p>
     <w:p>
       <w:pPr>
@@ -8025,19 +8256,9 @@
       <w:r>
         <w:t>Los títulos de las subsecciones de esta sección (</w:t>
       </w:r>
-      <w:proofErr w:type="spellStart"/>
-      <w:r>
-        <w:t>Conclusions</w:t>
-      </w:r>
-      <w:proofErr w:type="spellEnd"/>
-      <w:r>
-        <w:t xml:space="preserve"> and future </w:t>
-      </w:r>
-      <w:proofErr w:type="spellStart"/>
-      <w:r>
-        <w:t>work</w:t>
-      </w:r>
-      <w:proofErr w:type="spellEnd"/>
+      <w:r>
+        <w:t>Conclusions and future work</w:t>
+      </w:r>
       <w:r>
         <w:t xml:space="preserve">) usan el estilo </w:t>
       </w:r>
@@ -8097,7 +8318,6 @@
       </w:pPr>
       <w:bookmarkStart w:id="59" w:name="_Toc116636450"/>
       <w:bookmarkStart w:id="60" w:name="_Toc237111023"/>
-      <w:proofErr w:type="spellStart"/>
       <w:r>
         <w:lastRenderedPageBreak/>
         <w:t>Bibliografía</w:t>
@@ -8105,7 +8325,6 @@
       <w:bookmarkEnd w:id="57"/>
       <w:bookmarkEnd w:id="59"/>
       <w:bookmarkEnd w:id="60"/>
-      <w:proofErr w:type="spellEnd"/>
       <w:r>
         <w:rPr>
           <w:sz w:val="22"/>
@@ -8431,23 +8650,66 @@
       </w:r>
       <w:r>
         <w:tab/>
-        <w:t xml:space="preserve">E. Barragan-Perez </w:t>
+        <w:t xml:space="preserve">J. G. García y J. M. G. Calleros, «Videojuegos en educación especial: niños con TDAH», </w:t>
       </w:r>
       <w:r>
         <w:rPr>
           <w:i/>
           <w:iCs/>
         </w:rPr>
-        <w:t>et al.</w:t>
-      </w:r>
-      <w:r>
-        <w:t xml:space="preserve">, «MIDIENDO EL ESPECTRO: DE LOS TRASTORNOS DEL LENGUAJE A LOS TRASTORNOS DEL ESPECTRO AUTISTA: CONSENSO LATINOAMERICANO DELPHI MODIFICADO», </w:t>
+        <w:t>Rev. Asoc. Interacción Pers. Ordenad. AIPO</w:t>
+      </w:r>
+      <w:r>
+        <w:t>, vol. 2, n.</w:t>
+      </w:r>
+      <w:r>
+        <w:rPr>
+          <w:vertAlign w:val="superscript"/>
+        </w:rPr>
+        <w:t>o</w:t>
+      </w:r>
+      <w:r>
+        <w:t xml:space="preserve"> 1, pp. 48-59, jun. 2021, doi: 10.65234/interaccion.35.</w:t>
+      </w:r>
+    </w:p>
+    <w:p>
+      <w:pPr>
+        <w:pStyle w:val="Bibliografa"/>
+      </w:pPr>
+      <w:r>
+        <w:t>[14]</w:t>
+      </w:r>
+      <w:r>
+        <w:tab/>
+        <w:t>D. C. Alban Tarco y V. E. Jara Ramírez, «Revisión sistemática de intervenciones basadas en el juego como herramienta terapéutica para niños con TEA o TDAH», masterThesis, Quito: Universidad de las Américas, 2025, 2025. Accedido: 9 de agosto de 2026. [En línea]. Disponible en: http://dspace.udla.edu.ec/handle/33000/18031</w:t>
+      </w:r>
+    </w:p>
+    <w:p>
+      <w:pPr>
+        <w:pStyle w:val="Bibliografa"/>
+      </w:pPr>
+      <w:r>
+        <w:t>[15]</w:t>
+      </w:r>
+      <w:r>
+        <w:tab/>
+        <w:t xml:space="preserve">E. Barragan-Perez </w:t>
       </w:r>
       <w:r>
         <w:rPr>
           <w:i/>
           <w:iCs/>
         </w:rPr>
+        <w:t>et al.</w:t>
+      </w:r>
+      <w:r>
+        <w:t xml:space="preserve">, «MIDIENDO EL ESPECTRO: DE LOS TRASTORNOS DEL LENGUAJE A LOS TRASTORNOS DEL ESPECTRO AUTISTA: CONSENSO LATINOAMERICANO DELPHI MODIFICADO», </w:t>
+      </w:r>
+      <w:r>
+        <w:rPr>
+          <w:i/>
+          <w:iCs/>
+        </w:rPr>
         <w:t>Rev. Médica Clínica Las Condes</w:t>
       </w:r>
       <w:r>
@@ -8468,23 +8730,74 @@
         <w:pStyle w:val="Bibliografa"/>
       </w:pPr>
       <w:r>
-        <w:t>[14]</w:t>
-      </w:r>
-      <w:r>
-        <w:tab/>
-        <w:t>D. C. Alban Tarco y V. E. Jara Ramírez, «Revisión sistemática de intervenciones basadas en el juego como herramienta terapéutica para niños con TEA o TDAH», masterThesis, Quito: Universidad de las Américas, 2025, 2025. Accedido: 9 de agosto de 2026. [En línea]. Disponible en: http://dspace.udla.edu.ec/handle/33000/18031</w:t>
-      </w:r>
-    </w:p>
-    <w:p>
-      <w:pPr>
-        <w:pStyle w:val="Bibliografa"/>
-      </w:pPr>
-      <w:r>
-        <w:t>[15]</w:t>
+        <w:lastRenderedPageBreak/>
+        <w:t>[16]</w:t>
       </w:r>
       <w:r>
         <w:tab/>
         <w:t>L. S. Encalada, «DETECCIÓN E INTERVENCIÓN A TRAVÉS DEL JUEGO DEL TRASTORNO POR DÉFICIT DE ATENCIÓN CON HIPERACTIVIDAD (TDAH)».</w:t>
+      </w:r>
+    </w:p>
+    <w:p>
+      <w:pPr>
+        <w:pStyle w:val="Bibliografa"/>
+      </w:pPr>
+      <w:r>
+        <w:t>[17]</w:t>
+      </w:r>
+      <w:r>
+        <w:tab/>
+        <w:t xml:space="preserve">J. Larraín-Valenzuela, M. Aspé-Sánchez, P. Nieto, R. C. Vergara, y A. M. Palma Contreras, «Effectiveness of family bonding therapy supported by child clinical psychomotricity to increase self-regulation in children with attention deficit hyperactivity disorder: A pilot study», </w:t>
+      </w:r>
+      <w:r>
+        <w:rPr>
+          <w:i/>
+          <w:iCs/>
+        </w:rPr>
+        <w:t>Rev. Psicodidáct. Engl. Ed</w:t>
+      </w:r>
+      <w:r>
+        <w:t>, vol. 28, n.</w:t>
+      </w:r>
+      <w:r>
+        <w:rPr>
+          <w:vertAlign w:val="superscript"/>
+        </w:rPr>
+        <w:t>o</w:t>
+      </w:r>
+      <w:r>
+        <w:t xml:space="preserve"> 1, pp. 80-91, ene. 2023, doi: 10.1016/j.psicoe.2022.12.003.</w:t>
+      </w:r>
+    </w:p>
+    <w:p>
+      <w:pPr>
+        <w:pStyle w:val="Bibliografa"/>
+      </w:pPr>
+      <w:r>
+        <w:t>[18]</w:t>
+      </w:r>
+      <w:r>
+        <w:tab/>
+        <w:t xml:space="preserve">K. E. C. Landy, J. L. P. Neira, y G. G. R. Ortiz, «Terapia cognitivo conductual en el tratamiento de las adicciones a los videojuegos: una revisión sistemática», </w:t>
+      </w:r>
+      <w:r>
+        <w:rPr>
+          <w:i/>
+          <w:iCs/>
+        </w:rPr>
+        <w:t>Sci. Rev. Prod. Cienc. E Investig.</w:t>
+      </w:r>
+      <w:r>
+        <w:t>, vol. 6, n.</w:t>
+      </w:r>
+      <w:r>
+        <w:rPr>
+          <w:vertAlign w:val="superscript"/>
+        </w:rPr>
+        <w:t>o</w:t>
+      </w:r>
+      <w:r>
+        <w:t xml:space="preserve"> 42, pp. 301-322, mar. 2022, doi: 10.29018/issn.2588-1000vol6iss42.2022pp301-322.</w:t>
       </w:r>
     </w:p>
     <w:p>
@@ -8594,41 +8907,20 @@
     </w:p>
     <w:p>
       <w:r>
-        <w:t xml:space="preserve">Para los títulos de las subsecciones de los apéndices se utiliza el estilo Título 8. Para las </w:t>
-      </w:r>
-      <w:proofErr w:type="spellStart"/>
-      <w:r>
-        <w:t>sub-subsecciones</w:t>
-      </w:r>
-      <w:proofErr w:type="spellEnd"/>
-      <w:r>
-        <w:t xml:space="preserve"> se usa el estilo Título 9, como aparece a continuación.</w:t>
+        <w:t>Para los títulos de las subsecciones de los apéndices se utiliza el estilo Título 8. Para las sub-subsecciones se usa el estilo Título 9, como aparece a continuación.</w:t>
       </w:r>
     </w:p>
     <w:p>
       <w:pPr>
         <w:pStyle w:val="Ttulo9"/>
       </w:pPr>
-      <w:proofErr w:type="spellStart"/>
-      <w:r>
-        <w:t>Sub-subsecciones</w:t>
-      </w:r>
-      <w:proofErr w:type="spellEnd"/>
-      <w:r>
-        <w:t xml:space="preserve"> del apéndice (Título 9)</w:t>
-      </w:r>
-    </w:p>
-    <w:p>
-      <w:r>
-        <w:t xml:space="preserve">Para las </w:t>
-      </w:r>
-      <w:proofErr w:type="spellStart"/>
-      <w:r>
-        <w:t>sub-subsecciones</w:t>
-      </w:r>
-      <w:proofErr w:type="spellEnd"/>
-      <w:r>
-        <w:t xml:space="preserve"> de un apéndice se utiliza el estilo Título 9. No se recomienda añadir más niveles de subsección</w:t>
+      <w:r>
+        <w:t>Sub-subsecciones del apéndice (Título 9)</w:t>
+      </w:r>
+    </w:p>
+    <w:p>
+      <w:r>
+        <w:t>Para las sub-subsecciones de un apéndice se utiliza el estilo Título 9. No se recomienda añadir más niveles de subsección</w:t>
       </w:r>
       <w:r>
         <w:t>.</w:t>

</xml_diff>

<commit_message>
Avances estado del arte
</commit_message>
<xml_diff>
--- a/MemoriaTFG/NahiaIglesiasEsquemaTFG.docx
+++ b/MemoriaTFG/NahiaIglesiasEsquemaTFG.docx
@@ -769,7 +769,15 @@
         <w:t xml:space="preserve">A mi hermana por </w:t>
       </w:r>
       <w:r>
-        <w:t xml:space="preserve">hacerme sandwitches todas las veces que </w:t>
+        <w:t xml:space="preserve">hacerme </w:t>
+      </w:r>
+      <w:proofErr w:type="spellStart"/>
+      <w:r>
+        <w:t>sandwitches</w:t>
+      </w:r>
+      <w:proofErr w:type="spellEnd"/>
+      <w:r>
+        <w:t xml:space="preserve"> todas las veces que </w:t>
       </w:r>
       <w:r>
         <w:t>me veía</w:t>
@@ -784,8 +792,13 @@
         <w:t>.</w:t>
       </w:r>
       <w:r>
-        <w:t xml:space="preserve"> Lna</w:t>
-      </w:r>
+        <w:t xml:space="preserve"> </w:t>
+      </w:r>
+      <w:proofErr w:type="spellStart"/>
+      <w:r>
+        <w:t>Lna</w:t>
+      </w:r>
+      <w:proofErr w:type="spellEnd"/>
     </w:p>
     <w:p>
       <w:pPr>
@@ -1342,14 +1355,21 @@
         <w:pStyle w:val="PageHeading"/>
       </w:pPr>
       <w:bookmarkStart w:id="1" w:name="Indice"/>
+      <w:proofErr w:type="spellStart"/>
       <w:r>
         <w:lastRenderedPageBreak/>
         <w:t>Índice</w:t>
       </w:r>
-      <w:r>
-        <w:t xml:space="preserve"> de contenidos</w:t>
+      <w:proofErr w:type="spellEnd"/>
+      <w:r>
+        <w:t xml:space="preserve"> de </w:t>
+      </w:r>
+      <w:proofErr w:type="spellStart"/>
+      <w:r>
+        <w:t>contenidos</w:t>
       </w:r>
       <w:bookmarkEnd w:id="1"/>
+      <w:proofErr w:type="spellEnd"/>
     </w:p>
     <w:sdt>
       <w:sdtPr>
@@ -5058,11 +5078,19 @@
       <w:bookmarkEnd w:id="7"/>
     </w:p>
     <w:p>
+      <w:proofErr w:type="spellStart"/>
       <w:r>
         <w:rPr>
           <w:shd w:val="clear" w:color="auto" w:fill="FFFFFF"/>
         </w:rPr>
-        <w:t>Hbalar un poco del TDAH y los juegos serios</w:t>
+        <w:t>Hbalar</w:t>
+      </w:r>
+      <w:proofErr w:type="spellEnd"/>
+      <w:r>
+        <w:rPr>
+          <w:shd w:val="clear" w:color="auto" w:fill="FFFFFF"/>
+        </w:rPr>
+        <w:t xml:space="preserve"> un poco del TDAH y los juegos serios</w:t>
       </w:r>
     </w:p>
     <w:p>
@@ -5202,7 +5230,15 @@
       </w:pPr>
       <w:r>
         <w:lastRenderedPageBreak/>
-        <w:t>(Como una checklist)</w:t>
+        <w:t xml:space="preserve">(Como una </w:t>
+      </w:r>
+      <w:proofErr w:type="spellStart"/>
+      <w:r>
+        <w:t>checklist</w:t>
+      </w:r>
+      <w:proofErr w:type="spellEnd"/>
+      <w:r>
+        <w:t>)</w:t>
       </w:r>
     </w:p>
     <w:p>
@@ -5246,10 +5282,74 @@
         <w:t xml:space="preserve"> </w:t>
       </w:r>
       <w:r>
-        <w:t>(creo, c#), Visual studio core (python), Photoshop, Blender, Scrum, Github, Drive (documentos compartidos y datos de pruebas)</w:t>
-      </w:r>
-      <w:r>
-        <w:t>, Itchio, Polypizza, Freepik, free3D, Davinci Resolve</w:t>
+        <w:t xml:space="preserve">(creo, </w:t>
+      </w:r>
+      <w:proofErr w:type="spellStart"/>
+      <w:r>
+        <w:t>c#</w:t>
+      </w:r>
+      <w:proofErr w:type="spellEnd"/>
+      <w:r>
+        <w:t xml:space="preserve">), Visual </w:t>
+      </w:r>
+      <w:proofErr w:type="spellStart"/>
+      <w:r>
+        <w:t>studio</w:t>
+      </w:r>
+      <w:proofErr w:type="spellEnd"/>
+      <w:r>
+        <w:t xml:space="preserve"> </w:t>
+      </w:r>
+      <w:proofErr w:type="spellStart"/>
+      <w:r>
+        <w:t>core</w:t>
+      </w:r>
+      <w:proofErr w:type="spellEnd"/>
+      <w:r>
+        <w:t xml:space="preserve"> (</w:t>
+      </w:r>
+      <w:proofErr w:type="spellStart"/>
+      <w:r>
+        <w:t>python</w:t>
+      </w:r>
+      <w:proofErr w:type="spellEnd"/>
+      <w:r>
+        <w:t xml:space="preserve">), Photoshop, Blender, Scrum, </w:t>
+      </w:r>
+      <w:proofErr w:type="spellStart"/>
+      <w:r>
+        <w:t>Github</w:t>
+      </w:r>
+      <w:proofErr w:type="spellEnd"/>
+      <w:r>
+        <w:t>, Drive (documentos compartidos y datos de pruebas)</w:t>
+      </w:r>
+      <w:r>
+        <w:t xml:space="preserve">, </w:t>
+      </w:r>
+      <w:proofErr w:type="spellStart"/>
+      <w:r>
+        <w:t>Itchio</w:t>
+      </w:r>
+      <w:proofErr w:type="spellEnd"/>
+      <w:r>
+        <w:t xml:space="preserve">, </w:t>
+      </w:r>
+      <w:proofErr w:type="spellStart"/>
+      <w:r>
+        <w:t>Polypizza</w:t>
+      </w:r>
+      <w:proofErr w:type="spellEnd"/>
+      <w:r>
+        <w:t xml:space="preserve">, </w:t>
+      </w:r>
+      <w:proofErr w:type="spellStart"/>
+      <w:r>
+        <w:t>Freepik</w:t>
+      </w:r>
+      <w:proofErr w:type="spellEnd"/>
+      <w:r>
+        <w:t>, free3D, Davinci Resolve</w:t>
       </w:r>
     </w:p>
     <w:p>
@@ -5281,7 +5381,23 @@
         <w:pStyle w:val="Textoindependiente"/>
       </w:pPr>
       <w:r>
-        <w:t>Planificar en tiempo lo que hice: Ej septiembre  hice tal, en octubre tal cual…</w:t>
+        <w:t xml:space="preserve">Planificar en tiempo lo que hice: </w:t>
+      </w:r>
+      <w:proofErr w:type="spellStart"/>
+      <w:r>
+        <w:t>Ej</w:t>
+      </w:r>
+      <w:proofErr w:type="spellEnd"/>
+      <w:r>
+        <w:t xml:space="preserve"> </w:t>
+      </w:r>
+      <w:proofErr w:type="gramStart"/>
+      <w:r>
+        <w:t>septiembre  hice</w:t>
+      </w:r>
+      <w:proofErr w:type="gramEnd"/>
+      <w:r>
+        <w:t xml:space="preserve"> tal, en octubre tal cual…</w:t>
       </w:r>
     </w:p>
     <w:p>
@@ -5520,7 +5636,15 @@
         <w:fldChar w:fldCharType="end"/>
       </w:r>
       <w:r>
-        <w:t xml:space="preserve"> (Esta es la guía para diagnostico de trastornos mentales).</w:t>
+        <w:t xml:space="preserve"> (Esta es la guía para </w:t>
+      </w:r>
+      <w:proofErr w:type="spellStart"/>
+      <w:r>
+        <w:t>diagnostico</w:t>
+      </w:r>
+      <w:proofErr w:type="spellEnd"/>
+      <w:r>
+        <w:t xml:space="preserve"> de trastornos mentales).</w:t>
       </w:r>
     </w:p>
     <w:p>
@@ -5582,6 +5706,7 @@
           <w:lang w:val="es-ES"/>
         </w:rPr>
       </w:pPr>
+      <w:proofErr w:type="spellStart"/>
       <w:r>
         <w:rPr>
           <w:lang w:val="es-ES"/>
@@ -5600,6 +5725,7 @@
         </w:rPr>
         <w:t>anificacion</w:t>
       </w:r>
+      <w:proofErr w:type="spellEnd"/>
     </w:p>
     <w:p>
       <w:pPr>
@@ -5845,7 +5971,25 @@
           <w:szCs w:val="22"/>
           <w:highlight w:val="yellow"/>
         </w:rPr>
-        <w:t xml:space="preserve"> (pg 19)</w:t>
+        <w:t xml:space="preserve"> (</w:t>
+      </w:r>
+      <w:proofErr w:type="spellStart"/>
+      <w:r>
+        <w:rPr>
+          <w:color w:val="000000"/>
+          <w:szCs w:val="22"/>
+          <w:highlight w:val="yellow"/>
+        </w:rPr>
+        <w:t>pg</w:t>
+      </w:r>
+      <w:proofErr w:type="spellEnd"/>
+      <w:r>
+        <w:rPr>
+          <w:color w:val="000000"/>
+          <w:szCs w:val="22"/>
+          <w:highlight w:val="yellow"/>
+        </w:rPr>
+        <w:t xml:space="preserve"> 19)</w:t>
       </w:r>
       <w:r>
         <w:rPr>
@@ -6507,8 +6651,30 @@
         <w:rPr>
           <w:lang w:val="es-ES"/>
         </w:rPr>
-        <w:t xml:space="preserve"> Por ejemplo puede ser un simulador o podría ser una novela visual, etc..</w:t>
-      </w:r>
+        <w:t xml:space="preserve"> Por </w:t>
+      </w:r>
+      <w:proofErr w:type="gramStart"/>
+      <w:r>
+        <w:rPr>
+          <w:lang w:val="es-ES"/>
+        </w:rPr>
+        <w:t>ejemplo</w:t>
+      </w:r>
+      <w:proofErr w:type="gramEnd"/>
+      <w:r>
+        <w:rPr>
+          <w:lang w:val="es-ES"/>
+        </w:rPr>
+        <w:t xml:space="preserve"> puede ser un simulador o podría ser una novela visual, </w:t>
+      </w:r>
+      <w:proofErr w:type="gramStart"/>
+      <w:r>
+        <w:rPr>
+          <w:lang w:val="es-ES"/>
+        </w:rPr>
+        <w:t>etc..</w:t>
+      </w:r>
+      <w:proofErr w:type="gramEnd"/>
     </w:p>
     <w:p>
       <w:pPr>
@@ -7456,8 +7622,159 @@
         <w:rPr>
           <w:lang w:val="es-ES"/>
         </w:rPr>
-        <w:t>En el TDAH puede ser muy efectivo blahblahblah</w:t>
-      </w:r>
+        <w:t xml:space="preserve">Hablar de por qué los juegos S. para la educación están muy </w:t>
+      </w:r>
+      <w:proofErr w:type="spellStart"/>
+      <w:r>
+        <w:rPr>
+          <w:lang w:val="es-ES"/>
+        </w:rPr>
+        <w:t>guays</w:t>
+      </w:r>
+      <w:proofErr w:type="spellEnd"/>
+    </w:p>
+    <w:p>
+      <w:pPr>
+        <w:pStyle w:val="Textoindependiente"/>
+        <w:rPr>
+          <w:lang w:val="es-ES"/>
+        </w:rPr>
+      </w:pPr>
+      <w:r>
+        <w:rPr>
+          <w:lang w:val="es-ES"/>
+        </w:rPr>
+        <w:t>Los juegos como estrategia en la enseñanza han demostrado mayor impacto en el aprendizaje de los niños en edad escolar, utilizando estos, es posible mejorar la capacidad cognitiva de los estudiantes  y lograr un aprendizaje efectivo</w:t>
+      </w:r>
+      <w:r>
+        <w:rPr>
+          <w:lang w:val="es-ES"/>
+        </w:rPr>
+        <w:fldChar w:fldCharType="begin"/>
+      </w:r>
+      <w:r>
+        <w:rPr>
+          <w:lang w:val="es-ES"/>
+        </w:rPr>
+        <w:instrText xml:space="preserve"> ADDIN ZOTERO_ITEM CSL_CITATION {"citationID":"Xcqp2haA","properties":{"unsorted":false,"formattedCitation":"[13]","plainCitation":"[13]","noteIndex":0},"citationItems":[{"id":75,"uris":["http://zotero.org/users/local/axS3HTYd/items/YAGCAE7R"],"itemData":{"id":75,"type":"article-journal","abstract":"El Trastorno por Déficit de Atención e Hiperactividad (TDAH) implica un patrón de déficit de atención, hiperactividad e impulsividad. Existen muchos trabajos donde se usan los videojuegos como un instrumento tecnológico de apoyo en el aula. No obstante, si bien se documentan los beneficios no queda claro el cómo fueron creados y sobre todo el impacto de estos para el propósito de aprendizaje para el que fueron creados. En este propósito, este artículo se centra en la propuesta metodológica de desarrollo de videojuegos para niños con TDAH. Se realizó una revisión de fuentes bibliográficas y entrevistas a especialistas para comprender que el apoyo basado en videojuegos tiene puntos positivos para el aprendizaje. Para el desarrollo de los videojuegos se emplea la metodología de SCRUM, se presentan 7 videojuegos para apoyar en el aprendizaje de niños de primaria, estos fueron evaluados por los especialistas en educación, padres de familia, especialistas de TDAH y los niños. Los resultados son alentadores y nos permiten sentar una base más formal respecto a los videojuegos serios para niños con TDAH. La metodología de desarrollo SRUM ha sido utilizada de manera específica para videojuegos, sin embargo, en este trabajo se presentan algunos artefactos modificados que contribuyen al diseño de videojuegos con propósitos de aprendizaje de niños con TDAH.","container-title":"Revista de la Asociación Interacción Persona Ordenador (AIPO)","DOI":"10.65234/interaccion.35","ISSN":"2695-6578","issue":"1","language":"es","license":"https://creativecommons.org/licenses/by-nc/4.0","page":"48-59","source":"revista.aipo.es","title":"Videojuegos en educación especial: niños con TDAH","title-short":"Videojuegos en educación especial","volume":"2","author":[{"family":"García","given":"Josefina Guerrero"},{"family":"Calleros","given":"Juan Manuel González"}],"issued":{"date-parts":[["2021",6,23]]}}}],"schema":"https://github.com/citation-style-language/schema/raw/master/csl-citation.json"} </w:instrText>
+      </w:r>
+      <w:r>
+        <w:rPr>
+          <w:lang w:val="es-ES"/>
+        </w:rPr>
+        <w:fldChar w:fldCharType="separate"/>
+      </w:r>
+      <w:r>
+        <w:rPr>
+          <w:lang w:val="es-ES"/>
+        </w:rPr>
+        <w:t>[13]</w:t>
+      </w:r>
+      <w:r>
+        <w:rPr>
+          <w:lang w:val="es-ES"/>
+        </w:rPr>
+        <w:fldChar w:fldCharType="end"/>
+      </w:r>
+      <w:r>
+        <w:rPr>
+          <w:lang w:val="es-ES"/>
+        </w:rPr>
+        <w:t>.</w:t>
+      </w:r>
+    </w:p>
+    <w:p>
+      <w:pPr>
+        <w:pStyle w:val="Textoindependiente"/>
+        <w:rPr>
+          <w:lang w:val="es-ES"/>
+        </w:rPr>
+      </w:pPr>
+      <w:r>
+        <w:rPr>
+          <w:lang w:val="es-ES"/>
+        </w:rPr>
+        <w:t>L</w:t>
+      </w:r>
+      <w:r>
+        <w:rPr>
+          <w:lang w:val="es-ES"/>
+        </w:rPr>
+        <w:t>a inclusión de gamificación y juegos pueden favorecer el aprendizaje, optimizando el nivel de concentración de los niños que los utilizan, mejorando su aprendizaje, y brindándoles motivación igual o superior a la de otros métodos con respecto a la adquisición de conocimientos</w:t>
+      </w:r>
+      <w:r>
+        <w:rPr>
+          <w:lang w:val="es-ES"/>
+        </w:rPr>
+        <w:fldChar w:fldCharType="begin"/>
+      </w:r>
+      <w:r>
+        <w:rPr>
+          <w:lang w:val="es-ES"/>
+        </w:rPr>
+        <w:instrText xml:space="preserve"> ADDIN ZOTERO_ITEM CSL_CITATION {"citationID":"LaanRmSX","properties":{"unsorted":false,"formattedCitation":"[13], [19]","plainCitation":"[13], [19]","noteIndex":0},"citationItems":[{"id":75,"uris":["http://zotero.org/users/local/axS3HTYd/items/YAGCAE7R"],"itemData":{"id":75,"type":"article-journal","abstract":"El Trastorno por Déficit de Atención e Hiperactividad (TDAH) implica un patrón de déficit de atención, hiperactividad e impulsividad. Existen muchos trabajos donde se usan los videojuegos como un instrumento tecnológico de apoyo en el aula. No obstante, si bien se documentan los beneficios no queda claro el cómo fueron creados y sobre todo el impacto de estos para el propósito de aprendizaje para el que fueron creados. En este propósito, este artículo se centra en la propuesta metodológica de desarrollo de videojuegos para niños con TDAH. Se realizó una revisión de fuentes bibliográficas y entrevistas a especialistas para comprender que el apoyo basado en videojuegos tiene puntos positivos para el aprendizaje. Para el desarrollo de los videojuegos se emplea la metodología de SCRUM, se presentan 7 videojuegos para apoyar en el aprendizaje de niños de primaria, estos fueron evaluados por los especialistas en educación, padres de familia, especialistas de TDAH y los niños. Los resultados son alentadores y nos permiten sentar una base más formal respecto a los videojuegos serios para niños con TDAH. La metodología de desarrollo SRUM ha sido utilizada de manera específica para videojuegos, sin embargo, en este trabajo se presentan algunos artefactos modificados que contribuyen al diseño de videojuegos con propósitos de aprendizaje de niños con TDAH.","container-title":"Revista de la Asociación Interacción Persona Ordenador (AIPO)","DOI":"10.65234/interaccion.35","ISSN":"2695-6578","issue":"1","language":"es","license":"https://creativecommons.org/licenses/by-nc/4.0","page":"48-59","source":"revista.aipo.es","title":"Videojuegos en educación especial: niños con TDAH","title-short":"Videojuegos en educación especial","volume":"2","author":[{"family":"García","given":"Josefina Guerrero"},{"family":"Calleros","given":"Juan Manuel González"}],"issued":{"date-parts":[["2021",6,23]]}}},{"id":91,"uris":["http://zotero.org/users/local/axS3HTYd/items/5MXREG46"],"itemData":{"id":91,"type":"article-journal","abstract":"It is assumed that serious games influences learning in 2 ways, by changing cognitive processes and by affecting motivation. However, until now research has shown little evidence for these assumptions. We used meta-analytic techniques to investigate whether serious games are more effective in terms of learning and more motivating than conventional instruction methods (learning: k = 77, N 5,547; motivation: k = 31, N 2,216). Consistent with our hypotheses, serious games were found to be more effective in terms of learning (d= 0.29, p d = 0.36, p d = 0.26, p &gt; .05) than conventional instruction methods. Additional moderator analyses on the learning effects revealed that learners in serious games learned more, relative to those taught with conventional instruction methods, when the game was supplemented with other instruction methods, when multiple training sessions were involved, and when players worked in groups. (PsycInfo Database Record (c) 2025 APA, all rights reserved)","container-title":"Journal of Educational Psychology","DOI":"10.1037/a0031311","ISSN":"1939-2176","issue":"2","page":"249-265","publisher":"American Psychological Association","publisher-place":"US","source":"APA PsycNet","title":"A meta-analysis of the cognitive and motivational effects of serious games","volume":"105","author":[{"family":"Wouters","given":"Pieter"},{"family":"Nimwegen","given":"Christof","non-dropping-particle":"van"},{"family":"Oostendorp","given":"Herre","non-dropping-particle":"van"},{"family":"Spek","given":"Erik D.","non-dropping-particle":"van der"}],"issued":{"date-parts":[["2013"]]}}}],"schema":"https://github.com/citation-style-language/schema/raw/master/csl-citation.json"} </w:instrText>
+      </w:r>
+      <w:r>
+        <w:rPr>
+          <w:lang w:val="es-ES"/>
+        </w:rPr>
+        <w:fldChar w:fldCharType="separate"/>
+      </w:r>
+      <w:r>
+        <w:rPr>
+          <w:lang w:val="es-ES"/>
+        </w:rPr>
+        <w:t>[13], [19]</w:t>
+      </w:r>
+      <w:r>
+        <w:rPr>
+          <w:lang w:val="es-ES"/>
+        </w:rPr>
+        <w:fldChar w:fldCharType="end"/>
+      </w:r>
+      <w:r>
+        <w:rPr>
+          <w:lang w:val="es-ES"/>
+        </w:rPr>
+        <w:t>.</w:t>
+      </w:r>
+    </w:p>
+    <w:p>
+      <w:pPr>
+        <w:pStyle w:val="Textoindependiente"/>
+        <w:rPr>
+          <w:lang w:val="es-ES"/>
+        </w:rPr>
+      </w:pPr>
+      <w:r>
+        <w:rPr>
+          <w:lang w:val="es-ES"/>
+        </w:rPr>
+        <w:t>En el caso del TDAH…</w:t>
+      </w:r>
+    </w:p>
+    <w:p>
+      <w:pPr>
+        <w:pStyle w:val="Textoindependiente"/>
+        <w:rPr>
+          <w:lang w:val="es-ES"/>
+        </w:rPr>
+      </w:pPr>
+      <w:r>
+        <w:rPr>
+          <w:lang w:val="es-ES"/>
+        </w:rPr>
+        <w:lastRenderedPageBreak/>
+        <w:t xml:space="preserve">En el TDAH puede ser muy efectivo </w:t>
+      </w:r>
+      <w:proofErr w:type="spellStart"/>
+      <w:r>
+        <w:rPr>
+          <w:lang w:val="es-ES"/>
+        </w:rPr>
+        <w:t>blahblahblah</w:t>
+      </w:r>
+      <w:proofErr w:type="spellEnd"/>
     </w:p>
     <w:p>
       <w:pPr>
@@ -7477,6 +7794,20 @@
     </w:p>
     <w:p>
       <w:pPr>
+        <w:pStyle w:val="Textoindependiente"/>
+        <w:rPr>
+          <w:lang w:val="es-ES"/>
+        </w:rPr>
+      </w:pPr>
+      <w:r>
+        <w:rPr>
+          <w:lang w:val="es-ES"/>
+        </w:rPr>
+        <w:t>Hablar de los juegos serios como herramienta psicológica en general y luego centrarme en el caso de JS como herramienta psico para TDAH</w:t>
+      </w:r>
+    </w:p>
+    <w:p>
+      <w:pPr>
         <w:pStyle w:val="Ttulo3"/>
         <w:rPr>
           <w:lang w:val="es-ES"/>
@@ -7490,6 +7821,208 @@
         <w:t>Ventajas de juegos en TDAH</w:t>
       </w:r>
       <w:bookmarkEnd w:id="34"/>
+    </w:p>
+    <w:p>
+      <w:pPr>
+        <w:pStyle w:val="Textoindependiente"/>
+        <w:rPr>
+          <w:lang w:val="es-ES"/>
+        </w:rPr>
+      </w:pPr>
+      <w:r>
+        <w:rPr>
+          <w:lang w:val="es-ES"/>
+        </w:rPr>
+        <w:t>Ventajas a la hora de usar un juego serio con una persona con TDAH</w:t>
+      </w:r>
+      <w:r>
+        <w:rPr>
+          <w:lang w:val="es-ES"/>
+        </w:rPr>
+        <w:t>.</w:t>
+      </w:r>
+    </w:p>
+    <w:p>
+      <w:pPr>
+        <w:pStyle w:val="Textoindependiente"/>
+        <w:rPr>
+          <w:lang w:val="es-ES"/>
+        </w:rPr>
+      </w:pPr>
+      <w:r>
+        <w:rPr>
+          <w:lang w:val="es-ES"/>
+        </w:rPr>
+        <w:t>El juego fortalece la motivación intrínseca y esto permite adherirse a las intervenciones para el manejo del Trastorno por déficit de atención e hiperactividad (TDAH)</w:t>
+      </w:r>
+      <w:r>
+        <w:rPr>
+          <w:lang w:val="es-ES"/>
+        </w:rPr>
+        <w:fldChar w:fldCharType="begin"/>
+      </w:r>
+      <w:r>
+        <w:rPr>
+          <w:lang w:val="es-ES"/>
+        </w:rPr>
+        <w:instrText xml:space="preserve"> ADDIN ZOTERO_ITEM CSL_CITATION {"citationID":"VKdsh6rm","properties":{"unsorted":false,"formattedCitation":"[14], [20]","plainCitation":"[14], [20]","noteIndex":0},"citationItems":[{"id":73,"uris":["http://zotero.org/users/local/axS3HTYd/items/BQFYIPRE"],"itemData":{"id":73,"type":"thesis","abstract":"El objetivo de esta revisión sistemática fue el analizar la efectividad y características de las intervenciones basadas en el juego aplicado a niños que presentan cuadros de TEA o TDAH, un tema que resulta importante, especialmente cuando existe la necesidad de optimizar enfoques terapéuticos y educativos en cada uno de estos grupos. En este sentido, el estudio se acogió a la guía PRISMA 2020, considerando varios criterios de inclusión y exclusión tal como la revisión de la literatura publicada entre el 2016 y 2025 dentro de bases de datos especializadas que incluyen estudios empíricos sobre población menor a 16 años con diagnóstico clínico confirmado. Así también, se evitaron revisiones narrativas, teóricas o sistemáticas, estudios que combinen el juego con otras terapias y documentos con acceso restringido. Para cumplir con este objetivo, se seleccionaron diez estudios tras un riguroso proceso de cribado y análisis de sesgo que inicialmente contaba con 800 investigaciones. Con base en esta selección, los hallazgos muestran que las intervenciones estructuradas, así como las flexibles que utilizan juegos simbólicos, digitales y grupales son eficaces para la mejora de las funciones cognitivas y socioemocionales de los niños. Entre los mayores defectos se detectó que la atención, autocontrol, comunicación y sociabilidad varían según el diagnóstico y contexto del niño. Se concluye que la aplicación de intervenciones lúdicas que se adaptan a las necesidades individuales del niño representa una pieza importante dentro de la atención clínica y escolar, sugiriendo profundizar en diseños robustos, así como el seguimiento longitudinal y estrategias de colaboración interdisciplinaria que permitan avanzar en la inclusión y bienestar de los niños.","genre":"masterThesis","language":"spa","license":"openAccess","note":"Accepted: 2025-09-15T20:44:29Z","publisher":"Quito: Universidad de las Américas, 2025","source":"dspace.udla.edu.ec","title":"Revisión sistemática de intervenciones basadas en el juego como herramienta terapéutica para niños con TEA o TDAH","URL":"http://dspace.udla.edu.ec/handle/33000/18031","author":[{"family":"Alban Tarco","given":"Dayana Carolina"},{"family":"Jara Ramírez","given":"Verónica Elizabeth"}],"accessed":{"date-parts":[["2026",8,9]]},"issued":{"date-parts":[["2025"]]}}},{"id":89,"uris":["http://zotero.org/users/local/axS3HTYd/items/IRSPEH2B"],"itemData":{"id":89,"type":"article-journal","container-title":"Revista iberoamericana de psicologia y salud.","DOI":"10.23923/j.rips.2020.01.034","ISSN":"21712069","issue":"1","language":"Spanish","license":"© 2020. This work is published under creativecommons.org/licenses/by-nc-nd/4.0 (the “License”). Notwithstanding the ProQuest Terms and Conditions, you may use this content in accordance with the terms of the License.","note":"number-of-pages: 42-53","page":"42-53","publisher":"Ramón González Cabanach","publisher-place":"A Coruna, Spain","source":"ProQuest","title":"Beneficios de las intervenciones basadas en la atención plena para el tratamiento de síntomas ansiosos en niños y adolescentes: Metaanálisis","title-short":"Beneficios de las intervenciones basadas en la atención plena para el tratamiento de síntomas ansiosos en niños y adolescentes","volume":"11","author":[{"family":"Soriano","given":"José Gabriel"},{"family":"Pérez-Fuentes","given":"María del Carmen"},{"family":"Molero-Jurado","given":"María del Mar"},{"family":"Gázquez","given":"José Jesús"},{"family":"Tortosa","given":"Begoña María"},{"family":"González","given":"Alba"}],"issued":{"date-parts":[["2020"]]}}}],"schema":"https://github.com/citation-style-language/schema/raw/master/csl-citation.json"} </w:instrText>
+      </w:r>
+      <w:r>
+        <w:rPr>
+          <w:lang w:val="es-ES"/>
+        </w:rPr>
+        <w:fldChar w:fldCharType="separate"/>
+      </w:r>
+      <w:r>
+        <w:rPr>
+          <w:lang w:val="es-ES"/>
+        </w:rPr>
+        <w:t>[14], [20]</w:t>
+      </w:r>
+      <w:r>
+        <w:rPr>
+          <w:lang w:val="es-ES"/>
+        </w:rPr>
+        <w:fldChar w:fldCharType="end"/>
+      </w:r>
+      <w:r>
+        <w:rPr>
+          <w:lang w:val="es-ES"/>
+        </w:rPr>
+        <w:t>.</w:t>
+      </w:r>
+    </w:p>
+    <w:p>
+      <w:pPr>
+        <w:pStyle w:val="Textoindependiente"/>
+        <w:rPr>
+          <w:lang w:val="es-ES"/>
+        </w:rPr>
+      </w:pPr>
+      <w:r>
+        <w:rPr>
+          <w:lang w:val="es-ES"/>
+        </w:rPr>
+        <w:t>Los juegos estructurados y digitales como entrenamientos para el TDAH en plataformas destacan por ser efectivos mejorando la atención prolongada o la regulación conductual</w:t>
+      </w:r>
+      <w:r>
+        <w:rPr>
+          <w:lang w:val="es-ES"/>
+        </w:rPr>
+        <w:fldChar w:fldCharType="begin"/>
+      </w:r>
+      <w:r>
+        <w:rPr>
+          <w:lang w:val="es-ES"/>
+        </w:rPr>
+        <w:instrText xml:space="preserve"> ADDIN ZOTERO_ITEM CSL_CITATION {"citationID":"bIfQZEHm","properties":{"unsorted":false,"formattedCitation":"[14]","plainCitation":"[14]","noteIndex":0},"citationItems":[{"id":73,"uris":["http://zotero.org/users/local/axS3HTYd/items/BQFYIPRE"],"itemData":{"id":73,"type":"thesis","abstract":"El objetivo de esta revisión sistemática fue el analizar la efectividad y características de las intervenciones basadas en el juego aplicado a niños que presentan cuadros de TEA o TDAH, un tema que resulta importante, especialmente cuando existe la necesidad de optimizar enfoques terapéuticos y educativos en cada uno de estos grupos. En este sentido, el estudio se acogió a la guía PRISMA 2020, considerando varios criterios de inclusión y exclusión tal como la revisión de la literatura publicada entre el 2016 y 2025 dentro de bases de datos especializadas que incluyen estudios empíricos sobre población menor a 16 años con diagnóstico clínico confirmado. Así también, se evitaron revisiones narrativas, teóricas o sistemáticas, estudios que combinen el juego con otras terapias y documentos con acceso restringido. Para cumplir con este objetivo, se seleccionaron diez estudios tras un riguroso proceso de cribado y análisis de sesgo que inicialmente contaba con 800 investigaciones. Con base en esta selección, los hallazgos muestran que las intervenciones estructuradas, así como las flexibles que utilizan juegos simbólicos, digitales y grupales son eficaces para la mejora de las funciones cognitivas y socioemocionales de los niños. Entre los mayores defectos se detectó que la atención, autocontrol, comunicación y sociabilidad varían según el diagnóstico y contexto del niño. Se concluye que la aplicación de intervenciones lúdicas que se adaptan a las necesidades individuales del niño representa una pieza importante dentro de la atención clínica y escolar, sugiriendo profundizar en diseños robustos, así como el seguimiento longitudinal y estrategias de colaboración interdisciplinaria que permitan avanzar en la inclusión y bienestar de los niños.","genre":"masterThesis","language":"spa","license":"openAccess","note":"Accepted: 2025-09-15T20:44:29Z","publisher":"Quito: Universidad de las Américas, 2025","source":"dspace.udla.edu.ec","title":"Revisión sistemática de intervenciones basadas en el juego como herramienta terapéutica para niños con TEA o TDAH","URL":"http://dspace.udla.edu.ec/handle/33000/18031","author":[{"family":"Alban Tarco","given":"Dayana Carolina"},{"family":"Jara Ramírez","given":"Verónica Elizabeth"}],"accessed":{"date-parts":[["2026",8,9]]},"issued":{"date-parts":[["2025"]]}}}],"schema":"https://github.com/citation-style-language/schema/raw/master/csl-citation.json"} </w:instrText>
+      </w:r>
+      <w:r>
+        <w:rPr>
+          <w:lang w:val="es-ES"/>
+        </w:rPr>
+        <w:fldChar w:fldCharType="separate"/>
+      </w:r>
+      <w:r>
+        <w:rPr>
+          <w:lang w:val="es-ES"/>
+        </w:rPr>
+        <w:t>[14]</w:t>
+      </w:r>
+      <w:r>
+        <w:rPr>
+          <w:lang w:val="es-ES"/>
+        </w:rPr>
+        <w:fldChar w:fldCharType="end"/>
+      </w:r>
+      <w:r>
+        <w:rPr>
+          <w:lang w:val="es-ES"/>
+        </w:rPr>
+        <w:t>.</w:t>
+      </w:r>
+    </w:p>
+    <w:p>
+      <w:pPr>
+        <w:pStyle w:val="Textoindependiente"/>
+        <w:rPr>
+          <w:lang w:val="es-ES"/>
+        </w:rPr>
+      </w:pPr>
+      <w:proofErr w:type="spellStart"/>
+      <w:r>
+        <w:rPr>
+          <w:lang w:val="es-ES"/>
+        </w:rPr>
+        <w:t>Santurde</w:t>
+      </w:r>
+      <w:proofErr w:type="spellEnd"/>
+      <w:r>
+        <w:rPr>
+          <w:lang w:val="es-ES"/>
+        </w:rPr>
+        <w:t xml:space="preserve"> del Arco</w:t>
+      </w:r>
+      <w:r>
+        <w:rPr>
+          <w:lang w:val="es-ES"/>
+        </w:rPr>
+        <w:t>, E (s/f)</w:t>
+      </w:r>
+      <w:r>
+        <w:rPr>
+          <w:lang w:val="es-ES"/>
+        </w:rPr>
+        <w:t xml:space="preserve"> </w:t>
+      </w:r>
+      <w:r>
+        <w:rPr>
+          <w:lang w:val="es-ES"/>
+        </w:rPr>
+        <w:fldChar w:fldCharType="begin"/>
+      </w:r>
+      <w:r>
+        <w:rPr>
+          <w:lang w:val="es-ES"/>
+        </w:rPr>
+        <w:instrText xml:space="preserve"> ADDIN ZOTERO_ITEM CSL_CITATION {"citationID":"2wJzb3e7","properties":{"unsorted":false,"formattedCitation":"[21]","plainCitation":"[21]","noteIndex":0},"citationItems":[{"id":93,"uris":["http://zotero.org/users/local/axS3HTYd/items/3SKXL8W4"],"itemData":{"id":93,"type":"paper-conference","abstract":"En este trabajo reflexionamos sobre la importancia de la utilización de los recursos didácticos que nos facilita la educación mediática en el rendimiento académico de los alumnos con Trastorno por Déficit de Atención e Hiperactividad (TDAH). Además, proporcionamos pautas para mejorar el trabajo con los alumnos TDAH en el ámbito de las nuevas tecnologías.","container-title":"Educación mediática &amp;amp; competencia digital: la cultura de la participación, 2011, ISBN 84-95532-29-8, 9 págs.","event-title":"Educación mediática &amp; competencia digital: la cultura de la participación","ISBN":"978-84-95532-29-9","language":"por","note":"section: Educación mediática &amp; competencia digital: la cultura de la participación","page":"1-9","source":"dialnet.unirioja.es","title":"La educación mediática como vía para la mejora del rendimiento académico y adquisición de la competencia digital en los alumnos con TDAH","URL":"https://dialnet.unirioja.es/servlet/articulo?codigo=8905747","author":[{"family":"Santurde del Arco","given":"Estefanía"}],"accessed":{"date-parts":[["2026",8,14]]},"issued":{"date-parts":[["2011"]]}}}],"schema":"https://github.com/citation-style-language/schema/raw/master/csl-citation.json"} </w:instrText>
+      </w:r>
+      <w:r>
+        <w:rPr>
+          <w:lang w:val="es-ES"/>
+        </w:rPr>
+        <w:fldChar w:fldCharType="separate"/>
+      </w:r>
+      <w:r>
+        <w:rPr>
+          <w:lang w:val="es-ES"/>
+        </w:rPr>
+        <w:t>[21]</w:t>
+      </w:r>
+      <w:r>
+        <w:rPr>
+          <w:lang w:val="es-ES"/>
+        </w:rPr>
+        <w:fldChar w:fldCharType="end"/>
+      </w:r>
+      <w:r>
+        <w:rPr>
+          <w:lang w:val="es-ES"/>
+        </w:rPr>
+        <w:t xml:space="preserve"> </w:t>
+      </w:r>
+      <w:r>
+        <w:rPr>
+          <w:lang w:val="es-ES"/>
+        </w:rPr>
+        <w:t>indica que los medios digitales, al ser flexibles,</w:t>
+      </w:r>
+      <w:r>
+        <w:rPr>
+          <w:lang w:val="es-ES"/>
+        </w:rPr>
+        <w:t xml:space="preserve"> permiten que los profesores puedan adecuar la práctica educativa a los ritmos de trabajo y concentración de los niños con características atencionales diferentes y esto es beneficioso en los casos de TDAH.</w:t>
+      </w:r>
     </w:p>
     <w:p>
       <w:pPr>
@@ -7661,7 +8194,21 @@
         <w:rPr>
           <w:lang w:val="es-ES"/>
         </w:rPr>
-        <w:t xml:space="preserve">Pruebas explicar bien que fue en </w:t>
+        <w:t xml:space="preserve">Pruebas </w:t>
+      </w:r>
+      <w:proofErr w:type="gramStart"/>
+      <w:r>
+        <w:rPr>
+          <w:lang w:val="es-ES"/>
+        </w:rPr>
+        <w:t>explicar</w:t>
+      </w:r>
+      <w:proofErr w:type="gramEnd"/>
+      <w:r>
+        <w:rPr>
+          <w:lang w:val="es-ES"/>
+        </w:rPr>
+        <w:t xml:space="preserve"> bien que fue en </w:t>
       </w:r>
       <w:r>
         <w:rPr>
@@ -7973,7 +8520,35 @@
         <w:rPr>
           <w:lang w:val="es-ES"/>
         </w:rPr>
-        <w:t>Realizar pruebas estando presente y que sean para mejorar el juego  con el feedback de los jugadores</w:t>
+        <w:t xml:space="preserve">Realizar pruebas estando presente y que sean para mejorar el </w:t>
+      </w:r>
+      <w:proofErr w:type="gramStart"/>
+      <w:r>
+        <w:rPr>
+          <w:lang w:val="es-ES"/>
+        </w:rPr>
+        <w:t>juego  con</w:t>
+      </w:r>
+      <w:proofErr w:type="gramEnd"/>
+      <w:r>
+        <w:rPr>
+          <w:lang w:val="es-ES"/>
+        </w:rPr>
+        <w:t xml:space="preserve"> el </w:t>
+      </w:r>
+      <w:proofErr w:type="spellStart"/>
+      <w:r>
+        <w:rPr>
+          <w:lang w:val="es-ES"/>
+        </w:rPr>
+        <w:t>feedback</w:t>
+      </w:r>
+      <w:proofErr w:type="spellEnd"/>
+      <w:r>
+        <w:rPr>
+          <w:lang w:val="es-ES"/>
+        </w:rPr>
+        <w:t xml:space="preserve"> de los jugadores</w:t>
       </w:r>
     </w:p>
     <w:p>
@@ -8006,6 +8581,7 @@
       </w:pPr>
       <w:bookmarkStart w:id="53" w:name="_Toc116636447"/>
       <w:bookmarkStart w:id="54" w:name="_Toc237111021"/>
+      <w:proofErr w:type="spellStart"/>
       <w:r>
         <w:rPr>
           <w:lang w:val="es-ES"/>
@@ -8015,6 +8591,7 @@
       </w:r>
       <w:bookmarkEnd w:id="53"/>
       <w:bookmarkEnd w:id="54"/>
+      <w:proofErr w:type="spellEnd"/>
     </w:p>
     <w:p>
       <w:pPr>
@@ -8083,16 +8660,26 @@
           <w:lang w:val="es-ES"/>
         </w:rPr>
       </w:pPr>
+      <w:proofErr w:type="spellStart"/>
       <w:r>
         <w:rPr>
           <w:lang w:val="es-ES"/>
         </w:rPr>
         <w:t>Motivation</w:t>
       </w:r>
-    </w:p>
-    <w:p>
-      <w:r>
-        <w:t xml:space="preserve">Los títulos de las subsecciones de esta sección (Introduction) usan el estilo </w:t>
+      <w:proofErr w:type="spellEnd"/>
+    </w:p>
+    <w:p>
+      <w:r>
+        <w:t>Los títulos de las subsecciones de esta sección (</w:t>
+      </w:r>
+      <w:proofErr w:type="spellStart"/>
+      <w:r>
+        <w:t>Introduction</w:t>
+      </w:r>
+      <w:proofErr w:type="spellEnd"/>
+      <w:r>
+        <w:t xml:space="preserve">) usan el estilo </w:t>
       </w:r>
       <w:r>
         <w:t>Título 7</w:t>
@@ -8157,15 +8744,31 @@
       </w:pPr>
       <w:bookmarkStart w:id="55" w:name="_Toc116636448"/>
       <w:bookmarkStart w:id="56" w:name="_Toc237111022"/>
+      <w:proofErr w:type="spellStart"/>
       <w:r>
         <w:rPr>
           <w:lang w:val="es-ES"/>
         </w:rPr>
         <w:lastRenderedPageBreak/>
-        <w:t>Conclusions and future work</w:t>
+        <w:t>Conclusions</w:t>
+      </w:r>
+      <w:proofErr w:type="spellEnd"/>
+      <w:r>
+        <w:rPr>
+          <w:lang w:val="es-ES"/>
+        </w:rPr>
+        <w:t xml:space="preserve"> and future </w:t>
+      </w:r>
+      <w:proofErr w:type="spellStart"/>
+      <w:r>
+        <w:rPr>
+          <w:lang w:val="es-ES"/>
+        </w:rPr>
+        <w:t>work</w:t>
       </w:r>
       <w:bookmarkEnd w:id="55"/>
       <w:bookmarkEnd w:id="56"/>
+      <w:proofErr w:type="spellEnd"/>
     </w:p>
     <w:p>
       <w:pPr>
@@ -8256,9 +8859,19 @@
       <w:r>
         <w:t>Los títulos de las subsecciones de esta sección (</w:t>
       </w:r>
-      <w:r>
-        <w:t>Conclusions and future work</w:t>
-      </w:r>
+      <w:proofErr w:type="spellStart"/>
+      <w:r>
+        <w:t>Conclusions</w:t>
+      </w:r>
+      <w:proofErr w:type="spellEnd"/>
+      <w:r>
+        <w:t xml:space="preserve"> and future </w:t>
+      </w:r>
+      <w:proofErr w:type="spellStart"/>
+      <w:r>
+        <w:t>work</w:t>
+      </w:r>
+      <w:proofErr w:type="spellEnd"/>
       <w:r>
         <w:t xml:space="preserve">) usan el estilo </w:t>
       </w:r>
@@ -8318,6 +8931,7 @@
       </w:pPr>
       <w:bookmarkStart w:id="59" w:name="_Toc116636450"/>
       <w:bookmarkStart w:id="60" w:name="_Toc237111023"/>
+      <w:proofErr w:type="spellStart"/>
       <w:r>
         <w:lastRenderedPageBreak/>
         <w:t>Bibliografía</w:t>
@@ -8325,6 +8939,7 @@
       <w:bookmarkEnd w:id="57"/>
       <w:bookmarkEnd w:id="59"/>
       <w:bookmarkEnd w:id="60"/>
+      <w:proofErr w:type="spellEnd"/>
       <w:r>
         <w:rPr>
           <w:sz w:val="22"/>
@@ -8798,6 +9413,90 @@
       </w:r>
       <w:r>
         <w:t xml:space="preserve"> 42, pp. 301-322, mar. 2022, doi: 10.29018/issn.2588-1000vol6iss42.2022pp301-322.</w:t>
+      </w:r>
+    </w:p>
+    <w:p>
+      <w:pPr>
+        <w:pStyle w:val="Bibliografa"/>
+      </w:pPr>
+      <w:r>
+        <w:t>[19]</w:t>
+      </w:r>
+      <w:r>
+        <w:tab/>
+        <w:t xml:space="preserve">P. Wouters, C. van Nimwegen, H. van Oostendorp, y E. D. van der Spek, «A meta-analysis of the cognitive and motivational effects of serious games», </w:t>
+      </w:r>
+      <w:r>
+        <w:rPr>
+          <w:i/>
+          <w:iCs/>
+        </w:rPr>
+        <w:t>J. Educ. Psychol.</w:t>
+      </w:r>
+      <w:r>
+        <w:t>, vol. 105, n.</w:t>
+      </w:r>
+      <w:r>
+        <w:rPr>
+          <w:vertAlign w:val="superscript"/>
+        </w:rPr>
+        <w:t>o</w:t>
+      </w:r>
+      <w:r>
+        <w:t xml:space="preserve"> 2, pp. 249-265, 2013, doi: 10.1037/a0031311.</w:t>
+      </w:r>
+    </w:p>
+    <w:p>
+      <w:pPr>
+        <w:pStyle w:val="Bibliografa"/>
+      </w:pPr>
+      <w:r>
+        <w:t>[20]</w:t>
+      </w:r>
+      <w:r>
+        <w:tab/>
+        <w:t xml:space="preserve">J. G. Soriano, M. del C. Pérez-Fuentes, M. del M. Molero-Jurado, J. J. Gázquez, B. M. Tortosa, y A. González, «Beneficios de las intervenciones basadas en la atención plena para el tratamiento de síntomas ansiosos en niños y adolescentes: Metaanálisis», </w:t>
+      </w:r>
+      <w:r>
+        <w:rPr>
+          <w:i/>
+          <w:iCs/>
+        </w:rPr>
+        <w:t>Rev. Iberoam. Psicol. Salud</w:t>
+      </w:r>
+      <w:r>
+        <w:t>, vol. 11, n.</w:t>
+      </w:r>
+      <w:r>
+        <w:rPr>
+          <w:vertAlign w:val="superscript"/>
+        </w:rPr>
+        <w:t>o</w:t>
+      </w:r>
+      <w:r>
+        <w:t xml:space="preserve"> 1, pp. 42-53, 2020, doi: 10.23923/j.rips.2020.01.034.</w:t>
+      </w:r>
+    </w:p>
+    <w:p>
+      <w:pPr>
+        <w:pStyle w:val="Bibliografa"/>
+      </w:pPr>
+      <w:r>
+        <w:t>[21]</w:t>
+      </w:r>
+      <w:r>
+        <w:tab/>
+        <w:t xml:space="preserve">E. Santurde del Arco, «La educación mediática como vía para la mejora del rendimiento académico y adquisición de la competencia digital en los alumnos con TDAH», en </w:t>
+      </w:r>
+      <w:r>
+        <w:rPr>
+          <w:i/>
+          <w:iCs/>
+        </w:rPr>
+        <w:t>Educación mediática &amp;amp; competencia digital: la cultura de la participación, 2011, ISBN 84-95532-29-8, 9 págs.</w:t>
+      </w:r>
+      <w:r>
+        <w:t>, 2011, pp. 1-9. Accedido: 14 de agosto de 2026. [En línea]. Disponible en: https://dialnet.unirioja.es/servlet/articulo?codigo=8905747</w:t>
       </w:r>
     </w:p>
     <w:p>
@@ -8907,20 +9606,41 @@
     </w:p>
     <w:p>
       <w:r>
-        <w:t>Para los títulos de las subsecciones de los apéndices se utiliza el estilo Título 8. Para las sub-subsecciones se usa el estilo Título 9, como aparece a continuación.</w:t>
+        <w:t xml:space="preserve">Para los títulos de las subsecciones de los apéndices se utiliza el estilo Título 8. Para las </w:t>
+      </w:r>
+      <w:proofErr w:type="spellStart"/>
+      <w:r>
+        <w:t>sub-subsecciones</w:t>
+      </w:r>
+      <w:proofErr w:type="spellEnd"/>
+      <w:r>
+        <w:t xml:space="preserve"> se usa el estilo Título 9, como aparece a continuación.</w:t>
       </w:r>
     </w:p>
     <w:p>
       <w:pPr>
         <w:pStyle w:val="Ttulo9"/>
       </w:pPr>
-      <w:r>
-        <w:t>Sub-subsecciones del apéndice (Título 9)</w:t>
-      </w:r>
-    </w:p>
-    <w:p>
-      <w:r>
-        <w:t>Para las sub-subsecciones de un apéndice se utiliza el estilo Título 9. No se recomienda añadir más niveles de subsección</w:t>
+      <w:proofErr w:type="spellStart"/>
+      <w:r>
+        <w:t>Sub-subsecciones</w:t>
+      </w:r>
+      <w:proofErr w:type="spellEnd"/>
+      <w:r>
+        <w:t xml:space="preserve"> del apéndice (Título 9)</w:t>
+      </w:r>
+    </w:p>
+    <w:p>
+      <w:r>
+        <w:t xml:space="preserve">Para las </w:t>
+      </w:r>
+      <w:proofErr w:type="spellStart"/>
+      <w:r>
+        <w:t>sub-subsecciones</w:t>
+      </w:r>
+      <w:proofErr w:type="spellEnd"/>
+      <w:r>
+        <w:t xml:space="preserve"> de un apéndice se utiliza el estilo Título 9. No se recomienda añadir más niveles de subsección</w:t>
       </w:r>
       <w:r>
         <w:t>.</w:t>

</xml_diff>